<commit_message>
Restrict default algorithms and update report
</commit_message>
<xml_diff>
--- a/docs/find-your-path-report.docx
+++ b/docs/find-your-path-report.docx
@@ -27,7 +27,21 @@
           <w:b/>
           <w:color w:val="000000"/>
         </w:rPr>
-        <w:t>TRƯỜNG ĐẠI HỌC SƯ PHẠM KỸ THUẬT TP. HỒ CHÍ MINH</w:t>
+        <w:t xml:space="preserve">TRƯỜNG ĐẠI HỌC </w:t>
+      </w:r>
+      <w:r>
+        <w:rPr>
+          <w:b/>
+          <w:color w:val="000000"/>
+        </w:rPr>
+        <w:t>CÔNG NGHỆ</w:t>
+      </w:r>
+      <w:r>
+        <w:rPr>
+          <w:b/>
+          <w:color w:val="000000"/>
+        </w:rPr>
+        <w:t xml:space="preserve"> KỸ THUẬT TP. HỒ CHÍ MINH</w:t>
       </w:r>
     </w:p>
     <w:p>
@@ -417,12 +431,27 @@
       <w:pPr>
         <w:spacing w:after="0"/>
         <w:ind w:firstLine="0"/>
+      </w:pPr>
+    </w:p>
+    <w:p>
+      <w:pPr>
+        <w:spacing w:after="0"/>
+        <w:ind w:firstLine="0"/>
+      </w:pPr>
+    </w:p>
+    <w:p>
+      <w:pPr>
+        <w:spacing w:after="0"/>
+        <w:ind w:firstLine="0"/>
         <w:jc w:val="center"/>
+        <w:rPr>
+          <w:iCs/>
+        </w:rPr>
       </w:pPr>
       <w:r>
         <w:rPr>
           <w:b/>
-          <w:i/>
+          <w:iCs/>
           <w:color w:val="000000"/>
         </w:rPr>
         <w:t>Tp. Hồ Chí Minh, tháng 6 năm 2026</w:t>
@@ -450,7 +479,6 @@
           <w:b/>
           <w:color w:val="000000"/>
         </w:rPr>
-        <w:lastRenderedPageBreak/>
         <w:t>BẢNG PHÂN CÔNG</w:t>
       </w:r>
     </w:p>
@@ -471,12 +499,6 @@
       <w:pPr>
         <w:spacing w:after="160"/>
       </w:pPr>
-      <w:r>
-        <w:rPr>
-          <w:color w:val="000000"/>
-        </w:rPr>
-        <w:t>Tên báo cáo: Báo cáo tổng hợp kiến thức học phần Trí tuệ nhân tạo qua đề tài ứng dụng Find Your Path.</w:t>
-      </w:r>
     </w:p>
     <w:tbl>
       <w:tblPr>
@@ -838,8 +860,14 @@
     </w:p>
     <w:p>
       <w:pPr>
+        <w:tabs>
+          <w:tab w:val="right" w:leader="dot" w:pos="9071"/>
+        </w:tabs>
         <w:spacing w:after="40"/>
         <w:ind w:firstLine="0"/>
+        <w:rPr>
+          <w:color w:val="000000"/>
+        </w:rPr>
       </w:pPr>
       <w:r>
         <w:rPr>
@@ -847,35 +875,77 @@
         </w:rPr>
         <w:t>Hình thức:</w:t>
       </w:r>
-    </w:p>
-    <w:p>
-      <w:pPr>
-        <w:spacing w:after="0"/>
-        <w:ind w:firstLine="0"/>
-      </w:pPr>
       <w:r>
         <w:rPr>
           <w:color w:val="000000"/>
         </w:rPr>
-        <w:t>.........................................................................................................</w:t>
-      </w:r>
-    </w:p>
-    <w:p>
-      <w:pPr>
-        <w:spacing w:after="0"/>
+        <w:tab/>
+      </w:r>
+    </w:p>
+    <w:p>
+      <w:pPr>
+        <w:tabs>
+          <w:tab w:val="right" w:leader="dot" w:pos="9071"/>
+        </w:tabs>
+        <w:spacing w:after="40"/>
         <w:ind w:firstLine="0"/>
-      </w:pPr>
-      <w:r>
         <w:rPr>
           <w:color w:val="000000"/>
         </w:rPr>
-        <w:t>.........................................................................................................</w:t>
-      </w:r>
-    </w:p>
-    <w:p>
-      <w:pPr>
+      </w:pPr>
+      <w:r>
+        <w:rPr>
+          <w:color w:val="000000"/>
+        </w:rPr>
+        <w:tab/>
+      </w:r>
+    </w:p>
+    <w:p>
+      <w:pPr>
+        <w:tabs>
+          <w:tab w:val="right" w:leader="dot" w:pos="9071"/>
+        </w:tabs>
         <w:spacing w:after="40"/>
         <w:ind w:firstLine="0"/>
+        <w:rPr>
+          <w:color w:val="000000"/>
+        </w:rPr>
+      </w:pPr>
+      <w:r>
+        <w:rPr>
+          <w:color w:val="000000"/>
+        </w:rPr>
+        <w:tab/>
+      </w:r>
+    </w:p>
+    <w:p>
+      <w:pPr>
+        <w:tabs>
+          <w:tab w:val="right" w:leader="dot" w:pos="9071"/>
+        </w:tabs>
+        <w:spacing w:after="40"/>
+        <w:ind w:firstLine="0"/>
+        <w:rPr>
+          <w:color w:val="000000"/>
+        </w:rPr>
+      </w:pPr>
+      <w:r>
+        <w:rPr>
+          <w:color w:val="000000"/>
+        </w:rPr>
+        <w:tab/>
+      </w:r>
+    </w:p>
+    <w:p>
+      <w:pPr>
+        <w:tabs>
+          <w:tab w:val="right" w:leader="dot" w:pos="9071"/>
+        </w:tabs>
+        <w:spacing w:after="40"/>
+        <w:ind w:firstLine="0"/>
+        <w:rPr>
+          <w:color w:val="000000"/>
+        </w:rPr>
       </w:pPr>
       <w:r>
         <w:rPr>
@@ -883,35 +953,77 @@
         </w:rPr>
         <w:t>Nội dung:</w:t>
       </w:r>
-    </w:p>
-    <w:p>
-      <w:pPr>
-        <w:spacing w:after="0"/>
-        <w:ind w:firstLine="0"/>
-      </w:pPr>
       <w:r>
         <w:rPr>
           <w:color w:val="000000"/>
         </w:rPr>
-        <w:t>.........................................................................................................</w:t>
-      </w:r>
-    </w:p>
-    <w:p>
-      <w:pPr>
-        <w:spacing w:after="0"/>
+        <w:tab/>
+      </w:r>
+    </w:p>
+    <w:p>
+      <w:pPr>
+        <w:tabs>
+          <w:tab w:val="right" w:leader="dot" w:pos="9071"/>
+        </w:tabs>
+        <w:spacing w:after="40"/>
         <w:ind w:firstLine="0"/>
-      </w:pPr>
-      <w:r>
         <w:rPr>
           <w:color w:val="000000"/>
         </w:rPr>
-        <w:t>.........................................................................................................</w:t>
-      </w:r>
-    </w:p>
-    <w:p>
-      <w:pPr>
+      </w:pPr>
+      <w:r>
+        <w:rPr>
+          <w:color w:val="000000"/>
+        </w:rPr>
+        <w:tab/>
+      </w:r>
+    </w:p>
+    <w:p>
+      <w:pPr>
+        <w:tabs>
+          <w:tab w:val="right" w:leader="dot" w:pos="9071"/>
+        </w:tabs>
         <w:spacing w:after="40"/>
         <w:ind w:firstLine="0"/>
+        <w:rPr>
+          <w:color w:val="000000"/>
+        </w:rPr>
+      </w:pPr>
+      <w:r>
+        <w:rPr>
+          <w:color w:val="000000"/>
+        </w:rPr>
+        <w:tab/>
+      </w:r>
+    </w:p>
+    <w:p>
+      <w:pPr>
+        <w:tabs>
+          <w:tab w:val="right" w:leader="dot" w:pos="9071"/>
+        </w:tabs>
+        <w:spacing w:after="40"/>
+        <w:ind w:firstLine="0"/>
+        <w:rPr>
+          <w:color w:val="000000"/>
+        </w:rPr>
+      </w:pPr>
+      <w:r>
+        <w:rPr>
+          <w:color w:val="000000"/>
+        </w:rPr>
+        <w:tab/>
+      </w:r>
+    </w:p>
+    <w:p>
+      <w:pPr>
+        <w:tabs>
+          <w:tab w:val="right" w:leader="dot" w:pos="9071"/>
+        </w:tabs>
+        <w:spacing w:after="40"/>
+        <w:ind w:firstLine="0"/>
+        <w:rPr>
+          <w:color w:val="000000"/>
+        </w:rPr>
       </w:pPr>
       <w:r>
         <w:rPr>
@@ -919,56 +1031,107 @@
         </w:rPr>
         <w:t>Tổng điểm:</w:t>
       </w:r>
-    </w:p>
-    <w:p>
-      <w:pPr>
-        <w:spacing w:after="0"/>
-        <w:ind w:firstLine="0"/>
-      </w:pPr>
       <w:r>
         <w:rPr>
           <w:color w:val="000000"/>
         </w:rPr>
-        <w:t>.........................................................................................................</w:t>
-      </w:r>
-    </w:p>
-    <w:p>
-      <w:pPr>
-        <w:spacing w:after="0"/>
+        <w:tab/>
+      </w:r>
+    </w:p>
+    <w:p>
+      <w:pPr>
+        <w:tabs>
+          <w:tab w:val="right" w:leader="dot" w:pos="9071"/>
+        </w:tabs>
+        <w:spacing w:after="40"/>
         <w:ind w:firstLine="0"/>
-      </w:pPr>
-      <w:r>
         <w:rPr>
           <w:color w:val="000000"/>
         </w:rPr>
-        <w:t>.........................................................................................................</w:t>
-      </w:r>
-    </w:p>
-    <w:p>
-      <w:pPr>
+      </w:pPr>
+      <w:r>
+        <w:rPr>
+          <w:color w:val="000000"/>
+        </w:rPr>
+        <w:tab/>
+      </w:r>
+    </w:p>
+    <w:p>
+      <w:pPr>
+        <w:tabs>
+          <w:tab w:val="right" w:leader="dot" w:pos="9071"/>
+        </w:tabs>
         <w:spacing w:after="40"/>
         <w:ind w:firstLine="0"/>
-        <w:jc w:val="right"/>
+        <w:rPr>
+          <w:color w:val="000000"/>
+        </w:rPr>
+      </w:pPr>
+      <w:r>
+        <w:rPr>
+          <w:color w:val="000000"/>
+        </w:rPr>
+        <w:tab/>
+      </w:r>
+    </w:p>
+    <w:p>
+      <w:pPr>
+        <w:tabs>
+          <w:tab w:val="right" w:leader="dot" w:pos="9071"/>
+        </w:tabs>
+        <w:spacing w:after="40"/>
+        <w:ind w:firstLine="0"/>
+        <w:rPr>
+          <w:color w:val="000000"/>
+        </w:rPr>
+      </w:pPr>
+      <w:r>
+        <w:rPr>
+          <w:color w:val="000000"/>
+        </w:rPr>
+        <w:tab/>
+      </w:r>
+    </w:p>
+    <w:p>
+      <w:pPr>
+        <w:spacing w:after="40"/>
+        <w:ind w:firstLine="0"/>
+        <w:rPr>
+          <w:color w:val="000000"/>
+        </w:rPr>
+      </w:pPr>
+    </w:p>
+    <w:p>
+      <w:pPr>
+        <w:tabs>
+          <w:tab w:val="center" w:pos="7938"/>
+        </w:tabs>
+        <w:spacing w:after="40"/>
+        <w:ind w:firstLine="0"/>
       </w:pPr>
       <w:r>
         <w:rPr>
           <w:i/>
           <w:color w:val="000000"/>
         </w:rPr>
+        <w:tab/>
         <w:t>Ngày 27 tháng 6 năm 2026</w:t>
       </w:r>
     </w:p>
     <w:p>
       <w:pPr>
+        <w:tabs>
+          <w:tab w:val="center" w:pos="7938"/>
+        </w:tabs>
         <w:spacing w:after="360"/>
         <w:ind w:firstLine="0"/>
-        <w:jc w:val="right"/>
       </w:pPr>
       <w:r>
         <w:rPr>
           <w:i/>
           <w:color w:val="000000"/>
         </w:rPr>
+        <w:tab/>
         <w:t>Giảng viên</w:t>
       </w:r>
     </w:p>
@@ -994,7 +1157,6 @@
           <w:b/>
           <w:color w:val="000000"/>
         </w:rPr>
-        <w:lastRenderedPageBreak/>
         <w:t>MỤC LỤC</w:t>
       </w:r>
     </w:p>
@@ -1005,7 +1167,12 @@
           <w:tab w:val="right" w:leader="dot" w:pos="9061"/>
         </w:tabs>
         <w:rPr>
+          <w:rFonts w:asciiTheme="minorHAnsi" w:eastAsiaTheme="minorEastAsia" w:hAnsiTheme="minorHAnsi" w:cstheme="minorBidi"/>
           <w:noProof/>
+          <w:kern w:val="2"/>
+          <w:sz w:val="24"/>
+          <w:szCs w:val="24"/>
+          <w14:ligatures w14:val="standardContextual"/>
         </w:rPr>
       </w:pPr>
       <w:r>
@@ -1026,13 +1193,13 @@
         </w:rPr>
         <w:fldChar w:fldCharType="separate"/>
       </w:r>
-      <w:hyperlink w:anchor="_Toc233492387" w:history="1">
+      <w:hyperlink w:anchor="_Toc233509667" w:history="1">
         <w:r>
           <w:rPr>
             <w:rStyle w:val="Hyperlink"/>
             <w:noProof/>
           </w:rPr>
-          <w:t>I. Bài toán đặt ra</w:t>
+          <w:t>I. BÀI TOÁN ĐẶT RA</w:t>
         </w:r>
         <w:r>
           <w:rPr>
@@ -1053,7 +1220,7 @@
             <w:noProof/>
             <w:webHidden/>
           </w:rPr>
-          <w:instrText xml:space="preserve"> PAGEREF _Toc233492387 \h </w:instrText>
+          <w:instrText xml:space="preserve"> PAGEREF _Toc233509667 \h </w:instrText>
         </w:r>
         <w:r>
           <w:rPr>
@@ -1091,10 +1258,15 @@
           <w:tab w:val="right" w:leader="dot" w:pos="9061"/>
         </w:tabs>
         <w:rPr>
+          <w:rFonts w:asciiTheme="minorHAnsi" w:eastAsiaTheme="minorEastAsia" w:hAnsiTheme="minorHAnsi" w:cstheme="minorBidi"/>
           <w:noProof/>
+          <w:kern w:val="2"/>
+          <w:sz w:val="24"/>
+          <w:szCs w:val="24"/>
+          <w14:ligatures w14:val="standardContextual"/>
         </w:rPr>
       </w:pPr>
-      <w:hyperlink w:anchor="_Toc233492388" w:history="1">
+      <w:hyperlink w:anchor="_Toc233509668" w:history="1">
         <w:r>
           <w:rPr>
             <w:rStyle w:val="Hyperlink"/>
@@ -1121,7 +1293,7 @@
             <w:noProof/>
             <w:webHidden/>
           </w:rPr>
-          <w:instrText xml:space="preserve"> PAGEREF _Toc233492388 \h </w:instrText>
+          <w:instrText xml:space="preserve"> PAGEREF _Toc233509668 \h </w:instrText>
         </w:r>
         <w:r>
           <w:rPr>
@@ -1159,10 +1331,15 @@
           <w:tab w:val="right" w:leader="dot" w:pos="9061"/>
         </w:tabs>
         <w:rPr>
+          <w:rFonts w:asciiTheme="minorHAnsi" w:eastAsiaTheme="minorEastAsia" w:hAnsiTheme="minorHAnsi" w:cstheme="minorBidi"/>
           <w:noProof/>
+          <w:kern w:val="2"/>
+          <w:sz w:val="24"/>
+          <w:szCs w:val="24"/>
+          <w14:ligatures w14:val="standardContextual"/>
         </w:rPr>
       </w:pPr>
-      <w:hyperlink w:anchor="_Toc233492389" w:history="1">
+      <w:hyperlink w:anchor="_Toc233509669" w:history="1">
         <w:r>
           <w:rPr>
             <w:rStyle w:val="Hyperlink"/>
@@ -1189,7 +1366,7 @@
             <w:noProof/>
             <w:webHidden/>
           </w:rPr>
-          <w:instrText xml:space="preserve"> PAGEREF _Toc233492389 \h </w:instrText>
+          <w:instrText xml:space="preserve"> PAGEREF _Toc233509669 \h </w:instrText>
         </w:r>
         <w:r>
           <w:rPr>
@@ -1227,16 +1404,21 @@
           <w:tab w:val="right" w:leader="dot" w:pos="9061"/>
         </w:tabs>
         <w:rPr>
+          <w:rFonts w:asciiTheme="minorHAnsi" w:eastAsiaTheme="minorEastAsia" w:hAnsiTheme="minorHAnsi" w:cstheme="minorBidi"/>
           <w:noProof/>
+          <w:kern w:val="2"/>
+          <w:sz w:val="24"/>
+          <w:szCs w:val="24"/>
+          <w14:ligatures w14:val="standardContextual"/>
         </w:rPr>
       </w:pPr>
-      <w:hyperlink w:anchor="_Toc233492390" w:history="1">
+      <w:hyperlink w:anchor="_Toc233509670" w:history="1">
         <w:r>
           <w:rPr>
             <w:rStyle w:val="Hyperlink"/>
             <w:noProof/>
           </w:rPr>
-          <w:t>II. Thuật toán áp dụng</w:t>
+          <w:t>II. THUẬT TOÁN ÁP DỤNG</w:t>
         </w:r>
         <w:r>
           <w:rPr>
@@ -1257,7 +1439,7 @@
             <w:noProof/>
             <w:webHidden/>
           </w:rPr>
-          <w:instrText xml:space="preserve"> PAGEREF _Toc233492390 \h </w:instrText>
+          <w:instrText xml:space="preserve"> PAGEREF _Toc233509670 \h </w:instrText>
         </w:r>
         <w:r>
           <w:rPr>
@@ -1295,10 +1477,15 @@
           <w:tab w:val="right" w:leader="dot" w:pos="9061"/>
         </w:tabs>
         <w:rPr>
+          <w:rFonts w:asciiTheme="minorHAnsi" w:eastAsiaTheme="minorEastAsia" w:hAnsiTheme="minorHAnsi" w:cstheme="minorBidi"/>
           <w:noProof/>
+          <w:kern w:val="2"/>
+          <w:sz w:val="24"/>
+          <w:szCs w:val="24"/>
+          <w14:ligatures w14:val="standardContextual"/>
         </w:rPr>
       </w:pPr>
-      <w:hyperlink w:anchor="_Toc233492391" w:history="1">
+      <w:hyperlink w:anchor="_Toc233509671" w:history="1">
         <w:r>
           <w:rPr>
             <w:rStyle w:val="Hyperlink"/>
@@ -1325,7 +1512,7 @@
             <w:noProof/>
             <w:webHidden/>
           </w:rPr>
-          <w:instrText xml:space="preserve"> PAGEREF _Toc233492391 \h </w:instrText>
+          <w:instrText xml:space="preserve"> PAGEREF _Toc233509671 \h </w:instrText>
         </w:r>
         <w:r>
           <w:rPr>
@@ -1363,10 +1550,15 @@
           <w:tab w:val="right" w:leader="dot" w:pos="9061"/>
         </w:tabs>
         <w:rPr>
+          <w:rFonts w:asciiTheme="minorHAnsi" w:eastAsiaTheme="minorEastAsia" w:hAnsiTheme="minorHAnsi" w:cstheme="minorBidi"/>
           <w:noProof/>
+          <w:kern w:val="2"/>
+          <w:sz w:val="24"/>
+          <w:szCs w:val="24"/>
+          <w14:ligatures w14:val="standardContextual"/>
         </w:rPr>
       </w:pPr>
-      <w:hyperlink w:anchor="_Toc233492392" w:history="1">
+      <w:hyperlink w:anchor="_Toc233509672" w:history="1">
         <w:r>
           <w:rPr>
             <w:rStyle w:val="Hyperlink"/>
@@ -1393,7 +1585,7 @@
             <w:noProof/>
             <w:webHidden/>
           </w:rPr>
-          <w:instrText xml:space="preserve"> PAGEREF _Toc233492392 \h </w:instrText>
+          <w:instrText xml:space="preserve"> PAGEREF _Toc233509672 \h </w:instrText>
         </w:r>
         <w:r>
           <w:rPr>
@@ -1431,10 +1623,15 @@
           <w:tab w:val="right" w:leader="dot" w:pos="9061"/>
         </w:tabs>
         <w:rPr>
+          <w:rFonts w:asciiTheme="minorHAnsi" w:eastAsiaTheme="minorEastAsia" w:hAnsiTheme="minorHAnsi" w:cstheme="minorBidi"/>
           <w:noProof/>
+          <w:kern w:val="2"/>
+          <w:sz w:val="24"/>
+          <w:szCs w:val="24"/>
+          <w14:ligatures w14:val="standardContextual"/>
         </w:rPr>
       </w:pPr>
-      <w:hyperlink w:anchor="_Toc233492393" w:history="1">
+      <w:hyperlink w:anchor="_Toc233509673" w:history="1">
         <w:r>
           <w:rPr>
             <w:rStyle w:val="Hyperlink"/>
@@ -1461,7 +1658,7 @@
             <w:noProof/>
             <w:webHidden/>
           </w:rPr>
-          <w:instrText xml:space="preserve"> PAGEREF _Toc233492393 \h </w:instrText>
+          <w:instrText xml:space="preserve"> PAGEREF _Toc233509673 \h </w:instrText>
         </w:r>
         <w:r>
           <w:rPr>
@@ -1481,7 +1678,7 @@
             <w:noProof/>
             <w:webHidden/>
           </w:rPr>
-          <w:t>3</w:t>
+          <w:t>4</w:t>
         </w:r>
         <w:r>
           <w:rPr>
@@ -1499,10 +1696,15 @@
           <w:tab w:val="right" w:leader="dot" w:pos="9061"/>
         </w:tabs>
         <w:rPr>
+          <w:rFonts w:asciiTheme="minorHAnsi" w:eastAsiaTheme="minorEastAsia" w:hAnsiTheme="minorHAnsi" w:cstheme="minorBidi"/>
           <w:noProof/>
+          <w:kern w:val="2"/>
+          <w:sz w:val="24"/>
+          <w:szCs w:val="24"/>
+          <w14:ligatures w14:val="standardContextual"/>
         </w:rPr>
       </w:pPr>
-      <w:hyperlink w:anchor="_Toc233492394" w:history="1">
+      <w:hyperlink w:anchor="_Toc233509674" w:history="1">
         <w:r>
           <w:rPr>
             <w:rStyle w:val="Hyperlink"/>
@@ -1529,7 +1731,7 @@
             <w:noProof/>
             <w:webHidden/>
           </w:rPr>
-          <w:instrText xml:space="preserve"> PAGEREF _Toc233492394 \h </w:instrText>
+          <w:instrText xml:space="preserve"> PAGEREF _Toc233509674 \h </w:instrText>
         </w:r>
         <w:r>
           <w:rPr>
@@ -1549,7 +1751,7 @@
             <w:noProof/>
             <w:webHidden/>
           </w:rPr>
-          <w:t>4</w:t>
+          <w:t>5</w:t>
         </w:r>
         <w:r>
           <w:rPr>
@@ -1567,10 +1769,15 @@
           <w:tab w:val="right" w:leader="dot" w:pos="9061"/>
         </w:tabs>
         <w:rPr>
+          <w:rFonts w:asciiTheme="minorHAnsi" w:eastAsiaTheme="minorEastAsia" w:hAnsiTheme="minorHAnsi" w:cstheme="minorBidi"/>
           <w:noProof/>
+          <w:kern w:val="2"/>
+          <w:sz w:val="24"/>
+          <w:szCs w:val="24"/>
+          <w14:ligatures w14:val="standardContextual"/>
         </w:rPr>
       </w:pPr>
-      <w:hyperlink w:anchor="_Toc233492395" w:history="1">
+      <w:hyperlink w:anchor="_Toc233509675" w:history="1">
         <w:r>
           <w:rPr>
             <w:rStyle w:val="Hyperlink"/>
@@ -1597,7 +1804,7 @@
             <w:noProof/>
             <w:webHidden/>
           </w:rPr>
-          <w:instrText xml:space="preserve"> PAGEREF _Toc233492395 \h </w:instrText>
+          <w:instrText xml:space="preserve"> PAGEREF _Toc233509675 \h </w:instrText>
         </w:r>
         <w:r>
           <w:rPr>
@@ -1617,7 +1824,7 @@
             <w:noProof/>
             <w:webHidden/>
           </w:rPr>
-          <w:t>4</w:t>
+          <w:t>5</w:t>
         </w:r>
         <w:r>
           <w:rPr>
@@ -1635,10 +1842,15 @@
           <w:tab w:val="right" w:leader="dot" w:pos="9061"/>
         </w:tabs>
         <w:rPr>
+          <w:rFonts w:asciiTheme="minorHAnsi" w:eastAsiaTheme="minorEastAsia" w:hAnsiTheme="minorHAnsi" w:cstheme="minorBidi"/>
           <w:noProof/>
+          <w:kern w:val="2"/>
+          <w:sz w:val="24"/>
+          <w:szCs w:val="24"/>
+          <w14:ligatures w14:val="standardContextual"/>
         </w:rPr>
       </w:pPr>
-      <w:hyperlink w:anchor="_Toc233492396" w:history="1">
+      <w:hyperlink w:anchor="_Toc233509676" w:history="1">
         <w:r>
           <w:rPr>
             <w:rStyle w:val="Hyperlink"/>
@@ -1665,7 +1877,7 @@
             <w:noProof/>
             <w:webHidden/>
           </w:rPr>
-          <w:instrText xml:space="preserve"> PAGEREF _Toc233492396 \h </w:instrText>
+          <w:instrText xml:space="preserve"> PAGEREF _Toc233509676 \h </w:instrText>
         </w:r>
         <w:r>
           <w:rPr>
@@ -1685,7 +1897,7 @@
             <w:noProof/>
             <w:webHidden/>
           </w:rPr>
-          <w:t>4</w:t>
+          <w:t>6</w:t>
         </w:r>
         <w:r>
           <w:rPr>
@@ -1703,10 +1915,15 @@
           <w:tab w:val="right" w:leader="dot" w:pos="9061"/>
         </w:tabs>
         <w:rPr>
+          <w:rFonts w:asciiTheme="minorHAnsi" w:eastAsiaTheme="minorEastAsia" w:hAnsiTheme="minorHAnsi" w:cstheme="minorBidi"/>
           <w:noProof/>
+          <w:kern w:val="2"/>
+          <w:sz w:val="24"/>
+          <w:szCs w:val="24"/>
+          <w14:ligatures w14:val="standardContextual"/>
         </w:rPr>
       </w:pPr>
-      <w:hyperlink w:anchor="_Toc233492397" w:history="1">
+      <w:hyperlink w:anchor="_Toc233509677" w:history="1">
         <w:r>
           <w:rPr>
             <w:rStyle w:val="Hyperlink"/>
@@ -1733,7 +1950,7 @@
             <w:noProof/>
             <w:webHidden/>
           </w:rPr>
-          <w:instrText xml:space="preserve"> PAGEREF _Toc233492397 \h </w:instrText>
+          <w:instrText xml:space="preserve"> PAGEREF _Toc233509677 \h </w:instrText>
         </w:r>
         <w:r>
           <w:rPr>
@@ -1753,7 +1970,7 @@
             <w:noProof/>
             <w:webHidden/>
           </w:rPr>
-          <w:t>5</w:t>
+          <w:t>7</w:t>
         </w:r>
         <w:r>
           <w:rPr>
@@ -1771,10 +1988,15 @@
           <w:tab w:val="right" w:leader="dot" w:pos="9061"/>
         </w:tabs>
         <w:rPr>
+          <w:rFonts w:asciiTheme="minorHAnsi" w:eastAsiaTheme="minorEastAsia" w:hAnsiTheme="minorHAnsi" w:cstheme="minorBidi"/>
           <w:noProof/>
+          <w:kern w:val="2"/>
+          <w:sz w:val="24"/>
+          <w:szCs w:val="24"/>
+          <w14:ligatures w14:val="standardContextual"/>
         </w:rPr>
       </w:pPr>
-      <w:hyperlink w:anchor="_Toc233492398" w:history="1">
+      <w:hyperlink w:anchor="_Toc233509678" w:history="1">
         <w:r>
           <w:rPr>
             <w:rStyle w:val="Hyperlink"/>
@@ -1801,7 +2023,7 @@
             <w:noProof/>
             <w:webHidden/>
           </w:rPr>
-          <w:instrText xml:space="preserve"> PAGEREF _Toc233492398 \h </w:instrText>
+          <w:instrText xml:space="preserve"> PAGEREF _Toc233509678 \h </w:instrText>
         </w:r>
         <w:r>
           <w:rPr>
@@ -1821,7 +2043,7 @@
             <w:noProof/>
             <w:webHidden/>
           </w:rPr>
-          <w:t>5</w:t>
+          <w:t>7</w:t>
         </w:r>
         <w:r>
           <w:rPr>
@@ -1839,10 +2061,15 @@
           <w:tab w:val="right" w:leader="dot" w:pos="9061"/>
         </w:tabs>
         <w:rPr>
+          <w:rFonts w:asciiTheme="minorHAnsi" w:eastAsiaTheme="minorEastAsia" w:hAnsiTheme="minorHAnsi" w:cstheme="minorBidi"/>
           <w:noProof/>
+          <w:kern w:val="2"/>
+          <w:sz w:val="24"/>
+          <w:szCs w:val="24"/>
+          <w14:ligatures w14:val="standardContextual"/>
         </w:rPr>
       </w:pPr>
-      <w:hyperlink w:anchor="_Toc233492399" w:history="1">
+      <w:hyperlink w:anchor="_Toc233509679" w:history="1">
         <w:r>
           <w:rPr>
             <w:rStyle w:val="Hyperlink"/>
@@ -1869,7 +2096,7 @@
             <w:noProof/>
             <w:webHidden/>
           </w:rPr>
-          <w:instrText xml:space="preserve"> PAGEREF _Toc233492399 \h </w:instrText>
+          <w:instrText xml:space="preserve"> PAGEREF _Toc233509679 \h </w:instrText>
         </w:r>
         <w:r>
           <w:rPr>
@@ -1889,7 +2116,7 @@
             <w:noProof/>
             <w:webHidden/>
           </w:rPr>
-          <w:t>5</w:t>
+          <w:t>8</w:t>
         </w:r>
         <w:r>
           <w:rPr>
@@ -1907,10 +2134,15 @@
           <w:tab w:val="right" w:leader="dot" w:pos="9061"/>
         </w:tabs>
         <w:rPr>
+          <w:rFonts w:asciiTheme="minorHAnsi" w:eastAsiaTheme="minorEastAsia" w:hAnsiTheme="minorHAnsi" w:cstheme="minorBidi"/>
           <w:noProof/>
+          <w:kern w:val="2"/>
+          <w:sz w:val="24"/>
+          <w:szCs w:val="24"/>
+          <w14:ligatures w14:val="standardContextual"/>
         </w:rPr>
       </w:pPr>
-      <w:hyperlink w:anchor="_Toc233492400" w:history="1">
+      <w:hyperlink w:anchor="_Toc233509680" w:history="1">
         <w:r>
           <w:rPr>
             <w:rStyle w:val="Hyperlink"/>
@@ -1937,7 +2169,7 @@
             <w:noProof/>
             <w:webHidden/>
           </w:rPr>
-          <w:instrText xml:space="preserve"> PAGEREF _Toc233492400 \h </w:instrText>
+          <w:instrText xml:space="preserve"> PAGEREF _Toc233509680 \h </w:instrText>
         </w:r>
         <w:r>
           <w:rPr>
@@ -1957,7 +2189,7 @@
             <w:noProof/>
             <w:webHidden/>
           </w:rPr>
-          <w:t>6</w:t>
+          <w:t>9</w:t>
         </w:r>
         <w:r>
           <w:rPr>
@@ -1975,10 +2207,15 @@
           <w:tab w:val="right" w:leader="dot" w:pos="9061"/>
         </w:tabs>
         <w:rPr>
+          <w:rFonts w:asciiTheme="minorHAnsi" w:eastAsiaTheme="minorEastAsia" w:hAnsiTheme="minorHAnsi" w:cstheme="minorBidi"/>
           <w:noProof/>
+          <w:kern w:val="2"/>
+          <w:sz w:val="24"/>
+          <w:szCs w:val="24"/>
+          <w14:ligatures w14:val="standardContextual"/>
         </w:rPr>
       </w:pPr>
-      <w:hyperlink w:anchor="_Toc233492401" w:history="1">
+      <w:hyperlink w:anchor="_Toc233509681" w:history="1">
         <w:r>
           <w:rPr>
             <w:rStyle w:val="Hyperlink"/>
@@ -2005,7 +2242,7 @@
             <w:noProof/>
             <w:webHidden/>
           </w:rPr>
-          <w:instrText xml:space="preserve"> PAGEREF _Toc233492401 \h </w:instrText>
+          <w:instrText xml:space="preserve"> PAGEREF _Toc233509681 \h </w:instrText>
         </w:r>
         <w:r>
           <w:rPr>
@@ -2025,7 +2262,7 @@
             <w:noProof/>
             <w:webHidden/>
           </w:rPr>
-          <w:t>6</w:t>
+          <w:t>9</w:t>
         </w:r>
         <w:r>
           <w:rPr>
@@ -2043,10 +2280,15 @@
           <w:tab w:val="right" w:leader="dot" w:pos="9061"/>
         </w:tabs>
         <w:rPr>
+          <w:rFonts w:asciiTheme="minorHAnsi" w:eastAsiaTheme="minorEastAsia" w:hAnsiTheme="minorHAnsi" w:cstheme="minorBidi"/>
           <w:noProof/>
+          <w:kern w:val="2"/>
+          <w:sz w:val="24"/>
+          <w:szCs w:val="24"/>
+          <w14:ligatures w14:val="standardContextual"/>
         </w:rPr>
       </w:pPr>
-      <w:hyperlink w:anchor="_Toc233492402" w:history="1">
+      <w:hyperlink w:anchor="_Toc233509682" w:history="1">
         <w:r>
           <w:rPr>
             <w:rStyle w:val="Hyperlink"/>
@@ -2073,7 +2315,7 @@
             <w:noProof/>
             <w:webHidden/>
           </w:rPr>
-          <w:instrText xml:space="preserve"> PAGEREF _Toc233492402 \h </w:instrText>
+          <w:instrText xml:space="preserve"> PAGEREF _Toc233509682 \h </w:instrText>
         </w:r>
         <w:r>
           <w:rPr>
@@ -2093,7 +2335,7 @@
             <w:noProof/>
             <w:webHidden/>
           </w:rPr>
-          <w:t>6</w:t>
+          <w:t>10</w:t>
         </w:r>
         <w:r>
           <w:rPr>
@@ -2111,10 +2353,15 @@
           <w:tab w:val="right" w:leader="dot" w:pos="9061"/>
         </w:tabs>
         <w:rPr>
+          <w:rFonts w:asciiTheme="minorHAnsi" w:eastAsiaTheme="minorEastAsia" w:hAnsiTheme="minorHAnsi" w:cstheme="minorBidi"/>
           <w:noProof/>
+          <w:kern w:val="2"/>
+          <w:sz w:val="24"/>
+          <w:szCs w:val="24"/>
+          <w14:ligatures w14:val="standardContextual"/>
         </w:rPr>
       </w:pPr>
-      <w:hyperlink w:anchor="_Toc233492403" w:history="1">
+      <w:hyperlink w:anchor="_Toc233509683" w:history="1">
         <w:r>
           <w:rPr>
             <w:rStyle w:val="Hyperlink"/>
@@ -2141,7 +2388,7 @@
             <w:noProof/>
             <w:webHidden/>
           </w:rPr>
-          <w:instrText xml:space="preserve"> PAGEREF _Toc233492403 \h </w:instrText>
+          <w:instrText xml:space="preserve"> PAGEREF _Toc233509683 \h </w:instrText>
         </w:r>
         <w:r>
           <w:rPr>
@@ -2161,7 +2408,7 @@
             <w:noProof/>
             <w:webHidden/>
           </w:rPr>
-          <w:t>6</w:t>
+          <w:t>10</w:t>
         </w:r>
         <w:r>
           <w:rPr>
@@ -2179,10 +2426,15 @@
           <w:tab w:val="right" w:leader="dot" w:pos="9061"/>
         </w:tabs>
         <w:rPr>
+          <w:rFonts w:asciiTheme="minorHAnsi" w:eastAsiaTheme="minorEastAsia" w:hAnsiTheme="minorHAnsi" w:cstheme="minorBidi"/>
           <w:noProof/>
+          <w:kern w:val="2"/>
+          <w:sz w:val="24"/>
+          <w:szCs w:val="24"/>
+          <w14:ligatures w14:val="standardContextual"/>
         </w:rPr>
       </w:pPr>
-      <w:hyperlink w:anchor="_Toc233492404" w:history="1">
+      <w:hyperlink w:anchor="_Toc233509684" w:history="1">
         <w:r>
           <w:rPr>
             <w:rStyle w:val="Hyperlink"/>
@@ -2209,7 +2461,7 @@
             <w:noProof/>
             <w:webHidden/>
           </w:rPr>
-          <w:instrText xml:space="preserve"> PAGEREF _Toc233492404 \h </w:instrText>
+          <w:instrText xml:space="preserve"> PAGEREF _Toc233509684 \h </w:instrText>
         </w:r>
         <w:r>
           <w:rPr>
@@ -2229,7 +2481,7 @@
             <w:noProof/>
             <w:webHidden/>
           </w:rPr>
-          <w:t>7</w:t>
+          <w:t>11</w:t>
         </w:r>
         <w:r>
           <w:rPr>
@@ -2247,10 +2499,15 @@
           <w:tab w:val="right" w:leader="dot" w:pos="9061"/>
         </w:tabs>
         <w:rPr>
+          <w:rFonts w:asciiTheme="minorHAnsi" w:eastAsiaTheme="minorEastAsia" w:hAnsiTheme="minorHAnsi" w:cstheme="minorBidi"/>
           <w:noProof/>
+          <w:kern w:val="2"/>
+          <w:sz w:val="24"/>
+          <w:szCs w:val="24"/>
+          <w14:ligatures w14:val="standardContextual"/>
         </w:rPr>
       </w:pPr>
-      <w:hyperlink w:anchor="_Toc233492405" w:history="1">
+      <w:hyperlink w:anchor="_Toc233509685" w:history="1">
         <w:r>
           <w:rPr>
             <w:rStyle w:val="Hyperlink"/>
@@ -2277,7 +2534,7 @@
             <w:noProof/>
             <w:webHidden/>
           </w:rPr>
-          <w:instrText xml:space="preserve"> PAGEREF _Toc233492405 \h </w:instrText>
+          <w:instrText xml:space="preserve"> PAGEREF _Toc233509685 \h </w:instrText>
         </w:r>
         <w:r>
           <w:rPr>
@@ -2297,7 +2554,7 @@
             <w:noProof/>
             <w:webHidden/>
           </w:rPr>
-          <w:t>7</w:t>
+          <w:t>11</w:t>
         </w:r>
         <w:r>
           <w:rPr>
@@ -2315,16 +2572,21 @@
           <w:tab w:val="right" w:leader="dot" w:pos="9061"/>
         </w:tabs>
         <w:rPr>
+          <w:rFonts w:asciiTheme="minorHAnsi" w:eastAsiaTheme="minorEastAsia" w:hAnsiTheme="minorHAnsi" w:cstheme="minorBidi"/>
           <w:noProof/>
+          <w:kern w:val="2"/>
+          <w:sz w:val="24"/>
+          <w:szCs w:val="24"/>
+          <w14:ligatures w14:val="standardContextual"/>
         </w:rPr>
       </w:pPr>
-      <w:hyperlink w:anchor="_Toc233492406" w:history="1">
+      <w:hyperlink w:anchor="_Toc233509686" w:history="1">
         <w:r>
           <w:rPr>
             <w:rStyle w:val="Hyperlink"/>
             <w:noProof/>
           </w:rPr>
-          <w:t>6. Nhóm môi trường phức tạp: định hướng bổ sung sau</w:t>
+          <w:t>6. Nhóm môi trường phức tạp: Online Re-planning và AND-OR Search</w:t>
         </w:r>
         <w:r>
           <w:rPr>
@@ -2345,7 +2607,7 @@
             <w:noProof/>
             <w:webHidden/>
           </w:rPr>
-          <w:instrText xml:space="preserve"> PAGEREF _Toc233492406 \h </w:instrText>
+          <w:instrText xml:space="preserve"> PAGEREF _Toc233509686 \h </w:instrText>
         </w:r>
         <w:r>
           <w:rPr>
@@ -2365,7 +2627,153 @@
             <w:noProof/>
             <w:webHidden/>
           </w:rPr>
-          <w:t>7</w:t>
+          <w:t>12</w:t>
+        </w:r>
+        <w:r>
+          <w:rPr>
+            <w:noProof/>
+            <w:webHidden/>
+          </w:rPr>
+          <w:fldChar w:fldCharType="end"/>
+        </w:r>
+      </w:hyperlink>
+    </w:p>
+    <w:p>
+      <w:pPr>
+        <w:pStyle w:val="TOC3"/>
+        <w:tabs>
+          <w:tab w:val="right" w:leader="dot" w:pos="9061"/>
+        </w:tabs>
+        <w:rPr>
+          <w:rFonts w:asciiTheme="minorHAnsi" w:eastAsiaTheme="minorEastAsia" w:hAnsiTheme="minorHAnsi" w:cstheme="minorBidi"/>
+          <w:noProof/>
+          <w:kern w:val="2"/>
+          <w:sz w:val="24"/>
+          <w:szCs w:val="24"/>
+          <w14:ligatures w14:val="standardContextual"/>
+        </w:rPr>
+      </w:pPr>
+      <w:hyperlink w:anchor="_Toc233509687" w:history="1">
+        <w:r>
+          <w:rPr>
+            <w:rStyle w:val="Hyperlink"/>
+            <w:noProof/>
+          </w:rPr>
+          <w:t>6.1. Online Re-planning</w:t>
+        </w:r>
+        <w:r>
+          <w:rPr>
+            <w:noProof/>
+            <w:webHidden/>
+          </w:rPr>
+          <w:tab/>
+        </w:r>
+        <w:r>
+          <w:rPr>
+            <w:noProof/>
+            <w:webHidden/>
+          </w:rPr>
+          <w:fldChar w:fldCharType="begin"/>
+        </w:r>
+        <w:r>
+          <w:rPr>
+            <w:noProof/>
+            <w:webHidden/>
+          </w:rPr>
+          <w:instrText xml:space="preserve"> PAGEREF _Toc233509687 \h </w:instrText>
+        </w:r>
+        <w:r>
+          <w:rPr>
+            <w:noProof/>
+            <w:webHidden/>
+          </w:rPr>
+        </w:r>
+        <w:r>
+          <w:rPr>
+            <w:noProof/>
+            <w:webHidden/>
+          </w:rPr>
+          <w:fldChar w:fldCharType="separate"/>
+        </w:r>
+        <w:r>
+          <w:rPr>
+            <w:noProof/>
+            <w:webHidden/>
+          </w:rPr>
+          <w:t>12</w:t>
+        </w:r>
+        <w:r>
+          <w:rPr>
+            <w:noProof/>
+            <w:webHidden/>
+          </w:rPr>
+          <w:fldChar w:fldCharType="end"/>
+        </w:r>
+      </w:hyperlink>
+    </w:p>
+    <w:p>
+      <w:pPr>
+        <w:pStyle w:val="TOC3"/>
+        <w:tabs>
+          <w:tab w:val="right" w:leader="dot" w:pos="9061"/>
+        </w:tabs>
+        <w:rPr>
+          <w:rFonts w:asciiTheme="minorHAnsi" w:eastAsiaTheme="minorEastAsia" w:hAnsiTheme="minorHAnsi" w:cstheme="minorBidi"/>
+          <w:noProof/>
+          <w:kern w:val="2"/>
+          <w:sz w:val="24"/>
+          <w:szCs w:val="24"/>
+          <w14:ligatures w14:val="standardContextual"/>
+        </w:rPr>
+      </w:pPr>
+      <w:hyperlink w:anchor="_Toc233509688" w:history="1">
+        <w:r>
+          <w:rPr>
+            <w:rStyle w:val="Hyperlink"/>
+            <w:noProof/>
+          </w:rPr>
+          <w:t>6.2. AND-OR Search</w:t>
+        </w:r>
+        <w:r>
+          <w:rPr>
+            <w:noProof/>
+            <w:webHidden/>
+          </w:rPr>
+          <w:tab/>
+        </w:r>
+        <w:r>
+          <w:rPr>
+            <w:noProof/>
+            <w:webHidden/>
+          </w:rPr>
+          <w:fldChar w:fldCharType="begin"/>
+        </w:r>
+        <w:r>
+          <w:rPr>
+            <w:noProof/>
+            <w:webHidden/>
+          </w:rPr>
+          <w:instrText xml:space="preserve"> PAGEREF _Toc233509688 \h </w:instrText>
+        </w:r>
+        <w:r>
+          <w:rPr>
+            <w:noProof/>
+            <w:webHidden/>
+          </w:rPr>
+        </w:r>
+        <w:r>
+          <w:rPr>
+            <w:noProof/>
+            <w:webHidden/>
+          </w:rPr>
+          <w:fldChar w:fldCharType="separate"/>
+        </w:r>
+        <w:r>
+          <w:rPr>
+            <w:noProof/>
+            <w:webHidden/>
+          </w:rPr>
+          <w:t>13</w:t>
         </w:r>
         <w:r>
           <w:rPr>
@@ -2383,16 +2791,21 @@
           <w:tab w:val="right" w:leader="dot" w:pos="9061"/>
         </w:tabs>
         <w:rPr>
+          <w:rFonts w:asciiTheme="minorHAnsi" w:eastAsiaTheme="minorEastAsia" w:hAnsiTheme="minorHAnsi" w:cstheme="minorBidi"/>
           <w:noProof/>
+          <w:kern w:val="2"/>
+          <w:sz w:val="24"/>
+          <w:szCs w:val="24"/>
+          <w14:ligatures w14:val="standardContextual"/>
         </w:rPr>
       </w:pPr>
-      <w:hyperlink w:anchor="_Toc233492407" w:history="1">
+      <w:hyperlink w:anchor="_Toc233509689" w:history="1">
         <w:r>
           <w:rPr>
             <w:rStyle w:val="Hyperlink"/>
             <w:noProof/>
           </w:rPr>
-          <w:t>III. Thực nghiệm và kết quả</w:t>
+          <w:t>III. THỰC NGHIỆM VÀ KẾT QUẢ</w:t>
         </w:r>
         <w:r>
           <w:rPr>
@@ -2413,7 +2826,7 @@
             <w:noProof/>
             <w:webHidden/>
           </w:rPr>
-          <w:instrText xml:space="preserve"> PAGEREF _Toc233492407 \h </w:instrText>
+          <w:instrText xml:space="preserve"> PAGEREF _Toc233509689 \h </w:instrText>
         </w:r>
         <w:r>
           <w:rPr>
@@ -2433,7 +2846,7 @@
             <w:noProof/>
             <w:webHidden/>
           </w:rPr>
-          <w:t>8</w:t>
+          <w:t>15</w:t>
         </w:r>
         <w:r>
           <w:rPr>
@@ -2451,10 +2864,15 @@
           <w:tab w:val="right" w:leader="dot" w:pos="9061"/>
         </w:tabs>
         <w:rPr>
+          <w:rFonts w:asciiTheme="minorHAnsi" w:eastAsiaTheme="minorEastAsia" w:hAnsiTheme="minorHAnsi" w:cstheme="minorBidi"/>
           <w:noProof/>
+          <w:kern w:val="2"/>
+          <w:sz w:val="24"/>
+          <w:szCs w:val="24"/>
+          <w14:ligatures w14:val="standardContextual"/>
         </w:rPr>
       </w:pPr>
-      <w:hyperlink w:anchor="_Toc233492408" w:history="1">
+      <w:hyperlink w:anchor="_Toc233509690" w:history="1">
         <w:r>
           <w:rPr>
             <w:rStyle w:val="Hyperlink"/>
@@ -2481,7 +2899,7 @@
             <w:noProof/>
             <w:webHidden/>
           </w:rPr>
-          <w:instrText xml:space="preserve"> PAGEREF _Toc233492408 \h </w:instrText>
+          <w:instrText xml:space="preserve"> PAGEREF _Toc233509690 \h </w:instrText>
         </w:r>
         <w:r>
           <w:rPr>
@@ -2501,7 +2919,7 @@
             <w:noProof/>
             <w:webHidden/>
           </w:rPr>
-          <w:t>8</w:t>
+          <w:t>15</w:t>
         </w:r>
         <w:r>
           <w:rPr>
@@ -2519,10 +2937,15 @@
           <w:tab w:val="right" w:leader="dot" w:pos="9061"/>
         </w:tabs>
         <w:rPr>
+          <w:rFonts w:asciiTheme="minorHAnsi" w:eastAsiaTheme="minorEastAsia" w:hAnsiTheme="minorHAnsi" w:cstheme="minorBidi"/>
           <w:noProof/>
+          <w:kern w:val="2"/>
+          <w:sz w:val="24"/>
+          <w:szCs w:val="24"/>
+          <w14:ligatures w14:val="standardContextual"/>
         </w:rPr>
       </w:pPr>
-      <w:hyperlink w:anchor="_Toc233492409" w:history="1">
+      <w:hyperlink w:anchor="_Toc233509691" w:history="1">
         <w:r>
           <w:rPr>
             <w:rStyle w:val="Hyperlink"/>
@@ -2549,7 +2972,7 @@
             <w:noProof/>
             <w:webHidden/>
           </w:rPr>
-          <w:instrText xml:space="preserve"> PAGEREF _Toc233492409 \h </w:instrText>
+          <w:instrText xml:space="preserve"> PAGEREF _Toc233509691 \h </w:instrText>
         </w:r>
         <w:r>
           <w:rPr>
@@ -2569,7 +2992,7 @@
             <w:noProof/>
             <w:webHidden/>
           </w:rPr>
-          <w:t>8</w:t>
+          <w:t>15</w:t>
         </w:r>
         <w:r>
           <w:rPr>
@@ -2587,10 +3010,15 @@
           <w:tab w:val="right" w:leader="dot" w:pos="9061"/>
         </w:tabs>
         <w:rPr>
+          <w:rFonts w:asciiTheme="minorHAnsi" w:eastAsiaTheme="minorEastAsia" w:hAnsiTheme="minorHAnsi" w:cstheme="minorBidi"/>
           <w:noProof/>
+          <w:kern w:val="2"/>
+          <w:sz w:val="24"/>
+          <w:szCs w:val="24"/>
+          <w14:ligatures w14:val="standardContextual"/>
         </w:rPr>
       </w:pPr>
-      <w:hyperlink w:anchor="_Toc233492410" w:history="1">
+      <w:hyperlink w:anchor="_Toc233509692" w:history="1">
         <w:r>
           <w:rPr>
             <w:rStyle w:val="Hyperlink"/>
@@ -2617,7 +3045,7 @@
             <w:noProof/>
             <w:webHidden/>
           </w:rPr>
-          <w:instrText xml:space="preserve"> PAGEREF _Toc233492410 \h </w:instrText>
+          <w:instrText xml:space="preserve"> PAGEREF _Toc233509692 \h </w:instrText>
         </w:r>
         <w:r>
           <w:rPr>
@@ -2637,7 +3065,7 @@
             <w:noProof/>
             <w:webHidden/>
           </w:rPr>
-          <w:t>9</w:t>
+          <w:t>16</w:t>
         </w:r>
         <w:r>
           <w:rPr>
@@ -2655,10 +3083,15 @@
           <w:tab w:val="right" w:leader="dot" w:pos="9061"/>
         </w:tabs>
         <w:rPr>
+          <w:rFonts w:asciiTheme="minorHAnsi" w:eastAsiaTheme="minorEastAsia" w:hAnsiTheme="minorHAnsi" w:cstheme="minorBidi"/>
           <w:noProof/>
+          <w:kern w:val="2"/>
+          <w:sz w:val="24"/>
+          <w:szCs w:val="24"/>
+          <w14:ligatures w14:val="standardContextual"/>
         </w:rPr>
       </w:pPr>
-      <w:hyperlink w:anchor="_Toc233492411" w:history="1">
+      <w:hyperlink w:anchor="_Toc233509693" w:history="1">
         <w:r>
           <w:rPr>
             <w:rStyle w:val="Hyperlink"/>
@@ -2685,7 +3118,7 @@
             <w:noProof/>
             <w:webHidden/>
           </w:rPr>
-          <w:instrText xml:space="preserve"> PAGEREF _Toc233492411 \h </w:instrText>
+          <w:instrText xml:space="preserve"> PAGEREF _Toc233509693 \h </w:instrText>
         </w:r>
         <w:r>
           <w:rPr>
@@ -2705,7 +3138,7 @@
             <w:noProof/>
             <w:webHidden/>
           </w:rPr>
-          <w:t>9</w:t>
+          <w:t>16</w:t>
         </w:r>
         <w:r>
           <w:rPr>
@@ -2723,10 +3156,15 @@
           <w:tab w:val="right" w:leader="dot" w:pos="9061"/>
         </w:tabs>
         <w:rPr>
+          <w:rFonts w:asciiTheme="minorHAnsi" w:eastAsiaTheme="minorEastAsia" w:hAnsiTheme="minorHAnsi" w:cstheme="minorBidi"/>
           <w:noProof/>
+          <w:kern w:val="2"/>
+          <w:sz w:val="24"/>
+          <w:szCs w:val="24"/>
+          <w14:ligatures w14:val="standardContextual"/>
         </w:rPr>
       </w:pPr>
-      <w:hyperlink w:anchor="_Toc233492412" w:history="1">
+      <w:hyperlink w:anchor="_Toc233509694" w:history="1">
         <w:r>
           <w:rPr>
             <w:rStyle w:val="Hyperlink"/>
@@ -2753,7 +3191,7 @@
             <w:noProof/>
             <w:webHidden/>
           </w:rPr>
-          <w:instrText xml:space="preserve"> PAGEREF _Toc233492412 \h </w:instrText>
+          <w:instrText xml:space="preserve"> PAGEREF _Toc233509694 \h </w:instrText>
         </w:r>
         <w:r>
           <w:rPr>
@@ -2773,7 +3211,7 @@
             <w:noProof/>
             <w:webHidden/>
           </w:rPr>
-          <w:t>9</w:t>
+          <w:t>16</w:t>
         </w:r>
         <w:r>
           <w:rPr>
@@ -2791,16 +3229,21 @@
           <w:tab w:val="right" w:leader="dot" w:pos="9061"/>
         </w:tabs>
         <w:rPr>
+          <w:rFonts w:asciiTheme="minorHAnsi" w:eastAsiaTheme="minorEastAsia" w:hAnsiTheme="minorHAnsi" w:cstheme="minorBidi"/>
           <w:noProof/>
+          <w:kern w:val="2"/>
+          <w:sz w:val="24"/>
+          <w:szCs w:val="24"/>
+          <w14:ligatures w14:val="standardContextual"/>
         </w:rPr>
       </w:pPr>
-      <w:hyperlink w:anchor="_Toc233492413" w:history="1">
+      <w:hyperlink w:anchor="_Toc233509695" w:history="1">
         <w:r>
           <w:rPr>
             <w:rStyle w:val="Hyperlink"/>
             <w:noProof/>
           </w:rPr>
-          <w:t>6. Link GitHub</w:t>
+          <w:t>6. Nhóm môi trường phức tạp</w:t>
         </w:r>
         <w:r>
           <w:rPr>
@@ -2821,7 +3264,7 @@
             <w:noProof/>
             <w:webHidden/>
           </w:rPr>
-          <w:instrText xml:space="preserve"> PAGEREF _Toc233492413 \h </w:instrText>
+          <w:instrText xml:space="preserve"> PAGEREF _Toc233509695 \h </w:instrText>
         </w:r>
         <w:r>
           <w:rPr>
@@ -2841,7 +3284,80 @@
             <w:noProof/>
             <w:webHidden/>
           </w:rPr>
-          <w:t>10</w:t>
+          <w:t>17</w:t>
+        </w:r>
+        <w:r>
+          <w:rPr>
+            <w:noProof/>
+            <w:webHidden/>
+          </w:rPr>
+          <w:fldChar w:fldCharType="end"/>
+        </w:r>
+      </w:hyperlink>
+    </w:p>
+    <w:p>
+      <w:pPr>
+        <w:pStyle w:val="TOC2"/>
+        <w:tabs>
+          <w:tab w:val="right" w:leader="dot" w:pos="9061"/>
+        </w:tabs>
+        <w:rPr>
+          <w:rFonts w:asciiTheme="minorHAnsi" w:eastAsiaTheme="minorEastAsia" w:hAnsiTheme="minorHAnsi" w:cstheme="minorBidi"/>
+          <w:noProof/>
+          <w:kern w:val="2"/>
+          <w:sz w:val="24"/>
+          <w:szCs w:val="24"/>
+          <w14:ligatures w14:val="standardContextual"/>
+        </w:rPr>
+      </w:pPr>
+      <w:hyperlink w:anchor="_Toc233509696" w:history="1">
+        <w:r>
+          <w:rPr>
+            <w:rStyle w:val="Hyperlink"/>
+            <w:noProof/>
+          </w:rPr>
+          <w:t>7. Link GitHub</w:t>
+        </w:r>
+        <w:r>
+          <w:rPr>
+            <w:noProof/>
+            <w:webHidden/>
+          </w:rPr>
+          <w:tab/>
+        </w:r>
+        <w:r>
+          <w:rPr>
+            <w:noProof/>
+            <w:webHidden/>
+          </w:rPr>
+          <w:fldChar w:fldCharType="begin"/>
+        </w:r>
+        <w:r>
+          <w:rPr>
+            <w:noProof/>
+            <w:webHidden/>
+          </w:rPr>
+          <w:instrText xml:space="preserve"> PAGEREF _Toc233509696 \h </w:instrText>
+        </w:r>
+        <w:r>
+          <w:rPr>
+            <w:noProof/>
+            <w:webHidden/>
+          </w:rPr>
+        </w:r>
+        <w:r>
+          <w:rPr>
+            <w:noProof/>
+            <w:webHidden/>
+          </w:rPr>
+          <w:fldChar w:fldCharType="separate"/>
+        </w:r>
+        <w:r>
+          <w:rPr>
+            <w:noProof/>
+            <w:webHidden/>
+          </w:rPr>
+          <w:t>17</w:t>
         </w:r>
         <w:r>
           <w:rPr>
@@ -2859,16 +3375,21 @@
           <w:tab w:val="right" w:leader="dot" w:pos="9061"/>
         </w:tabs>
         <w:rPr>
+          <w:rFonts w:asciiTheme="minorHAnsi" w:eastAsiaTheme="minorEastAsia" w:hAnsiTheme="minorHAnsi" w:cstheme="minorBidi"/>
           <w:noProof/>
+          <w:kern w:val="2"/>
+          <w:sz w:val="24"/>
+          <w:szCs w:val="24"/>
+          <w14:ligatures w14:val="standardContextual"/>
         </w:rPr>
       </w:pPr>
-      <w:hyperlink w:anchor="_Toc233492414" w:history="1">
+      <w:hyperlink w:anchor="_Toc233509697" w:history="1">
         <w:r>
           <w:rPr>
             <w:rStyle w:val="Hyperlink"/>
             <w:noProof/>
           </w:rPr>
-          <w:t>IV. Đánh giá và thảo luận</w:t>
+          <w:t>IV. ĐÁNH GIÁ VÀ THẢO LUẬN</w:t>
         </w:r>
         <w:r>
           <w:rPr>
@@ -2889,7 +3410,7 @@
             <w:noProof/>
             <w:webHidden/>
           </w:rPr>
-          <w:instrText xml:space="preserve"> PAGEREF _Toc233492414 \h </w:instrText>
+          <w:instrText xml:space="preserve"> PAGEREF _Toc233509697 \h </w:instrText>
         </w:r>
         <w:r>
           <w:rPr>
@@ -2909,7 +3430,7 @@
             <w:noProof/>
             <w:webHidden/>
           </w:rPr>
-          <w:t>11</w:t>
+          <w:t>18</w:t>
         </w:r>
         <w:r>
           <w:rPr>
@@ -2927,16 +3448,21 @@
           <w:tab w:val="right" w:leader="dot" w:pos="9061"/>
         </w:tabs>
         <w:rPr>
+          <w:rFonts w:asciiTheme="minorHAnsi" w:eastAsiaTheme="minorEastAsia" w:hAnsiTheme="minorHAnsi" w:cstheme="minorBidi"/>
           <w:noProof/>
+          <w:kern w:val="2"/>
+          <w:sz w:val="24"/>
+          <w:szCs w:val="24"/>
+          <w14:ligatures w14:val="standardContextual"/>
         </w:rPr>
       </w:pPr>
-      <w:hyperlink w:anchor="_Toc233492415" w:history="1">
+      <w:hyperlink w:anchor="_Toc233509698" w:history="1">
         <w:r>
           <w:rPr>
             <w:rStyle w:val="Hyperlink"/>
             <w:noProof/>
           </w:rPr>
-          <w:t>V. Kết luận</w:t>
+          <w:t>V. KẾT LUẬN</w:t>
         </w:r>
         <w:r>
           <w:rPr>
@@ -2957,7 +3483,7 @@
             <w:noProof/>
             <w:webHidden/>
           </w:rPr>
-          <w:instrText xml:space="preserve"> PAGEREF _Toc233492415 \h </w:instrText>
+          <w:instrText xml:space="preserve"> PAGEREF _Toc233509698 \h </w:instrText>
         </w:r>
         <w:r>
           <w:rPr>
@@ -2977,7 +3503,7 @@
             <w:noProof/>
             <w:webHidden/>
           </w:rPr>
-          <w:t>13</w:t>
+          <w:t>20</w:t>
         </w:r>
         <w:r>
           <w:rPr>
@@ -2995,10 +3521,15 @@
           <w:tab w:val="right" w:leader="dot" w:pos="9061"/>
         </w:tabs>
         <w:rPr>
+          <w:rFonts w:asciiTheme="minorHAnsi" w:eastAsiaTheme="minorEastAsia" w:hAnsiTheme="minorHAnsi" w:cstheme="minorBidi"/>
           <w:noProof/>
+          <w:kern w:val="2"/>
+          <w:sz w:val="24"/>
+          <w:szCs w:val="24"/>
+          <w14:ligatures w14:val="standardContextual"/>
         </w:rPr>
       </w:pPr>
-      <w:hyperlink w:anchor="_Toc233492416" w:history="1">
+      <w:hyperlink w:anchor="_Toc233509699" w:history="1">
         <w:r>
           <w:rPr>
             <w:rStyle w:val="Hyperlink"/>
@@ -3025,7 +3556,7 @@
             <w:noProof/>
             <w:webHidden/>
           </w:rPr>
-          <w:instrText xml:space="preserve"> PAGEREF _Toc233492416 \h </w:instrText>
+          <w:instrText xml:space="preserve"> PAGEREF _Toc233509699 \h </w:instrText>
         </w:r>
         <w:r>
           <w:rPr>
@@ -3045,7 +3576,7 @@
             <w:noProof/>
             <w:webHidden/>
           </w:rPr>
-          <w:t>14</w:t>
+          <w:t>21</w:t>
         </w:r>
         <w:r>
           <w:rPr>
@@ -3083,14 +3614,13 @@
       <w:pPr>
         <w:pStyle w:val="Heading1"/>
       </w:pPr>
-      <w:bookmarkStart w:id="0" w:name="_Toc233492387"/>
+      <w:bookmarkStart w:id="0" w:name="_Toc233509667"/>
       <w:r>
         <w:rPr>
           <w:rFonts w:eastAsia="Times New Roman" w:cs="Times New Roman"/>
           <w:color w:val="000000"/>
         </w:rPr>
-        <w:lastRenderedPageBreak/>
-        <w:t>I. Bài toán đặt ra</w:t>
+        <w:t>I. BÀI TOÁN ĐẶT RA</w:t>
       </w:r>
       <w:bookmarkEnd w:id="0"/>
     </w:p>
@@ -3098,7 +3628,7 @@
       <w:pPr>
         <w:pStyle w:val="Heading2"/>
       </w:pPr>
-      <w:bookmarkStart w:id="1" w:name="_Toc233492388"/>
+      <w:bookmarkStart w:id="1" w:name="_Toc233509668"/>
       <w:r>
         <w:rPr>
           <w:rFonts w:eastAsia="Times New Roman" w:cs="Times New Roman"/>
@@ -3113,7 +3643,13 @@
         <w:rPr>
           <w:color w:val="000000"/>
         </w:rPr>
-        <w:t>Find Your Path được xác định là bài toán lập lộ trình giao hàng trong môi trường đô thị, trong đó tác tử cần lựa chọn chuỗi hành động di chuyển từ vị trí xuất phát đến một hoặc nhiều điểm giao hàng sao cho phương án cuối cùng thỏa mãn mục tiêu chi phí và các ràng buộc vận hành. Ở mức đơn giản, bài toán là tìm đường đi giữa hai vị trí trên đồ thị có trọng số. Ở mức mở rộng, bài toán trở thành lựa chọn thứ tự phục vụ nhiều đơn hàng, kiểm tra tính khả thi của route và ứng phó với các thay đổi bất lợi của môi trường.</w:t>
+        <w:t>Find Your Path được xác định là bài toán lập lộ trình giao hàng trong môi trường đô thị, trong đó tác tử cần lựa chọn chuỗi hành động di chuyển từ vị trí xuất phát đến một hoặc nhiều điểm giao hàng sao cho phương án cuối cùng thỏa mãn mục tiêu chi phí và các ràng buộc vận hành. Ở mức đơn giản, bài toán là tìm đường đi giữa hai vị trí trên đồ thị có trọng số. Ở mức mở rộng, bài toán trở thành lựa chọn thứ tự phục vụ nhiều đơn hàng, kiểm tra tính khả thi của route và ứng phó với các thay đổi bất lợi của môi t</w:t>
+      </w:r>
+      <w:r>
+        <w:rPr>
+          <w:color w:val="000000"/>
+        </w:rPr>
+        <w:t>rường.</w:t>
       </w:r>
     </w:p>
     <w:p>
@@ -3144,7 +3680,7 @@
       <w:pPr>
         <w:pStyle w:val="Heading2"/>
       </w:pPr>
-      <w:bookmarkStart w:id="2" w:name="_Toc233492389"/>
+      <w:bookmarkStart w:id="2" w:name="_Toc233509669"/>
       <w:r>
         <w:rPr>
           <w:rFonts w:eastAsia="Times New Roman" w:cs="Times New Roman"/>
@@ -3159,14 +3695,13 @@
         <w:rPr>
           <w:color w:val="000000"/>
         </w:rPr>
-        <w:t xml:space="preserve">Performance measure của Find Your Path cần được hiểu như một hàm đánh giá đa mục tiêu thay vì chỉ là độ dài tuyến đường. Ở lớp tìm đường cơ bản, hiệu năng có </w:t>
+        <w:t>Performance measure của Find Your Path cần được hiểu như một hàm đánh giá đa mục tiêu thay vì chỉ là độ dài tuyến đường. Ở lớp tìm đường cơ bản, hiệu năng có thể đo bằng tổng trọng số cạnh và số node được mở rộng. Ở lớp giao hàng, hệ thống cần xét thêm tỷ lệ đơn đúng hạn, số ràng buộc bị vi phạm, mức phạt do trễ deadline, khả năng cân bằng tải giữa shipper và độ ổn định của route khi dữ liệu đầu vào thay đổi. Đối với báo cáo học thuật, một tiêu chí quan trọng khác là tính giải thích được: thuật toán phải ch</w:t>
       </w:r>
       <w:r>
         <w:rPr>
           <w:color w:val="000000"/>
         </w:rPr>
-        <w:lastRenderedPageBreak/>
-        <w:t>thể đo bằng tổng trọng số cạnh và số node được mở rộng. Ở lớp giao hàng, hệ thống cần xét thêm tỷ lệ đơn đúng hạn, số ràng buộc bị vi phạm, mức phạt do trễ deadline, khả năng cân bằng tải giữa shipper và độ ổn định của route khi dữ liệu đầu vào thay đổi. Đối với báo cáo học thuật, một tiêu chí quan trọng khác là tính giải thích được: thuật toán phải cho phép nhóm mô tả được trạng thái ban đầu, điều kiện dừng và cơ chế chọn lời giải.</w:t>
+        <w:t>o phép nhóm mô tả được trạng thái ban đầu, điều kiện dừng và cơ chế chọn lời giải.</w:t>
       </w:r>
     </w:p>
     <w:p>
@@ -3174,15 +3709,13 @@
         <w:rPr>
           <w:color w:val="000000"/>
         </w:rPr>
-        <w:t>Environment là môi trường đô thị được biểu diễn bằng đồ thị có trọng số. Node có thể là giao điểm, depot, vị trí shipper hoặc điểm giao hàng; cạnh biểu diễn đoạn đường có chi phí di chuyển. Ở thực nghiệm cơ bản, môi trường có thể được xem là xác định và quan sát đầy đủ: chi phí cạnh đã biết, graph không thay đổi trong lúc thuật toán chạy. Tuy nhiên, bản chất của bài toán giao hàng cho phép mở rộng sang môi trường động, nơi chi phí cạnh thay đổi do tắc đường, một số cạnh bị khóa hoặc đơn hàng mới xuất hiện. Đây là lý do phần môi trường phức tạp được giữ như hướng phát triển sau thay vì chọn vội một thuật toán khi kịch bản chưa rõ.</w:t>
-      </w:r>
-    </w:p>
-    <w:p>
+        <w:t xml:space="preserve">Environment là môi trường đô thị được biểu diễn bằng đồ thị có trọng số. Node có thể là giao điểm, depot, vị trí shipper hoặc điểm giao hàng; cạnh biểu diễn đoạn đường có chi phí di chuyển. Ở thực nghiệm cơ bản, môi trường có thể được xem là xác định và quan sát đầy đủ: chi phí cạnh đã biết, graph không thay đổi trong lúc thuật toán chạy. Tuy nhiên, bản chất của bài toán giao hàng cho phép mở rộng sang môi trường động, nơi chi phí cạnh thay đổi do tắc đường, một số cạnh bị khóa hoặc đơn hàng mới xuất hiện. </w:t>
+      </w:r>
       <w:r>
         <w:rPr>
           <w:color w:val="000000"/>
         </w:rPr>
-        <w:t>Actuators là các hành động mà tác tử hoặc hệ thống có thể thực hiện để biến đổi trạng thái. Ở mức graph, hành động là chọn node kế tiếp từ tập node kề. Ở mức route nhiều đơn, hành động có thể là chọn đơn hàng kế tiếp, hoán đổi thứ tự hai điểm giao, thay thế một đoạn tuyến bằng đoạn khác hoặc loại bỏ một nhánh tìm kiếm không còn khả thi. Ở mức ràng buộc, hành động là gán giá trị cho biến và cập nhật domain còn lại. Ở mức đối kháng, hành động của hệ thống là chọn phương án còn môi trường giả lập có thể chọn phản ứng bất lợi để kiểm tra độ an toàn của quyết định.</w:t>
+        <w:t>Đây là lý do phần môi trường phức tạp được giữ như hướng phát triển sau thay vì chọn vội một thuật toán khi kịch bản chưa rõ.</w:t>
       </w:r>
     </w:p>
     <w:p>
@@ -3190,7 +3723,27 @@
         <w:rPr>
           <w:color w:val="000000"/>
         </w:rPr>
-        <w:t>Sensors là nguồn thông tin giúp hệ thống nhận biết trạng thái hiện tại và đánh giá lựa chọn tiếp theo. Trong dự án, cảm biến được hiểu theo nghĩa phần mềm: dữ liệu graph, danh sách đơn hàng, trạng thái đã nhận hoặc đã giao, deadline, tải trọng, chi phí cạnh, vị trí hiện tại và kết quả trung gian của thuật toán. Nếu mở rộng sang môi trường phức tạp, sensor không nhất thiết cung cấp thông tin hoàn hảo; khi đó hệ thống phải ra quyết định dựa trên dữ liệu thiếu, dữ liệu trễ hoặc ước lượng xác suất. Việc phân biệt mức quan sát này giúp nhóm tránh nhầm lẫn giữa bài toán tìm đường tĩnh và bài toán ra quyết định trong môi trường động.</w:t>
+        <w:t>Actuators là các hành động mà tác tử hoặc hệ thống có thể thực hiện để biến đổi trạng thái. Ở mức graph, hành động là chọn node kế tiếp từ tập node kề. Ở mức route nhiều đơn, hành động có thể là chọn đơn hàng kế tiếp, hoán đổi thứ tự hai điểm giao, thay thế một đoạn tuyến bằng đoạn khác hoặc loại bỏ một nhánh tìm kiếm không còn khả thi. Ở mức ràng buộc, hành động là gán giá trị cho biến và cập nhật domain còn lại. Ở mức đối kháng, hành động của hệ thống là chọn phương án còn môi trường giả lập có thể chọn p</w:t>
+      </w:r>
+      <w:r>
+        <w:rPr>
+          <w:color w:val="000000"/>
+        </w:rPr>
+        <w:t>hản ứng bất lợi để kiểm tra độ an toàn của quyết định.</w:t>
+      </w:r>
+    </w:p>
+    <w:p>
+      <w:r>
+        <w:rPr>
+          <w:color w:val="000000"/>
+        </w:rPr>
+        <w:t>Sensors là nguồn thông tin giúp hệ thống nhận biết trạng thái hiện tại và đánh giá lựa chọn tiếp theo. Trong dự án, cảm biến được hiểu theo nghĩa phần mềm: dữ liệu graph, danh sách đơn hàng, trạng thái đã nhận hoặc đã giao, deadline, tải trọng, chi phí cạnh, vị trí hiện tại và kết quả trung gian của thuật toán. Nếu mở rộng sang môi trường phức tạp, sensor không nhất thiết cung cấp thông tin hoàn hảo; khi đó hệ thống phải ra quyết định dựa trên dữ liệu thiếu, dữ liệu trễ hoặc ước lượng xác suất. Việc phân bi</w:t>
+      </w:r>
+      <w:r>
+        <w:rPr>
+          <w:color w:val="000000"/>
+        </w:rPr>
+        <w:t>ệt mức quan sát này giúp nhóm tránh nhầm lẫn giữa bài toán tìm đường tĩnh và bài toán ra quyết định trong môi trường động.</w:t>
       </w:r>
     </w:p>
     <w:p>
@@ -3198,14 +3751,13 @@
         <w:pStyle w:val="Heading1"/>
         <w:pageBreakBefore/>
       </w:pPr>
-      <w:bookmarkStart w:id="3" w:name="_Toc233492390"/>
+      <w:bookmarkStart w:id="3" w:name="_Toc233509670"/>
       <w:r>
         <w:rPr>
           <w:rFonts w:eastAsia="Times New Roman" w:cs="Times New Roman"/>
           <w:color w:val="000000"/>
         </w:rPr>
-        <w:lastRenderedPageBreak/>
-        <w:t>II. Thuật toán áp dụng</w:t>
+        <w:t>II. THUẬT TOÁN ÁP DỤNG</w:t>
       </w:r>
       <w:bookmarkEnd w:id="3"/>
     </w:p>
@@ -3218,10 +3770,15 @@
       </w:r>
     </w:p>
     <w:p>
+      <w:r>
+        <w:t>Trong các phân tích dưới đây, b là hệ số phân nhánh trung bình của không gian trạng thái, d là độ sâu của nghiệm nông nhất, m là độ sâu tối đa, n là số biến trong bài toán ràng buộc, d_csp là kích thước miền giá trị lớn nhất của một biến, k là số vòng lặp của thuật toán cục bộ, và |N(s)| là số láng giềng của trạng thái s. Bốn tính chất được dùng để đánh giá gồm tính đầy đủ, tính tối ưu, độ phức tạp thời gian và độ phức tạp không gian.</w:t>
+      </w:r>
+    </w:p>
+    <w:p>
       <w:pPr>
         <w:pStyle w:val="Heading2"/>
       </w:pPr>
-      <w:bookmarkStart w:id="4" w:name="_Toc233492391"/>
+      <w:bookmarkStart w:id="4" w:name="_Toc233509671"/>
       <w:r>
         <w:rPr>
           <w:rFonts w:eastAsia="Times New Roman" w:cs="Times New Roman"/>
@@ -3243,7 +3800,7 @@
       <w:pPr>
         <w:pStyle w:val="Heading3"/>
       </w:pPr>
-      <w:bookmarkStart w:id="5" w:name="_Toc233492392"/>
+      <w:bookmarkStart w:id="5" w:name="_Toc233509672"/>
       <w:r>
         <w:t>1.1. Breadth-First Search (BFS)</w:t>
       </w:r>
@@ -3266,10 +3823,20 @@
       </w:r>
     </w:p>
     <w:p>
+      <w:r>
+        <w:t>Đánh giá bốn tính chất của BFS cho thấy thuật toán đầy đủ nếu hệ số phân nhánh hữu hạn, vì mọi trạng thái ở độ sâu nhỏ hơn d đều được xét trước khi sang lớp sâu hơn. BFS tối ưu khi chi phí mỗi bước bằng nhau, do lời giải đầu tiên ở độ sâu d cũng là lời giải có số cạnh ít nhất. Độ phức tạp thời gian là O(b^(d+1)) vì thuật toán phải sinh gần như toàn bộ các node từ độ sâu 0 đến d. Độ phức tạp không gian cũng là O(b^(d+1)) do hàng đợi phải lưu nhiều node biên cùng lúc.</w:t>
+      </w:r>
+    </w:p>
+    <w:p>
+      <w:r>
+        <w:t>BFS không dùng hàm heuristic mà chỉ dùng quy tắc FIFO để chọn node mở rộng. So với DFS trong cùng nhóm, BFS đáng tin cậy hơn khi cần đường đi ít bước nhất, nhưng tốn bộ nhớ hơn rất nhiều. Trong Find Your Path, BFS phù hợp làm chuẩn so sánh cho các graph nhỏ; khi graph đô thị lớn hoặc có trọng số cạnh khác nhau, BFS trở nên kém phù hợp vì tiêu chí số cạnh không phản ánh đầy đủ chi phí di chuyển thực tế.</w:t>
+      </w:r>
+    </w:p>
+    <w:p>
       <w:pPr>
         <w:pStyle w:val="Heading3"/>
       </w:pPr>
-      <w:bookmarkStart w:id="6" w:name="_Toc233492393"/>
+      <w:bookmarkStart w:id="6" w:name="_Toc233509673"/>
       <w:r>
         <w:t>1.2. Depth-First Search (DFS)</w:t>
       </w:r>
@@ -3288,21 +3855,24 @@
         <w:rPr>
           <w:color w:val="000000"/>
         </w:rPr>
-        <w:t xml:space="preserve">DFS phù hợp để minh họa quá trình khám phá sâu trong không gian trạng thái và có ưu điểm sử dụng bộ nhớ ít hơn BFS. Tuy nhiên, DFS không bảo đảm tìm đường </w:t>
-      </w:r>
-      <w:r>
-        <w:rPr>
-          <w:color w:val="000000"/>
-        </w:rPr>
-        <w:lastRenderedPageBreak/>
-        <w:t>ngắn nhất và có thể đi vào nhánh dài không hiệu quả nếu thứ tự xét node không tốt. Khi áp dụng vào bản đồ giao hàng, DFS nên được xem như thuật toán nền để so sánh, không phải lựa chọn tối ưu cho route thực tế có trọng số.</w:t>
+        <w:t>DFS phù hợp để minh họa quá trình khám phá sâu trong không gian trạng thái và có ưu điểm sử dụng bộ nhớ ít hơn BFS. Tuy nhiên, DFS không bảo đảm tìm đường ngắn nhất và có thể đi vào nhánh dài không hiệu quả nếu thứ tự xét node không tốt. Khi áp dụng vào bản đồ giao hàng, DFS nên được xem như thuật toán nền để so sánh, không phải lựa chọn tối ưu cho route thực tế có trọng số.</w:t>
+      </w:r>
+    </w:p>
+    <w:p>
+      <w:r>
+        <w:t>DFS không đầy đủ trong không gian trạng thái vô hạn hoặc khi graph có chu trình mà không kiểm soát visited/depth limit; trong graph hữu hạn có đánh dấu visited, thuật toán có thể kết thúc. DFS không tối ưu vì lời giải đầu tiên tìm được phụ thuộc mạnh vào thứ tự mở rộng node. Độ phức tạp thời gian trong trường hợp xấu là O(b^m), với m là độ sâu tối đa mà thuật toán có thể đi tới. Độ phức tạp không gian thường là O(bm) nếu lưu stack theo đường đi hiện tại và các nhánh chờ, thấp hơn BFS đáng kể.</w:t>
+      </w:r>
+    </w:p>
+    <w:p>
+      <w:r>
+        <w:t>DFS không sử dụng công thức đánh giá trạng thái mà vận hành theo cơ chế LIFO hoặc đệ quy. So với BFS, ưu điểm chính của DFS là tiết kiệm bộ nhớ và dễ cài đặt, nhưng nhược điểm là khó bảo đảm chất lượng lời giải. Trong bài toán giao hàng, DFS hữu ích để minh họa quay lui và khám phá nhánh sâu, còn BFS phù hợp hơn khi cần một baseline có tính đầy đủ và có thể tối ưu theo số bước.</w:t>
       </w:r>
     </w:p>
     <w:p>
       <w:pPr>
         <w:pStyle w:val="Heading2"/>
       </w:pPr>
-      <w:bookmarkStart w:id="7" w:name="_Toc233492394"/>
+      <w:bookmarkStart w:id="7" w:name="_Toc233509674"/>
       <w:r>
         <w:rPr>
           <w:rFonts w:eastAsia="Times New Roman" w:cs="Times New Roman"/>
@@ -3324,7 +3894,7 @@
       <w:pPr>
         <w:pStyle w:val="Heading3"/>
       </w:pPr>
-      <w:bookmarkStart w:id="8" w:name="_Toc233492395"/>
+      <w:bookmarkStart w:id="8" w:name="_Toc233509675"/>
       <w:r>
         <w:t>2.1. Greedy Best-First Search</w:t>
       </w:r>
@@ -3347,10 +3917,241 @@
       </w:r>
     </w:p>
     <w:p>
+      <w:r>
+        <w:t>Greedy Best-First Search dùng hàm đánh giá f(n) = h(n), trong đó h(n) là chi phí ước lượng từ node n đến mục tiêu. Với bản đồ, h(n) có thể là khoảng cách Euclid h(n) = sqrt((x_n - x_goal)^2 + (y_n - y_goal)^2), khoảng cách Manhattan h(n) = |x_n - x_goal| + |y_n - y_goal|, hoặc ước lượng thời gian còn lại. Thuật toán ưu tiên node có h(n) nhỏ nhất, nghĩa là node trông có vẻ gần mục tiêu nhất.</w:t>
+      </w:r>
+    </w:p>
+    <w:p>
+      <w:pPr>
+        <w:spacing w:before="60" w:after="60"/>
+        <w:ind w:firstLine="0"/>
+        <w:jc w:val="center"/>
+      </w:pPr>
+      <m:oMathPara>
+        <m:oMath>
+          <m:r>
+            <m:t>f(n)=h(n)</m:t>
+          </m:r>
+        </m:oMath>
+      </m:oMathPara>
+    </w:p>
+    <w:p>
+      <w:pPr>
+        <w:spacing w:before="60" w:after="60"/>
+        <w:ind w:firstLine="0"/>
+        <w:jc w:val="center"/>
+      </w:pPr>
+      <m:oMathPara>
+        <m:oMath>
+          <m:sSub>
+            <m:e>
+              <m:r>
+                <m:t>h</m:t>
+              </m:r>
+            </m:e>
+            <m:sub>
+              <m:r>
+                <m:t>E</m:t>
+              </m:r>
+            </m:sub>
+          </m:sSub>
+          <m:r>
+            <m:t>(n)=</m:t>
+          </m:r>
+          <m:rad>
+            <m:radPr>
+              <m:degHide m:val="1"/>
+            </m:radPr>
+            <m:deg/>
+            <m:e>
+              <m:sSup>
+                <m:e>
+                  <m:r>
+                    <m:t>(</m:t>
+                  </m:r>
+                  <m:sSub>
+                    <m:e>
+                      <m:r>
+                        <m:t>x</m:t>
+                      </m:r>
+                    </m:e>
+                    <m:sub>
+                      <m:r>
+                        <m:t>n</m:t>
+                      </m:r>
+                    </m:sub>
+                  </m:sSub>
+                  <m:r>
+                    <m:t>−</m:t>
+                  </m:r>
+                  <m:sSub>
+                    <m:e>
+                      <m:r>
+                        <m:t>x</m:t>
+                      </m:r>
+                    </m:e>
+                    <m:sub>
+                      <m:r>
+                        <m:t>g</m:t>
+                      </m:r>
+                    </m:sub>
+                  </m:sSub>
+                  <m:r>
+                    <m:t>)</m:t>
+                  </m:r>
+                </m:e>
+                <m:sup>
+                  <m:r>
+                    <m:t>2</m:t>
+                  </m:r>
+                </m:sup>
+              </m:sSup>
+              <m:r>
+                <m:t>+</m:t>
+              </m:r>
+              <m:sSup>
+                <m:e>
+                  <m:r>
+                    <m:t>(</m:t>
+                  </m:r>
+                  <m:sSub>
+                    <m:e>
+                      <m:r>
+                        <m:t>y</m:t>
+                      </m:r>
+                    </m:e>
+                    <m:sub>
+                      <m:r>
+                        <m:t>n</m:t>
+                      </m:r>
+                    </m:sub>
+                  </m:sSub>
+                  <m:r>
+                    <m:t>−</m:t>
+                  </m:r>
+                  <m:sSub>
+                    <m:e>
+                      <m:r>
+                        <m:t>y</m:t>
+                      </m:r>
+                    </m:e>
+                    <m:sub>
+                      <m:r>
+                        <m:t>g</m:t>
+                      </m:r>
+                    </m:sub>
+                  </m:sSub>
+                  <m:r>
+                    <m:t>)</m:t>
+                  </m:r>
+                </m:e>
+                <m:sup>
+                  <m:r>
+                    <m:t>2</m:t>
+                  </m:r>
+                </m:sup>
+              </m:sSup>
+            </m:e>
+          </m:rad>
+        </m:oMath>
+      </m:oMathPara>
+    </w:p>
+    <w:p>
+      <w:pPr>
+        <w:spacing w:before="60" w:after="60"/>
+        <w:ind w:firstLine="0"/>
+        <w:jc w:val="center"/>
+      </w:pPr>
+      <m:oMathPara>
+        <m:oMath>
+          <m:sSub>
+            <m:e>
+              <m:r>
+                <m:t>h</m:t>
+              </m:r>
+            </m:e>
+            <m:sub>
+              <m:r>
+                <m:t>M</m:t>
+              </m:r>
+            </m:sub>
+          </m:sSub>
+          <m:r>
+            <m:t>(n)=|</m:t>
+          </m:r>
+          <m:sSub>
+            <m:e>
+              <m:r>
+                <m:t>x</m:t>
+              </m:r>
+            </m:e>
+            <m:sub>
+              <m:r>
+                <m:t>n</m:t>
+              </m:r>
+            </m:sub>
+          </m:sSub>
+          <m:r>
+            <m:t>−</m:t>
+          </m:r>
+          <m:sSub>
+            <m:e>
+              <m:r>
+                <m:t>x</m:t>
+              </m:r>
+            </m:e>
+            <m:sub>
+              <m:r>
+                <m:t>g</m:t>
+              </m:r>
+            </m:sub>
+          </m:sSub>
+          <m:r>
+            <m:t>|+|</m:t>
+          </m:r>
+          <m:sSub>
+            <m:e>
+              <m:r>
+                <m:t>y</m:t>
+              </m:r>
+            </m:e>
+            <m:sub>
+              <m:r>
+                <m:t>n</m:t>
+              </m:r>
+            </m:sub>
+          </m:sSub>
+          <m:r>
+            <m:t>−</m:t>
+          </m:r>
+          <m:sSub>
+            <m:e>
+              <m:r>
+                <m:t>y</m:t>
+              </m:r>
+            </m:e>
+            <m:sub>
+              <m:r>
+                <m:t>g</m:t>
+              </m:r>
+            </m:sub>
+          </m:sSub>
+          <m:r>
+            <m:t>|</m:t>
+          </m:r>
+        </m:oMath>
+      </m:oMathPara>
+    </w:p>
+    <w:p>
+      <w:r>
+        <w:t>Về bốn tính chất, Greedy không bảo đảm đầy đủ trong không gian vô hạn và có thể mắc kẹt nếu chiến lược chọn node bị heuristic dẫn sai. Thuật toán không tối ưu vì bỏ qua chi phí đã đi g(n). Trong trường hợp xấu, thời gian và không gian đều có thể là O(b^m), do priority queue vẫn có thể chứa rất nhiều node ứng viên. So với A*, Greedy thường nhanh và trực quan hơn, nhưng chất lượng lời giải yếu hơn vì chỉ nhìn về phía mục tiêu mà không kiểm tra tổng chi phí thực tế đã tích lũy.</w:t>
+      </w:r>
+    </w:p>
+    <w:p>
       <w:pPr>
         <w:pStyle w:val="Heading3"/>
       </w:pPr>
-      <w:bookmarkStart w:id="9" w:name="_Toc233492396"/>
+      <w:bookmarkStart w:id="9" w:name="_Toc233509676"/>
       <w:r>
         <w:t>2.2. A*</w:t>
       </w:r>
@@ -3373,16 +4174,42 @@
       </w:r>
     </w:p>
     <w:p>
+      <w:r>
+        <w:t>A* sử dụng hàm đánh giá f(n) = g(n) + h(n). Trong đó g(n) là chi phí thực tế từ trạng thái bắt đầu đến n, còn h(n) là chi phí ước lượng từ n đến mục tiêu. Nếu h(n) admissible, tức không bao giờ ước lượng vượt quá chi phí thật, A* có thể bảo đảm tối ưu. Nếu h(n) consistent, tức h(n) &lt;= c(n,a,n') + h(n') với mọi cạnh chuyển trạng thái, việc xử lý closed set trở nên ổn định hơn và không cần mở lại node đã tối ưu.</w:t>
+      </w:r>
+    </w:p>
+    <w:p>
+      <w:pPr>
+        <w:spacing w:before="60" w:after="60"/>
+        <w:ind w:firstLine="0"/>
+        <w:jc w:val="center"/>
+      </w:pPr>
+      <m:oMathPara>
+        <m:oMath>
+          <m:r>
+            <m:t>f(n)=g(n)+h(n)</m:t>
+          </m:r>
+        </m:oMath>
+      </m:oMathPara>
+    </w:p>
+    <w:p>
+      <w:r>
+        <w:t xml:space="preserve">A* đầy đủ nếu hệ số phân nhánh hữu hạn, chi phí cạnh dương và có nghiệm. A* tối ưu khi heuristic thỏa điều kiện admissible, và đặc biệt ổn định hơn khi heuristic consistent. Độ phức tạp thời gian trong trường hợp xấu vẫn có thể là hàm mũ, thường ký hiệu O(b^d), vì số node cần mở rộng phụ thuộc mạnh vào chất lượng heuristic. Độ phức tạp không gian cũng rất lớn, thường O(b^d), do thuật toán phải lưu frontier, g-score và parent map. So với Greedy, A* chậm và tốn bộ nhớ hơn, nhưng đổi lại lời giải có cơ sở tối </w:t>
+      </w:r>
+      <w:r>
+        <w:t>ưu rõ hơn.</w:t>
+      </w:r>
+    </w:p>
+    <w:p>
       <w:pPr>
         <w:pStyle w:val="Heading2"/>
       </w:pPr>
-      <w:bookmarkStart w:id="10" w:name="_Toc233492397"/>
+      <w:bookmarkStart w:id="10" w:name="_Toc233509677"/>
       <w:r>
         <w:rPr>
           <w:rFonts w:eastAsia="Times New Roman" w:cs="Times New Roman"/>
           <w:color w:val="000000"/>
         </w:rPr>
-        <w:lastRenderedPageBreak/>
         <w:t>3. Nhóm tìm kiếm cục bộ: Hill Climbing và Simulated Annealing</w:t>
       </w:r>
       <w:bookmarkEnd w:id="10"/>
@@ -3399,7 +4226,7 @@
       <w:pPr>
         <w:pStyle w:val="Heading3"/>
       </w:pPr>
-      <w:bookmarkStart w:id="11" w:name="_Toc233492398"/>
+      <w:bookmarkStart w:id="11" w:name="_Toc233509678"/>
       <w:r>
         <w:t>3.1. Hill Climbing có bonus sideways move</w:t>
       </w:r>
@@ -3422,10 +4249,94 @@
       </w:r>
     </w:p>
     <w:p>
+      <w:r>
+        <w:t>Hill Climbing cần một hàm đánh giá trạng thái, thường viết dưới dạng E(s) hoặc cost(s). Với Find Your Path, có thể dùng cost(route) = travel_time + late_penalty + capacity_penalty + constraint_penalty. Thuật toán sinh tập láng giềng N(s), chọn trạng thái s' có cost(s') thấp hơn cost(s), và lặp lại cho đến khi không còn cải thiện. Sideways move cho phép nhận trạng thái có cost(s') = cost(s) trong một số bước giới hạn để đi qua vùng plateau.</w:t>
+      </w:r>
+    </w:p>
+    <w:p>
+      <w:pPr>
+        <w:spacing w:before="60" w:after="60"/>
+        <w:ind w:firstLine="0"/>
+        <w:jc w:val="center"/>
+      </w:pPr>
+      <m:oMathPara>
+        <m:oMath>
+          <m:r>
+            <m:t>cost(route)=</m:t>
+          </m:r>
+          <m:sSub>
+            <m:e>
+              <m:r>
+                <m:t>travel</m:t>
+              </m:r>
+            </m:e>
+            <m:sub>
+              <m:r>
+                <m:t>time</m:t>
+              </m:r>
+            </m:sub>
+          </m:sSub>
+          <m:r>
+            <m:t>+</m:t>
+          </m:r>
+          <m:sSub>
+            <m:e>
+              <m:r>
+                <m:t>late</m:t>
+              </m:r>
+            </m:e>
+            <m:sub>
+              <m:r>
+                <m:t>penalty</m:t>
+              </m:r>
+            </m:sub>
+          </m:sSub>
+          <m:r>
+            <m:t>+</m:t>
+          </m:r>
+          <m:sSub>
+            <m:e>
+              <m:r>
+                <m:t>capacity</m:t>
+              </m:r>
+            </m:e>
+            <m:sub>
+              <m:r>
+                <m:t>penalty</m:t>
+              </m:r>
+            </m:sub>
+          </m:sSub>
+          <m:r>
+            <m:t>+</m:t>
+          </m:r>
+          <m:sSub>
+            <m:e>
+              <m:r>
+                <m:t>constraint</m:t>
+              </m:r>
+            </m:e>
+            <m:sub>
+              <m:r>
+                <m:t>penalty</m:t>
+              </m:r>
+            </m:sub>
+          </m:sSub>
+        </m:oMath>
+      </m:oMathPara>
+    </w:p>
+    <w:p>
+      <w:r>
+        <w:t>Hill Climbing không đầy đủ vì có thể dừng ở cực trị cục bộ, plateau hoặc ridge dù vẫn tồn tại lời giải tốt hơn. Thuật toán không tối ưu toàn cục, trừ các trường hợp không gian lời giải có cấu trúc rất đặc biệt. Nếu chạy k vòng lặp và mỗi vòng đánh giá |N(s)| láng giềng, thời gian xấp xỉ O(k|N(s)|). Không gian thường O(1) nếu chỉ giữ lời giải hiện tại và lời giải tốt nhất, hoặc O(|N(s)|) nếu lưu toàn bộ láng giềng trong mỗi vòng. So với Simulated Annealing, Hill Climbing đơn giản và nhanh hơn nhưng dễ kẹt hơ</w:t>
+      </w:r>
+      <w:r>
+        <w:t>n.</w:t>
+      </w:r>
+    </w:p>
+    <w:p>
       <w:pPr>
         <w:pStyle w:val="Heading3"/>
       </w:pPr>
-      <w:bookmarkStart w:id="12" w:name="_Toc233492399"/>
+      <w:bookmarkStart w:id="12" w:name="_Toc233509679"/>
       <w:r>
         <w:t>3.2. Simulated Annealing</w:t>
       </w:r>
@@ -3448,16 +4359,101 @@
       </w:r>
     </w:p>
     <w:p>
+      <w:r>
+        <w:t>Simulated Annealing dùng cùng ý tưởng hàm chi phí cost(s), nhưng khác Hill Climbing ở xác suất chấp nhận bước đi xấu hơn. Nếu delta = cost(s') - cost(s), thuật toán luôn nhận s' khi delta &lt; 0; nếu delta &gt; 0, thuật toán nhận với xác suất P = exp(-delta / T), trong đó T là nhiệt độ hiện tại. Lịch giảm nhiệt có thể viết T_{k+1} = alpha*T_k với 0 &lt; alpha &lt; 1, hoặc dùng các lịch giảm chậm hơn tùy yêu cầu thực nghiệm.</w:t>
+      </w:r>
+    </w:p>
+    <w:p>
+      <w:pPr>
+        <w:spacing w:before="60" w:after="60"/>
+        <w:ind w:firstLine="0"/>
+        <w:jc w:val="center"/>
+      </w:pPr>
+      <m:oMathPara>
+        <m:oMath>
+          <m:r>
+            <m:t>P(accept)=exp(</m:t>
+          </m:r>
+          <m:r>
+            <m:t>-</m:t>
+          </m:r>
+          <m:f>
+            <m:e>
+              <m:r>
+                <m:t>Δ</m:t>
+              </m:r>
+            </m:e>
+            <m:den>
+              <m:r>
+                <m:t>T</m:t>
+              </m:r>
+            </m:den>
+          </m:f>
+          <m:r>
+            <m:t>)</m:t>
+          </m:r>
+        </m:oMath>
+      </m:oMathPara>
+    </w:p>
+    <w:p>
+      <w:pPr>
+        <w:spacing w:before="60" w:after="60"/>
+        <w:ind w:firstLine="0"/>
+        <w:jc w:val="center"/>
+      </w:pPr>
+      <m:oMathPara>
+        <m:oMath>
+          <m:sSub>
+            <m:e>
+              <m:r>
+                <m:t>T</m:t>
+              </m:r>
+            </m:e>
+            <m:sub>
+              <m:r>
+                <m:t>k+1</m:t>
+              </m:r>
+            </m:sub>
+          </m:sSub>
+          <m:r>
+            <m:t>=</m:t>
+          </m:r>
+          <m:r>
+            <m:t>α</m:t>
+          </m:r>
+          <m:sSub>
+            <m:e>
+              <m:r>
+                <m:t>T</m:t>
+              </m:r>
+            </m:e>
+            <m:sub>
+              <m:r>
+                <m:t>k</m:t>
+              </m:r>
+            </m:sub>
+          </m:sSub>
+        </m:oMath>
+      </m:oMathPara>
+    </w:p>
+    <w:p>
+      <w:r>
+        <w:t xml:space="preserve">Trong triển khai hữu hạn, Simulated Annealing không bảo đảm đầy đủ và không bảo đảm tối ưu tuyệt đối. Về lý thuyết, với lịch giảm nhiệt đủ chậm, thuật toán có thể hội tụ đến tối ưu toàn cục theo xác suất, nhưng lịch này thường quá chậm cho bài toán thực tế. Nếu chạy k vòng lặp và mỗi vòng sinh một neighbor, thời gian là O(k), hoặc O(k|N(s)|) nếu mỗi vòng đánh giá nhiều neighbor. Không gian thường O(1). So với Hill Climbing, Simulated Annealing tốn thời gian kiểm soát tham số hơn nhưng có khả năng thoát cực </w:t>
+      </w:r>
+      <w:r>
+        <w:t>trị cục bộ tốt hơn.</w:t>
+      </w:r>
+    </w:p>
+    <w:p>
       <w:pPr>
         <w:pStyle w:val="Heading2"/>
       </w:pPr>
-      <w:bookmarkStart w:id="13" w:name="_Toc233492400"/>
+      <w:bookmarkStart w:id="13" w:name="_Toc233509680"/>
       <w:r>
         <w:rPr>
           <w:rFonts w:eastAsia="Times New Roman" w:cs="Times New Roman"/>
           <w:color w:val="000000"/>
         </w:rPr>
-        <w:lastRenderedPageBreak/>
         <w:t>4. Nhóm thỏa ràng buộc: Backtracking và Forward Checking</w:t>
       </w:r>
       <w:bookmarkEnd w:id="13"/>
@@ -3474,7 +4470,7 @@
       <w:pPr>
         <w:pStyle w:val="Heading3"/>
       </w:pPr>
-      <w:bookmarkStart w:id="14" w:name="_Toc233492401"/>
+      <w:bookmarkStart w:id="14" w:name="_Toc233509681"/>
       <w:r>
         <w:t>4.1. Backtracking</w:t>
       </w:r>
@@ -3497,10 +4493,23 @@
       </w:r>
     </w:p>
     <w:p>
+      <w:r>
+        <w:t>Backtracking trong CSP làm việc với tập biến X = {X1, X2, ..., Xn}, miền giá trị D_i của từng biến và tập ràng buộc C. Một phép gán từng phần được xem là hợp lệ nếu không vi phạm bất kỳ ràng buộc nào đã có đủ biến để kiểm tra. Trong Find Your Path, ràng buộc có thể là deadline(order_i), capacity(route), pickup_i trước dropoff_i hoặc cấm đi qua cạnh bị khóa.</w:t>
+      </w:r>
+    </w:p>
+    <w:p>
+      <w:r>
+        <w:t>Backtracking đầy đủ với số biến hữu hạn và miền giá trị hữu hạn, vì thuật toán sẽ thử hết các phép gán có thể nếu chưa tìm được nghiệm. Thuật toán không tối ưu theo nghĩa chi phí nếu chỉ dùng để tìm nghiệm hợp lệ đầu tiên; muốn tối ưu cần bổ sung objective và branch-and-bound. Độ phức tạp thời gian trong trường hợp xấu là O(d_csp^n). Độ phức tạp không gian thường O(n) cho stack đệ quy và phép gán hiện tại, chưa tính chi phí lưu domain. So với Forward Checking, Backtracking đơn giản hơn nhưng phát hiện bế tắ</w:t>
+      </w:r>
+      <w:r>
+        <w:t>c muộn hơn.</w:t>
+      </w:r>
+    </w:p>
+    <w:p>
       <w:pPr>
         <w:pStyle w:val="Heading3"/>
       </w:pPr>
-      <w:bookmarkStart w:id="15" w:name="_Toc233492402"/>
+      <w:bookmarkStart w:id="15" w:name="_Toc233509682"/>
       <w:r>
         <w:t>4.2. Forward Checking</w:t>
       </w:r>
@@ -3523,10 +4532,91 @@
       </w:r>
     </w:p>
     <w:p>
+      <w:r>
+        <w:t>Forward Checking vẫn dựa trên Backtracking nhưng sau mỗi phép gán Xi = v, thuật toán loại khỏi domain của các biến chưa gán những giá trị chắc chắn vi phạm ràng buộc với Xi. Có thể mô tả thao tác này như cập nhật D_j = D_j - {u | (Xi = v, Xj = u) vi phạm C}. Nếu một domain D_j trở thành rỗng, nhánh hiện tại bị loại ngay.</w:t>
+      </w:r>
+    </w:p>
+    <w:p>
+      <w:pPr>
+        <w:spacing w:before="60" w:after="60"/>
+        <w:ind w:firstLine="0"/>
+        <w:jc w:val="center"/>
+      </w:pPr>
+      <m:oMathPara>
+        <m:oMath>
+          <m:sSub>
+            <m:e>
+              <m:r>
+                <m:t>D</m:t>
+              </m:r>
+            </m:e>
+            <m:sub>
+              <m:r>
+                <m:t>j</m:t>
+              </m:r>
+            </m:sub>
+          </m:sSub>
+          <m:r>
+            <m:t> ← </m:t>
+          </m:r>
+          <m:sSub>
+            <m:e>
+              <m:r>
+                <m:t>D</m:t>
+              </m:r>
+            </m:e>
+            <m:sub>
+              <m:r>
+                <m:t>j</m:t>
+              </m:r>
+            </m:sub>
+          </m:sSub>
+          <m:r>
+            <m:t> \ {u | (</m:t>
+          </m:r>
+          <m:sSub>
+            <m:e>
+              <m:r>
+                <m:t>X</m:t>
+              </m:r>
+            </m:e>
+            <m:sub>
+              <m:r>
+                <m:t>i</m:t>
+              </m:r>
+            </m:sub>
+          </m:sSub>
+          <m:r>
+            <m:t>=v, </m:t>
+          </m:r>
+          <m:sSub>
+            <m:e>
+              <m:r>
+                <m:t>X</m:t>
+              </m:r>
+            </m:e>
+            <m:sub>
+              <m:r>
+                <m:t>j</m:t>
+              </m:r>
+            </m:sub>
+          </m:sSub>
+          <m:r>
+            <m:t>=u) violates C}</m:t>
+          </m:r>
+        </m:oMath>
+      </m:oMathPara>
+    </w:p>
+    <w:p>
+      <w:r>
+        <w:t>Forward Checking vẫn đầy đủ với CSP hữu hạn vì nó chỉ loại các giá trị chắc chắn không thể tham gia nghiệm hợp lệ. Thuật toán không tự bảo đảm tối ưu chi phí nếu chưa kết hợp với hàm mục tiêu. Trong trường hợp xấu, thời gian vẫn có thể là O(d_csp^n), nhưng thực tế thường giảm số nhánh so với Backtracking thuần. Không gian tăng lên O(n*d_csp) hoặc hơn do cần lưu/copy domain để quay lui. So với Backtracking, Forward Checking phức tạp hơn khi cài đặt nhưng có ưu điểm phát hiện sớm nhánh vô nghiệm.</w:t>
+      </w:r>
+    </w:p>
+    <w:p>
       <w:pPr>
         <w:pStyle w:val="Heading2"/>
       </w:pPr>
-      <w:bookmarkStart w:id="16" w:name="_Toc233492403"/>
+      <w:bookmarkStart w:id="16" w:name="_Toc233509683"/>
       <w:r>
         <w:rPr>
           <w:rFonts w:eastAsia="Times New Roman" w:cs="Times New Roman"/>
@@ -3548,9 +4638,8 @@
       <w:pPr>
         <w:pStyle w:val="Heading3"/>
       </w:pPr>
-      <w:bookmarkStart w:id="17" w:name="_Toc233492404"/>
-      <w:r>
-        <w:lastRenderedPageBreak/>
+      <w:bookmarkStart w:id="17" w:name="_Toc233509684"/>
+      <w:r>
         <w:t>5.1. Minimax</w:t>
       </w:r>
       <w:bookmarkEnd w:id="17"/>
@@ -3572,10 +4661,134 @@
       </w:r>
     </w:p>
     <w:p>
+      <w:r>
+        <w:t>Minimax dùng hàm utility để đánh giá trạng thái lá hoặc trạng thái ở độ sâu giới hạn. Công thức hồi quy cơ bản là V(s) = max V(s') nếu s là lượt MAX, và V(s) = min V(s') nếu s là lượt MIN. Trong Find Your Path, utility có thể được xây dựng từ chi phí route, độ trễ, số sự cố và mức độ an toàn, ví dụ utility(route) = -travel_cost - late_penalty - risk_penalty.</w:t>
+      </w:r>
+    </w:p>
+    <w:p>
+      <w:pPr>
+        <w:spacing w:before="60" w:after="60"/>
+        <w:ind w:firstLine="0"/>
+        <w:jc w:val="center"/>
+      </w:pPr>
+      <m:oMathPara>
+        <m:oMath>
+          <m:r>
+            <m:t>V(s)=</m:t>
+          </m:r>
+          <m:sSub>
+            <m:e>
+              <m:r>
+                <m:t>max</m:t>
+              </m:r>
+            </m:e>
+            <m:sub>
+              <m:r>
+                <m:t>s′∈Succ(s)</m:t>
+              </m:r>
+            </m:sub>
+          </m:sSub>
+          <m:r>
+            <m:t> V(s′)   if s∈MAX</m:t>
+          </m:r>
+        </m:oMath>
+      </m:oMathPara>
+    </w:p>
+    <w:p>
+      <w:pPr>
+        <w:spacing w:before="60" w:after="60"/>
+        <w:ind w:firstLine="0"/>
+        <w:jc w:val="center"/>
+      </w:pPr>
+      <m:oMathPara>
+        <m:oMath>
+          <m:r>
+            <m:t>V(s)=</m:t>
+          </m:r>
+          <m:sSub>
+            <m:e>
+              <m:r>
+                <m:t>min</m:t>
+              </m:r>
+            </m:e>
+            <m:sub>
+              <m:r>
+                <m:t>s′∈Succ(s)</m:t>
+              </m:r>
+            </m:sub>
+          </m:sSub>
+          <m:r>
+            <m:t> V(s′)   if s∈MIN</m:t>
+          </m:r>
+        </m:oMath>
+      </m:oMathPara>
+    </w:p>
+    <w:p>
+      <w:pPr>
+        <w:spacing w:before="60" w:after="60"/>
+        <w:ind w:firstLine="0"/>
+        <w:jc w:val="center"/>
+      </w:pPr>
+      <m:oMathPara>
+        <m:oMath>
+          <m:r>
+            <m:t>utility(route)=-</m:t>
+          </m:r>
+          <m:sSub>
+            <m:e>
+              <m:r>
+                <m:t>travel</m:t>
+              </m:r>
+            </m:e>
+            <m:sub>
+              <m:r>
+                <m:t>cost</m:t>
+              </m:r>
+            </m:sub>
+          </m:sSub>
+          <m:r>
+            <m:t>-</m:t>
+          </m:r>
+          <m:sSub>
+            <m:e>
+              <m:r>
+                <m:t>late</m:t>
+              </m:r>
+            </m:e>
+            <m:sub>
+              <m:r>
+                <m:t>penalty</m:t>
+              </m:r>
+            </m:sub>
+          </m:sSub>
+          <m:r>
+            <m:t>-</m:t>
+          </m:r>
+          <m:sSub>
+            <m:e>
+              <m:r>
+                <m:t>risk</m:t>
+              </m:r>
+            </m:e>
+            <m:sub>
+              <m:r>
+                <m:t>penalty</m:t>
+              </m:r>
+            </m:sub>
+          </m:sSub>
+        </m:oMath>
+      </m:oMathPara>
+    </w:p>
+    <w:p>
+      <w:r>
+        <w:t>Minimax đầy đủ nếu cây trò chơi hữu hạn. Thuật toán tối ưu đối với giả định đối thủ MIN luôn chọn phản ứng bất lợi nhất và hàm utility phản ánh đúng mục tiêu. Nếu b là số nước đi hợp lệ tại mỗi tầng và m là độ sâu tìm kiếm, độ phức tạp thời gian là O(b^m). Không gian là O(bm) nếu duyệt theo chiều sâu, hoặc lớn hơn nếu lưu toàn bộ cây. So với Alpha-Beta, Minimax dễ hiểu hơn nhưng mở rộng nhiều node không cần thiết.</w:t>
+      </w:r>
+    </w:p>
+    <w:p>
       <w:pPr>
         <w:pStyle w:val="Heading3"/>
       </w:pPr>
-      <w:bookmarkStart w:id="18" w:name="_Toc233492405"/>
+      <w:bookmarkStart w:id="18" w:name="_Toc233509685"/>
       <w:r>
         <w:t>5.2. Alpha-Beta Pruning</w:t>
       </w:r>
@@ -3598,42 +4811,532 @@
       </w:r>
     </w:p>
     <w:p>
+      <w:r>
+        <w:t>Alpha-Beta Pruning dùng cùng hàm utility và cùng giá trị Minimax, nhưng bổ sung hai ngưỡng alpha và beta. Alpha là giá trị tốt nhất MAX đã bảo đảm được trên đường đi hiện tại; beta là giá trị tốt nhất MIN đã bảo đảm được. Khi alpha &gt;= beta, nhánh còn lại không thể ảnh hưởng đến quyết định cuối cùng và được cắt bỏ.</w:t>
+      </w:r>
+    </w:p>
+    <w:p>
+      <w:pPr>
+        <w:spacing w:before="60" w:after="60"/>
+        <w:ind w:firstLine="0"/>
+        <w:jc w:val="center"/>
+      </w:pPr>
+      <m:oMathPara>
+        <m:oMath>
+          <m:r>
+            <m:t>prune if α ≥ β</m:t>
+          </m:r>
+        </m:oMath>
+      </m:oMathPara>
+    </w:p>
+    <w:p>
+      <w:r>
+        <w:t>Alpha-Beta đầy đủ và tối ưu trong cùng điều kiện với Minimax, vì cắt tỉa không làm thay đổi giá trị quyết định ở gốc. Trong trường hợp xấu, khi thứ tự xét nước đi kém, thời gian vẫn là O(b^m). Trong trường hợp thứ tự xét tốt, thời gian có thể giảm xấp xỉ còn O(b^(m/2)). Không gian tương tự Minimax theo DFS, thường O(bm). So với Minimax, Alpha-Beta khó giải thích hơn một chút nhưng hiệu quả hơn rõ rệt khi cây quyết định lớn.</w:t>
+      </w:r>
+    </w:p>
+    <w:p>
       <w:pPr>
         <w:pStyle w:val="Heading2"/>
       </w:pPr>
-      <w:bookmarkStart w:id="19" w:name="_Toc233492406"/>
+      <w:bookmarkStart w:id="19" w:name="_Toc233509686"/>
+      <w:r>
+        <w:rPr>
+          <w:rFonts w:eastAsia="Times New Roman" w:cs="Times New Roman"/>
+        </w:rPr>
+        <w:t>6. Nhóm môi trường phức tạp: Online Re-planning và AND-OR Search</w:t>
+      </w:r>
+      <w:bookmarkEnd w:id="19"/>
+    </w:p>
+    <w:p>
+      <w:r>
+        <w:t>Nhóm môi trường phức tạp được dùng khi agent không thể quan sát đầy đủ trạng thái thật của môi trường hoặc khi hành động có thể dẫn tới nhiều kết quả khác nhau. Trong Find Your Path, trạng thái thật có thể gồm vị trí shipper, goal, trạng thái traffic, các cạnh bị blocked và các sự kiện mới phát sinh. Tuy nhiên, agent chỉ quan sát được một phần thông qua sensor radius, dữ liệu cập nhật theo thời điểm hoặc phản hồi khi đang di chuyển. Vì vậy, hai thuật toán được chọn là Online Re-planning và AND-OR Search: mộ</w:t>
+      </w:r>
+      <w:r>
+        <w:t>t thuật toán phản ứng sau quan sát mới, một thuật toán lập kế hoạch có điều kiện trước các outcome bất định.</w:t>
+      </w:r>
+    </w:p>
+    <w:p>
+      <w:pPr>
+        <w:pStyle w:val="Heading3"/>
+        <w:ind w:firstLine="0"/>
+      </w:pPr>
+      <w:bookmarkStart w:id="20" w:name="_Toc233509687"/>
+      <w:r>
+        <w:rPr>
+          <w:rFonts w:eastAsia="Times New Roman" w:cs="Times New Roman"/>
+          <w:i w:val="0"/>
+        </w:rPr>
+        <w:t>6.1. Online Re-planning</w:t>
+      </w:r>
+      <w:bookmarkEnd w:id="20"/>
+    </w:p>
+    <w:p>
+      <w:r>
+        <w:t>Online Re-planning xử lý partial observation trong quá trình agent đang di chuyển. Thuật toán không giả định toàn bộ bản đồ thật đã được biết ngay từ đầu. Thay vào đó, hệ thống lập một tuyến ban đầu trên belief state hiện có, cho shipper di chuyển một đoạn, quan sát môi trường xung quanh, cập nhật belief và lập lại kế hoạch nếu phát hiện cạnh bị chặn, chi phí tăng hoặc route hiện tại không còn phù hợp.</w:t>
+      </w:r>
+    </w:p>
+    <w:p>
+      <w:r>
+        <w:t>Chu trình của Online Re-planning có thể mô tả bằng bốn bước: sense, update, plan và act. Ở thời điểm t, agent nhận quan sát o_t, cập nhật belief b_t, sau đó gọi planner cấp thấp như A* từ trạng thái hiện tại s_t tới goal. Nếu môi trường không thay đổi, route cũ vẫn được dùng; nếu phát hiện sự cố, hệ thống không quay về start ban đầu mà lập kế hoạch lại từ vị trí hiện tại.</w:t>
+      </w:r>
+    </w:p>
+    <w:p>
+      <w:pPr>
+        <w:spacing w:before="60" w:after="60"/>
+        <w:ind w:firstLine="0"/>
+        <w:jc w:val="center"/>
+      </w:pPr>
+      <m:oMathPara>
+        <m:oMath>
+          <m:sSub>
+            <m:e>
+              <m:r>
+                <m:t>b</m:t>
+              </m:r>
+            </m:e>
+            <m:sub>
+              <m:r>
+                <m:t>t</m:t>
+              </m:r>
+            </m:sub>
+          </m:sSub>
+          <m:r>
+            <m:t>=</m:t>
+          </m:r>
+          <m:r>
+            <m:t>Update</m:t>
+          </m:r>
+          <m:r>
+            <m:t>(</m:t>
+          </m:r>
+          <m:sSub>
+            <m:e>
+              <m:r>
+                <m:t>b</m:t>
+              </m:r>
+            </m:e>
+            <m:sub>
+              <m:r>
+                <m:t>t-1</m:t>
+              </m:r>
+            </m:sub>
+          </m:sSub>
+          <m:r>
+            <m:t>,</m:t>
+          </m:r>
+          <m:sSub>
+            <m:e>
+              <m:r>
+                <m:t>o</m:t>
+              </m:r>
+            </m:e>
+            <m:sub>
+              <m:r>
+                <m:t>t</m:t>
+              </m:r>
+            </m:sub>
+          </m:sSub>
+          <m:r>
+            <m:t>)</m:t>
+          </m:r>
+        </m:oMath>
+      </m:oMathPara>
+    </w:p>
+    <w:p>
+      <w:pPr>
+        <w:spacing w:before="60" w:after="60"/>
+        <w:ind w:firstLine="0"/>
+        <w:jc w:val="center"/>
+      </w:pPr>
+      <m:oMathPara>
+        <m:oMath>
+          <m:sSub>
+            <m:e>
+              <m:r>
+                <m:t>C</m:t>
+              </m:r>
+            </m:e>
+            <m:sub>
+              <m:r>
+                <m:t>t</m:t>
+              </m:r>
+            </m:sub>
+          </m:sSub>
+          <m:r>
+            <m:t>(path)=</m:t>
+          </m:r>
+          <m:nary>
+            <m:naryPr>
+              <m:chr m:val="∑"/>
+              <m:limLoc m:val="undOvr"/>
+            </m:naryPr>
+            <m:sub>
+              <m:r>
+                <m:t>e∈path</m:t>
+              </m:r>
+            </m:sub>
+            <m:sup/>
+            <m:e>
+              <m:sSub>
+                <m:e>
+                  <m:r>
+                    <m:t>c</m:t>
+                  </m:r>
+                </m:e>
+                <m:sub>
+                  <m:r>
+                    <m:t>t</m:t>
+                  </m:r>
+                </m:sub>
+              </m:sSub>
+              <m:r>
+                <m:t>(e)</m:t>
+              </m:r>
+            </m:e>
+          </m:nary>
+        </m:oMath>
+      </m:oMathPara>
+    </w:p>
+    <w:p>
+      <w:pPr>
+        <w:spacing w:before="60" w:after="60"/>
+        <w:ind w:firstLine="0"/>
+        <w:jc w:val="center"/>
+      </w:pPr>
+      <m:oMathPara>
+        <m:oMath>
+          <m:sSub>
+            <m:e>
+              <m:r>
+                <m:t>π</m:t>
+              </m:r>
+            </m:e>
+            <m:sub>
+              <m:r>
+                <m:t>t</m:t>
+              </m:r>
+            </m:sub>
+          </m:sSub>
+          <m:r>
+            <m:t>=</m:t>
+          </m:r>
+          <m:sSub>
+            <m:e>
+              <m:r>
+                <m:t>arg min</m:t>
+              </m:r>
+            </m:e>
+            <m:sub>
+              <m:r>
+                <m:t>π∈Paths(</m:t>
+              </m:r>
+              <m:sSub>
+                <m:e>
+                  <m:r>
+                    <m:t>s</m:t>
+                  </m:r>
+                </m:e>
+                <m:sub>
+                  <m:r>
+                    <m:t>t</m:t>
+                  </m:r>
+                </m:sub>
+              </m:sSub>
+              <m:r>
+                <m:t>,g)</m:t>
+              </m:r>
+            </m:sub>
+          </m:sSub>
+          <m:r>
+            <m:t> </m:t>
+          </m:r>
+          <m:sSub>
+            <m:e>
+              <m:r>
+                <m:t>C</m:t>
+              </m:r>
+            </m:e>
+            <m:sub>
+              <m:r>
+                <m:t>t</m:t>
+              </m:r>
+            </m:sub>
+          </m:sSub>
+          <m:r>
+            <m:t>(π)</m:t>
+          </m:r>
+        </m:oMath>
+      </m:oMathPara>
+    </w:p>
+    <w:p>
+      <w:r>
+        <w:t>Về bốn tính chất, Online Re-planning có tính đầy đủ trong môi trường hữu hạn nếu mỗi lần replan dùng một planner đầy đủ và số lần thay đổi môi trường là hữu hạn. Thuật toán không bảo đảm tối ưu toàn cục vì quyết định phụ thuộc vào thời điểm agent quan sát được sự cố; một route tối ưu sau khi biết toàn bộ môi trường có thể khác route được hình thành qua nhiều lần cập nhật cục bộ. Nếu có r lần replan và planner con có chi phí T_plan, thời gian xấp xỉ O(r·T_plan). Khi dùng A* làm planner, T_plan có thể là O(b^</w:t>
+      </w:r>
+      <w:r>
+        <w:t>d) trong trường hợp xấu; nếu dùng Dijkstra trên graph có |V| node và |E| cạnh thì thường xét O(|E|log|V|). Không gian phụ thuộc frontier của planner và belief map, thường là O(S_plan + |V| + |E|).</w:t>
+      </w:r>
+    </w:p>
+    <w:p>
+      <w:pPr>
+        <w:spacing w:before="60" w:after="60"/>
+        <w:ind w:firstLine="0"/>
+        <w:jc w:val="center"/>
+      </w:pPr>
+      <m:oMathPara>
+        <m:oMath>
+          <m:sSub>
+            <m:e>
+              <m:r>
+                <m:t>T</m:t>
+              </m:r>
+            </m:e>
+            <m:sub>
+              <m:r>
+                <m:t>online</m:t>
+              </m:r>
+            </m:sub>
+          </m:sSub>
+          <m:r>
+            <m:t>=O(r·</m:t>
+          </m:r>
+          <m:sSub>
+            <m:e>
+              <m:r>
+                <m:t>T</m:t>
+              </m:r>
+            </m:e>
+            <m:sub>
+              <m:r>
+                <m:t>plan</m:t>
+              </m:r>
+            </m:sub>
+          </m:sSub>
+          <m:r>
+            <m:t>)</m:t>
+          </m:r>
+        </m:oMath>
+      </m:oMathPara>
+    </w:p>
+    <w:p>
+      <w:r>
+        <w:t>So với AND-OR Search, Online Re-planning linh hoạt hơn khi môi trường thay đổi trong lúc di chuyển và không cần liệt kê trước toàn bộ outcome. Nhược điểm là nó mang tính phản ứng: hệ thống chỉ sửa route sau khi quan sát được vấn đề, nên có thể bỏ lỡ phương án dự phòng tốt hơn nếu sự cố đáng lẽ cần được dự đoán từ trước.</w:t>
+      </w:r>
+    </w:p>
+    <w:p>
+      <w:pPr>
+        <w:pStyle w:val="Heading3"/>
+        <w:ind w:firstLine="0"/>
+      </w:pPr>
+      <w:bookmarkStart w:id="21" w:name="_Toc233509688"/>
+      <w:r>
+        <w:rPr>
+          <w:rFonts w:eastAsia="Times New Roman" w:cs="Times New Roman"/>
+          <w:i w:val="0"/>
+        </w:rPr>
+        <w:t>6.2. AND-OR Search</w:t>
+      </w:r>
+      <w:bookmarkEnd w:id="21"/>
+    </w:p>
+    <w:p>
+      <w:r>
+        <w:t>AND-OR Search được dùng khi hành động của agent có thể dẫn tới nhiều kết quả môi trường khác nhau. OR node biểu diễn lựa chọn của agent; AND node biểu diễn các outcome mà kế hoạch phải xử lý hết. Kết quả của thuật toán không chỉ là một path đơn lẻ, mà là conditional plan: nếu outcome thứ nhất xảy ra thì đi theo nhánh A, nếu outcome thứ hai xảy ra thì chuyển sang nhánh B.</w:t>
+      </w:r>
+    </w:p>
+    <w:p>
+      <w:r>
+        <w:t>Trong Find Your Path, AND-OR Search phù hợp với kịch bản agent biết trước một số bất định: một cạnh có thể thông hoặc bị chặn, một đoạn đường có thể bình thường hoặc tăng chi phí, một điểm giao có thể sẵn sàng hoặc cần chờ. Thay vì đợi tới lúc gặp sự cố mới replan, AND-OR Search xây dựng trước kế hoạch có điều kiện để mọi outcome quan trọng đều có nhánh xử lý.</w:t>
+      </w:r>
+    </w:p>
+    <w:p>
+      <w:pPr>
+        <w:spacing w:before="60" w:after="60"/>
+        <w:ind w:firstLine="0"/>
+        <w:jc w:val="center"/>
+      </w:pPr>
+      <m:oMathPara>
+        <m:oMath>
+          <m:r>
+            <m:t>Result(s,a)={</m:t>
+          </m:r>
+          <m:sSub>
+            <m:e>
+              <m:r>
+                <m:t>s</m:t>
+              </m:r>
+            </m:e>
+            <m:sub>
+              <m:r>
+                <m:t>1</m:t>
+              </m:r>
+            </m:sub>
+          </m:sSub>
+          <m:r>
+            <m:t>,</m:t>
+          </m:r>
+          <m:sSub>
+            <m:e>
+              <m:r>
+                <m:t>s</m:t>
+              </m:r>
+            </m:e>
+            <m:sub>
+              <m:r>
+                <m:t>2</m:t>
+              </m:r>
+            </m:sub>
+          </m:sSub>
+          <m:r>
+            <m:t>,...,</m:t>
+          </m:r>
+          <m:sSub>
+            <m:e>
+              <m:r>
+                <m:t>s</m:t>
+              </m:r>
+            </m:e>
+            <m:sub>
+              <m:r>
+                <m:t>k</m:t>
+              </m:r>
+            </m:sub>
+          </m:sSub>
+          <m:r>
+            <m:t>}</m:t>
+          </m:r>
+        </m:oMath>
+      </m:oMathPara>
+    </w:p>
+    <w:p>
+      <w:pPr>
+        <w:spacing w:before="60" w:after="60"/>
+        <w:ind w:firstLine="0"/>
+        <w:jc w:val="center"/>
+      </w:pPr>
+      <m:oMathPara>
+        <m:oMath>
+          <m:r>
+            <m:t>Plan(s)=a ∧ ∀ </m:t>
+          </m:r>
+          <m:sSub>
+            <m:e>
+              <m:r>
+                <m:t>s</m:t>
+              </m:r>
+            </m:e>
+            <m:sub>
+              <m:r>
+                <m:t>i</m:t>
+              </m:r>
+            </m:sub>
+          </m:sSub>
+          <m:r>
+            <m:t>∈Result(s,a): Plan(</m:t>
+          </m:r>
+          <m:sSub>
+            <m:e>
+              <m:r>
+                <m:t>s</m:t>
+              </m:r>
+            </m:e>
+            <m:sub>
+              <m:r>
+                <m:t>i</m:t>
+              </m:r>
+            </m:sub>
+          </m:sSub>
+          <m:r>
+            <m:t>)</m:t>
+          </m:r>
+        </m:oMath>
+      </m:oMathPara>
+    </w:p>
+    <w:p>
+      <w:pPr>
+        <w:spacing w:before="60" w:after="60"/>
+        <w:ind w:firstLine="0"/>
+        <w:jc w:val="center"/>
+      </w:pPr>
+      <m:oMathPara>
+        <m:oMath>
+          <m:r>
+            <m:t>C(s,a)=c(s,a)+</m:t>
+          </m:r>
+          <m:sSub>
+            <m:e>
+              <m:r>
+                <m:t>max</m:t>
+              </m:r>
+            </m:e>
+            <m:sub>
+              <m:r>
+                <m:t>s′∈Result(s,a)</m:t>
+              </m:r>
+            </m:sub>
+          </m:sSub>
+          <m:r>
+            <m:t> C(s′)</m:t>
+          </m:r>
+        </m:oMath>
+      </m:oMathPara>
+    </w:p>
+    <w:p>
+      <w:pPr>
+        <w:spacing w:before="60" w:after="60"/>
+        <w:ind w:firstLine="0"/>
+        <w:jc w:val="center"/>
+      </w:pPr>
+      <m:oMathPara>
+        <m:oMath>
+          <m:r>
+            <m:t>E[C(s,a)]=c(s,a)+</m:t>
+          </m:r>
+          <m:nary>
+            <m:naryPr>
+              <m:chr m:val="∑"/>
+              <m:limLoc m:val="undOvr"/>
+            </m:naryPr>
+            <m:sub>
+              <m:r>
+                <m:t>s′</m:t>
+              </m:r>
+            </m:sub>
+            <m:sup/>
+            <m:e>
+              <m:r>
+                <m:t>P(s′|s,a)C(s′)</m:t>
+              </m:r>
+            </m:e>
+          </m:nary>
+        </m:oMath>
+      </m:oMathPara>
+    </w:p>
+    <w:p>
+      <w:r>
+        <w:t>Về bốn tính chất, AND-OR Search đầy đủ trên state space hữu hạn nếu transition model liệt kê đầy đủ outcome, có kiểm tra chu trình và mọi nhánh AND cần thiết đều được xét. Thuật toán tối ưu nếu dùng hàm đánh giá phù hợp và duyệt đầy đủ cây AND-OR theo tiêu chí đã chọn, chẳng hạn chi phí xấu nhất hoặc chi phí kỳ vọng. Nếu b là số hành động trung bình, o là số outcome trung bình của mỗi hành động và m là độ sâu, kích thước cây có thể tăng xấp xỉ O((b·o)^m). Không gian phụ thuộc cách duyệt và kích thước condit</w:t>
+      </w:r>
+      <w:r>
+        <w:t>ional plan; nếu lưu toàn bộ cây, không gian cũng có thể tăng theo O((b·o)^m).</w:t>
+      </w:r>
+    </w:p>
+    <w:p>
+      <w:r>
+        <w:t>So với Online Re-planning, AND-OR Search chủ động hơn vì chuẩn bị trước các nhánh ứng phó. Tuy nhiên, nó đòi hỏi transition model đủ rõ và dễ bị bùng nổ số nhánh khi có nhiều outcome. Vì vậy, trong báo cáo, Online Re-planning phù hợp để minh họa partial observation khi đang di chuyển, còn AND-OR Search phù hợp để minh họa conditional plan trước các kết quả môi trường bất định.</w:t>
+      </w:r>
+    </w:p>
+    <w:p>
+      <w:pPr>
+        <w:pStyle w:val="Heading1"/>
+        <w:pageBreakBefore/>
+      </w:pPr>
+      <w:bookmarkStart w:id="22" w:name="_Toc233509689"/>
       <w:r>
         <w:rPr>
           <w:rFonts w:eastAsia="Times New Roman" w:cs="Times New Roman"/>
           <w:color w:val="000000"/>
         </w:rPr>
-        <w:t>6. Nhóm môi trường phức tạp: định hướng bổ sung sau</w:t>
-      </w:r>
-      <w:bookmarkEnd w:id="19"/>
-    </w:p>
-    <w:p>
-      <w:r>
-        <w:rPr>
-          <w:color w:val="000000"/>
-        </w:rPr>
-        <w:t>Nhóm thuật toán cho môi trường phức tạp chưa được chọn chính thức trong bản hiện tại. Đây là quyết định hợp lý vì thuật toán phụ thuộc mạnh vào bản chất phức tạp của môi trường. Nếu môi trường động nhưng quan sát đầy đủ, nhóm có thể cân nhắc online search hoặc replanning. Nếu môi trường quan sát không đầy đủ, belief-state search phù hợp hơn. Nếu môi trường có xác suất chuyển trạng thái và phần thưởng, Markov Decision Process sẽ là hướng hợp lý hơn.</w:t>
-      </w:r>
-    </w:p>
-    <w:p>
-      <w:pPr>
-        <w:pStyle w:val="Heading1"/>
-        <w:pageBreakBefore/>
-      </w:pPr>
-      <w:bookmarkStart w:id="20" w:name="_Toc233492407"/>
-      <w:r>
-        <w:rPr>
-          <w:rFonts w:eastAsia="Times New Roman" w:cs="Times New Roman"/>
-          <w:color w:val="000000"/>
-        </w:rPr>
-        <w:lastRenderedPageBreak/>
-        <w:t>III. Thực nghiệm và kết quả</w:t>
-      </w:r>
-      <w:bookmarkEnd w:id="20"/>
+        <w:t>III. THỰC NGHIỆM VÀ KẾT QUẢ</w:t>
+      </w:r>
+      <w:bookmarkEnd w:id="22"/>
     </w:p>
     <w:p>
       <w:r>
@@ -3647,7 +5350,7 @@
       <w:pPr>
         <w:pStyle w:val="Heading2"/>
       </w:pPr>
-      <w:bookmarkStart w:id="21" w:name="_Toc233492408"/>
+      <w:bookmarkStart w:id="23" w:name="_Toc233509690"/>
       <w:r>
         <w:rPr>
           <w:rFonts w:eastAsia="Times New Roman" w:cs="Times New Roman"/>
@@ -3655,7 +5358,7 @@
         </w:rPr>
         <w:t>1. Nhóm tìm kiếm không thông tin</w:t>
       </w:r>
-      <w:bookmarkEnd w:id="21"/>
+      <w:bookmarkEnd w:id="23"/>
     </w:p>
     <w:p>
       <w:r>
@@ -3705,7 +5408,7 @@
       <w:pPr>
         <w:pStyle w:val="Heading2"/>
       </w:pPr>
-      <w:bookmarkStart w:id="22" w:name="_Toc233492409"/>
+      <w:bookmarkStart w:id="24" w:name="_Toc233509691"/>
       <w:r>
         <w:rPr>
           <w:rFonts w:eastAsia="Times New Roman" w:cs="Times New Roman"/>
@@ -3713,7 +5416,7 @@
         </w:rPr>
         <w:t>2. Nhóm tìm kiếm có thông tin</w:t>
       </w:r>
-      <w:bookmarkEnd w:id="22"/>
+      <w:bookmarkEnd w:id="24"/>
     </w:p>
     <w:p>
       <w:r>
@@ -3763,16 +5466,15 @@
       <w:pPr>
         <w:pStyle w:val="Heading2"/>
       </w:pPr>
-      <w:bookmarkStart w:id="23" w:name="_Toc233492410"/>
+      <w:bookmarkStart w:id="25" w:name="_Toc233509692"/>
       <w:r>
         <w:rPr>
           <w:rFonts w:eastAsia="Times New Roman" w:cs="Times New Roman"/>
           <w:color w:val="000000"/>
         </w:rPr>
-        <w:lastRenderedPageBreak/>
         <w:t>3. Nhóm tìm kiếm cục bộ</w:t>
       </w:r>
-      <w:bookmarkEnd w:id="23"/>
+      <w:bookmarkEnd w:id="25"/>
     </w:p>
     <w:p>
       <w:r>
@@ -3822,7 +5524,7 @@
       <w:pPr>
         <w:pStyle w:val="Heading2"/>
       </w:pPr>
-      <w:bookmarkStart w:id="24" w:name="_Toc233492411"/>
+      <w:bookmarkStart w:id="26" w:name="_Toc233509693"/>
       <w:r>
         <w:rPr>
           <w:rFonts w:eastAsia="Times New Roman" w:cs="Times New Roman"/>
@@ -3830,7 +5532,7 @@
         </w:rPr>
         <w:t>4. Nhóm thỏa ràng buộc</w:t>
       </w:r>
-      <w:bookmarkEnd w:id="24"/>
+      <w:bookmarkEnd w:id="26"/>
     </w:p>
     <w:p>
       <w:r>
@@ -3880,7 +5582,7 @@
       <w:pPr>
         <w:pStyle w:val="Heading2"/>
       </w:pPr>
-      <w:bookmarkStart w:id="25" w:name="_Toc233492412"/>
+      <w:bookmarkStart w:id="27" w:name="_Toc233509694"/>
       <w:r>
         <w:rPr>
           <w:rFonts w:eastAsia="Times New Roman" w:cs="Times New Roman"/>
@@ -3888,7 +5590,7 @@
         </w:rPr>
         <w:t>5. Nhóm tìm kiếm đối kháng</w:t>
       </w:r>
-      <w:bookmarkEnd w:id="25"/>
+      <w:bookmarkEnd w:id="27"/>
     </w:p>
     <w:p>
       <w:r>
@@ -3938,47 +5640,89 @@
       <w:pPr>
         <w:pStyle w:val="Heading2"/>
       </w:pPr>
-      <w:bookmarkStart w:id="26" w:name="_Toc233492413"/>
+      <w:bookmarkStart w:id="28" w:name="_Toc233509695"/>
+      <w:r>
+        <w:t>6. Nhóm môi trư</w:t>
+      </w:r>
+      <w:r>
+        <w:t>ờ</w:t>
+      </w:r>
+      <w:r>
+        <w:t>ng ph</w:t>
+      </w:r>
+      <w:r>
+        <w:t>ứ</w:t>
+      </w:r>
+      <w:r>
+        <w:t>c t</w:t>
+      </w:r>
+      <w:r>
+        <w:t>ạ</w:t>
+      </w:r>
+      <w:r>
+        <w:t>p</w:t>
+      </w:r>
+      <w:bookmarkEnd w:id="28"/>
+    </w:p>
+    <w:p>
+      <w:r>
+        <w:t>Thực nghiệm Online Re-planning cần thể hiện initial path, hidden edge, observed edge, belief update và final path sau khi replan từ vị trí hiện tại. Thực nghiệm AND-OR Search cần thể hiện cây nhỏ gồm OR_CHOOSE_ACTION, hai nhánh AND_ENV_OUTCOME và RETURN_CONDITIONAL_PLAN.</w:t>
+      </w:r>
+    </w:p>
+    <w:p>
+      <w:r>
+        <w:t>Vị trí chèn hình hoặc ảnh động: Online Re-planning phát hiện cạnh ẩn và lập route mới từ current node.</w:t>
+      </w:r>
+    </w:p>
+    <w:p>
+      <w:r>
+        <w:t>Vị trí chèn hình hoặc ảnh động: AND-OR Search trả conditional plan với nhánh ifOpen và ifDisrupted.</w:t>
+      </w:r>
+    </w:p>
+    <w:p>
+      <w:r>
+        <w:t>Vị trí chèn hình hoặc ảnh động: Ảnh tổng kết so sánh Online Re-planning phản ứng sau quan sát với AND-OR chuẩn bị trước nhánh dự phòng.</w:t>
+      </w:r>
+    </w:p>
+    <w:p>
+      <w:pPr>
+        <w:pStyle w:val="Heading2"/>
+      </w:pPr>
+      <w:bookmarkStart w:id="29" w:name="_Toc233509696"/>
+      <w:r>
+        <w:t>7. Link GitHub</w:t>
+      </w:r>
+      <w:bookmarkEnd w:id="29"/>
+    </w:p>
+    <w:p>
+      <w:r>
+        <w:rPr>
+          <w:color w:val="000000"/>
+        </w:rPr>
+        <w:t>Mã nguồn và dữ liệu demo của dự án được lưu tại: https://github.com/zomboXx/FYP.git. Khi hoàn thiện báo cáo, nhóm nên dẫn thêm đường dẫn đến thư mục demo, ảnh động hoặc video minh họa nếu các tài nguyên đó được đưa lên repository.</w:t>
+      </w:r>
+    </w:p>
+    <w:p>
+      <w:pPr>
+        <w:pStyle w:val="Heading1"/>
+        <w:pageBreakBefore/>
+      </w:pPr>
+      <w:bookmarkStart w:id="30" w:name="_Toc233509697"/>
       <w:r>
         <w:rPr>
           <w:rFonts w:eastAsia="Times New Roman" w:cs="Times New Roman"/>
           <w:color w:val="000000"/>
         </w:rPr>
-        <w:lastRenderedPageBreak/>
-        <w:t>6. Link GitHub</w:t>
-      </w:r>
-      <w:bookmarkEnd w:id="26"/>
-    </w:p>
-    <w:p>
-      <w:r>
-        <w:rPr>
-          <w:color w:val="000000"/>
-        </w:rPr>
-        <w:t>Mã nguồn và dữ liệu demo của dự án được lưu tại: https://github.com/zomboXx/FYP.git. Khi hoàn thiện báo cáo, nhóm nên dẫn thêm đường dẫn đến thư mục demo, ảnh động hoặc video minh họa nếu các tài nguyên đó được đưa lên repository.</w:t>
-      </w:r>
-    </w:p>
-    <w:p>
-      <w:pPr>
-        <w:pStyle w:val="Heading1"/>
-        <w:pageBreakBefore/>
-      </w:pPr>
-      <w:bookmarkStart w:id="27" w:name="_Toc233492414"/>
-      <w:r>
-        <w:rPr>
-          <w:rFonts w:eastAsia="Times New Roman" w:cs="Times New Roman"/>
-          <w:color w:val="000000"/>
-        </w:rPr>
-        <w:lastRenderedPageBreak/>
-        <w:t>IV. Đánh giá và thảo luận</w:t>
-      </w:r>
-      <w:bookmarkEnd w:id="27"/>
-    </w:p>
-    <w:p>
-      <w:r>
-        <w:rPr>
-          <w:color w:val="000000"/>
-        </w:rPr>
-        <w:t>Phần đánh giá không nên chỉ kết luận thuật toán nào nhanh hơn, vì mỗi nhóm thuật toán trả lời một loại câu hỏi khác nhau. BFS và DFS giúp hiểu cách duyệt không gian trạng thái; Greedy và A* khai thác heuristic để giảm tìm kiếm mù; Hill Climbing và Simulated Annealing xử lý tối ưu cấu hình; Backtracking và Forward Checking kiểm tra tính hợp lệ dưới ràng buộc; Minimax và Alpha-Beta phân tích quyết định trong tình huống có phản ứng bất lợi.</w:t>
+        <w:t>IV. ĐÁNH GIÁ VÀ THẢO LUẬN</w:t>
+      </w:r>
+      <w:bookmarkEnd w:id="30"/>
+    </w:p>
+    <w:p>
+      <w:r>
+        <w:t>Phần đánh giá không nên chỉ kết luận thuật toán nào nhanh hơn, vì mỗi nhóm thuật toán trả lời một loại câu hỏi khác nhau. BFS và DFS giúp hiểu cách duyệt không gian trạng thái; Greedy và A* khai thác heuristic để giảm tìm kiếm mù; Hill Climbing và Simulated Annealing xử lý tối ưu cấu hình; Backtracking và Forward Checking kiểm tra tính hợp lệ dưới ràng buộc; Online Re-planning và AND-OR Search xử lý môi trường không quan sát đầy đủ; Minimax và Alpha-Beta phân tích quyết định trong tình huống có phản ứng bất</w:t>
+      </w:r>
+      <w:r>
+        <w:t xml:space="preserve"> lợi.</w:t>
       </w:r>
     </w:p>
     <w:tbl>
@@ -4556,6 +6300,83 @@
           </w:p>
         </w:tc>
       </w:tr>
+      <w:tr>
+        <w:tc>
+          <w:tcPr>
+            <w:tcW w:w="1814" w:type="dxa"/>
+            <w:vAlign w:val="center"/>
+          </w:tcPr>
+          <w:p>
+            <w:pPr>
+              <w:ind w:firstLine="0"/>
+              <w:jc w:val="center"/>
+            </w:pPr>
+            <w:r>
+              <w:t>Môi trường phức tạp</w:t>
+            </w:r>
+          </w:p>
+        </w:tc>
+        <w:tc>
+          <w:tcPr>
+            <w:tcW w:w="1814" w:type="dxa"/>
+            <w:vAlign w:val="center"/>
+          </w:tcPr>
+          <w:p>
+            <w:pPr>
+              <w:ind w:firstLine="0"/>
+              <w:jc w:val="center"/>
+            </w:pPr>
+            <w:r>
+              <w:t>Online Re-planning / AND-OR</w:t>
+            </w:r>
+          </w:p>
+        </w:tc>
+        <w:tc>
+          <w:tcPr>
+            <w:tcW w:w="1814" w:type="dxa"/>
+            <w:vAlign w:val="center"/>
+          </w:tcPr>
+          <w:p>
+            <w:pPr>
+              <w:ind w:firstLine="0"/>
+              <w:jc w:val="center"/>
+            </w:pPr>
+            <w:r>
+              <w:t>Xử lý quan sát thiếu và outcome bất định</w:t>
+            </w:r>
+          </w:p>
+        </w:tc>
+        <w:tc>
+          <w:tcPr>
+            <w:tcW w:w="1814" w:type="dxa"/>
+            <w:vAlign w:val="center"/>
+          </w:tcPr>
+          <w:p>
+            <w:pPr>
+              <w:ind w:firstLine="0"/>
+              <w:jc w:val="center"/>
+            </w:pPr>
+            <w:r>
+              <w:t>Dễ tăng chi phí khi replan nhiều hoặc outcome lớn</w:t>
+            </w:r>
+          </w:p>
+        </w:tc>
+        <w:tc>
+          <w:tcPr>
+            <w:tcW w:w="1814" w:type="dxa"/>
+            <w:vAlign w:val="center"/>
+          </w:tcPr>
+          <w:p>
+            <w:pPr>
+              <w:ind w:firstLine="0"/>
+              <w:jc w:val="center"/>
+            </w:pPr>
+            <w:r>
+              <w:t>Tái lập kế hoạch và conditional plan</w:t>
+            </w:r>
+          </w:p>
+        </w:tc>
+      </w:tr>
     </w:tbl>
     <w:p>
       <w:r>
@@ -4570,7 +6391,6 @@
         <w:rPr>
           <w:color w:val="000000"/>
         </w:rPr>
-        <w:lastRenderedPageBreak/>
         <w:t>Quan điểm của nhóm là không nên ép một thuật toán xử lý toàn bộ bài toán Find Your Path. Một thiết kế hợp lý có thể kết hợp nhiều lớp: thuật toán tìm đường xử lý graph, thuật toán ràng buộc kiểm tra tính khả thi của đơn hàng, thuật toán cục bộ cải thiện thứ tự giao và mô hình đối kháng dùng để đánh giá kịch bản xấu. Cách kết hợp này phản ánh đúng tinh thần của trí tuệ nhân tạo: lựa chọn biểu diễn và thuật toán phụ thuộc vào bản chất của bài toán.</w:t>
       </w:r>
     </w:p>
@@ -4579,31 +6399,24 @@
         <w:pStyle w:val="Heading1"/>
         <w:pageBreakBefore/>
       </w:pPr>
-      <w:bookmarkStart w:id="28" w:name="_Toc233492415"/>
+      <w:bookmarkStart w:id="31" w:name="_Toc233509698"/>
       <w:r>
         <w:rPr>
           <w:rFonts w:eastAsia="Times New Roman" w:cs="Times New Roman"/>
           <w:color w:val="000000"/>
         </w:rPr>
-        <w:lastRenderedPageBreak/>
-        <w:t>V. Kết luận</w:t>
-      </w:r>
-      <w:bookmarkEnd w:id="28"/>
-    </w:p>
-    <w:p>
-      <w:r>
-        <w:rPr>
-          <w:color w:val="000000"/>
-        </w:rPr>
-        <w:t>Báo cáo đã được tổ chức theo bố cục cuối kỳ gồm bài toán đặt ra, thuật toán áp dụng, thực nghiệm và kết quả, đánh giá và thảo luận, kết luận và tài liệu tham khảo. Phần bài toán được phân tích thông qua không gian trạng thái, dữ liệu vào ra, tiêu chí chi phí và mô hình PEAS. Phần thuật toán lựa chọn hai đại diện cho mỗi nhóm chính: BFS/DFS, Greedy/A*, Hill Climbing/Simulated Annealing, Backtracking/Forward Checking và Minimax/Alpha-Beta Pruning.</w:t>
-      </w:r>
-    </w:p>
-    <w:p>
-      <w:r>
-        <w:rPr>
-          <w:color w:val="000000"/>
-        </w:rPr>
-        <w:t>Trong bước tiếp theo, nhóm cần bổ sung ảnh động hoặc ảnh chụp màn hình thực nghiệm cho từng nhóm thuật toán, cập nhật số liệu chạy thực tế và quyết định có mở rộng sang nhóm môi trường phức tạp hay không. Khi có số liệu đầy đủ, phần đánh giá có thể bổ sung biểu đồ so sánh số node mở rộng, thời gian chạy, chi phí route và mức độ thỏa ràng buộc.</w:t>
+        <w:t>V. KẾT LUẬN</w:t>
+      </w:r>
+      <w:bookmarkEnd w:id="31"/>
+    </w:p>
+    <w:p>
+      <w:r>
+        <w:t>Báo cáo đã được tổ chức theo bố cục cuối kỳ gồm bài toán đặt ra, thuật toán áp dụng, thực nghiệm và kết quả, đánh giá và thảo luận, kết luận và tài liệu tham khảo. Phần bài toán được phân tích thông qua không gian trạng thái, dữ liệu vào ra, tiêu chí chi phí và mô hình PEAS. Phần thuật toán lựa chọn tối thiểu hai đại diện cho mỗi nhóm chính: BFS/DFS, Greedy/A*, Hill Climbing/Simulated Annealing, Backtracking/Forward Checking, Online Re-planning/AND-OR Search và Minimax/Alpha-Beta Pruning.</w:t>
+      </w:r>
+    </w:p>
+    <w:p>
+      <w:r>
+        <w:t>Trong bước tiếp theo, nhóm cần bổ sung ảnh động hoặc ảnh chụp màn hình thực nghiệm cho từng nhóm thuật toán, đặc biệt là trace Online Re-planning và cây AND-OR conditional plan. Khi có số liệu đầy đủ, phần đánh giá có thể bổ sung biểu đồ so sánh số node mở rộng, thời gian chạy, chi phí route và mức độ thỏa ràng buộc.</w:t>
       </w:r>
     </w:p>
     <w:p>
@@ -4612,16 +6425,15 @@
         <w:pageBreakBefore/>
         <w:jc w:val="center"/>
       </w:pPr>
-      <w:bookmarkStart w:id="29" w:name="_Toc233492416"/>
+      <w:bookmarkStart w:id="32" w:name="_Toc233509699"/>
       <w:r>
         <w:rPr>
           <w:rFonts w:eastAsia="Times New Roman" w:cs="Times New Roman"/>
           <w:color w:val="000000"/>
         </w:rPr>
-        <w:lastRenderedPageBreak/>
         <w:t>TÀI LIỆU THAM KHẢO</w:t>
       </w:r>
-      <w:bookmarkEnd w:id="29"/>
+      <w:bookmarkEnd w:id="32"/>
     </w:p>
     <w:p>
       <w:pPr>

</xml_diff>

<commit_message>
Rebuild final report document
</commit_message>
<xml_diff>
--- a/docs/find-your-path-report.docx
+++ b/docs/find-your-path-report.docx
@@ -1149,46 +1149,27 @@
     <w:p>
       <w:pPr>
         <w:spacing w:after="160"/>
-        <w:ind w:firstLine="0"/>
         <w:jc w:val="center"/>
       </w:pPr>
       <w:r>
         <w:rPr>
+          <w:rFonts w:ascii="Times New Roman" w:hAnsi="Times New Roman" w:eastAsia="Times New Roman"/>
           <w:b/>
-          <w:color w:val="000000"/>
+          <w:sz w:val="26"/>
         </w:rPr>
         <w:t>MỤC LỤC</w:t>
       </w:r>
     </w:p>
     <w:p>
       <w:pPr>
-        <w:ind w:firstLine="0"/>
-      </w:pPr>
-      <w:r>
-        <w:rPr>
-          <w:color w:val="000000"/>
-        </w:rPr>
-        <w:fldChar w:fldCharType="end"/>
-      </w:r>
-    </w:p>
-    <w:p>
-      <w:pPr>
-        <w:sectPr>
-          <w:headerReference w:type="default" r:id="rId9"/>
-          <w:footerReference w:type="default" r:id="rId10"/>
-          <w:pgSz w:w="11906" w:h="16838"/>
-          <w:pgMar w:top="1417" w:right="1134" w:bottom="1417" w:left="1701" w:header="850" w:footer="850" w:gutter="0"/>
-          <w:cols w:space="720"/>
-          <w:docGrid w:linePitch="360"/>
-        </w:sectPr>
-      </w:pPr>
-    </w:p>
-    <w:p>
-      <w:pPr>
         <w:pStyle w:val="TOC1"/>
-      </w:pPr>
-      <w:r>
-        <w:t>I. BÀI TOÁN ĐẶT RA</w:t>
+        <w:tabs>
+          <w:tab w:pos="8844" w:val="right" w:leader="dot"/>
+        </w:tabs>
+        <w:spacing w:after="40" w:line="276" w:lineRule="auto"/>
+      </w:pPr>
+      <w:r>
+        <w:t>I. Bài toán đặt ra</w:t>
         <w:tab/>
         <w:t>1</w:t>
       </w:r>
@@ -1196,6 +1177,11 @@
     <w:p>
       <w:pPr>
         <w:pStyle w:val="TOC2"/>
+        <w:tabs>
+          <w:tab w:pos="8844" w:val="right" w:leader="dot"/>
+        </w:tabs>
+        <w:spacing w:after="40" w:line="276" w:lineRule="auto"/>
+        <w:ind w:left="397"/>
       </w:pPr>
       <w:r>
         <w:t>1. Bài toán gì</w:t>
@@ -1206,398 +1192,850 @@
     <w:p>
       <w:pPr>
         <w:pStyle w:val="TOC2"/>
-      </w:pPr>
-      <w:r>
-        <w:t>2. PEAS của bài toán</w:t>
-        <w:tab/>
-        <w:t>1</w:t>
-      </w:r>
-    </w:p>
-    <w:p>
-      <w:pPr>
-        <w:pStyle w:val="TOC1"/>
-      </w:pPr>
-      <w:r>
-        <w:t>II. THUẬT TOÁN ÁP DỤNG</w:t>
+        <w:tabs>
+          <w:tab w:pos="8844" w:val="right" w:leader="dot"/>
+        </w:tabs>
+        <w:spacing w:after="40" w:line="276" w:lineRule="auto"/>
+        <w:ind w:left="397"/>
+      </w:pPr>
+      <w:r>
+        <w:t>2. Phân tích PEAS của bài toán</w:t>
         <w:tab/>
         <w:t>3</w:t>
       </w:r>
     </w:p>
     <w:p>
       <w:pPr>
+        <w:pStyle w:val="TOC1"/>
+        <w:tabs>
+          <w:tab w:pos="8844" w:val="right" w:leader="dot"/>
+        </w:tabs>
+        <w:spacing w:after="40" w:line="276" w:lineRule="auto"/>
+      </w:pPr>
+      <w:r>
+        <w:t>II. Thuật toán áp dụng</w:t>
+        <w:tab/>
+        <w:t>6</w:t>
+      </w:r>
+    </w:p>
+    <w:p>
+      <w:pPr>
         <w:pStyle w:val="TOC2"/>
+        <w:tabs>
+          <w:tab w:pos="8844" w:val="right" w:leader="dot"/>
+        </w:tabs>
+        <w:spacing w:after="40" w:line="276" w:lineRule="auto"/>
+        <w:ind w:left="397"/>
       </w:pPr>
       <w:r>
         <w:t>1. Nhóm tìm kiếm không thông tin: Depth-First Search (DFS)</w:t>
         <w:tab/>
-        <w:t>3</w:t>
+        <w:t>6</w:t>
       </w:r>
     </w:p>
     <w:p>
       <w:pPr>
         <w:pStyle w:val="TOC2"/>
+        <w:tabs>
+          <w:tab w:pos="8844" w:val="right" w:leader="dot"/>
+        </w:tabs>
+        <w:spacing w:after="40" w:line="276" w:lineRule="auto"/>
+        <w:ind w:left="397"/>
       </w:pPr>
       <w:r>
         <w:t>2. Nhóm tìm kiếm có thông tin: A*</w:t>
         <w:tab/>
-        <w:t>4</w:t>
+        <w:t>10</w:t>
       </w:r>
     </w:p>
     <w:p>
       <w:pPr>
         <w:pStyle w:val="TOC2"/>
+        <w:tabs>
+          <w:tab w:pos="8844" w:val="right" w:leader="dot"/>
+        </w:tabs>
+        <w:spacing w:after="40" w:line="276" w:lineRule="auto"/>
+        <w:ind w:left="397"/>
       </w:pPr>
       <w:r>
         <w:t>3. Nhóm tìm kiếm cục bộ: Simple Hill Climbing</w:t>
         <w:tab/>
-        <w:t>5</w:t>
+        <w:t>14</w:t>
       </w:r>
     </w:p>
     <w:p>
       <w:pPr>
         <w:pStyle w:val="TOC2"/>
+        <w:tabs>
+          <w:tab w:pos="8844" w:val="right" w:leader="dot"/>
+        </w:tabs>
+        <w:spacing w:after="40" w:line="276" w:lineRule="auto"/>
+        <w:ind w:left="397"/>
       </w:pPr>
       <w:r>
         <w:t>4. Nhóm môi trường phức tạp: AND-OR Search</w:t>
         <w:tab/>
-        <w:t>6</w:t>
+        <w:t>18</w:t>
       </w:r>
     </w:p>
     <w:p>
       <w:pPr>
         <w:pStyle w:val="TOC2"/>
+        <w:tabs>
+          <w:tab w:pos="8844" w:val="right" w:leader="dot"/>
+        </w:tabs>
+        <w:spacing w:after="40" w:line="276" w:lineRule="auto"/>
+        <w:ind w:left="397"/>
       </w:pPr>
       <w:r>
         <w:t>5. Nhóm thỏa ràng buộc: Forward Checking</w:t>
         <w:tab/>
-        <w:t>7</w:t>
+        <w:t>22</w:t>
       </w:r>
     </w:p>
     <w:p>
       <w:pPr>
         <w:pStyle w:val="TOC2"/>
+        <w:tabs>
+          <w:tab w:pos="8844" w:val="right" w:leader="dot"/>
+        </w:tabs>
+        <w:spacing w:after="40" w:line="276" w:lineRule="auto"/>
+        <w:ind w:left="397"/>
       </w:pPr>
       <w:r>
         <w:t>6. Nhóm tìm kiếm đối kháng: Alpha-Beta Pruning</w:t>
         <w:tab/>
-        <w:t>8</w:t>
+        <w:t>26</w:t>
       </w:r>
     </w:p>
     <w:p>
       <w:pPr>
         <w:pStyle w:val="TOC1"/>
-      </w:pPr>
-      <w:r>
-        <w:t>III. THỰC NGHIỆM VÀ KẾT QUẢ</w:t>
+        <w:tabs>
+          <w:tab w:pos="8844" w:val="right" w:leader="dot"/>
+        </w:tabs>
+        <w:spacing w:after="40" w:line="276" w:lineRule="auto"/>
+      </w:pPr>
+      <w:r>
+        <w:t>III. Thực nghiệm và kết quả</w:t>
         <w:tab/>
-        <w:t>10</w:t>
+        <w:t>30</w:t>
       </w:r>
     </w:p>
     <w:p>
       <w:pPr>
         <w:pStyle w:val="TOC2"/>
-      </w:pPr>
-      <w:r>
-        <w:t>1. Nhóm tìm kiếm không thông tin</w:t>
+        <w:tabs>
+          <w:tab w:pos="8844" w:val="right" w:leader="dot"/>
+        </w:tabs>
+        <w:spacing w:after="40" w:line="276" w:lineRule="auto"/>
+        <w:ind w:left="397"/>
+      </w:pPr>
+      <w:r>
+        <w:t>1. Thiết kế kịch bản thực nghiệm</w:t>
         <w:tab/>
-        <w:t>10</w:t>
+        <w:t>30</w:t>
       </w:r>
     </w:p>
     <w:p>
       <w:pPr>
         <w:pStyle w:val="TOC2"/>
-      </w:pPr>
-      <w:r>
-        <w:t>2. Nhóm tìm kiếm có thông tin</w:t>
+        <w:tabs>
+          <w:tab w:pos="8844" w:val="right" w:leader="dot"/>
+        </w:tabs>
+        <w:spacing w:after="40" w:line="276" w:lineRule="auto"/>
+        <w:ind w:left="397"/>
+      </w:pPr>
+      <w:r>
+        <w:t>2. Chỉ tiêu quan sát và cách ghi nhận kết quả</w:t>
         <w:tab/>
-        <w:t>10</w:t>
+        <w:t>32</w:t>
       </w:r>
     </w:p>
     <w:p>
       <w:pPr>
         <w:pStyle w:val="TOC2"/>
-      </w:pPr>
-      <w:r>
-        <w:t>3. Nhóm tìm kiếm cục bộ</w:t>
+        <w:tabs>
+          <w:tab w:pos="8844" w:val="right" w:leader="dot"/>
+        </w:tabs>
+        <w:spacing w:after="40" w:line="276" w:lineRule="auto"/>
+        <w:ind w:left="397"/>
+      </w:pPr>
+      <w:r>
+        <w:t>3. Định hướng chèn hình minh họa</w:t>
         <w:tab/>
-        <w:t>10</w:t>
+        <w:t>34</w:t>
       </w:r>
     </w:p>
     <w:p>
       <w:pPr>
         <w:pStyle w:val="TOC2"/>
-      </w:pPr>
-      <w:r>
-        <w:t>4. Nhóm môi trường phức tạp</w:t>
+        <w:tabs>
+          <w:tab w:pos="8844" w:val="right" w:leader="dot"/>
+        </w:tabs>
+        <w:spacing w:after="40" w:line="276" w:lineRule="auto"/>
+        <w:ind w:left="397"/>
+      </w:pPr>
+      <w:r>
+        <w:t>4. Link GitHub</w:t>
         <w:tab/>
-        <w:t>11</w:t>
-      </w:r>
-    </w:p>
-    <w:p>
-      <w:pPr>
-        <w:pStyle w:val="TOC2"/>
-      </w:pPr>
-      <w:r>
-        <w:t>5. Nhóm thỏa ràng buộc</w:t>
+        <w:t>35</w:t>
+      </w:r>
+    </w:p>
+    <w:p>
+      <w:pPr>
+        <w:pStyle w:val="TOC1"/>
+        <w:tabs>
+          <w:tab w:pos="8844" w:val="right" w:leader="dot"/>
+        </w:tabs>
+        <w:spacing w:after="40" w:line="276" w:lineRule="auto"/>
+      </w:pPr>
+      <w:r>
+        <w:t>IV. Đánh giá và thảo luận</w:t>
         <w:tab/>
-        <w:t>11</w:t>
-      </w:r>
-    </w:p>
-    <w:p>
-      <w:pPr>
-        <w:pStyle w:val="TOC2"/>
-      </w:pPr>
-      <w:r>
-        <w:t>6. Nhóm tìm kiếm đối kháng</w:t>
+        <w:t>36</w:t>
+      </w:r>
+    </w:p>
+    <w:p>
+      <w:pPr>
+        <w:pStyle w:val="TOC1"/>
+        <w:tabs>
+          <w:tab w:pos="8844" w:val="right" w:leader="dot"/>
+        </w:tabs>
+        <w:spacing w:after="40" w:line="276" w:lineRule="auto"/>
+      </w:pPr>
+      <w:r>
+        <w:t>1. Tổng hợp vai trò của sáu thuật toán</w:t>
         <w:tab/>
-        <w:t>11</w:t>
-      </w:r>
-    </w:p>
-    <w:p>
-      <w:pPr>
-        <w:pStyle w:val="TOC2"/>
-      </w:pPr>
-      <w:r>
-        <w:t>7. Link GitHub</w:t>
+        <w:t>37</w:t>
+      </w:r>
+    </w:p>
+    <w:p>
+      <w:pPr>
+        <w:pStyle w:val="TOC1"/>
+        <w:tabs>
+          <w:tab w:pos="8844" w:val="right" w:leader="dot"/>
+        </w:tabs>
+        <w:spacing w:after="40" w:line="276" w:lineRule="auto"/>
+      </w:pPr>
+      <w:r>
+        <w:t>2. Mối liên hệ giữa biểu diễn trạng thái và thuật toán</w:t>
         <w:tab/>
-        <w:t>12</w:t>
-      </w:r>
-    </w:p>
-    <w:p>
-      <w:pPr>
-        <w:pStyle w:val="TOC1"/>
-      </w:pPr>
-      <w:r>
-        <w:t>IV. ĐÁNH GIÁ VÀ THẢO LUẬN</w:t>
-        <w:tab/>
-        <w:t>13</w:t>
-      </w:r>
-    </w:p>
-    <w:p>
-      <w:pPr>
-        <w:pStyle w:val="TOC1"/>
-      </w:pPr>
-      <w:r>
-        <w:t>V. KẾT LUẬN</w:t>
-        <w:tab/>
-        <w:t>14</w:t>
-      </w:r>
-    </w:p>
-    <w:p>
-      <w:pPr>
-        <w:pStyle w:val="TOC1"/>
-      </w:pPr>
-      <w:r>
-        <w:t>TÀI LIỆU THAM KHẢO</w:t>
-        <w:tab/>
-        <w:t>15</w:t>
-      </w:r>
-    </w:p>
-    <w:p>
-      <w:pPr>
-        <w:pStyle w:val="Heading1"/>
-      </w:pPr>
-      <w:bookmarkStart w:id="0" w:name="_Toc233509667"/>
-      <w:r>
-        <w:rPr>
-          <w:rFonts w:eastAsia="Times New Roman" w:cs="Times New Roman"/>
-          <w:color w:val="000000"/>
-        </w:rPr>
-        <w:t>I. BÀI TOÁN ĐẶT RA</w:t>
-      </w:r>
-      <w:bookmarkEnd w:id="0"/>
-    </w:p>
-    <w:p>
-      <w:pPr>
-        <w:pStyle w:val="Heading2"/>
-      </w:pPr>
-      <w:bookmarkStart w:id="1" w:name="_Toc233509668"/>
-      <w:r>
-        <w:rPr>
-          <w:rFonts w:eastAsia="Times New Roman" w:cs="Times New Roman"/>
-          <w:color w:val="000000"/>
-        </w:rPr>
-        <w:t>1. Bài toán gì</w:t>
-      </w:r>
-      <w:bookmarkEnd w:id="1"/>
-    </w:p>
-    <w:p>
-      <w:r>
-        <w:rPr>
-          <w:color w:val="000000"/>
-        </w:rPr>
-        <w:t>Find Your Path được xác định là bài toán lập lộ trình giao hàng trong môi trường đô thị, trong đó tác tử cần lựa chọn chuỗi hành động di chuyển từ vị trí xuất phát đến một hoặc nhiều điểm giao hàng sao cho phương án cuối cùng thỏa mãn mục tiêu chi phí và các ràng buộc vận hành. Ở mức đơn giản, bài toán là tìm đường đi giữa hai vị trí trên đồ thị có trọng số. Ở mức mở rộng, bài toán trở thành lựa chọn thứ tự phục vụ nhiều đơn hàng, kiểm tra tính khả thi của route và ứng phó với các thay đổi bất lợi của môi t</w:t>
-      </w:r>
-      <w:r>
-        <w:rPr>
-          <w:color w:val="000000"/>
-        </w:rPr>
-        <w:t>rường.</w:t>
-      </w:r>
-    </w:p>
-    <w:p>
-      <w:r>
-        <w:rPr>
-          <w:color w:val="000000"/>
-        </w:rPr>
-        <w:t>Không gian trạng thái của bài toán không chỉ là tập các giao điểm trên bản đồ. Một trạng thái có thể bao gồm vị trí hiện tại của shipper, danh sách đơn đã giao, danh sách đơn chưa giao, thời gian tích lũy, tải trọng hiện tại, các ràng buộc còn hiệu lực và chi phí đã phát sinh. Khi trạng thái được mô hình hóa đầy đủ hơn, cùng một hệ thống có thể dùng nhiều nhóm thuật toán khác nhau: tìm kiếm đường đi trên graph, tối ưu thứ tự giao hàng, kiểm tra ràng buộc và mô phỏng quyết định trong kịch bản bất lợi.</w:t>
-      </w:r>
-    </w:p>
-    <w:p>
-      <w:r>
-        <w:rPr>
-          <w:color w:val="000000"/>
-        </w:rPr>
-        <w:t>Dữ liệu đầu vào của bài toán gồm đồ thị đường đi, vị trí bắt đầu, tập điểm đích hoặc đơn hàng, trọng số cạnh và các tham số ràng buộc. Dữ liệu đầu ra là một lời giải có thể thực thi, thường là đường đi hoặc thứ tự các điểm giao kèm tổng chi phí. Trong phạm vi học phần, báo cáo không dùng dịch vụ định tuyến bên ngoài để thay thế thuật toán của dự án; thay vào đó, các thuật toán được phân tích như những cơ chế tự xây dựng lời giải từ biểu diễn trạng thái đã cho.</w:t>
-      </w:r>
-    </w:p>
-    <w:p>
-      <w:r>
-        <w:rPr>
-          <w:color w:val="000000"/>
-        </w:rPr>
-        <w:t>Bài toán có ý nghĩa thực tiễn vì một route tốt không chỉ ngắn về mặt hình học. Một tuyến đường có thể ngắn nhưng đi qua cạnh có chi phí cao, khiến đơn hàng bị trễ hạn hoặc làm hệ thống khó giải thích quyết định. Vì vậy, tiêu chí đánh giá cần đặt trên nhiều chiều: chi phí đường đi, thời gian tính toán, số trạng thái mở rộng, mức độ thỏa ràng buộc và khả năng trình bày rõ vì sao thuật toán tạo ra lời giải đó.</w:t>
-      </w:r>
-    </w:p>
-    <w:p>
-      <w:pPr>
-        <w:pStyle w:val="Heading2"/>
-      </w:pPr>
-      <w:bookmarkStart w:id="2" w:name="_Toc233509669"/>
-      <w:r>
-        <w:rPr>
-          <w:rFonts w:eastAsia="Times New Roman" w:cs="Times New Roman"/>
-          <w:color w:val="000000"/>
-        </w:rPr>
-        <w:t>2. PEAS của bài toán</w:t>
-      </w:r>
-      <w:bookmarkEnd w:id="2"/>
-    </w:p>
-    <w:p>
-      <w:r>
-        <w:rPr>
-          <w:color w:val="000000"/>
-        </w:rPr>
-        <w:t>Performance measure của Find Your Path cần được hiểu như một hàm đánh giá đa mục tiêu thay vì chỉ là độ dài tuyến đường. Ở lớp tìm đường cơ bản, hiệu năng có thể đo bằng tổng trọng số cạnh và số node được mở rộng. Ở lớp giao hàng, hệ thống cần xét thêm tỷ lệ đơn đúng hạn, số ràng buộc bị vi phạm, mức phạt do trễ deadline, khả năng cân bằng tải giữa shipper và độ ổn định của route khi dữ liệu đầu vào thay đổi. Đối với báo cáo học thuật, một tiêu chí quan trọng khác là tính giải thích được: thuật toán phải ch</w:t>
-      </w:r>
-      <w:r>
-        <w:rPr>
-          <w:color w:val="000000"/>
-        </w:rPr>
-        <w:t>o phép nhóm mô tả được trạng thái ban đầu, điều kiện dừng và cơ chế chọn lời giải.</w:t>
-      </w:r>
-    </w:p>
-    <w:p>
-      <w:r>
-        <w:rPr>
-          <w:color w:val="000000"/>
-        </w:rPr>
-        <w:t xml:space="preserve">Environment là môi trường đô thị được biểu diễn bằng đồ thị có trọng số. Node có thể là giao điểm, depot, vị trí shipper hoặc điểm giao hàng; cạnh biểu diễn đoạn đường có chi phí di chuyển. Ở thực nghiệm cơ bản, môi trường có thể được xem là xác định và quan sát đầy đủ: chi phí cạnh đã biết, graph không thay đổi trong lúc thuật toán chạy. Tuy nhiên, bản chất của bài toán giao hàng cho phép mở rộng sang môi trường động, nơi chi phí cạnh thay đổi do tắc đường, một số cạnh bị khóa hoặc đơn hàng mới xuất hiện. </w:t>
-      </w:r>
-      <w:r>
-        <w:rPr>
-          <w:color w:val="000000"/>
-        </w:rPr>
-        <w:t>Đây là lý do phần môi trường phức tạp được giữ như hướng phát triển sau thay vì chọn vội một thuật toán khi kịch bản chưa rõ.</w:t>
-      </w:r>
-    </w:p>
-    <w:p>
-      <w:r>
-        <w:rPr>
-          <w:color w:val="000000"/>
-        </w:rPr>
-        <w:t>Actuators là các hành động mà tác tử hoặc hệ thống có thể thực hiện để biến đổi trạng thái. Ở mức graph, hành động là chọn node kế tiếp từ tập node kề. Ở mức route nhiều đơn, hành động có thể là chọn đơn hàng kế tiếp, hoán đổi thứ tự hai điểm giao, thay thế một đoạn tuyến bằng đoạn khác hoặc loại bỏ một nhánh tìm kiếm không còn khả thi. Ở mức ràng buộc, hành động là gán giá trị cho biến và cập nhật domain còn lại. Ở mức đối kháng, hành động của hệ thống là chọn phương án còn môi trường giả lập có thể chọn p</w:t>
-      </w:r>
-      <w:r>
-        <w:rPr>
-          <w:color w:val="000000"/>
-        </w:rPr>
-        <w:t>hản ứng bất lợi để kiểm tra độ an toàn của quyết định.</w:t>
-      </w:r>
-    </w:p>
-    <w:p>
-      <w:r>
-        <w:rPr>
-          <w:color w:val="000000"/>
-        </w:rPr>
-        <w:t>Sensors là nguồn thông tin giúp hệ thống nhận biết trạng thái hiện tại và đánh giá lựa chọn tiếp theo. Trong dự án, cảm biến được hiểu theo nghĩa phần mềm: dữ liệu graph, danh sách đơn hàng, trạng thái đã nhận hoặc đã giao, deadline, tải trọng, chi phí cạnh, vị trí hiện tại và kết quả trung gian của thuật toán. Nếu mở rộng sang môi trường phức tạp, sensor không nhất thiết cung cấp thông tin hoàn hảo; khi đó hệ thống phải ra quyết định dựa trên dữ liệu thiếu, dữ liệu trễ hoặc ước lượng xác suất. Việc phân bi</w:t>
-      </w:r>
-      <w:r>
-        <w:rPr>
-          <w:color w:val="000000"/>
-        </w:rPr>
-        <w:t>ệt mức quan sát này giúp nhóm tránh nhầm lẫn giữa bài toán tìm đường tĩnh và bài toán ra quyết định trong môi trường động.</w:t>
+        <w:t>39</w:t>
       </w:r>
     </w:p>
     <w:p>
       <w:pPr>
         <w:pStyle w:val="Heading1"/>
         <w:pageBreakBefore/>
-      </w:pPr>
-      <w:bookmarkStart w:id="3" w:name="_Toc233509670"/>
-      <w:r>
-        <w:rPr>
-          <w:rFonts w:eastAsia="Times New Roman" w:cs="Times New Roman"/>
-          <w:color w:val="000000"/>
-        </w:rPr>
-        <w:t>II. THUẬT TOÁN ÁP DỤNG</w:t>
-      </w:r>
-      <w:bookmarkEnd w:id="3"/>
-    </w:p>
-    <w:p>
-      <w:pPr/>
-      <w:r>
-        <w:t>Phần thuật toán được tổ chức theo sáu nhóm kiến thức đã học. Mỗi nhóm chỉ chọn một thuật toán đại diện để phân tích sâu, gồm trạng thái bắt đầu, trạng thái mục tiêu, quy trình tìm lời giải, hàm đánh giá nếu có, độ phức tạp, bốn tính chất cơ bản và giới hạn khi áp dụng vào bài toán Find Your Path.</w:t>
-      </w:r>
-    </w:p>
-    <w:p>
-      <w:pPr/>
-      <w:r>
-        <w:t>Trong các phân tích dưới đây, b là hệ số phân nhánh trung bình, d là độ sâu nghiệm nông nhất, m là độ sâu tối đa, n là số biến trong bài toán ràng buộc và k là số outcome trung bình của một hành động trong môi trường bất định.</w:t>
+        <w:spacing w:before="0" w:after="120"/>
+        <w:jc w:val="left"/>
+      </w:pPr>
+      <w:r>
+        <w:rPr>
+          <w:rFonts w:ascii="Times New Roman" w:hAnsi="Times New Roman" w:eastAsia="Times New Roman"/>
+          <w:b/>
+          <w:sz w:val="26"/>
+        </w:rPr>
+        <w:t>I. Bài toán đặt ra</w:t>
       </w:r>
     </w:p>
     <w:p>
       <w:pPr>
         <w:pStyle w:val="Heading2"/>
-      </w:pPr>
-      <w:r>
+        <w:spacing w:before="120" w:after="120"/>
+        <w:jc w:val="left"/>
+      </w:pPr>
+      <w:r>
+        <w:rPr>
+          <w:rFonts w:ascii="Times New Roman" w:hAnsi="Times New Roman" w:eastAsia="Times New Roman"/>
+          <w:b/>
+          <w:sz w:val="26"/>
+        </w:rPr>
+        <w:t>1. Bài toán gì</w:t>
+      </w:r>
+    </w:p>
+    <w:p>
+      <w:pPr>
+        <w:spacing w:before="0" w:after="120" w:line="300" w:lineRule="auto"/>
+        <w:ind w:firstLine="567"/>
+        <w:jc w:val="both"/>
+      </w:pPr>
+      <w:r>
+        <w:rPr>
+          <w:rFonts w:ascii="Times New Roman" w:hAnsi="Times New Roman" w:eastAsia="Times New Roman"/>
+          <w:sz w:val="26"/>
+        </w:rPr>
+        <w:t>Find Your Path được xác định là bài toán lập lộ trình giao hàng trong môi trường đô thị, nơi hệ thống phải chọn đường đi và chuỗi hành động phù hợp cho tác tử giao hàng. Nếu nhìn ở mức tối giản, bài toán có thể được mô tả là tìm một đường đi từ điểm xuất phát đến điểm đích trên đồ thị có trọng số. Tuy nhiên, trong bối cảnh ứng dụng thực tế, cách hiểu đó chưa đủ, vì mỗi quyết định di chuyển còn chịu ảnh hưởng của thời gian, ràng buộc đơn hàng, trạng thái đường đi, khả năng cập nhật thông tin và mục tiêu tối ưu tổng thể.</w:t>
+      </w:r>
+    </w:p>
+    <w:p>
+      <w:pPr>
+        <w:spacing w:before="0" w:after="120" w:line="300" w:lineRule="auto"/>
+        <w:ind w:firstLine="567"/>
+        <w:jc w:val="both"/>
+      </w:pPr>
+      <w:r>
+        <w:rPr>
+          <w:rFonts w:ascii="Times New Roman" w:hAnsi="Times New Roman" w:eastAsia="Times New Roman"/>
+          <w:sz w:val="26"/>
+        </w:rPr>
+        <w:t>Không gian trạng thái của bài toán gồm nhiều thành phần hơn một node hiện tại. Một trạng thái có thể bao gồm vị trí của shipper, tập đơn hàng chưa phục vụ, tập đơn hàng đã nhận, trạng thái tải hiện tại, thời gian đã trôi qua, các cạnh bị chặn hoặc có chi phí thay đổi, cùng những thông tin mà hệ thống đã quan sát được. Chính sự kết hợp này làm cho bài toán Find Your Path phù hợp để khảo sát nhiều nhóm thuật toán trí tuệ nhân tạo khác nhau thay vì chỉ dùng một thuật toán tìm đường đơn lẻ.</w:t>
+      </w:r>
+    </w:p>
+    <w:p>
+      <w:pPr>
+        <w:spacing w:before="0" w:after="120" w:line="300" w:lineRule="auto"/>
+        <w:ind w:firstLine="567"/>
+        <w:jc w:val="both"/>
+      </w:pPr>
+      <w:r>
+        <w:rPr>
+          <w:rFonts w:ascii="Times New Roman" w:hAnsi="Times New Roman" w:eastAsia="Times New Roman"/>
+          <w:sz w:val="26"/>
+        </w:rPr>
+        <w:t>Trạng thái bắt đầu là trạng thái mà shipper hoặc hệ thống đang đứng trước một yêu cầu giao hàng. Ở trạng thái này, hệ thống biết vị trí xuất phát, biết hoặc ước lượng bản đồ đường đi, biết mục tiêu cần phục vụ và có thể có một số thông tin ban đầu về chi phí cạnh. Trạng thái mục tiêu là trạng thái mà tác tử đã đến đúng điểm đích hoặc hoàn thành một chuỗi giao hàng thỏa các ràng buộc đặt ra. Trong phiên bản đơn giản, mục tiêu là đến node đích; trong phiên bản mở rộng, mục tiêu là hoàn thành route với chi phí chấp nhận được và không vi phạm các điều kiện quan trọng.</w:t>
+      </w:r>
+    </w:p>
+    <w:p>
+      <w:pPr>
+        <w:spacing w:before="0" w:after="120" w:line="300" w:lineRule="auto"/>
+        <w:ind w:firstLine="567"/>
+        <w:jc w:val="both"/>
+      </w:pPr>
+      <w:r>
+        <w:rPr>
+          <w:rFonts w:ascii="Times New Roman" w:hAnsi="Times New Roman" w:eastAsia="Times New Roman"/>
+          <w:sz w:val="26"/>
+        </w:rPr>
+        <w:t>Các phép hành động trong bài toán có thể được biểu diễn dưới dạng chọn node kế tiếp, nhận đơn, gán đơn cho shipper, cập nhật route hoặc thay đổi kế hoạch khi phát hiện thông tin mới. Nếu mô hình chỉ xét graph tĩnh, hành động là di chuyển qua một cạnh hợp lệ. Nếu mô hình xét nhiều đơn hàng và ràng buộc, hành động còn bao gồm việc chọn thứ tự phục vụ hoặc loại bỏ một phương án không khả thi. Nếu mô hình xét môi trường bất định, hành động có thể dẫn đến nhiều kết quả khác nhau, chẳng hạn một cạnh đang thông nhưng sau đó bị chặn, hoặc chi phí di chuyển tăng do điều kiện đường đi.</w:t>
+      </w:r>
+    </w:p>
+    <w:p>
+      <w:pPr>
+        <w:spacing w:before="0" w:after="120" w:line="300" w:lineRule="auto"/>
+        <w:ind w:firstLine="567"/>
+        <w:jc w:val="both"/>
+      </w:pPr>
+      <w:r>
+        <w:rPr>
+          <w:rFonts w:ascii="Times New Roman" w:hAnsi="Times New Roman" w:eastAsia="Times New Roman"/>
+          <w:sz w:val="26"/>
+        </w:rPr>
+        <w:t>Đầu vào của bài toán gồm đồ thị đường đi, tập node, tập cạnh, trọng số cạnh, vị trí bắt đầu, vị trí mục tiêu, thông tin đơn hàng và các tham số đánh giá. Trọng số cạnh có thể đại diện cho khoảng cách, thời gian di chuyển, chi phí nhiên liệu hoặc một chỉ số tổng hợp. Đầu ra mong muốn là một route hoặc một kế hoạch hành động giúp tác tử đi từ trạng thái bắt đầu đến trạng thái mục tiêu. Trong các thuật toán phức tạp hơn, đầu ra không chỉ là một path đơn, mà có thể là kế hoạch có điều kiện hoặc một lời giải thỏa ràng buộc.</w:t>
+      </w:r>
+    </w:p>
+    <w:p>
+      <w:pPr>
+        <w:spacing w:before="0" w:after="120" w:line="300" w:lineRule="auto"/>
+        <w:ind w:firstLine="567"/>
+        <w:jc w:val="both"/>
+      </w:pPr>
+      <w:r>
+        <w:rPr>
+          <w:rFonts w:ascii="Times New Roman" w:hAnsi="Times New Roman" w:eastAsia="Times New Roman"/>
+          <w:sz w:val="26"/>
+        </w:rPr>
+        <w:t>Tiêu chí đánh giá lời giải không chỉ là độ dài hình học. Một route tốt trong bài toán giao hàng cần cân bằng giữa thời gian, chi phí, độ ổn định, tính khả thi và mức độ thỏa ràng buộc. Tuyến đường ngắn nhất chưa chắc là tốt nhất nếu đi qua khu vực thường tắc nghẽn, nếu làm trễ deadline hoặc nếu khiến shipper không thể hoàn thành các đơn tiếp theo. Vì vậy, báo cáo xem Find Your Path như một bài toán tổng hợp, trong đó từng nhóm thuật toán đại diện cho một góc nhìn khác nhau của trí tuệ nhân tạo.</w:t>
+      </w:r>
+    </w:p>
+    <w:p>
+      <w:pPr>
+        <w:spacing w:before="0" w:after="120" w:line="300" w:lineRule="auto"/>
+        <w:ind w:firstLine="567"/>
+        <w:jc w:val="both"/>
+      </w:pPr>
+      <w:r>
+        <w:rPr>
+          <w:rFonts w:ascii="Times New Roman" w:hAnsi="Times New Roman" w:eastAsia="Times New Roman"/>
+          <w:sz w:val="26"/>
+        </w:rPr>
+        <w:t>Lý do chọn đề tài này là vì bài toán tìm đường có tính trực quan, dễ minh họa bằng bản đồ và animation, đồng thời đủ giàu để phân tích nhiều khái niệm cốt lõi trong môn Trí tuệ nhân tạo. DFS giúp hiểu tìm kiếm mù, A* cho thấy vai trò của heuristic, Simple Hill Climbing minh họa tối ưu cục bộ, AND-OR Search mô tả kế hoạch trong môi trường bất định, Forward Checking diễn giải xử lý ràng buộc, còn Alpha-Beta Pruning cho thấy cách ra quyết định khi có yếu tố đối kháng.</w:t>
+      </w:r>
+    </w:p>
+    <w:p>
+      <w:pPr>
+        <w:pStyle w:val="Heading2"/>
+        <w:spacing w:before="120" w:after="120"/>
+        <w:jc w:val="left"/>
+      </w:pPr>
+      <w:r>
+        <w:rPr>
+          <w:rFonts w:ascii="Times New Roman" w:hAnsi="Times New Roman" w:eastAsia="Times New Roman"/>
+          <w:b/>
+          <w:sz w:val="26"/>
+        </w:rPr>
+        <w:t>2. Phân tích PEAS của bài toán</w:t>
+      </w:r>
+    </w:p>
+    <w:p>
+      <w:pPr>
+        <w:spacing w:before="0" w:after="120" w:line="300" w:lineRule="auto"/>
+        <w:ind w:firstLine="567"/>
+        <w:jc w:val="both"/>
+      </w:pPr>
+      <w:r>
+        <w:rPr>
+          <w:rFonts w:ascii="Times New Roman" w:hAnsi="Times New Roman" w:eastAsia="Times New Roman"/>
+          <w:sz w:val="26"/>
+        </w:rPr>
+        <w:t>PEAS là khung phân tích gồm Performance measure, Environment, Actuators và Sensors. Đối với Find Your Path, PEAS giúp chuyển bài toán từ mô tả tự nhiên sang mô hình tác tử rõ ràng. Nhờ đó, người đọc có thể xác định hệ thống đang tối ưu điều gì, hoạt động trong môi trường nào, có thể thực hiện hành động gì và nhận thông tin từ nguồn nào.</w:t>
+      </w:r>
+    </w:p>
+    <w:p>
+      <w:pPr>
+        <w:spacing w:before="0" w:after="120" w:line="300" w:lineRule="auto"/>
+        <w:ind w:firstLine="567"/>
+        <w:jc w:val="both"/>
+      </w:pPr>
+      <w:r>
+        <w:rPr>
+          <w:rFonts w:ascii="Times New Roman" w:hAnsi="Times New Roman" w:eastAsia="Times New Roman"/>
+          <w:sz w:val="26"/>
+        </w:rPr>
+        <w:t>Performance measure của hệ thống là tập các tiêu chí đo chất lượng route và chất lượng quyết định. Tiêu chí cơ bản nhất là tổng chi phí đường đi, có thể được tính từ khoảng cách hoặc thời gian. Tuy nhiên, nếu chỉ tối thiểu hóa khoảng cách, hệ thống có thể chọn một route không phù hợp với bối cảnh giao hàng. Do đó, performance measure nên bao gồm thêm độ trễ so với deadline, số lần vi phạm ràng buộc, độ ổn định của route, số node đã mở rộng khi tìm kiếm và khả năng thích nghi khi môi trường thay đổi.</w:t>
+      </w:r>
+    </w:p>
+    <w:p>
+      <w:pPr>
+        <w:spacing w:before="0" w:after="120" w:line="300" w:lineRule="auto"/>
+        <w:ind w:firstLine="567"/>
+        <w:jc w:val="both"/>
+      </w:pPr>
+      <w:r>
+        <w:rPr>
+          <w:rFonts w:ascii="Times New Roman" w:hAnsi="Times New Roman" w:eastAsia="Times New Roman"/>
+          <w:sz w:val="26"/>
+        </w:rPr>
+        <w:t>Một hàm đánh giá tổng hợp có thể viết dưới dạng chi phí route gồm nhiều thành phần. Thành phần đầu tiên là chi phí di chuyển; thành phần thứ hai là phạt trễ hạn; thành phần thứ ba là phạt vi phạm capacity hoặc thứ tự phục vụ; thành phần cuối có thể là phạt rủi ro nếu route đi qua vùng có khả năng thay đổi cao. Công thức này không nhất thiết dùng nguyên xi trong mọi thuật toán, nhưng nó cho thấy cách chuyển mục tiêu thực tế thành giá trị định lượng.</w:t>
+      </w:r>
+    </w:p>
+    <w:p>
+      <w:pPr>
+        <w:spacing w:before="60" w:after="120"/>
+        <w:jc w:val="center"/>
+      </w:pPr>
+      <m:oMathPara>
+        <m:oMath>
+          <m:r>
+            <m:t>Cost(route)=</m:t>
+          </m:r>
+          <m:sSub>
+            <m:e>
+              <m:r>
+                <m:t>travel</m:t>
+              </m:r>
+            </m:e>
+            <m:sub>
+              <m:r>
+                <m:t>time</m:t>
+              </m:r>
+            </m:sub>
+          </m:sSub>
+          <m:r>
+            <m:t>+</m:t>
+          </m:r>
+          <m:sSub>
+            <m:e>
+              <m:r>
+                <m:t>late</m:t>
+              </m:r>
+            </m:e>
+            <m:sub>
+              <m:r>
+                <m:t>penalty</m:t>
+              </m:r>
+            </m:sub>
+          </m:sSub>
+          <m:r>
+            <m:t>+</m:t>
+          </m:r>
+          <m:sSub>
+            <m:e>
+              <m:r>
+                <m:t>constraint</m:t>
+              </m:r>
+            </m:e>
+            <m:sub>
+              <m:r>
+                <m:t>penalty</m:t>
+              </m:r>
+            </m:sub>
+          </m:sSub>
+          <m:r>
+            <m:t>+</m:t>
+          </m:r>
+          <m:sSub>
+            <m:e>
+              <m:r>
+                <m:t>risk</m:t>
+              </m:r>
+            </m:e>
+            <m:sub>
+              <m:r>
+                <m:t>penalty</m:t>
+              </m:r>
+            </m:sub>
+          </m:sSub>
+        </m:oMath>
+      </m:oMathPara>
+    </w:p>
+    <w:p>
+      <w:pPr>
+        <w:spacing w:before="0" w:after="120" w:line="300" w:lineRule="auto"/>
+        <w:ind w:firstLine="567"/>
+        <w:jc w:val="both"/>
+      </w:pPr>
+      <w:r>
+        <w:rPr>
+          <w:rFonts w:ascii="Times New Roman" w:hAnsi="Times New Roman" w:eastAsia="Times New Roman"/>
+          <w:sz w:val="26"/>
+        </w:rPr>
+        <w:t>Environment là môi trường đô thị được biểu diễn bằng đồ thị có trọng số. Node có thể là giao điểm, depot, vị trí shipper, điểm lấy hàng hoặc điểm giao hàng. Cạnh biểu diễn đoạn đường có thể đi qua, kèm chi phí di chuyển. Môi trường này có thể được xem là rời rạc vì trạng thái được biểu diễn bằng node và cạnh, nhưng vẫn có yếu tố động nếu chi phí cạnh thay đổi theo thời gian hoặc nếu một đoạn đường bất ngờ không còn khả dụng.</w:t>
+      </w:r>
+    </w:p>
+    <w:p>
+      <w:pPr>
+        <w:spacing w:before="0" w:after="120" w:line="300" w:lineRule="auto"/>
+        <w:ind w:firstLine="567"/>
+        <w:jc w:val="both"/>
+      </w:pPr>
+      <w:r>
+        <w:rPr>
+          <w:rFonts w:ascii="Times New Roman" w:hAnsi="Times New Roman" w:eastAsia="Times New Roman"/>
+          <w:sz w:val="26"/>
+        </w:rPr>
+        <w:t>Môi trường của Find Your Path không hoàn toàn quan sát được trong mọi tình huống. Ở mức đơn giản, hệ thống biết toàn bộ graph trước khi tìm đường. Ở mức thực tế hơn, hệ thống chỉ biết một phần thông tin hoặc chỉ cập nhật khi shipper tiến đến gần một khu vực. Đây là lý do báo cáo có nhóm môi trường phức tạp với AND-OR Search, vì tác tử cần chuẩn bị kế hoạch khi hành động có nhiều kết quả khả dĩ.</w:t>
+      </w:r>
+    </w:p>
+    <w:p>
+      <w:pPr>
+        <w:spacing w:before="0" w:after="120" w:line="300" w:lineRule="auto"/>
+        <w:ind w:firstLine="567"/>
+        <w:jc w:val="both"/>
+      </w:pPr>
+      <w:r>
+        <w:rPr>
+          <w:rFonts w:ascii="Times New Roman" w:hAnsi="Times New Roman" w:eastAsia="Times New Roman"/>
+          <w:sz w:val="26"/>
+        </w:rPr>
+        <w:t>Actuators là các hành động mà tác tử hoặc hệ thống có thể thực hiện. Ở mức tìm đường, actuator là hành động chọn node kế tiếp từ tập node kề. Ở mức lập kế hoạch giao hàng, actuator bao gồm chọn đơn kế tiếp, đổi thứ tự route, gán đơn cho shipper hoặc loại bỏ phương án không hợp lệ. Ở mức mô phỏng đối kháng, actuator có thể là chọn phương án có utility cao nhất trong khi môi trường chọn phản ứng bất lợi.</w:t>
+      </w:r>
+    </w:p>
+    <w:p>
+      <w:pPr>
+        <w:spacing w:before="0" w:after="120" w:line="300" w:lineRule="auto"/>
+        <w:ind w:firstLine="567"/>
+        <w:jc w:val="both"/>
+      </w:pPr>
+      <w:r>
+        <w:rPr>
+          <w:rFonts w:ascii="Times New Roman" w:hAnsi="Times New Roman" w:eastAsia="Times New Roman"/>
+          <w:sz w:val="26"/>
+        </w:rPr>
+        <w:t>Sensors là nguồn thông tin giúp tác tử nhận biết trạng thái. Trong dự án phần mềm, sensor không nhất thiết là cảm biến vật lý, mà là dữ liệu vị trí, bản đồ, trạng thái đơn hàng, trọng số cạnh, thông tin tắc đường hoặc phản hồi từ quá trình mô phỏng. Sensor quyết định chất lượng của belief hiện tại, từ đó ảnh hưởng trực tiếp đến thuật toán tìm kiếm và thuật toán lập kế hoạch.</w:t>
+      </w:r>
+    </w:p>
+    <w:p>
+      <w:pPr>
+        <w:spacing w:before="0" w:after="120" w:line="300" w:lineRule="auto"/>
+        <w:ind w:firstLine="567"/>
+        <w:jc w:val="both"/>
+      </w:pPr>
+      <w:r>
+        <w:rPr>
+          <w:rFonts w:ascii="Times New Roman" w:hAnsi="Times New Roman" w:eastAsia="Times New Roman"/>
+          <w:sz w:val="26"/>
+        </w:rPr>
+        <w:t>Nếu xét theo đặc điểm môi trường trong AI, Find Your Path có thể là single-agent ở phiên bản tìm đường, nhưng trở thành multi-agent hoặc adversarial nếu xét nhiều shipper hoặc yếu tố môi trường bất lợi. Bài toán có thể deterministic khi mỗi hành động dẫn đến một kết quả chắc chắn, nhưng có thể nondeterministic khi đường đi có thể bị chặn hoặc chi phí cạnh thay đổi. Bài toán có thể static trong graph cố định, nhưng dynamic khi dữ liệu cập nhật theo thời gian.</w:t>
+      </w:r>
+    </w:p>
+    <w:p>
+      <w:pPr>
+        <w:spacing w:before="0" w:after="120" w:line="300" w:lineRule="auto"/>
+        <w:ind w:firstLine="567"/>
+        <w:jc w:val="both"/>
+      </w:pPr>
+      <w:r>
+        <w:rPr>
+          <w:rFonts w:ascii="Times New Roman" w:hAnsi="Times New Roman" w:eastAsia="Times New Roman"/>
+          <w:sz w:val="26"/>
+        </w:rPr>
+        <w:t>Phân tích PEAS cho thấy không nên chọn thuật toán chỉ dựa trên tên bài toán. Nếu chỉ cần tìm đường trên graph đã biết, A* là lựa chọn rất mạnh. Nếu chỉ cần minh họa tìm kiếm mù, DFS đủ rõ ràng. Nếu cần cải thiện route nhiều điểm, Simple Hill Climbing có ý nghĩa. Nếu route chịu ràng buộc, Forward Checking phù hợp. Nếu có outcome bất định, AND-OR Search giúp biểu diễn conditional plan. Nếu cần phân tích phản ứng bất lợi, Alpha-Beta Pruning là công cụ thích hợp.</w:t>
+      </w:r>
+    </w:p>
+    <w:p>
+      <w:pPr>
+        <w:pStyle w:val="Heading1"/>
+        <w:pageBreakBefore/>
+        <w:spacing w:before="0" w:after="120"/>
+        <w:jc w:val="left"/>
+      </w:pPr>
+      <w:r>
+        <w:rPr>
+          <w:rFonts w:ascii="Times New Roman" w:hAnsi="Times New Roman" w:eastAsia="Times New Roman"/>
+          <w:b/>
+          <w:sz w:val="26"/>
+        </w:rPr>
+        <w:t>II. Thuật toán áp dụng</w:t>
+      </w:r>
+    </w:p>
+    <w:p>
+      <w:pPr>
+        <w:spacing w:before="0" w:after="120" w:line="300" w:lineRule="auto"/>
+        <w:ind w:firstLine="567"/>
+        <w:jc w:val="both"/>
+      </w:pPr>
+      <w:r>
+        <w:rPr>
+          <w:rFonts w:ascii="Times New Roman" w:hAnsi="Times New Roman" w:eastAsia="Times New Roman"/>
+          <w:sz w:val="26"/>
+        </w:rPr>
+        <w:t>Phần này chọn một thuật toán đại diện cho mỗi nhóm kiến thức. Thứ tự trình bày là DFS, A*, Simple Hill Climbing, AND-OR Search, Forward Checking và Alpha-Beta Pruning. Mỗi mục được viết như một tiểu mục nghiên cứu độc lập, tập trung vào bản chất thuật toán và cách thuật toán đóng góp cho bài toán Find Your Path.</w:t>
+      </w:r>
+    </w:p>
+    <w:p>
+      <w:pPr>
+        <w:spacing w:before="0" w:after="120" w:line="300" w:lineRule="auto"/>
+        <w:ind w:firstLine="567"/>
+        <w:jc w:val="both"/>
+      </w:pPr>
+      <w:r>
+        <w:rPr>
+          <w:rFonts w:ascii="Times New Roman" w:hAnsi="Times New Roman" w:eastAsia="Times New Roman"/>
+          <w:sz w:val="26"/>
+        </w:rPr>
+        <w:t>Các ký hiệu dùng chung gồm b là hệ số phân nhánh trung bình, d là độ sâu nghiệm nông nhất, m là độ sâu tối đa, n là số biến trong bài toán ràng buộc, d_c là kích thước miền giá trị của biến CSP và k là số outcome trung bình của một hành động trong môi trường bất định.</w:t>
+      </w:r>
+    </w:p>
+    <w:p>
+      <w:pPr>
+        <w:pStyle w:val="Heading2"/>
+        <w:spacing w:before="120" w:after="120"/>
+        <w:jc w:val="left"/>
+      </w:pPr>
+      <w:r>
+        <w:rPr>
+          <w:rFonts w:ascii="Times New Roman" w:hAnsi="Times New Roman" w:eastAsia="Times New Roman"/>
+          <w:b/>
+          <w:sz w:val="26"/>
+        </w:rPr>
         <w:t>1. Nhóm tìm kiếm không thông tin: Depth-First Search (DFS)</w:t>
       </w:r>
     </w:p>
     <w:p>
-      <w:pPr/>
-      <w:r>
-        <w:t>DFS bắt đầu từ node xuất phát và ưu tiên mở rộng sâu theo một nhánh trước khi quay lui. Trạng thái bắt đầu gồm node hiện tại, tập visited và stack hoặc ngăn xếp lời gọi đệ quy. Trạng thái mục tiêu đạt được khi node đang xét trùng với điểm cần đến hoặc khi một chuỗi hành động thỏa điều kiện kết thúc của bài toán.</w:t>
-      </w:r>
-    </w:p>
-    <w:p>
-      <w:pPr/>
-      <w:r>
-        <w:t>Các bước chính của DFS gồm đưa trạng thái đầu vào stack, lấy trạng thái trên cùng ra để kiểm tra, mở rộng các node kề chưa thăm, rồi lặp lại cho đến khi tìm thấy mục tiêu hoặc không còn trạng thái để xét. Trong Find Your Path, DFS phù hợp để minh họa cơ chế duyệt không gian trạng thái và kiểm thử kết nối graph, nhưng không phải lựa chọn tối ưu cho tìm đường có trọng số.</w:t>
-      </w:r>
-    </w:p>
-    <w:p>
-      <w:pPr/>
-      <w:r>
-        <w:t>DFS không dùng heuristic hay hàm chi phí để chọn node; thứ tự mở rộng phụ thuộc vào thứ tự liệt kê node kề. Thuật toán đầy đủ trên graph hữu hạn nếu có đánh dấu visited hoặc giới hạn độ sâu, nhưng không đầy đủ trong không gian vô hạn nếu đi vào nhánh vô tận. DFS không tối ưu vì nghiệm đầu tiên chưa chắc là đường đi ngắn nhất hoặc rẻ nhất. Độ phức tạp thời gian trong trường hợp xấu là O(b^m), trong khi không gian thường là O(bm) hoặc O(m) nếu cài đặt đệ quy với từng nhánh.</w:t>
+      <w:pPr>
+        <w:spacing w:before="0" w:after="120" w:line="300" w:lineRule="auto"/>
+        <w:ind w:firstLine="567"/>
+        <w:jc w:val="both"/>
+      </w:pPr>
+      <w:r>
+        <w:rPr>
+          <w:rFonts w:ascii="Times New Roman" w:hAnsi="Times New Roman" w:eastAsia="Times New Roman"/>
+          <w:sz w:val="26"/>
+        </w:rPr>
+        <w:t>Thuật toán DFS được chọn vì nó thể hiện rõ cách một tác tử có thể tìm kiếm khi chưa có heuristic. Trong phạm vi báo cáo, thuật toán không chỉ được mô tả như một đoạn mã, mà được phân tích theo cách hình thành trạng thái, cách chọn hành động, tiêu chí dừng, độ phức tạp và mức độ phù hợp với Find Your Path. Cách trình bày này giúp liên hệ trực tiếp giữa lý thuyết học trên lớp và quyết định thiết kế trong dự án.</w:t>
+      </w:r>
+    </w:p>
+    <w:p>
+      <w:pPr>
+        <w:spacing w:before="0" w:after="120" w:line="300" w:lineRule="auto"/>
+        <w:ind w:firstLine="567"/>
+        <w:jc w:val="both"/>
+      </w:pPr>
+      <w:r>
+        <w:rPr>
+          <w:rFonts w:ascii="Times New Roman" w:hAnsi="Times New Roman" w:eastAsia="Times New Roman"/>
+          <w:sz w:val="26"/>
+        </w:rPr>
+        <w:t>DFS bắt đầu từ trạng thái xuất phát và ưu tiên mở rộng sâu theo một nhánh trước khi xét các nhánh còn lại. Nếu cài đặt bằng stack, node được thêm sau sẽ được lấy ra trước; nếu cài đặt bằng đệ quy, lời gọi hiện tại tiếp tục đi sâu cho đến khi gặp mục tiêu, hết node kề hoặc cần quay lui. Chính đặc điểm đi sâu này làm DFS khác với các thuật toán mở rộng theo lớp.</w:t>
+      </w:r>
+    </w:p>
+    <w:p>
+      <w:pPr>
+        <w:spacing w:before="0" w:after="120" w:line="300" w:lineRule="auto"/>
+        <w:ind w:firstLine="567"/>
+        <w:jc w:val="both"/>
+      </w:pPr>
+      <w:r>
+        <w:rPr>
+          <w:rFonts w:ascii="Times New Roman" w:hAnsi="Times New Roman" w:eastAsia="Times New Roman"/>
+          <w:sz w:val="26"/>
+        </w:rPr>
+        <w:t>Trong Find Your Path, trạng thái của DFS có thể được biểu diễn bằng node hiện tại, tập node đã thăm, parent map và stack đang chờ xét. Trạng thái bắt đầu là vị trí xuất phát của shipper. Trạng thái mục tiêu là node đích hoặc một điều kiện hoàn thành route. Khi mở rộng một node, DFS duyệt các node kề chưa được thăm, thêm chúng vào stack và lưu quan hệ parent để có thể truy vết đường đi nếu tìm thấy mục tiêu.</w:t>
+      </w:r>
+    </w:p>
+    <w:p>
+      <w:pPr>
+        <w:spacing w:before="0" w:after="120" w:line="300" w:lineRule="auto"/>
+        <w:ind w:firstLine="567"/>
+        <w:jc w:val="both"/>
+      </w:pPr>
+      <w:r>
+        <w:rPr>
+          <w:rFonts w:ascii="Times New Roman" w:hAnsi="Times New Roman" w:eastAsia="Times New Roman"/>
+          <w:sz w:val="26"/>
+        </w:rPr>
+        <w:t>Ưu điểm quan trọng của DFS là đơn giản và tiết kiệm bộ nhớ. Thuật toán không cần hàng đợi ưu tiên, không cần heuristic và không cần lưu toàn bộ frontier theo từng lớp. Vì vậy, DFS phù hợp để kiểm tra tính liên thông của graph, phát hiện một path bất kỳ và minh họa trực quan quá trình duyệt trạng thái. Trong báo cáo cuối kỳ, DFS cũng là nền tảng giúp người đọc hiểu sự khác biệt giữa tìm kiếm mù và tìm kiếm có thông tin.</w:t>
+      </w:r>
+    </w:p>
+    <w:p>
+      <w:pPr>
+        <w:spacing w:before="0" w:after="120" w:line="300" w:lineRule="auto"/>
+        <w:ind w:firstLine="567"/>
+        <w:jc w:val="both"/>
+      </w:pPr>
+      <w:r>
+        <w:rPr>
+          <w:rFonts w:ascii="Times New Roman" w:hAnsi="Times New Roman" w:eastAsia="Times New Roman"/>
+          <w:sz w:val="26"/>
+        </w:rPr>
+        <w:t>Tuy nhiên, DFS không phù hợp để tìm đường tối ưu trong graph có trọng số. Nếu node kề được liệt kê theo thứ tự không tốt, DFS có thể đi rất sâu vào một nhánh dài trước khi xét nhánh ngắn hơn. Trong bản đồ giao thông, điều này có nghĩa thuật toán có thể tìm được một route hợp lệ nhưng route đó không ngắn, không rẻ và không phản ánh tiêu chí tối ưu thực tế.</w:t>
+      </w:r>
+    </w:p>
+    <w:p>
+      <w:pPr>
+        <w:spacing w:before="0" w:after="120" w:line="300" w:lineRule="auto"/>
+        <w:ind w:firstLine="567"/>
+        <w:jc w:val="both"/>
+      </w:pPr>
+      <w:r>
+        <w:rPr>
+          <w:rFonts w:ascii="Times New Roman" w:hAnsi="Times New Roman" w:eastAsia="Times New Roman"/>
+          <w:sz w:val="26"/>
+        </w:rPr>
+        <w:t>Bốn tính chất của DFS cần được đánh giá cẩn thận. Về tính đầy đủ, DFS không đầy đủ trong không gian vô hạn hoặc khi graph có chu trình mà không có cơ chế visited hay depth limit. Trong graph hữu hạn có kiểm soát visited, DFS có thể tìm thấy nghiệm nếu nghiệm tồn tại. Về tính tối ưu, DFS không bảo đảm tối ưu vì nghiệm đầu tiên phụ thuộc vào thứ tự duyệt. Về thời gian, trường hợp xấu là O(b^m). Về không gian, DFS thường tốt hơn BFS, khoảng O(bm) hoặc O(m) tùy cách cài đặt.</w:t>
+      </w:r>
+    </w:p>
+    <w:p>
+      <w:pPr>
+        <w:spacing w:before="0" w:after="120" w:line="300" w:lineRule="auto"/>
+        <w:ind w:firstLine="567"/>
+        <w:jc w:val="both"/>
+      </w:pPr>
+      <w:r>
+        <w:rPr>
+          <w:rFonts w:ascii="Times New Roman" w:hAnsi="Times New Roman" w:eastAsia="Times New Roman"/>
+          <w:sz w:val="26"/>
+        </w:rPr>
+        <w:t>Khi áp dụng vào Find Your Path, DFS nên được xem là thuật toán nền để giải thích không gian trạng thái, không nên được quảng bá như thuật toán tìm tuyến chính. Giá trị của DFS nằm ở khả năng minh họa quá trình mở rộng, quay lui và đánh dấu visited. Nếu demo có animation, DFS có thể cho thấy rất rõ vì sao một thuật toán không dùng heuristic dễ đi vào nhánh không hiệu quả.</w:t>
+      </w:r>
+    </w:p>
+    <w:p>
+      <w:pPr>
+        <w:spacing w:before="60" w:after="120"/>
+        <w:jc w:val="center"/>
+      </w:pPr>
+      <m:oMathPara>
+        <m:oMath>
+          <m:r>
+            <m:t>Time(DFS)=O(</m:t>
+          </m:r>
+          <m:sSup>
+            <m:e>
+              <m:r>
+                <m:t>b</m:t>
+              </m:r>
+            </m:e>
+            <m:sup>
+              <m:r>
+                <m:t>m</m:t>
+              </m:r>
+            </m:sup>
+          </m:sSup>
+          <m:r>
+            <m:t>)</m:t>
+          </m:r>
+        </m:oMath>
+      </m:oMathPara>
+    </w:p>
+    <w:p>
+      <w:pPr>
+        <w:spacing w:before="60" w:after="120"/>
+        <w:jc w:val="center"/>
+      </w:pPr>
+      <m:oMathPara>
+        <m:oMath>
+          <m:r>
+            <m:t>Space(DFS)=O(bm)</m:t>
+          </m:r>
+        </m:oMath>
+      </m:oMathPara>
+    </w:p>
+    <w:p>
+      <w:pPr>
+        <w:spacing w:before="0" w:after="120" w:line="300" w:lineRule="auto"/>
+        <w:ind w:firstLine="567"/>
+        <w:jc w:val="both"/>
+      </w:pPr>
+      <w:r>
+        <w:rPr>
+          <w:rFonts w:ascii="Times New Roman" w:hAnsi="Times New Roman" w:eastAsia="Times New Roman"/>
+          <w:sz w:val="26"/>
+        </w:rPr>
+        <w:t>Trong vấn đáp, điểm cần nhấn mạnh là DFS không sai chỉ vì nó không tối ưu. Nó trả lời một câu hỏi khác: liệu có thể tìm một đường đi bằng cách khám phá sâu hay không. Còn nếu câu hỏi là route nào tốt nhất theo chi phí, ta cần thuật toán khác, điển hình là A* trong nhóm tìm kiếm có thông tin.</w:t>
+      </w:r>
+    </w:p>
+    <w:p>
+      <w:pPr>
+        <w:spacing w:before="0" w:after="120" w:line="300" w:lineRule="auto"/>
+        <w:ind w:firstLine="567"/>
+        <w:jc w:val="both"/>
+      </w:pPr>
+      <w:r>
+        <w:rPr>
+          <w:rFonts w:ascii="Times New Roman" w:hAnsi="Times New Roman" w:eastAsia="Times New Roman"/>
+          <w:sz w:val="26"/>
+        </w:rPr>
+        <w:t>Nếu so với các thuật toán khác trong báo cáo, DFS có vai trò thấp tầng nhất. Nó không dùng hàm đánh giá, không xử lý ràng buộc phức tạp, không mô hình hóa bất định và không xét đối kháng. Chính vì vậy, DFS rất phù hợp để mở đầu phần thuật toán: từ một kỹ thuật đơn giản, báo cáo dần phát triển sang các kỹ thuật giàu thông tin và giàu mô hình hơn.</w:t>
       </w:r>
     </w:p>
     <w:p>
       <w:pPr>
         <w:pStyle w:val="Heading2"/>
-      </w:pPr>
-      <w:r>
+        <w:spacing w:before="120" w:after="120"/>
+        <w:jc w:val="left"/>
+      </w:pPr>
+      <w:r>
+        <w:rPr>
+          <w:rFonts w:ascii="Times New Roman" w:hAnsi="Times New Roman" w:eastAsia="Times New Roman"/>
+          <w:b/>
+          <w:sz w:val="26"/>
+        </w:rPr>
         <w:t>2. Nhóm tìm kiếm có thông tin: A*</w:t>
       </w:r>
     </w:p>
     <w:p>
-      <w:pPr/>
-      <w:r>
-        <w:t>A* sử dụng cả chi phí đã đi và chi phí ước lượng còn lại để quyết định node nào nên được mở rộng tiếp theo. Trạng thái bắt đầu gồm node xuất phát, open set, closed set, g-score và parent map. Trạng thái mục tiêu đạt được khi node đích được lấy ra khỏi open set với chi phí tốt nhất theo hàm đánh giá.</w:t>
-      </w:r>
-    </w:p>
-    <w:p>
-      <w:pPr>
+      <w:pPr>
+        <w:spacing w:before="0" w:after="120" w:line="300" w:lineRule="auto"/>
+        <w:ind w:firstLine="567"/>
+        <w:jc w:val="both"/>
+      </w:pPr>
+      <w:r>
+        <w:rPr>
+          <w:rFonts w:ascii="Times New Roman" w:hAnsi="Times New Roman" w:eastAsia="Times New Roman"/>
+          <w:sz w:val="26"/>
+        </w:rPr>
+        <w:t>Thuật toán A* được chọn vì nó là thuật toán tìm đường có heuristic phù hợp nhất với bản chất bản đồ của dự án. Trong phạm vi báo cáo, thuật toán không chỉ được mô tả như một đoạn mã, mà được phân tích theo cách hình thành trạng thái, cách chọn hành động, tiêu chí dừng, độ phức tạp và mức độ phù hợp với Find Your Path. Cách trình bày này giúp liên hệ trực tiếp giữa lý thuyết học trên lớp và quyết định thiết kế trong dự án.</w:t>
+      </w:r>
+    </w:p>
+    <w:p>
+      <w:pPr>
+        <w:spacing w:before="0" w:after="120" w:line="300" w:lineRule="auto"/>
+        <w:ind w:firstLine="567"/>
+        <w:jc w:val="both"/>
+      </w:pPr>
+      <w:r>
+        <w:rPr>
+          <w:rFonts w:ascii="Times New Roman" w:hAnsi="Times New Roman" w:eastAsia="Times New Roman"/>
+          <w:sz w:val="26"/>
+        </w:rPr>
+        <w:t>A* kết hợp hai nguồn thông tin: chi phí thật đã đi từ điểm xuất phát đến node hiện tại và chi phí ước lượng từ node hiện tại đến mục tiêu. Thay vì mở rộng node theo thứ tự mù, A* ưu tiên node có tổng chi phí dự kiến thấp nhất. Đây là lý do A* thường được dùng trong các bài toán tìm đường trên bản đồ, game, robot và hệ thống định tuyến.</w:t>
+      </w:r>
+    </w:p>
+    <w:p>
+      <w:pPr>
+        <w:spacing w:before="60" w:after="120"/>
         <w:jc w:val="center"/>
       </w:pPr>
       <m:oMathPara>
@@ -1609,33 +2047,251 @@
       </m:oMathPara>
     </w:p>
     <w:p>
-      <w:pPr/>
-      <w:r>
-        <w:t>Trong công thức trên, g(n) là chi phí thực tế từ trạng thái bắt đầu đến node n, còn h(n) là heuristic ước lượng từ n đến mục tiêu. Với bản đồ giao thông, h(n) có thể là khoảng cách Euclid hoặc Manhattan nếu phù hợp với cách biểu diễn tọa độ. A* mở rộng node có f(n) nhỏ nhất, cập nhật parent khi tìm được đường rẻ hơn và truy vết parent map để tạo route cuối cùng.</w:t>
-      </w:r>
-    </w:p>
-    <w:p>
-      <w:pPr/>
-      <w:r>
-        <w:t>A* đầy đủ khi hệ số phân nhánh hữu hạn, chi phí cạnh dương và tồn tại nghiệm. Thuật toán tối ưu nếu heuristic admissible, tức không đánh giá quá cao chi phí thật còn lại; nếu heuristic consistent, việc triển khai càng ổn định vì không cần mở lại node đã đóng trong nhiều trường hợp. Độ phức tạp thời gian và không gian có thể tăng theo O(b^d) trong trường hợp xấu, nhưng trên bản đồ thực tế A* thường hiệu quả hơn tìm kiếm mù nhờ heuristic định hướng.</w:t>
+      <w:pPr>
+        <w:spacing w:before="0" w:after="120" w:line="300" w:lineRule="auto"/>
+        <w:ind w:firstLine="567"/>
+        <w:jc w:val="both"/>
+      </w:pPr>
+      <w:r>
+        <w:rPr>
+          <w:rFonts w:ascii="Times New Roman" w:hAnsi="Times New Roman" w:eastAsia="Times New Roman"/>
+          <w:sz w:val="26"/>
+        </w:rPr>
+        <w:t>Trong công thức trên, g(n) là chi phí thực tế từ start đến n, còn h(n) là heuristic ước lượng chi phí từ n đến goal. Nếu graph dùng tọa độ, h(n) có thể là khoảng cách Euclid hoặc Manhattan. Nếu graph biểu diễn thời gian di chuyển, heuristic cần được thiết kế sao cho không đánh giá quá cao chi phí thật nếu muốn bảo đảm tối ưu.</w:t>
+      </w:r>
+    </w:p>
+    <w:p>
+      <w:pPr>
+        <w:spacing w:before="60" w:after="120"/>
+        <w:jc w:val="center"/>
+      </w:pPr>
+      <m:oMathPara>
+        <m:oMath>
+          <m:sSub>
+            <m:e>
+              <m:r>
+                <m:t>h</m:t>
+              </m:r>
+            </m:e>
+            <m:sub>
+              <m:r>
+                <m:t>E</m:t>
+              </m:r>
+            </m:sub>
+          </m:sSub>
+          <m:r>
+            <m:t>(n)=</m:t>
+          </m:r>
+          <m:r>
+            <m:t>sqrt((</m:t>
+          </m:r>
+          <m:sSub>
+            <m:e>
+              <m:r>
+                <m:t>x</m:t>
+              </m:r>
+            </m:e>
+            <m:sub>
+              <m:r>
+                <m:t>n</m:t>
+              </m:r>
+            </m:sub>
+          </m:sSub>
+          <m:r>
+            <m:t>-</m:t>
+          </m:r>
+          <m:sSub>
+            <m:e>
+              <m:r>
+                <m:t>x</m:t>
+              </m:r>
+            </m:e>
+            <m:sub>
+              <m:r>
+                <m:t>g</m:t>
+              </m:r>
+            </m:sub>
+          </m:sSub>
+          <m:r>
+            <m:t>)^2+(</m:t>
+          </m:r>
+          <m:sSub>
+            <m:e>
+              <m:r>
+                <m:t>y</m:t>
+              </m:r>
+            </m:e>
+            <m:sub>
+              <m:r>
+                <m:t>n</m:t>
+              </m:r>
+            </m:sub>
+          </m:sSub>
+          <m:r>
+            <m:t>-</m:t>
+          </m:r>
+          <m:sSub>
+            <m:e>
+              <m:r>
+                <m:t>y</m:t>
+              </m:r>
+            </m:e>
+            <m:sub>
+              <m:r>
+                <m:t>g</m:t>
+              </m:r>
+            </m:sub>
+          </m:sSub>
+          <m:r>
+            <m:t>)^2)</m:t>
+          </m:r>
+        </m:oMath>
+      </m:oMathPara>
+    </w:p>
+    <w:p>
+      <w:pPr>
+        <w:spacing w:before="0" w:after="120" w:line="300" w:lineRule="auto"/>
+        <w:ind w:firstLine="567"/>
+        <w:jc w:val="both"/>
+      </w:pPr>
+      <w:r>
+        <w:rPr>
+          <w:rFonts w:ascii="Times New Roman" w:hAnsi="Times New Roman" w:eastAsia="Times New Roman"/>
+          <w:sz w:val="26"/>
+        </w:rPr>
+        <w:t>Trạng thái bắt đầu của A* gồm node xuất phát, open set chứa node đang chờ xét, closed set chứa node đã xử lý, bảng g-score và parent map. Ở mỗi bước, thuật toán lấy node có f(n) nhỏ nhất ra khỏi open set. Nếu node đó là goal, thuật toán truy vết parent map để trả route. Nếu chưa phải goal, thuật toán xét các node kề, cập nhật g-score nếu tìm thấy đường rẻ hơn và đưa node kề vào open set.</w:t>
+      </w:r>
+    </w:p>
+    <w:p>
+      <w:pPr>
+        <w:spacing w:before="0" w:after="120" w:line="300" w:lineRule="auto"/>
+        <w:ind w:firstLine="567"/>
+        <w:jc w:val="both"/>
+      </w:pPr>
+      <w:r>
+        <w:rPr>
+          <w:rFonts w:ascii="Times New Roman" w:hAnsi="Times New Roman" w:eastAsia="Times New Roman"/>
+          <w:sz w:val="26"/>
+        </w:rPr>
+        <w:t>Trong Find Your Path, A* có vai trò trung tâm vì bài toán có đích rõ ràng, graph có trọng số và có thể sử dụng heuristic địa lý. So với DFS, A* không đi sâu tùy ý mà có định hướng. So với thuật toán chỉ dùng heuristic như Greedy Best-First Search, A* không bỏ qua chi phí đã đi, nhờ đó cân bằng giữa tham vọng đi gần goal và thực tế chi phí trên đường.</w:t>
+      </w:r>
+    </w:p>
+    <w:p>
+      <w:pPr>
+        <w:spacing w:before="0" w:after="120" w:line="300" w:lineRule="auto"/>
+        <w:ind w:firstLine="567"/>
+        <w:jc w:val="both"/>
+      </w:pPr>
+      <w:r>
+        <w:rPr>
+          <w:rFonts w:ascii="Times New Roman" w:hAnsi="Times New Roman" w:eastAsia="Times New Roman"/>
+          <w:sz w:val="26"/>
+        </w:rPr>
+        <w:t>Về bốn tính chất, A* đầy đủ nếu hệ số phân nhánh hữu hạn, chi phí cạnh dương và tồn tại nghiệm. A* tối ưu khi heuristic admissible, tức không bao giờ đánh giá quá cao chi phí thật còn lại. Nếu heuristic consistent, giá trị f dọc theo đường đi không giảm bất thường, giúp triển khai ổn định hơn. Trong trường hợp xấu, thời gian và không gian của A* vẫn có thể là O(b^d), vì thuật toán có thể phải lưu và xét rất nhiều node.</w:t>
+      </w:r>
+    </w:p>
+    <w:p>
+      <w:pPr>
+        <w:spacing w:before="0" w:after="120" w:line="300" w:lineRule="auto"/>
+        <w:ind w:firstLine="567"/>
+        <w:jc w:val="both"/>
+      </w:pPr>
+      <w:r>
+        <w:rPr>
+          <w:rFonts w:ascii="Times New Roman" w:hAnsi="Times New Roman" w:eastAsia="Times New Roman"/>
+          <w:sz w:val="26"/>
+        </w:rPr>
+        <w:t>Điểm mạnh của A* là tính thực dụng. Trong demo Find Your Path, A* cho phép hiển thị rõ open set, closed set, đường đi tạm thời và đường đi cuối cùng. Khi thay đổi heuristic, có thể quan sát số node mở rộng thay đổi như thế nào. Đây là minh chứng trực quan cho vai trò của tri thức bổ sung trong tìm kiếm có thông tin.</w:t>
+      </w:r>
+    </w:p>
+    <w:p>
+      <w:pPr>
+        <w:spacing w:before="0" w:after="120" w:line="300" w:lineRule="auto"/>
+        <w:ind w:firstLine="567"/>
+        <w:jc w:val="both"/>
+      </w:pPr>
+      <w:r>
+        <w:rPr>
+          <w:rFonts w:ascii="Times New Roman" w:hAnsi="Times New Roman" w:eastAsia="Times New Roman"/>
+          <w:sz w:val="26"/>
+        </w:rPr>
+        <w:t>Điểm yếu của A* là tiêu thụ bộ nhớ lớn và phụ thuộc vào chất lượng heuristic. Nếu heuristic quá yếu, A* gần giống Dijkstra và mở rộng nhiều node. Nếu heuristic không admissible, thuật toán có thể nhanh hơn nhưng mất bảo đảm tối ưu. Vì vậy, trong báo cáo cần nêu rõ điều kiện để A* tối ưu thay vì chỉ khẳng định A* luôn tìm đường tốt nhất.</w:t>
+      </w:r>
+    </w:p>
+    <w:p>
+      <w:pPr>
+        <w:spacing w:before="0" w:after="120" w:line="300" w:lineRule="auto"/>
+        <w:ind w:firstLine="567"/>
+        <w:jc w:val="both"/>
+      </w:pPr>
+      <w:r>
+        <w:rPr>
+          <w:rFonts w:ascii="Times New Roman" w:hAnsi="Times New Roman" w:eastAsia="Times New Roman"/>
+          <w:sz w:val="26"/>
+        </w:rPr>
+        <w:t>Khi vấn đáp, có thể giải thích rằng A* trong dự án không chỉ là công thức f(n)=g(n)+h(n). Điều quan trọng là cách hệ thống cập nhật g-score, cách chọn node có f nhỏ nhất, cách lưu parent để dựng route và cách kiểm soát heuristic để không phá vỡ tính tối ưu. Đây là những điểm cho thấy nhóm hiểu thuật toán ở mức triển khai, không chỉ thuộc định nghĩa.</w:t>
       </w:r>
     </w:p>
     <w:p>
       <w:pPr>
         <w:pStyle w:val="Heading2"/>
-      </w:pPr>
-      <w:r>
+        <w:spacing w:before="120" w:after="120"/>
+        <w:jc w:val="left"/>
+      </w:pPr>
+      <w:r>
+        <w:rPr>
+          <w:rFonts w:ascii="Times New Roman" w:hAnsi="Times New Roman" w:eastAsia="Times New Roman"/>
+          <w:b/>
+          <w:sz w:val="26"/>
+        </w:rPr>
         <w:t>3. Nhóm tìm kiếm cục bộ: Simple Hill Climbing</w:t>
       </w:r>
     </w:p>
     <w:p>
-      <w:pPr/>
-      <w:r>
-        <w:t>Simple Hill Climbing xem lời giải như một cấu hình cần cải thiện dần. Trạng thái bắt đầu là một route hoặc thứ tự giao hàng ban đầu; trạng thái mục tiêu không nhất thiết là một node đích cố định mà là cấu hình không còn láng giềng nào tốt hơn theo hàm đánh giá. Thuật toán sinh một láng giềng, nếu láng giềng tốt hơn trạng thái hiện tại thì chuyển sang nó, ngược lại xét láng giềng khác hoặc dừng khi không tìm thấy cải thiện.</w:t>
-      </w:r>
-    </w:p>
-    <w:p>
-      <w:pPr>
+      <w:pPr>
+        <w:spacing w:before="0" w:after="120" w:line="300" w:lineRule="auto"/>
+        <w:ind w:firstLine="567"/>
+        <w:jc w:val="both"/>
+      </w:pPr>
+      <w:r>
+        <w:rPr>
+          <w:rFonts w:ascii="Times New Roman" w:hAnsi="Times New Roman" w:eastAsia="Times New Roman"/>
+          <w:sz w:val="26"/>
+        </w:rPr>
+        <w:t>Thuật toán Simple Hill Climbing được chọn vì nó minh họa rõ tư duy cải thiện lời giải cục bộ thay vì xây dựng toàn bộ cây tìm kiếm. Trong phạm vi báo cáo, thuật toán không chỉ được mô tả như một đoạn mã, mà được phân tích theo cách hình thành trạng thái, cách chọn hành động, tiêu chí dừng, độ phức tạp và mức độ phù hợp với Find Your Path. Cách trình bày này giúp liên hệ trực tiếp giữa lý thuyết học trên lớp và quyết định thiết kế trong dự án.</w:t>
+      </w:r>
+    </w:p>
+    <w:p>
+      <w:pPr>
+        <w:spacing w:before="0" w:after="120" w:line="300" w:lineRule="auto"/>
+        <w:ind w:firstLine="567"/>
+        <w:jc w:val="both"/>
+      </w:pPr>
+      <w:r>
+        <w:rPr>
+          <w:rFonts w:ascii="Times New Roman" w:hAnsi="Times New Roman" w:eastAsia="Times New Roman"/>
+          <w:sz w:val="26"/>
+        </w:rPr>
+        <w:t>Simple Hill Climbing bắt đầu từ một lời giải ứng viên và liên tục tìm lời giải láng giềng tốt hơn. Khác với A*, thuật toán không nhất thiết tìm từ start đến goal trên graph. Nó xem toàn bộ route hoặc thứ tự giao hàng như một cấu hình, sau đó thay đổi cấu hình này bằng các phép biến đổi nhỏ.</w:t>
+      </w:r>
+    </w:p>
+    <w:p>
+      <w:pPr>
+        <w:spacing w:before="0" w:after="120" w:line="300" w:lineRule="auto"/>
+        <w:ind w:firstLine="567"/>
+        <w:jc w:val="both"/>
+      </w:pPr>
+      <w:r>
+        <w:rPr>
+          <w:rFonts w:ascii="Times New Roman" w:hAnsi="Times New Roman" w:eastAsia="Times New Roman"/>
+          <w:sz w:val="26"/>
+        </w:rPr>
+        <w:t>Trong Find Your Path, một cấu hình có thể là thứ tự các điểm giao, thứ tự nhận đơn hoặc một route ứng viên qua nhiều node quan trọng. Neighbor có thể được tạo bằng cách hoán đổi hai điểm giao, đảo một đoạn route, thay một node trung gian hoặc chọn lại thứ tự phục vụ gần nhất. Nếu neighbor làm giảm hàm chi phí, thuật toán chấp nhận neighbor và tiếp tục từ đó.</w:t>
+      </w:r>
+    </w:p>
+    <w:p>
+      <w:pPr>
+        <w:spacing w:before="60" w:after="120"/>
         <w:jc w:val="center"/>
       </w:pPr>
       <m:oMathPara>
@@ -1704,33 +2360,177 @@
       </m:oMathPara>
     </w:p>
     <w:p>
-      <w:pPr/>
-      <w:r>
-        <w:t>Hàm cost(route) cho phép lượng hóa chất lượng lời giải bằng tổng thời gian di chuyển và các khoản phạt do trễ hạn, vượt sức chứa hoặc vi phạm ràng buộc. Với Simple Hill Climbing, chỉ những bước làm giảm cost mới được chấp nhận. Cách này dễ hiểu, dễ cài đặt và phù hợp để minh họa tối ưu cục bộ trong Find Your Path.</w:t>
-      </w:r>
-    </w:p>
-    <w:p>
-      <w:pPr/>
-      <w:r>
-        <w:t>Simple Hill Climbing không đầy đủ vì có thể dừng ở cực trị cục bộ, plateau hoặc ridge dù vẫn còn lời giải tốt hơn ở vùng khác của không gian tìm kiếm. Thuật toán không bảo đảm tối ưu toàn cục. Nếu mỗi vòng xét q láng giềng và chạy tối đa t vòng, thời gian xấp xỉ O(tq·C_eval), trong đó C_eval là chi phí đánh giá một route; không gian thường thấp vì chỉ cần lưu trạng thái hiện tại và một số láng giềng đang xét.</w:t>
+      <w:pPr>
+        <w:spacing w:before="0" w:after="120" w:line="300" w:lineRule="auto"/>
+        <w:ind w:firstLine="567"/>
+        <w:jc w:val="both"/>
+      </w:pPr>
+      <w:r>
+        <w:rPr>
+          <w:rFonts w:ascii="Times New Roman" w:hAnsi="Times New Roman" w:eastAsia="Times New Roman"/>
+          <w:sz w:val="26"/>
+        </w:rPr>
+        <w:t>Hàm cost(route) có vai trò quyết định trong Simple Hill Climbing. Nếu hàm cost chỉ tính khoảng cách, thuật toán sẽ ưu tiên route ngắn. Nếu hàm cost thêm phạt deadline và capacity, thuật toán sẽ hướng đến route phù hợp hơn với bài toán giao hàng. Vì vậy, chất lượng của Simple Hill Climbing phụ thuộc mạnh vào cách thiết kế hàm đánh giá.</w:t>
+      </w:r>
+    </w:p>
+    <w:p>
+      <w:pPr>
+        <w:spacing w:before="0" w:after="120" w:line="300" w:lineRule="auto"/>
+        <w:ind w:firstLine="567"/>
+        <w:jc w:val="both"/>
+      </w:pPr>
+      <w:r>
+        <w:rPr>
+          <w:rFonts w:ascii="Times New Roman" w:hAnsi="Times New Roman" w:eastAsia="Times New Roman"/>
+          <w:sz w:val="26"/>
+        </w:rPr>
+        <w:t>Thuật toán này phù hợp với bài toán tối ưu cục bộ vì nó không cần lưu toàn bộ không gian trạng thái. Mỗi bước chỉ cần trạng thái hiện tại, một neighbor và giá trị đánh giá. Điều đó giúp thuật toán nhẹ, dễ cài đặt và dễ minh họa. Trong báo cáo, Simple Hill Climbing có thể được dùng để cho thấy một route ban đầu được cải thiện dần qua từng vòng.</w:t>
+      </w:r>
+    </w:p>
+    <w:p>
+      <w:pPr>
+        <w:spacing w:before="0" w:after="120" w:line="300" w:lineRule="auto"/>
+        <w:ind w:firstLine="567"/>
+        <w:jc w:val="both"/>
+      </w:pPr>
+      <w:r>
+        <w:rPr>
+          <w:rFonts w:ascii="Times New Roman" w:hAnsi="Times New Roman" w:eastAsia="Times New Roman"/>
+          <w:sz w:val="26"/>
+        </w:rPr>
+        <w:t>Nhược điểm lớn nhất của Simple Hill Climbing là dễ kẹt ở local optimum. Nếu mọi neighbor trực tiếp đều không tốt hơn trạng thái hiện tại, thuật toán dừng, dù có thể tồn tại lời giải tốt hơn ở xa hơn. Thuật toán cũng có thể gặp plateau, nơi nhiều trạng thái có cùng giá trị, hoặc ridge, nơi cần đi tạm qua bước không cải thiện để đến vùng tốt hơn. Vì báo cáo chọn Simple Hill Climbing, cần nói rõ đây là phiên bản đơn giản, không phải biến thể có sideways move hay simulated annealing.</w:t>
+      </w:r>
+    </w:p>
+    <w:p>
+      <w:pPr>
+        <w:spacing w:before="0" w:after="120" w:line="300" w:lineRule="auto"/>
+        <w:ind w:firstLine="567"/>
+        <w:jc w:val="both"/>
+      </w:pPr>
+      <w:r>
+        <w:rPr>
+          <w:rFonts w:ascii="Times New Roman" w:hAnsi="Times New Roman" w:eastAsia="Times New Roman"/>
+          <w:sz w:val="26"/>
+        </w:rPr>
+        <w:t>Về tính đầy đủ, Simple Hill Climbing không đầy đủ vì có thể dừng trước khi tìm thấy lời giải mong muốn. Về tối ưu, thuật toán không bảo đảm tối ưu toàn cục. Về thời gian, nếu mỗi vòng xét q neighbor và chạy tối đa t vòng, chi phí là O(tqC_eval), trong đó C_eval là chi phí tính hàm đánh giá. Về không gian, thuật toán thường rất tiết kiệm, có thể chỉ cần O(1) ngoài dữ liệu route nếu sinh neighbor tuần tự.</w:t>
+      </w:r>
+    </w:p>
+    <w:p>
+      <w:pPr>
+        <w:spacing w:before="60" w:after="120"/>
+        <w:jc w:val="center"/>
+      </w:pPr>
+      <m:oMathPara>
+        <m:oMath>
+          <m:r>
+            <m:t>T=O(tq·</m:t>
+          </m:r>
+          <m:sSub>
+            <m:e>
+              <m:r>
+                <m:t>C</m:t>
+              </m:r>
+            </m:e>
+            <m:sub>
+              <m:r>
+                <m:t>eval</m:t>
+              </m:r>
+            </m:sub>
+          </m:sSub>
+          <m:r>
+            <m:t>)</m:t>
+          </m:r>
+        </m:oMath>
+      </m:oMathPara>
+    </w:p>
+    <w:p>
+      <w:pPr>
+        <w:spacing w:before="0" w:after="120" w:line="300" w:lineRule="auto"/>
+        <w:ind w:firstLine="567"/>
+        <w:jc w:val="both"/>
+      </w:pPr>
+      <w:r>
+        <w:rPr>
+          <w:rFonts w:ascii="Times New Roman" w:hAnsi="Times New Roman" w:eastAsia="Times New Roman"/>
+          <w:sz w:val="26"/>
+        </w:rPr>
+        <w:t>Trong Find Your Path, thuật toán này không nên thay thế A* cho bài toán tìm đường giữa hai điểm. Vai trò hợp lý hơn là cải thiện thứ tự hoặc cấu hình ở mức cao, còn việc tính đường đi chi tiết giữa hai điểm vẫn có thể do A* đảm nhiệm. Cách phân tầng này giúp báo cáo tránh nhầm lẫn giữa path planning và route optimization.</w:t>
+      </w:r>
+    </w:p>
+    <w:p>
+      <w:pPr>
+        <w:spacing w:before="0" w:after="120" w:line="300" w:lineRule="auto"/>
+        <w:ind w:firstLine="567"/>
+        <w:jc w:val="both"/>
+      </w:pPr>
+      <w:r>
+        <w:rPr>
+          <w:rFonts w:ascii="Times New Roman" w:hAnsi="Times New Roman" w:eastAsia="Times New Roman"/>
+          <w:sz w:val="26"/>
+        </w:rPr>
+        <w:t>Khi vấn đáp, có thể nhấn mạnh rằng Simple Hill Climbing đại diện cho nhóm local search vì nó không xây dựng cây tìm kiếm đầy đủ. Nó chỉ quan tâm trạng thái hiện tại và neighbor. Chính sự đơn giản đó vừa là ưu điểm vừa là hạn chế: nhanh và dễ hiểu, nhưng không đủ mạnh trước không gian có nhiều cực trị cục bộ.</w:t>
       </w:r>
     </w:p>
     <w:p>
       <w:pPr>
         <w:pStyle w:val="Heading2"/>
-      </w:pPr>
-      <w:r>
+        <w:spacing w:before="120" w:after="120"/>
+        <w:jc w:val="left"/>
+      </w:pPr>
+      <w:r>
+        <w:rPr>
+          <w:rFonts w:ascii="Times New Roman" w:hAnsi="Times New Roman" w:eastAsia="Times New Roman"/>
+          <w:b/>
+          <w:sz w:val="26"/>
+        </w:rPr>
         <w:t>4. Nhóm môi trường phức tạp: AND-OR Search</w:t>
       </w:r>
     </w:p>
     <w:p>
-      <w:pPr/>
-      <w:r>
-        <w:t>AND-OR Search được dùng khi hành động của agent có thể dẫn đến nhiều kết quả môi trường khác nhau. OR node biểu diễn lựa chọn của agent, còn AND node biểu diễn các outcome mà kế hoạch phải xử lý đầy đủ. Trạng thái bắt đầu là trạng thái hiện tại cùng transition model; trạng thái mục tiêu là một conditional plan có nhánh xử lý cho mọi outcome quan trọng.</w:t>
-      </w:r>
-    </w:p>
-    <w:p>
-      <w:pPr>
+      <w:pPr>
+        <w:spacing w:before="0" w:after="120" w:line="300" w:lineRule="auto"/>
+        <w:ind w:firstLine="567"/>
+        <w:jc w:val="both"/>
+      </w:pPr>
+      <w:r>
+        <w:rPr>
+          <w:rFonts w:ascii="Times New Roman" w:hAnsi="Times New Roman" w:eastAsia="Times New Roman"/>
+          <w:sz w:val="26"/>
+        </w:rPr>
+        <w:t>Thuật toán AND-OR Search được chọn vì nó là thuật toán đã học phù hợp để biểu diễn hành động có nhiều kết quả trong môi trường bất định. Trong phạm vi báo cáo, thuật toán không chỉ được mô tả như một đoạn mã, mà được phân tích theo cách hình thành trạng thái, cách chọn hành động, tiêu chí dừng, độ phức tạp và mức độ phù hợp với Find Your Path. Cách trình bày này giúp liên hệ trực tiếp giữa lý thuyết học trên lớp và quyết định thiết kế trong dự án.</w:t>
+      </w:r>
+    </w:p>
+    <w:p>
+      <w:pPr>
+        <w:spacing w:before="0" w:after="120" w:line="300" w:lineRule="auto"/>
+        <w:ind w:firstLine="567"/>
+        <w:jc w:val="both"/>
+      </w:pPr>
+      <w:r>
+        <w:rPr>
+          <w:rFonts w:ascii="Times New Roman" w:hAnsi="Times New Roman" w:eastAsia="Times New Roman"/>
+          <w:sz w:val="26"/>
+        </w:rPr>
+        <w:t>AND-OR Search khác với các thuật toán tìm đường thông thường vì kết quả của nó không chỉ là một chuỗi hành động tuyến tính. Trong môi trường bất định, một hành động có thể dẫn đến nhiều trạng thái kết quả. Agent không chỉ cần chọn hành động tốt, mà còn phải có kế hoạch xử lý cho từng outcome có thể xảy ra.</w:t>
+      </w:r>
+    </w:p>
+    <w:p>
+      <w:pPr>
+        <w:spacing w:before="0" w:after="120" w:line="300" w:lineRule="auto"/>
+        <w:ind w:firstLine="567"/>
+        <w:jc w:val="both"/>
+      </w:pPr>
+      <w:r>
+        <w:rPr>
+          <w:rFonts w:ascii="Times New Roman" w:hAnsi="Times New Roman" w:eastAsia="Times New Roman"/>
+          <w:sz w:val="26"/>
+        </w:rPr>
+        <w:t>Trong cây AND-OR, OR node đại diện cho lựa chọn của agent. Tại OR node, chỉ cần chọn một hành động phù hợp. AND node đại diện cho các kết quả môi trường có thể xảy ra sau hành động đó. Tại AND node, kế hoạch phải giải quyết tất cả các nhánh kết quả, vì agent không kiểm soát outcome nào sẽ xảy ra. Đây là điểm cốt lõi làm AND-OR Search phù hợp với môi trường phức tạp.</w:t>
+      </w:r>
+    </w:p>
+    <w:p>
+      <w:pPr>
+        <w:spacing w:before="60" w:after="120"/>
         <w:jc w:val="center"/>
       </w:pPr>
       <m:oMathPara>
@@ -1788,6 +2588,7 @@
     </w:p>
     <w:p>
       <w:pPr>
+        <w:spacing w:before="60" w:after="120"/>
         <w:jc w:val="center"/>
       </w:pPr>
       <m:oMathPara>
@@ -1829,33 +2630,149 @@
       </m:oMathPara>
     </w:p>
     <w:p>
-      <w:pPr/>
-      <w:r>
-        <w:t>Trong Find Your Path, AND-OR Search phù hợp với tình huống một đoạn đường có thể thông hoặc bị chặn, chi phí có thể bình thường hoặc tăng cao. Thay vì tạo một tuyến duy nhất, thuật toán tạo kế hoạch có điều kiện: nếu outcome thứ nhất xảy ra thì đi theo nhánh A, nếu outcome thứ hai xảy ra thì chuyển sang nhánh B.</w:t>
-      </w:r>
-    </w:p>
-    <w:p>
-      <w:pPr/>
-      <w:r>
-        <w:t>AND-OR Search đầy đủ trên không gian hữu hạn nếu transition model liệt kê đủ outcome, có kiểm tra chu trình và mọi nhánh AND cần thiết đều được xét. Thuật toán tối ưu nếu duyệt đầy đủ cây theo tiêu chí đánh giá đã chọn, chẳng hạn chi phí xấu nhất hoặc chi phí kỳ vọng. Nếu b là số hành động trung bình, k là số outcome trung bình và m là độ sâu, kích thước cây có thể tăng xấp xỉ O((bk)^m), làm cho không gian lưu conditional plan cũng tăng rất nhanh.</w:t>
+      <w:pPr>
+        <w:spacing w:before="0" w:after="120" w:line="300" w:lineRule="auto"/>
+        <w:ind w:firstLine="567"/>
+        <w:jc w:val="both"/>
+      </w:pPr>
+      <w:r>
+        <w:rPr>
+          <w:rFonts w:ascii="Times New Roman" w:hAnsi="Times New Roman" w:eastAsia="Times New Roman"/>
+          <w:sz w:val="26"/>
+        </w:rPr>
+        <w:t>Trong Find Your Path, AND-OR Search có thể mô hình hóa tình huống một đoạn đường có thể thông hoặc bị chặn, một chi phí cạnh có thể giữ nguyên hoặc tăng cao, hoặc một điểm giao có thể khả dụng hoặc không khả dụng. Nếu chỉ dùng A*, hệ thống thường tạo một route dựa trên trạng thái hiện biết. Nếu dùng AND-OR Search, hệ thống có thể tạo conditional plan: nếu đoạn đường mở thì tiếp tục route A, nếu đoạn đường bị chặn thì chuyển sang route B.</w:t>
+      </w:r>
+    </w:p>
+    <w:p>
+      <w:pPr>
+        <w:spacing w:before="0" w:after="120" w:line="300" w:lineRule="auto"/>
+        <w:ind w:firstLine="567"/>
+        <w:jc w:val="both"/>
+      </w:pPr>
+      <w:r>
+        <w:rPr>
+          <w:rFonts w:ascii="Times New Roman" w:hAnsi="Times New Roman" w:eastAsia="Times New Roman"/>
+          <w:sz w:val="26"/>
+        </w:rPr>
+        <w:t>Trạng thái bắt đầu của AND-OR Search gồm trạng thái hiện tại và mô hình transition. Trạng thái mục tiêu là một conditional plan có thể dẫn đến goal trong mọi outcome quan trọng. Các bước tìm kiếm gồm chọn hành động ở OR node, sinh tập outcome ở AND node, kiểm tra goal, phát hiện chu trình và xây dựng kế hoạch con cho từng outcome. Nếu một outcome không có kế hoạch giải, hành động tương ứng không tạo được conditional plan hợp lệ.</w:t>
+      </w:r>
+    </w:p>
+    <w:p>
+      <w:pPr>
+        <w:spacing w:before="0" w:after="120" w:line="300" w:lineRule="auto"/>
+        <w:ind w:firstLine="567"/>
+        <w:jc w:val="both"/>
+      </w:pPr>
+      <w:r>
+        <w:rPr>
+          <w:rFonts w:ascii="Times New Roman" w:hAnsi="Times New Roman" w:eastAsia="Times New Roman"/>
+          <w:sz w:val="26"/>
+        </w:rPr>
+        <w:t>Về tính đầy đủ, AND-OR Search đầy đủ trên không gian hữu hạn nếu transition model liệt kê đầy đủ outcome và thuật toán có cơ chế tránh chu trình. Về tối ưu, thuật toán có thể tối ưu nếu duyệt đầy đủ và có tiêu chí đánh giá rõ ràng, chẳng hạn chi phí xấu nhất hoặc chi phí kỳ vọng. Về thời gian và không gian, cây AND-OR có thể tăng rất nhanh vì mỗi hành động lại sinh nhiều outcome. Nếu b là số hành động trung bình, k là số outcome và m là độ sâu, trường hợp xấu có thể xấp xỉ O((bk)^m).</w:t>
+      </w:r>
+    </w:p>
+    <w:p>
+      <w:pPr>
+        <w:spacing w:before="0" w:after="120" w:line="300" w:lineRule="auto"/>
+        <w:ind w:firstLine="567"/>
+        <w:jc w:val="both"/>
+      </w:pPr>
+      <w:r>
+        <w:rPr>
+          <w:rFonts w:ascii="Times New Roman" w:hAnsi="Times New Roman" w:eastAsia="Times New Roman"/>
+          <w:sz w:val="26"/>
+        </w:rPr>
+        <w:t>Điểm mạnh của AND-OR Search là cách biểu diễn kế hoạch giàu hơn path đơn. Nó phù hợp để trả lời câu hỏi: agent cần làm gì nếu môi trường phản hồi theo nhiều cách khác nhau. Điểm yếu là chi phí tính toán cao và đòi hỏi transition model đủ rõ. Nếu nhóm không mô hình hóa outcome tốt, AND-OR Search sẽ trở nên hình thức. Vì vậy, trong báo cáo cần mô tả outcome cụ thể gắn với đường đi: thông, bị chặn, tăng chi phí hoặc phải chuyển hướng.</w:t>
+      </w:r>
+    </w:p>
+    <w:p>
+      <w:pPr>
+        <w:spacing w:before="0" w:after="120" w:line="300" w:lineRule="auto"/>
+        <w:ind w:firstLine="567"/>
+        <w:jc w:val="both"/>
+      </w:pPr>
+      <w:r>
+        <w:rPr>
+          <w:rFonts w:ascii="Times New Roman" w:hAnsi="Times New Roman" w:eastAsia="Times New Roman"/>
+          <w:sz w:val="26"/>
+        </w:rPr>
+        <w:t>Cần phân biệt AND-OR Search với online re-planning. Online re-planning thường phản ứng sau khi quan sát thông tin mới, còn AND-OR Search chuẩn bị trước các nhánh điều kiện. Trong báo cáo hiện tại, nhóm chọn AND-OR Search vì đây là thuật toán rõ ràng trong nhóm môi trường phức tạp và phù hợp với yêu cầu mỗi nhóm chọn một thuật toán đã học.</w:t>
+      </w:r>
+    </w:p>
+    <w:p>
+      <w:pPr>
+        <w:spacing w:before="0" w:after="120" w:line="300" w:lineRule="auto"/>
+        <w:ind w:firstLine="567"/>
+        <w:jc w:val="both"/>
+      </w:pPr>
+      <w:r>
+        <w:rPr>
+          <w:rFonts w:ascii="Times New Roman" w:hAnsi="Times New Roman" w:eastAsia="Times New Roman"/>
+          <w:sz w:val="26"/>
+        </w:rPr>
+        <w:t>Khi vấn đáp, câu trả lời quan trọng là: AND-OR Search không chỉ tìm một đường đi từ start đến goal, mà tìm một kế hoạch có điều kiện. Đây là khác biệt bản chất so với DFS, A* hay Simple Hill Climbing. Nếu môi trường deterministic, path đơn có thể đủ; nếu môi trường nondeterministic, conditional plan mới phản ánh đúng yêu cầu của agent.</w:t>
       </w:r>
     </w:p>
     <w:p>
       <w:pPr>
         <w:pStyle w:val="Heading2"/>
-      </w:pPr>
-      <w:r>
+        <w:spacing w:before="120" w:after="120"/>
+        <w:jc w:val="left"/>
+      </w:pPr>
+      <w:r>
+        <w:rPr>
+          <w:rFonts w:ascii="Times New Roman" w:hAnsi="Times New Roman" w:eastAsia="Times New Roman"/>
+          <w:b/>
+          <w:sz w:val="26"/>
+        </w:rPr>
         <w:t>5. Nhóm thỏa ràng buộc: Forward Checking</w:t>
       </w:r>
     </w:p>
     <w:p>
-      <w:pPr/>
-      <w:r>
-        <w:t>Forward Checking là kỹ thuật tìm kiếm trong bài toán thỏa ràng buộc, thường được dùng cùng Backtracking nhưng có thêm bước nhìn trước. Trạng thái bắt đầu gồm tập biến, miền giá trị của từng biến và tập ràng buộc. Trạng thái mục tiêu là phép gán đầy đủ thỏa tất cả ràng buộc về deadline, capacity, thứ tự pickup/dropoff hoặc phân công shipper.</w:t>
-      </w:r>
-    </w:p>
-    <w:p>
-      <w:pPr>
+      <w:pPr>
+        <w:spacing w:before="0" w:after="120" w:line="300" w:lineRule="auto"/>
+        <w:ind w:firstLine="567"/>
+        <w:jc w:val="both"/>
+      </w:pPr>
+      <w:r>
+        <w:rPr>
+          <w:rFonts w:ascii="Times New Roman" w:hAnsi="Times New Roman" w:eastAsia="Times New Roman"/>
+          <w:sz w:val="26"/>
+        </w:rPr>
+        <w:t>Thuật toán Forward Checking được chọn vì nó đại diện rõ cho tư duy kiểm tra ràng buộc và cắt bỏ sớm miền giá trị không hợp lệ. Trong phạm vi báo cáo, thuật toán không chỉ được mô tả như một đoạn mã, mà được phân tích theo cách hình thành trạng thái, cách chọn hành động, tiêu chí dừng, độ phức tạp và mức độ phù hợp với Find Your Path. Cách trình bày này giúp liên hệ trực tiếp giữa lý thuyết học trên lớp và quyết định thiết kế trong dự án.</w:t>
+      </w:r>
+    </w:p>
+    <w:p>
+      <w:pPr>
+        <w:spacing w:before="0" w:after="120" w:line="300" w:lineRule="auto"/>
+        <w:ind w:firstLine="567"/>
+        <w:jc w:val="both"/>
+      </w:pPr>
+      <w:r>
+        <w:rPr>
+          <w:rFonts w:ascii="Times New Roman" w:hAnsi="Times New Roman" w:eastAsia="Times New Roman"/>
+          <w:sz w:val="26"/>
+        </w:rPr>
+        <w:t>Forward Checking là kỹ thuật tìm kiếm trong bài toán thỏa ràng buộc. Nó thường được trình bày như một cải tiến của Backtracking, nhưng trong báo cáo này được chọn làm thuật toán đại diện vì thể hiện rõ ý tưởng nhìn trước. Thay vì đợi đến khi gán nhiều biến rồi mới phát hiện mâu thuẫn, Forward Checking kiểm tra ảnh hưởng của mỗi phép gán lên các biến chưa gán.</w:t>
+      </w:r>
+    </w:p>
+    <w:p>
+      <w:pPr>
+        <w:spacing w:before="0" w:after="120" w:line="300" w:lineRule="auto"/>
+        <w:ind w:firstLine="567"/>
+        <w:jc w:val="both"/>
+      </w:pPr>
+      <w:r>
+        <w:rPr>
+          <w:rFonts w:ascii="Times New Roman" w:hAnsi="Times New Roman" w:eastAsia="Times New Roman"/>
+          <w:sz w:val="26"/>
+        </w:rPr>
+        <w:t>Một bài toán CSP gồm tập biến, miền giá trị của từng biến và tập ràng buộc. Trong Find Your Path, biến có thể là vị trí của một đơn hàng trong chuỗi giao, shipper được gán cho đơn, thời điểm phục vụ hoặc lựa chọn có nhận một đơn hay không. Miền giá trị là các lựa chọn khả dĩ cho từng biến. Ràng buộc có thể là deadline, capacity, thứ tự pickup trước dropoff hoặc giới hạn phân công.</w:t>
+      </w:r>
+    </w:p>
+    <w:p>
+      <w:pPr>
+        <w:spacing w:before="60" w:after="120"/>
         <w:jc w:val="center"/>
       </w:pPr>
       <m:oMathPara>
@@ -1924,33 +2841,149 @@
       </m:oMathPara>
     </w:p>
     <w:p>
-      <w:pPr/>
-      <w:r>
-        <w:t>Sau mỗi phép gán Xi = v, Forward Checking loại khỏi domain của các biến chưa gán những giá trị chắc chắn vi phạm ràng buộc với phép gán hiện tại. Nếu một biến tương lai bị rỗng domain, thuật toán quay lui ngay thay vì tiếp tục đi sâu vào nhánh chắc chắn thất bại. Nhờ đó, Forward Checking phát hiện mâu thuẫn sớm hơn Backtracking thuần.</w:t>
-      </w:r>
-    </w:p>
-    <w:p>
-      <w:pPr/>
-      <w:r>
-        <w:t>Forward Checking đầy đủ với CSP hữu hạn vì nó chỉ loại các giá trị không thể tham gia nghiệm hợp lệ. Thuật toán không tự tối ưu chi phí nếu không bổ sung hàm mục tiêu, nhưng rất hữu ích để kiểm tra tính khả thi. Trường hợp xấu vẫn có thể là O(d^n) với d là kích thước domain và n là số biến, nhưng chi phí thực nghiệm thường giảm đáng kể do cắt sớm nhiều nhánh không hợp lệ.</w:t>
+      <w:pPr>
+        <w:spacing w:before="0" w:after="120" w:line="300" w:lineRule="auto"/>
+        <w:ind w:firstLine="567"/>
+        <w:jc w:val="both"/>
+      </w:pPr>
+      <w:r>
+        <w:rPr>
+          <w:rFonts w:ascii="Times New Roman" w:hAnsi="Times New Roman" w:eastAsia="Times New Roman"/>
+          <w:sz w:val="26"/>
+        </w:rPr>
+        <w:t>Công thức trên mô tả thao tác loại khỏi domain Dj những giá trị u khiến phép gán Xi = v và Xj = u vi phạm ràng buộc C. Sau khi loại, nếu một biến chưa gán có domain rỗng, thuật toán quay lui ngay. Điều này giúp tránh việc tiếp tục mở rộng một nhánh chắc chắn không thể tạo nghiệm.</w:t>
+      </w:r>
+    </w:p>
+    <w:p>
+      <w:pPr>
+        <w:spacing w:before="0" w:after="120" w:line="300" w:lineRule="auto"/>
+        <w:ind w:firstLine="567"/>
+        <w:jc w:val="both"/>
+      </w:pPr>
+      <w:r>
+        <w:rPr>
+          <w:rFonts w:ascii="Times New Roman" w:hAnsi="Times New Roman" w:eastAsia="Times New Roman"/>
+          <w:sz w:val="26"/>
+        </w:rPr>
+        <w:t>Trong Find Your Path, Forward Checking đặc biệt hữu ích khi route không chỉ cần đi được mà còn phải hợp lệ. Ví dụ, một đơn hàng có deadline gần có thể không thể đặt sau nhiều đơn xa; một shipper có capacity giới hạn không thể nhận quá nhiều đơn cùng lúc; một đơn pickup/dropoff không thể giao trước khi lấy. Những điều kiện này không phải lúc nào cũng được thể hiện bằng cạnh trên graph, nên cần mô hình CSP để kiểm soát.</w:t>
+      </w:r>
+    </w:p>
+    <w:p>
+      <w:pPr>
+        <w:spacing w:before="0" w:after="120" w:line="300" w:lineRule="auto"/>
+        <w:ind w:firstLine="567"/>
+        <w:jc w:val="both"/>
+      </w:pPr>
+      <w:r>
+        <w:rPr>
+          <w:rFonts w:ascii="Times New Roman" w:hAnsi="Times New Roman" w:eastAsia="Times New Roman"/>
+          <w:sz w:val="26"/>
+        </w:rPr>
+        <w:t>Về tính đầy đủ, Forward Checking đầy đủ với CSP hữu hạn vì thuật toán chỉ loại các giá trị chắc chắn vi phạm ràng buộc. Nếu có nghiệm, nó không loại bỏ nghiệm hợp lệ. Về tối ưu, Forward Checking không tự tối ưu chi phí nếu không có hàm mục tiêu bổ sung; nó chủ yếu trả lời câu hỏi liệu có phép gán hợp lệ hay không. Về thời gian, trường hợp xấu vẫn có thể là O(d_c^n), vì vẫn có thể phải xét tổ hợp lớn. Về không gian, thuật toán cần lưu domain hiện tại và các thay đổi để phục hồi khi quay lui.</w:t>
+      </w:r>
+    </w:p>
+    <w:p>
+      <w:pPr>
+        <w:spacing w:before="0" w:after="120" w:line="300" w:lineRule="auto"/>
+        <w:ind w:firstLine="567"/>
+        <w:jc w:val="both"/>
+      </w:pPr>
+      <w:r>
+        <w:rPr>
+          <w:rFonts w:ascii="Times New Roman" w:hAnsi="Times New Roman" w:eastAsia="Times New Roman"/>
+          <w:sz w:val="26"/>
+        </w:rPr>
+        <w:t>Điểm mạnh của Forward Checking là cắt nhánh sớm và làm rõ lý do một phương án không hợp lệ. Trong báo cáo và demo, có thể minh họa domain của các biến bị thu hẹp sau từng phép gán. Đây là hình ảnh trực quan hơn nhiều so với chỉ nói thuật toán quay lui. Người xem có thể thấy ràng buộc tác động trực tiếp đến không gian tìm kiếm.</w:t>
+      </w:r>
+    </w:p>
+    <w:p>
+      <w:pPr>
+        <w:spacing w:before="0" w:after="120" w:line="300" w:lineRule="auto"/>
+        <w:ind w:firstLine="567"/>
+        <w:jc w:val="both"/>
+      </w:pPr>
+      <w:r>
+        <w:rPr>
+          <w:rFonts w:ascii="Times New Roman" w:hAnsi="Times New Roman" w:eastAsia="Times New Roman"/>
+          <w:sz w:val="26"/>
+        </w:rPr>
+        <w:t>Điểm yếu của Forward Checking là nó chỉ nhìn trước một bước theo các ràng buộc liên quan trực tiếp. Có những mâu thuẫn sâu hơn chỉ xuất hiện sau nhiều phép gán. Vì vậy, Forward Checking mạnh hơn Backtracking thuần nhưng chưa phải kỹ thuật suy luận ràng buộc toàn diện nhất. Tuy nhiên, trong phạm vi học phần và dự án, nó đủ rõ ràng để đại diện cho nhóm CSP.</w:t>
+      </w:r>
+    </w:p>
+    <w:p>
+      <w:pPr>
+        <w:spacing w:before="0" w:after="120" w:line="300" w:lineRule="auto"/>
+        <w:ind w:firstLine="567"/>
+        <w:jc w:val="both"/>
+      </w:pPr>
+      <w:r>
+        <w:rPr>
+          <w:rFonts w:ascii="Times New Roman" w:hAnsi="Times New Roman" w:eastAsia="Times New Roman"/>
+          <w:sz w:val="26"/>
+        </w:rPr>
+        <w:t>Khi vấn đáp, cần tránh nói Forward Checking là thuật toán tìm đường. Nó không tìm path trên graph theo nghĩa A*. Nó kiểm tra và thu hẹp miền giá trị trong bài toán ràng buộc. Trong hệ thống Find Your Path, Forward Checking có thể đứng ở tầng kiểm tra tính khả thi của route hoặc phân công trước khi thuật toán tìm đường chi tiết được gọi.</w:t>
       </w:r>
     </w:p>
     <w:p>
       <w:pPr>
         <w:pStyle w:val="Heading2"/>
-      </w:pPr>
-      <w:r>
+        <w:spacing w:before="120" w:after="120"/>
+        <w:jc w:val="left"/>
+      </w:pPr>
+      <w:r>
+        <w:rPr>
+          <w:rFonts w:ascii="Times New Roman" w:hAnsi="Times New Roman" w:eastAsia="Times New Roman"/>
+          <w:b/>
+          <w:sz w:val="26"/>
+        </w:rPr>
         <w:t>6. Nhóm tìm kiếm đối kháng: Alpha-Beta Pruning</w:t>
       </w:r>
     </w:p>
     <w:p>
-      <w:pPr/>
-      <w:r>
-        <w:t>Alpha-Beta Pruning là cải tiến của Minimax, dùng cho bài toán ra quyết định khi có yếu tố phản ứng bất lợi. MAX đại diện cho hệ thống muốn chọn phương án có utility cao, còn MIN đại diện cho môi trường hoặc đối thủ làm giảm utility. Trạng thái bắt đầu là node gốc của cây quyết định; trạng thái mục tiêu là hành động ở gốc có giá trị tốt nhất theo giả định đối kháng.</w:t>
-      </w:r>
-    </w:p>
-    <w:p>
-      <w:pPr>
+      <w:pPr>
+        <w:spacing w:before="0" w:after="120" w:line="300" w:lineRule="auto"/>
+        <w:ind w:firstLine="567"/>
+        <w:jc w:val="both"/>
+      </w:pPr>
+      <w:r>
+        <w:rPr>
+          <w:rFonts w:ascii="Times New Roman" w:hAnsi="Times New Roman" w:eastAsia="Times New Roman"/>
+          <w:sz w:val="26"/>
+        </w:rPr>
+        <w:t>Thuật toán Alpha-Beta Pruning được chọn vì nó là thuật toán đối kháng hiệu quả hơn Minimax thuần nhưng vẫn giữ nguyên quyết định tối ưu. Trong phạm vi báo cáo, thuật toán không chỉ được mô tả như một đoạn mã, mà được phân tích theo cách hình thành trạng thái, cách chọn hành động, tiêu chí dừng, độ phức tạp và mức độ phù hợp với Find Your Path. Cách trình bày này giúp liên hệ trực tiếp giữa lý thuyết học trên lớp và quyết định thiết kế trong dự án.</w:t>
+      </w:r>
+    </w:p>
+    <w:p>
+      <w:pPr>
+        <w:spacing w:before="0" w:after="120" w:line="300" w:lineRule="auto"/>
+        <w:ind w:firstLine="567"/>
+        <w:jc w:val="both"/>
+      </w:pPr>
+      <w:r>
+        <w:rPr>
+          <w:rFonts w:ascii="Times New Roman" w:hAnsi="Times New Roman" w:eastAsia="Times New Roman"/>
+          <w:sz w:val="26"/>
+        </w:rPr>
+        <w:t>Alpha-Beta Pruning được xây dựng trên nền Minimax. Trong cây quyết định, MAX là tác tử muốn tối đa hóa utility, còn MIN là tác tử hoặc yếu tố môi trường muốn làm giảm utility. Nếu xét bài toán Find Your Path theo nghĩa đối kháng, MAX có thể là hệ thống chọn route, còn MIN là kịch bản bất lợi như tắc đường, tăng chi phí hoặc chặn cạnh.</w:t>
+      </w:r>
+    </w:p>
+    <w:p>
+      <w:pPr>
+        <w:spacing w:before="0" w:after="120" w:line="300" w:lineRule="auto"/>
+        <w:ind w:firstLine="567"/>
+        <w:jc w:val="both"/>
+      </w:pPr>
+      <w:r>
+        <w:rPr>
+          <w:rFonts w:ascii="Times New Roman" w:hAnsi="Times New Roman" w:eastAsia="Times New Roman"/>
+          <w:sz w:val="26"/>
+        </w:rPr>
+        <w:t>Minimax duyệt cây để xác định giá trị của từng lựa chọn trong trường hợp đối thủ phản ứng bất lợi nhất. Alpha-Beta Pruning không thay đổi giá trị Minimax cuối cùng, mà chỉ cắt bỏ những nhánh chắc chắn không ảnh hưởng đến quyết định ở gốc. Vì vậy, thuật toán này có giá trị lớn khi cây quyết định rộng hoặc sâu.</w:t>
+      </w:r>
+    </w:p>
+    <w:p>
+      <w:pPr>
+        <w:spacing w:before="60" w:after="120"/>
         <w:jc w:val="center"/>
       </w:pPr>
       <m:oMathPara>
@@ -1962,174 +2995,496 @@
       </m:oMathPara>
     </w:p>
     <w:p>
-      <w:pPr/>
-      <w:r>
-        <w:t>Alpha là giá trị tốt nhất mà MAX đã bảo đảm trên đường đi hiện tại; beta là giá trị tốt nhất mà MIN đã bảo đảm. Khi alpha lớn hơn hoặc bằng beta, nhánh còn lại không thể ảnh hưởng tới quyết định cuối cùng nên được cắt bỏ. Trong Find Your Path, mô hình này có thể dùng để phân tích tuyến đường dưới các kịch bản bất lợi như tắc đường, chi phí tăng hoặc đoạn đường bị chặn.</w:t>
-      </w:r>
-    </w:p>
-    <w:p>
-      <w:pPr/>
-      <w:r>
-        <w:t>Alpha-Beta đầy đủ và tối ưu trong cùng điều kiện với Minimax, vì cắt tỉa không làm thay đổi giá trị quyết định ở gốc. Trường hợp xấu vẫn có thời gian O(b^m), nhưng nếu thứ tự xét nước đi tốt, thời gian có thể giảm xấp xỉ còn O(b^(m/2)). Không gian thường là O(bm) khi duyệt theo chiều sâu. So với Minimax thuần, Alpha-Beta giữ nguyên kết quả nhưng giảm số node cần đánh giá.</w:t>
+      <w:pPr>
+        <w:spacing w:before="0" w:after="120" w:line="300" w:lineRule="auto"/>
+        <w:ind w:firstLine="567"/>
+        <w:jc w:val="both"/>
+      </w:pPr>
+      <w:r>
+        <w:rPr>
+          <w:rFonts w:ascii="Times New Roman" w:hAnsi="Times New Roman" w:eastAsia="Times New Roman"/>
+          <w:sz w:val="26"/>
+        </w:rPr>
+        <w:t>Alpha là giá trị tốt nhất mà MAX đã bảo đảm được trên đường đi hiện tại. Beta là giá trị tốt nhất mà MIN đã bảo đảm được. Khi alpha lớn hơn hoặc bằng beta, nhánh còn lại không thể làm thay đổi lựa chọn cuối cùng, nên có thể bỏ qua. Ý tưởng này giúp giảm số trạng thái cần đánh giá mà vẫn giữ nguyên kết quả.</w:t>
+      </w:r>
+    </w:p>
+    <w:p>
+      <w:pPr>
+        <w:spacing w:before="0" w:after="120" w:line="300" w:lineRule="auto"/>
+        <w:ind w:firstLine="567"/>
+        <w:jc w:val="both"/>
+      </w:pPr>
+      <w:r>
+        <w:rPr>
+          <w:rFonts w:ascii="Times New Roman" w:hAnsi="Times New Roman" w:eastAsia="Times New Roman"/>
+          <w:sz w:val="26"/>
+        </w:rPr>
+        <w:t>Trong Find Your Path, Alpha-Beta không phải thuật toán dùng trực tiếp để tìm đường hằng ngày. Vai trò hợp lý hơn là mô phỏng và đánh giá route dưới kịch bản xấu. Ví dụ, hệ thống có thể so sánh hai tuyến: tuyến thứ nhất ngắn nhưng dễ bị ảnh hưởng nếu một đoạn bị chặn; tuyến thứ hai dài hơn nhưng ổn định hơn. Mô hình đối kháng giúp phân tích lựa chọn nào có utility tốt hơn khi môi trường phản ứng bất lợi.</w:t>
+      </w:r>
+    </w:p>
+    <w:p>
+      <w:pPr>
+        <w:spacing w:before="0" w:after="120" w:line="300" w:lineRule="auto"/>
+        <w:ind w:firstLine="567"/>
+        <w:jc w:val="both"/>
+      </w:pPr>
+      <w:r>
+        <w:rPr>
+          <w:rFonts w:ascii="Times New Roman" w:hAnsi="Times New Roman" w:eastAsia="Times New Roman"/>
+          <w:sz w:val="26"/>
+        </w:rPr>
+        <w:t>Hàm utility cần phản ánh mục tiêu của hệ thống. Utility có thể là số âm của tổng chi phí, phạt trễ hạn và phạt rủi ro. Khi utility càng cao, route càng tốt. Nếu utility chỉ tính khoảng cách, mô hình đối kháng sẽ không phản ánh đủ rủi ro. Vì vậy, thiết kế hàm utility là bước quan trọng khi đưa Alpha-Beta vào bài toán vận tải.</w:t>
+      </w:r>
+    </w:p>
+    <w:p>
+      <w:pPr>
+        <w:spacing w:before="60" w:after="120"/>
+        <w:jc w:val="center"/>
+      </w:pPr>
+      <m:oMathPara>
+        <m:oMath>
+          <m:r>
+            <m:t>utility(route)=-</m:t>
+          </m:r>
+          <m:sSub>
+            <m:e>
+              <m:r>
+                <m:t>travel</m:t>
+              </m:r>
+            </m:e>
+            <m:sub>
+              <m:r>
+                <m:t>cost</m:t>
+              </m:r>
+            </m:sub>
+          </m:sSub>
+          <m:r>
+            <m:t>-</m:t>
+          </m:r>
+          <m:sSub>
+            <m:e>
+              <m:r>
+                <m:t>late</m:t>
+              </m:r>
+            </m:e>
+            <m:sub>
+              <m:r>
+                <m:t>penalty</m:t>
+              </m:r>
+            </m:sub>
+          </m:sSub>
+          <m:r>
+            <m:t>-</m:t>
+          </m:r>
+          <m:sSub>
+            <m:e>
+              <m:r>
+                <m:t>risk</m:t>
+              </m:r>
+            </m:e>
+            <m:sub>
+              <m:r>
+                <m:t>penalty</m:t>
+              </m:r>
+            </m:sub>
+          </m:sSub>
+        </m:oMath>
+      </m:oMathPara>
+    </w:p>
+    <w:p>
+      <w:pPr>
+        <w:spacing w:before="0" w:after="120" w:line="300" w:lineRule="auto"/>
+        <w:ind w:firstLine="567"/>
+        <w:jc w:val="both"/>
+      </w:pPr>
+      <w:r>
+        <w:rPr>
+          <w:rFonts w:ascii="Times New Roman" w:hAnsi="Times New Roman" w:eastAsia="Times New Roman"/>
+          <w:sz w:val="26"/>
+        </w:rPr>
+        <w:t>Về tính đầy đủ, Alpha-Beta đầy đủ nếu cây trò chơi hữu hạn và thuật toán duyệt đủ các nhánh cần thiết. Về tối ưu, nó cho cùng quyết định với Minimax nếu hàm utility đúng và giả định MIN luôn chọn phản ứng bất lợi nhất. Về thời gian, trường hợp xấu vẫn là O(b^m) nếu thứ tự xét nhánh kém. Trong trường hợp thứ tự xét tốt, số node có thể giảm đáng kể, thường được mô tả xấp xỉ O(b^(m/2)). Về không gian, thuật toán có thể duyệt theo chiều sâu nên thường cần O(bm).</w:t>
+      </w:r>
+    </w:p>
+    <w:p>
+      <w:pPr>
+        <w:spacing w:before="0" w:after="120" w:line="300" w:lineRule="auto"/>
+        <w:ind w:firstLine="567"/>
+        <w:jc w:val="both"/>
+      </w:pPr>
+      <w:r>
+        <w:rPr>
+          <w:rFonts w:ascii="Times New Roman" w:hAnsi="Times New Roman" w:eastAsia="Times New Roman"/>
+          <w:sz w:val="26"/>
+        </w:rPr>
+        <w:t>Điểm mạnh của Alpha-Beta là hiệu quả tính toán. Nó cho phép mô hình đối kháng có thể mở rộng hơn Minimax thuần. Điểm yếu là hiệu quả cắt tỉa phụ thuộc vào thứ tự xét nhánh. Nếu xét nhánh tốt trước, alpha và beta được cập nhật sớm, nhiều nhánh bị cắt. Nếu xét nhánh xấu trước, thuật toán gần giống Minimax về số node cần duyệt.</w:t>
+      </w:r>
+    </w:p>
+    <w:p>
+      <w:pPr>
+        <w:spacing w:before="0" w:after="120" w:line="300" w:lineRule="auto"/>
+        <w:ind w:firstLine="567"/>
+        <w:jc w:val="both"/>
+      </w:pPr>
+      <w:r>
+        <w:rPr>
+          <w:rFonts w:ascii="Times New Roman" w:hAnsi="Times New Roman" w:eastAsia="Times New Roman"/>
+          <w:sz w:val="26"/>
+        </w:rPr>
+        <w:t>Khi vấn đáp, cần nhấn mạnh rằng Alpha-Beta không phải thuật toán khác mục tiêu với Minimax. Nó là cùng giá trị quyết định, nhưng tối ưu quá trình duyệt. Trong báo cáo, nhóm chọn Alpha-Beta thay vì Minimax vì yêu cầu mỗi nhóm chọn một thuật toán, và Alpha-Beta vừa bao hàm tư duy Minimax vừa thể hiện kỹ thuật cắt tỉa nâng cao.</w:t>
+      </w:r>
+    </w:p>
+    <w:p>
+      <w:pPr>
+        <w:spacing w:before="0" w:after="120" w:line="300" w:lineRule="auto"/>
+        <w:ind w:firstLine="567"/>
+        <w:jc w:val="both"/>
+      </w:pPr>
+      <w:r>
+        <w:rPr>
+          <w:rFonts w:ascii="Times New Roman" w:hAnsi="Times New Roman" w:eastAsia="Times New Roman"/>
+          <w:sz w:val="26"/>
+        </w:rPr>
+        <w:t>Kết thúc phần thuật toán, có thể thấy sáu thuật toán không cạnh tranh trực tiếp với nhau. DFS minh họa tìm kiếm mù, A* giải bài toán tìm đường có heuristic, Simple Hill Climbing cải thiện cấu hình, AND-OR Search xử lý outcome bất định, Forward Checking kiểm tra ràng buộc và Alpha-Beta phân tích tình huống đối kháng. Mỗi thuật toán trả lời một câu hỏi khác nhau trong cùng miền bài toán Find Your Path.</w:t>
       </w:r>
     </w:p>
     <w:p>
       <w:pPr>
         <w:pStyle w:val="Heading1"/>
         <w:pageBreakBefore/>
-      </w:pPr>
-      <w:bookmarkStart w:id="22" w:name="_Toc233509689"/>
-      <w:r>
-        <w:rPr>
-          <w:rFonts w:eastAsia="Times New Roman" w:cs="Times New Roman"/>
-          <w:color w:val="000000"/>
-        </w:rPr>
-        <w:t>III. THỰC NGHIỆM VÀ KẾT QUẢ</w:t>
-      </w:r>
-      <w:bookmarkEnd w:id="22"/>
-    </w:p>
-    <w:p>
-      <w:r>
-        <w:rPr>
-          <w:color w:val="000000"/>
-        </w:rPr>
-        <w:t>Phần thực nghiệm cần chứng minh thuật toán vận hành đúng trên cùng một tập dữ liệu hoặc trên các kịch bản có kiểm soát. Theo yêu cầu của giảng viên, mỗi nhóm thuật toán nên có ảnh động hoặc chuỗi ảnh thể hiện quá trình mở rộng trạng thái, đường đi đang xét, nhánh bị loại và lời giải cuối cùng. Các vị trí chèn hình dưới đây được giữ như khung triển khai để nhóm bổ sung ảnh sau khi xuất animation từ chương trình.</w:t>
+        <w:spacing w:before="0" w:after="120"/>
+        <w:jc w:val="left"/>
+      </w:pPr>
+      <w:r>
+        <w:rPr>
+          <w:rFonts w:ascii="Times New Roman" w:hAnsi="Times New Roman" w:eastAsia="Times New Roman"/>
+          <w:b/>
+          <w:sz w:val="26"/>
+        </w:rPr>
+        <w:t>III. Thực nghiệm và kết quả</w:t>
       </w:r>
     </w:p>
     <w:p>
       <w:pPr>
         <w:pStyle w:val="Heading2"/>
-      </w:pPr>
-      <w:r>
-        <w:t>1. Nhóm tìm kiếm không thông tin</w:t>
-      </w:r>
-    </w:p>
-    <w:p>
-      <w:pPr/>
-      <w:r>
-        <w:t>Thực nghiệm DFS nên dùng một graph nhỏ để thể hiện rõ cơ chế đi sâu, đánh dấu visited và quay lui khi gặp nhánh không dẫn đến mục tiêu. Kết quả cần nêu thứ tự node được duyệt, đường đi tìm được và trường hợp DFS không cho đường đi ngắn nhất.</w:t>
-      </w:r>
-    </w:p>
-    <w:p>
-      <w:pPr/>
-      <w:r>
-        <w:t>Vị trí chèn hình hoặc ảnh động: DFS đi sâu theo một nhánh, đánh dấu visited và quay lui.</w:t>
+        <w:spacing w:before="120" w:after="120"/>
+        <w:jc w:val="left"/>
+      </w:pPr>
+      <w:r>
+        <w:rPr>
+          <w:rFonts w:ascii="Times New Roman" w:hAnsi="Times New Roman" w:eastAsia="Times New Roman"/>
+          <w:b/>
+          <w:sz w:val="26"/>
+        </w:rPr>
+        <w:t>1. Thiết kế kịch bản thực nghiệm</w:t>
+      </w:r>
+    </w:p>
+    <w:p>
+      <w:pPr>
+        <w:spacing w:before="0" w:after="120" w:line="300" w:lineRule="auto"/>
+        <w:ind w:firstLine="567"/>
+        <w:jc w:val="both"/>
+      </w:pPr>
+      <w:r>
+        <w:rPr>
+          <w:rFonts w:ascii="Times New Roman" w:hAnsi="Times New Roman" w:eastAsia="Times New Roman"/>
+          <w:sz w:val="26"/>
+        </w:rPr>
+        <w:t>Phần thực nghiệm cần chứng minh các thuật toán hoạt động đúng trên các kịch bản có kiểm soát. Thay vì chỉ chụp màn hình kết quả cuối cùng, nhóm nên trình bày quá trình thuật toán ra quyết định. Với mỗi thuật toán, cần có trạng thái bắt đầu, trạng thái mục tiêu, các bước trung gian và kết quả sau cùng.</w:t>
+      </w:r>
+    </w:p>
+    <w:p>
+      <w:pPr>
+        <w:spacing w:before="0" w:after="120" w:line="300" w:lineRule="auto"/>
+        <w:ind w:firstLine="567"/>
+        <w:jc w:val="both"/>
+      </w:pPr>
+      <w:r>
+        <w:rPr>
+          <w:rFonts w:ascii="Times New Roman" w:hAnsi="Times New Roman" w:eastAsia="Times New Roman"/>
+          <w:sz w:val="26"/>
+        </w:rPr>
+        <w:t>Đối với DFS, kịch bản nên dùng graph nhỏ có ít nhất một nhánh cụt để thể hiện rõ quá trình đi sâu và quay lui. Kết quả cần ghi thứ tự node được duyệt, stack tại một số thời điểm quan trọng và đường đi cuối cùng nếu tìm thấy goal. Nếu đường đi không ngắn nhất, đó là minh chứng tốt cho hạn chế của DFS.</w:t>
+      </w:r>
+    </w:p>
+    <w:p>
+      <w:pPr>
+        <w:spacing w:before="0" w:after="120" w:line="300" w:lineRule="auto"/>
+        <w:ind w:firstLine="567"/>
+        <w:jc w:val="both"/>
+      </w:pPr>
+      <w:r>
+        <w:rPr>
+          <w:rFonts w:ascii="Times New Roman" w:hAnsi="Times New Roman" w:eastAsia="Times New Roman"/>
+          <w:sz w:val="26"/>
+        </w:rPr>
+        <w:t>Đối với A*, kịch bản nên dùng graph có tọa độ hoặc trọng số rõ ràng. Cần hiển thị g-score, h-score và f-score của các node đang xét. Kết quả nên ghi tổng chi phí route, số node đã mở rộng và đường đi cuối cùng. Nếu có thể, nhóm nên so sánh A* với DFS ở mức số node duyệt, nhưng không biến báo cáo thành bảng so sánh máy móc.</w:t>
+      </w:r>
+    </w:p>
+    <w:p>
+      <w:pPr>
+        <w:spacing w:before="0" w:after="120" w:line="300" w:lineRule="auto"/>
+        <w:ind w:firstLine="567"/>
+        <w:jc w:val="both"/>
+      </w:pPr>
+      <w:r>
+        <w:rPr>
+          <w:rFonts w:ascii="Times New Roman" w:hAnsi="Times New Roman" w:eastAsia="Times New Roman"/>
+          <w:sz w:val="26"/>
+        </w:rPr>
+        <w:t>Đối với Simple Hill Climbing, kịch bản nên bắt đầu bằng một route chưa tốt và cho thấy route được cải thiện qua từng vòng. Mỗi vòng cần nêu neighbor được chọn, cost trước và sau khi cập nhật. Nếu thuật toán dừng ở local optimum, phần thực nghiệm nên ghi nhận trung thực thay vì cố trình bày như luôn tìm lời giải tối ưu.</w:t>
+      </w:r>
+    </w:p>
+    <w:p>
+      <w:pPr>
+        <w:spacing w:before="0" w:after="120" w:line="300" w:lineRule="auto"/>
+        <w:ind w:firstLine="567"/>
+        <w:jc w:val="both"/>
+      </w:pPr>
+      <w:r>
+        <w:rPr>
+          <w:rFonts w:ascii="Times New Roman" w:hAnsi="Times New Roman" w:eastAsia="Times New Roman"/>
+          <w:sz w:val="26"/>
+        </w:rPr>
+        <w:t>Đối với AND-OR Search, kịch bản nên có ít nhất một hành động với hai outcome. Ví dụ, một cạnh có thể thông hoặc bị chặn. Kết quả không phải một path đơn, mà là conditional plan gồm các nhánh nếu outcome này xảy ra thì làm gì, nếu outcome kia xảy ra thì làm gì. Đây là điểm quan trọng để phân biệt với A*.</w:t>
+      </w:r>
+    </w:p>
+    <w:p>
+      <w:pPr>
+        <w:spacing w:before="0" w:after="120" w:line="300" w:lineRule="auto"/>
+        <w:ind w:firstLine="567"/>
+        <w:jc w:val="both"/>
+      </w:pPr>
+      <w:r>
+        <w:rPr>
+          <w:rFonts w:ascii="Times New Roman" w:hAnsi="Times New Roman" w:eastAsia="Times New Roman"/>
+          <w:sz w:val="26"/>
+        </w:rPr>
+        <w:t>Đối với Forward Checking, kịch bản nên có vài biến đơn hàng và ràng buộc deadline hoặc capacity. Nhóm cần hiển thị domain ban đầu, phép gán được thử, domain sau khi loại giá trị và thời điểm thuật toán quay lui do domain rỗng. Cách trình bày này cho thấy thuật toán cắt bớt không gian tìm kiếm như thế nào.</w:t>
+      </w:r>
+    </w:p>
+    <w:p>
+      <w:pPr>
+        <w:spacing w:before="0" w:after="120" w:line="300" w:lineRule="auto"/>
+        <w:ind w:firstLine="567"/>
+        <w:jc w:val="both"/>
+      </w:pPr>
+      <w:r>
+        <w:rPr>
+          <w:rFonts w:ascii="Times New Roman" w:hAnsi="Times New Roman" w:eastAsia="Times New Roman"/>
+          <w:sz w:val="26"/>
+        </w:rPr>
+        <w:t>Đối với Alpha-Beta Pruning, kịch bản nên dùng cây quyết định nhỏ có giá trị utility ở lá. Thực nghiệm cần thể hiện quá trình cập nhật alpha, beta và các nhánh bị cắt. Nếu có animation, nên dùng màu khác nhau cho node đã duyệt, node đang xét và node bị cắt.</w:t>
       </w:r>
     </w:p>
     <w:p>
       <w:pPr>
         <w:pStyle w:val="Heading2"/>
-      </w:pPr>
-      <w:r>
-        <w:t>2. Nhóm tìm kiếm có thông tin</w:t>
-      </w:r>
-    </w:p>
-    <w:p>
-      <w:pPr/>
-      <w:r>
-        <w:t>Thực nghiệm A* cần thể hiện open set, closed set, g-score, h-score, f-score và parent map. Kết quả nên nêu tổng chi phí route, số node mở rộng và ảnh hưởng của heuristic tới tốc độ tìm kiếm.</w:t>
-      </w:r>
-    </w:p>
-    <w:p>
-      <w:pPr/>
-      <w:r>
-        <w:t>Vị trí chèn hình hoặc ảnh động: A* cập nhật g-score, f-score và truy vết đường đi từ parent map.</w:t>
+        <w:spacing w:before="120" w:after="120"/>
+        <w:jc w:val="left"/>
+      </w:pPr>
+      <w:r>
+        <w:rPr>
+          <w:rFonts w:ascii="Times New Roman" w:hAnsi="Times New Roman" w:eastAsia="Times New Roman"/>
+          <w:b/>
+          <w:sz w:val="26"/>
+        </w:rPr>
+        <w:t>2. Chỉ tiêu quan sát và cách ghi nhận kết quả</w:t>
+      </w:r>
+    </w:p>
+    <w:p>
+      <w:pPr>
+        <w:spacing w:before="0" w:after="120" w:line="300" w:lineRule="auto"/>
+        <w:ind w:firstLine="567"/>
+        <w:jc w:val="both"/>
+      </w:pPr>
+      <w:r>
+        <w:rPr>
+          <w:rFonts w:ascii="Times New Roman" w:hAnsi="Times New Roman" w:eastAsia="Times New Roman"/>
+          <w:sz w:val="26"/>
+        </w:rPr>
+        <w:t>Kết quả thực nghiệm nên được ghi nhận bằng cả mô tả định tính và số liệu định lượng. Với thuật toán tìm kiếm, số node mở rộng là chỉ tiêu quan trọng vì nó phản ánh chi phí tìm kiếm. Với thuật toán tối ưu cục bộ, giá trị cost qua từng vòng cho thấy xu hướng cải thiện. Với CSP, số giá trị bị loại khỏi domain giúp đánh giá hiệu quả cắt nhánh. Với Alpha-Beta, số node bị cắt là minh chứng trực tiếp cho lợi ích của thuật toán.</w:t>
+      </w:r>
+    </w:p>
+    <w:p>
+      <w:pPr>
+        <w:spacing w:before="0" w:after="120" w:line="300" w:lineRule="auto"/>
+        <w:ind w:firstLine="567"/>
+        <w:jc w:val="both"/>
+      </w:pPr>
+      <w:r>
+        <w:rPr>
+          <w:rFonts w:ascii="Times New Roman" w:hAnsi="Times New Roman" w:eastAsia="Times New Roman"/>
+          <w:sz w:val="26"/>
+        </w:rPr>
+        <w:t>Không nên chỉ kết luận thuật toán nào nhanh hơn vì mỗi thuật toán phục vụ một loại bài toán khác nhau. DFS không được kỳ vọng tối ưu như A*. AND-OR Search không trả cùng loại kết quả với A*. Forward Checking kiểm tra miền giá trị chứ không tìm path hình học. Vì vậy, kết quả cần được diễn giải trong đúng bối cảnh của từng nhóm thuật toán.</w:t>
+      </w:r>
+    </w:p>
+    <w:p>
+      <w:pPr>
+        <w:spacing w:before="0" w:after="120" w:line="300" w:lineRule="auto"/>
+        <w:ind w:firstLine="567"/>
+        <w:jc w:val="both"/>
+      </w:pPr>
+      <w:r>
+        <w:rPr>
+          <w:rFonts w:ascii="Times New Roman" w:hAnsi="Times New Roman" w:eastAsia="Times New Roman"/>
+          <w:sz w:val="26"/>
+        </w:rPr>
+        <w:t>Khi ghi nhận thời gian chạy, cần lưu ý rằng thời gian phụ thuộc vào kích thước graph, cấu trúc dữ liệu và môi trường máy. Nếu chưa có benchmark ổn định, nhóm có thể ưu tiên số node mở rộng, số bước lặp hoặc số nhánh bị cắt. Các chỉ tiêu này gắn trực tiếp hơn với bản chất thuật toán và dễ giải thích khi vấn đáp.</w:t>
+      </w:r>
+    </w:p>
+    <w:p>
+      <w:pPr>
+        <w:spacing w:before="0" w:after="120" w:line="300" w:lineRule="auto"/>
+        <w:ind w:firstLine="567"/>
+        <w:jc w:val="both"/>
+      </w:pPr>
+      <w:r>
+        <w:rPr>
+          <w:rFonts w:ascii="Times New Roman" w:hAnsi="Times New Roman" w:eastAsia="Times New Roman"/>
+          <w:sz w:val="26"/>
+        </w:rPr>
+        <w:t>Đối với A*, chất lượng heuristic cần được trình bày rõ. Nếu heuristic quá nhỏ, A* mở rộng nhiều node hơn nhưng vẫn an toàn về tối ưu. Nếu heuristic quá tham lam hoặc không admissible, thuật toán có thể nhanh hơn nhưng không còn bảo đảm tối ưu. Đây là điểm nên đưa vào phần nhận xét thay vì chỉ trình bày route cuối cùng.</w:t>
+      </w:r>
+    </w:p>
+    <w:p>
+      <w:pPr>
+        <w:spacing w:before="0" w:after="120" w:line="300" w:lineRule="auto"/>
+        <w:ind w:firstLine="567"/>
+        <w:jc w:val="both"/>
+      </w:pPr>
+      <w:r>
+        <w:rPr>
+          <w:rFonts w:ascii="Times New Roman" w:hAnsi="Times New Roman" w:eastAsia="Times New Roman"/>
+          <w:sz w:val="26"/>
+        </w:rPr>
+        <w:t>Đối với Simple Hill Climbing, kết quả nên có chuỗi cost: cost ban đầu, cost sau từng bước cải thiện và cost tại điểm dừng. Nếu điểm dừng không phải tối ưu toàn cục, nhóm có thể giải thích do thuật toán chỉ nhìn neighbor cục bộ. Cách trình bày này trung thực và đúng bản chất hơn việc cố tìm một ví dụ luôn thành công.</w:t>
+      </w:r>
+    </w:p>
+    <w:p>
+      <w:pPr>
+        <w:spacing w:before="0" w:after="120" w:line="300" w:lineRule="auto"/>
+        <w:ind w:firstLine="567"/>
+        <w:jc w:val="both"/>
+      </w:pPr>
+      <w:r>
+        <w:rPr>
+          <w:rFonts w:ascii="Times New Roman" w:hAnsi="Times New Roman" w:eastAsia="Times New Roman"/>
+          <w:sz w:val="26"/>
+        </w:rPr>
+        <w:t>Đối với Forward Checking, kết quả nên mô tả một nhánh bị loại sớm. Ví dụ, sau khi gán một đơn hàng vào vị trí quá muộn, domain của đơn tiếp theo bị rỗng vì không còn thời gian giao hợp lệ. Đây là bằng chứng rõ ràng cho việc thuật toán tiết kiệm công sức so với thử hết tổ hợp.</w:t>
+      </w:r>
+    </w:p>
+    <w:p>
+      <w:pPr>
+        <w:spacing w:before="0" w:after="120" w:line="300" w:lineRule="auto"/>
+        <w:ind w:firstLine="567"/>
+        <w:jc w:val="both"/>
+      </w:pPr>
+      <w:r>
+        <w:rPr>
+          <w:rFonts w:ascii="Times New Roman" w:hAnsi="Times New Roman" w:eastAsia="Times New Roman"/>
+          <w:sz w:val="26"/>
+        </w:rPr>
+        <w:t>Đối với Alpha-Beta, kết quả nên so sánh số node Minimax cần xét với số node Alpha-Beta thực sự duyệt trong cùng cây. Dù báo cáo không chọn Minimax làm thuật toán chính, việc nhắc Minimax như nền tảng giúp giải thích ý nghĩa của cắt tỉa mà không biến nó thành một mục thuật toán riêng.</w:t>
       </w:r>
     </w:p>
     <w:p>
       <w:pPr>
         <w:pStyle w:val="Heading2"/>
-      </w:pPr>
-      <w:r>
-        <w:t>3. Nhóm tìm kiếm cục bộ</w:t>
-      </w:r>
-    </w:p>
-    <w:p>
-      <w:pPr/>
-      <w:r>
-        <w:t>Thực nghiệm Simple Hill Climbing nên đặt trên bài toán cải thiện route hoặc thứ tự giao hàng. Kết quả quan trọng là cost(route) qua từng vòng, số neighbor được xét và điểm dừng khi không còn láng giềng tốt hơn.</w:t>
-      </w:r>
-    </w:p>
-    <w:p>
-      <w:pPr/>
-      <w:r>
-        <w:t>Vị trí chèn hình hoặc ảnh động: Simple Hill Climbing chọn neighbor có chi phí thấp hơn và dừng ở trạng thái cục bộ.</w:t>
+        <w:spacing w:before="120" w:after="120"/>
+        <w:jc w:val="left"/>
+      </w:pPr>
+      <w:r>
+        <w:rPr>
+          <w:rFonts w:ascii="Times New Roman" w:hAnsi="Times New Roman" w:eastAsia="Times New Roman"/>
+          <w:b/>
+          <w:sz w:val="26"/>
+        </w:rPr>
+        <w:t>3. Định hướng chèn hình minh họa</w:t>
+      </w:r>
+    </w:p>
+    <w:p>
+      <w:pPr>
+        <w:spacing w:before="0" w:after="120" w:line="300" w:lineRule="auto"/>
+        <w:ind w:firstLine="567"/>
+        <w:jc w:val="both"/>
+      </w:pPr>
+      <w:r>
+        <w:rPr>
+          <w:rFonts w:ascii="Times New Roman" w:hAnsi="Times New Roman" w:eastAsia="Times New Roman"/>
+          <w:sz w:val="26"/>
+        </w:rPr>
+        <w:t>Theo yêu cầu báo cáo cuối kỳ, phần thực nghiệm nên có ảnh động hoặc chuỗi ảnh minh họa. Với DFS, hình nên thể hiện hướng đi sâu và mũi tên quay lui. Với A*, hình nên thể hiện frontier và giá trị f(n). Với Simple Hill Climbing, hình nên thể hiện route trước và sau khi đổi neighbor. Với AND-OR Search, hình nên thể hiện cây conditional plan. Với Forward Checking, hình nên thể hiện domain bị thu hẹp. Với Alpha-Beta, hình nên thể hiện nhánh bị cắt.</w:t>
+      </w:r>
+    </w:p>
+    <w:p>
+      <w:pPr>
+        <w:spacing w:before="0" w:after="120" w:line="300" w:lineRule="auto"/>
+        <w:ind w:firstLine="567"/>
+        <w:jc w:val="both"/>
+      </w:pPr>
+      <w:r>
+        <w:rPr>
+          <w:rFonts w:ascii="Times New Roman" w:hAnsi="Times New Roman" w:eastAsia="Times New Roman"/>
+          <w:sz w:val="26"/>
+        </w:rPr>
+        <w:t>Ảnh minh họa cần được đặt sau đoạn mô tả kịch bản, không nên dồn hết về cuối. Mỗi ảnh nên có chú thích ngắn nêu thuật toán, trạng thái đang xét và ý nghĩa của màu sắc. Nếu dùng GIF hoặc video trong slide, báo cáo Word có thể chèn ảnh tĩnh đại diện và dẫn link GitHub hoặc thư mục demo chứa animation.</w:t>
+      </w:r>
+    </w:p>
+    <w:p>
+      <w:pPr>
+        <w:spacing w:before="0" w:after="120" w:line="300" w:lineRule="auto"/>
+        <w:ind w:firstLine="567"/>
+        <w:jc w:val="both"/>
+      </w:pPr>
+      <w:r>
+        <w:rPr>
+          <w:rFonts w:ascii="Times New Roman" w:hAnsi="Times New Roman" w:eastAsia="Times New Roman"/>
+          <w:sz w:val="26"/>
+        </w:rPr>
+        <w:t>Khi chèn hình, cần tránh ảnh quá nhỏ hoặc chỉ là screenshot giao diện không giải thích được thuật toán. Một ảnh tốt phải cho thấy quá trình ra quyết định. Ví dụ, với A*, chỉ thấy đường đi cuối cùng là chưa đủ; nên có thêm node đã mở rộng. Với Alpha-Beta, chỉ thấy cây cuối cùng là chưa đủ; cần đánh dấu nhánh nào bị prune.</w:t>
+      </w:r>
+    </w:p>
+    <w:p>
+      <w:pPr>
+        <w:spacing w:before="0" w:after="120" w:line="300" w:lineRule="auto"/>
+        <w:ind w:firstLine="567"/>
+        <w:jc w:val="both"/>
+      </w:pPr>
+      <w:r>
+        <w:rPr>
+          <w:rFonts w:ascii="Times New Roman" w:hAnsi="Times New Roman" w:eastAsia="Times New Roman"/>
+          <w:sz w:val="26"/>
+        </w:rPr>
+        <w:t>Nếu chưa có đầy đủ hình, báo cáo có thể để vị trí chèn hình theo từng thuật toán nhưng nên viết chú thích cụ thể. Chú thích cụ thể giúp người đọc biết nhóm dự định minh họa điều gì, đồng thời giúp quá trình hoàn thiện sau này nhất quán với nội dung phân tích.</w:t>
       </w:r>
     </w:p>
     <w:p>
       <w:pPr>
         <w:pStyle w:val="Heading2"/>
-      </w:pPr>
-      <w:r>
-        <w:t>4. Nhóm môi trường phức tạp</w:t>
-      </w:r>
-    </w:p>
-    <w:p>
-      <w:pPr/>
-      <w:r>
-        <w:t>Thực nghiệm AND-OR Search cần thể hiện một cây nhỏ gồm OR node cho lựa chọn của agent và AND node cho các outcome môi trường. Kết quả cần là conditional plan thay vì một path đơn lẻ.</w:t>
-      </w:r>
-    </w:p>
-    <w:p>
-      <w:pPr/>
-      <w:r>
-        <w:t>Vị trí chèn hình hoặc ảnh động: AND-OR Search trả conditional plan với các nhánh ifOpen và ifDisrupted.</w:t>
-      </w:r>
-    </w:p>
-    <w:p>
-      <w:pPr>
-        <w:pStyle w:val="Heading2"/>
-      </w:pPr>
-      <w:r>
-        <w:t>5. Nhóm thỏa ràng buộc</w:t>
-      </w:r>
-    </w:p>
-    <w:p>
-      <w:pPr/>
-      <w:r>
-        <w:t>Thực nghiệm Forward Checking cần thể hiện domain của các biến trước và sau mỗi phép gán. Kết quả nên nêu số nhánh bị loại sớm do deadline, capacity hoặc thứ tự pickup/dropoff.</w:t>
-      </w:r>
-    </w:p>
-    <w:p>
-      <w:pPr/>
-      <w:r>
-        <w:t>Vị trí chèn hình hoặc ảnh động: Forward Checking loại giá trị khỏi domain tương lai và quay lui khi domain rỗng.</w:t>
-      </w:r>
-    </w:p>
-    <w:p>
-      <w:pPr>
-        <w:pStyle w:val="Heading2"/>
-      </w:pPr>
-      <w:r>
-        <w:t>6. Nhóm tìm kiếm đối kháng</w:t>
-      </w:r>
-    </w:p>
-    <w:p>
-      <w:pPr/>
-      <w:r>
-        <w:t>Thực nghiệm Alpha-Beta Pruning nên mô phỏng cây quyết định nhỏ, trong đó hệ thống chọn tuyến còn môi trường chọn sự cố bất lợi. Kết quả cần thể hiện giá trị alpha, beta và các nhánh bị cắt.</w:t>
-      </w:r>
-    </w:p>
-    <w:p>
-      <w:pPr/>
-      <w:r>
-        <w:t>Vị trí chèn hình hoặc ảnh động: Alpha-Beta cập nhật alpha/beta và cắt nhánh không còn ảnh hưởng tới quyết định cuối cùng.</w:t>
-      </w:r>
-    </w:p>
-    <w:p>
-      <w:pPr>
-        <w:pStyle w:val="Heading2"/>
-      </w:pPr>
-      <w:bookmarkStart w:id="29" w:name="_Toc233509696"/>
-      <w:r>
-        <w:t>7. Link GitHub</w:t>
-      </w:r>
-      <w:bookmarkEnd w:id="29"/>
-    </w:p>
-    <w:p>
-      <w:r>
-        <w:rPr>
-          <w:color w:val="000000"/>
+        <w:spacing w:before="120" w:after="120"/>
+        <w:jc w:val="left"/>
+      </w:pPr>
+      <w:r>
+        <w:rPr>
+          <w:rFonts w:ascii="Times New Roman" w:hAnsi="Times New Roman" w:eastAsia="Times New Roman"/>
+          <w:b/>
+          <w:sz w:val="26"/>
+        </w:rPr>
+        <w:t>4. Link GitHub</w:t>
+      </w:r>
+    </w:p>
+    <w:p>
+      <w:pPr>
+        <w:spacing w:before="0" w:after="120" w:line="300" w:lineRule="auto"/>
+        <w:ind w:firstLine="567"/>
+        <w:jc w:val="both"/>
+      </w:pPr>
+      <w:r>
+        <w:rPr>
+          <w:rFonts w:ascii="Times New Roman" w:hAnsi="Times New Roman" w:eastAsia="Times New Roman"/>
+          <w:sz w:val="26"/>
         </w:rPr>
         <w:t>Mã nguồn và dữ liệu demo của dự án được lưu tại: https://github.com/zomboXx/FYP.git. Khi hoàn thiện báo cáo, nhóm nên dẫn thêm đường dẫn đến thư mục demo, ảnh động hoặc video minh họa nếu các tài nguyên đó được đưa lên repository.</w:t>
       </w:r>
@@ -2138,588 +3493,576 @@
       <w:pPr>
         <w:pStyle w:val="Heading1"/>
         <w:pageBreakBefore/>
-      </w:pPr>
-      <w:bookmarkStart w:id="30" w:name="_Toc233509697"/>
-      <w:r>
-        <w:rPr>
-          <w:rFonts w:eastAsia="Times New Roman" w:cs="Times New Roman"/>
-          <w:color w:val="000000"/>
-        </w:rPr>
-        <w:t>IV. ĐÁNH GIÁ VÀ THẢO LUẬN</w:t>
-      </w:r>
-      <w:bookmarkEnd w:id="30"/>
-    </w:p>
-    <w:p>
-      <w:r>
-        <w:t>Phần đánh giá không nên chỉ kết luận thuật toán nào nhanh hơn, vì mỗi nhóm thuật toán trả lời một loại câu hỏi khác nhau. DFS giúp hiểu cơ chế duyệt sâu trong không gian trạng thái; A* khai thác heuristic để tìm tuyến hiệu quả; Simple Hill Climbing xử lý tối ưu cục bộ; AND-OR Search mô hình hóa kế hoạch có điều kiện trong môi trường bất định; Forward Checking kiểm tra tính khả thi dưới ràng buộc; Alpha-Beta Pruning phân tích quyết định trong tình huống có phản ứng bất lợi.</w:t>
-      </w:r>
-    </w:p>
-    <w:tbl>
-      <w:tblPr>
-        <w:tblStyle w:val="TableGrid"/>
-        <w:tblW w:w="0" w:type="auto"/>
-        <w:tblLook w:val="04A0" w:firstRow="1" w:lastRow="0" w:firstColumn="1" w:lastColumn="0" w:noHBand="0" w:noVBand="1"/>
-      </w:tblPr>
-      <w:tblGrid>
-        <w:gridCol w:w="1814"/>
-        <w:gridCol w:w="1814"/>
-        <w:gridCol w:w="1814"/>
-        <w:gridCol w:w="1814"/>
-        <w:gridCol w:w="1814"/>
-      </w:tblGrid>
-      <w:tr>
-        <w:tc>
-          <w:tcPr>
-            <w:tcW w:w="1814" w:type="dxa"/>
-            <w:vAlign w:val="center"/>
-          </w:tcPr>
-          <w:p>
-            <w:pPr>
-              <w:spacing w:before="60" w:after="60"/>
-              <w:ind w:firstLine="0"/>
-              <w:jc w:val="center"/>
-            </w:pPr>
-            <w:r>
-              <w:rPr>
-                <w:b/>
-                <w:color w:val="000000"/>
-              </w:rPr>
-              <w:t>Nhóm</w:t>
-            </w:r>
-          </w:p>
-        </w:tc>
-        <w:tc>
-          <w:tcPr>
-            <w:tcW w:w="1814" w:type="dxa"/>
-            <w:vAlign w:val="center"/>
-          </w:tcPr>
-          <w:p>
-            <w:pPr>
-              <w:spacing w:before="60" w:after="60"/>
-              <w:ind w:firstLine="0"/>
-              <w:jc w:val="center"/>
-            </w:pPr>
-            <w:r>
-              <w:rPr>
-                <w:b/>
-                <w:color w:val="000000"/>
-              </w:rPr>
-              <w:t>Thuật toán</w:t>
-            </w:r>
-          </w:p>
-        </w:tc>
-        <w:tc>
-          <w:tcPr>
-            <w:tcW w:w="1814" w:type="dxa"/>
-            <w:vAlign w:val="center"/>
-          </w:tcPr>
-          <w:p>
-            <w:pPr>
-              <w:spacing w:before="60" w:after="60"/>
-              <w:ind w:firstLine="0"/>
-              <w:jc w:val="center"/>
-            </w:pPr>
-            <w:r>
-              <w:rPr>
-                <w:b/>
-                <w:color w:val="000000"/>
-              </w:rPr>
-              <w:t>Vai trò</w:t>
-            </w:r>
-          </w:p>
-        </w:tc>
-        <w:tc>
-          <w:tcPr>
-            <w:tcW w:w="1814" w:type="dxa"/>
-            <w:vAlign w:val="center"/>
-          </w:tcPr>
-          <w:p>
-            <w:pPr>
-              <w:spacing w:before="60" w:after="60"/>
-              <w:ind w:firstLine="0"/>
-              <w:jc w:val="center"/>
-            </w:pPr>
-            <w:r>
-              <w:rPr>
-                <w:b/>
-                <w:color w:val="000000"/>
-              </w:rPr>
-              <w:t>Giới hạn</w:t>
-            </w:r>
-          </w:p>
-        </w:tc>
-        <w:tc>
-          <w:tcPr>
-            <w:tcW w:w="1814" w:type="dxa"/>
-            <w:vAlign w:val="center"/>
-          </w:tcPr>
-          <w:p>
-            <w:pPr>
-              <w:spacing w:before="60" w:after="60"/>
-              <w:ind w:firstLine="0"/>
-              <w:jc w:val="center"/>
-            </w:pPr>
-            <w:r>
-              <w:rPr>
-                <w:b/>
-                <w:color w:val="000000"/>
-              </w:rPr>
-              <w:t>Ứng dụng phù hợp</w:t>
-            </w:r>
-          </w:p>
-        </w:tc>
-      </w:tr>
-      <w:tr>
-        <w:tc>
-          <w:tcPr>
-            <w:tcW w:w="1814" w:type="dxa"/>
-            <w:vAlign w:val="center"/>
-          </w:tcPr>
-          <w:p>
-            <w:r>
-              <w:t>Không thông tin</w:t>
-            </w:r>
-          </w:p>
-        </w:tc>
-        <w:tc>
-          <w:tcPr>
-            <w:tcW w:w="1814" w:type="dxa"/>
-            <w:vAlign w:val="center"/>
-          </w:tcPr>
-          <w:p>
-            <w:r>
-              <w:t>DFS</w:t>
-            </w:r>
-          </w:p>
-        </w:tc>
-        <w:tc>
-          <w:tcPr>
-            <w:tcW w:w="1814" w:type="dxa"/>
-            <w:vAlign w:val="center"/>
-          </w:tcPr>
-          <w:p>
-            <w:r>
-              <w:t>Duyệt sâu không dùng heuristic</w:t>
-            </w:r>
-          </w:p>
-        </w:tc>
-        <w:tc>
-          <w:tcPr>
-            <w:tcW w:w="1814" w:type="dxa"/>
-            <w:vAlign w:val="center"/>
-          </w:tcPr>
-          <w:p>
-            <w:r>
-              <w:t>Không tối ưu, dễ đi sâu nhánh kém</w:t>
-            </w:r>
-          </w:p>
-        </w:tc>
-        <w:tc>
-          <w:tcPr>
-            <w:tcW w:w="1814" w:type="dxa"/>
-            <w:vAlign w:val="center"/>
-          </w:tcPr>
-          <w:p>
-            <w:r>
-              <w:t>Minh họa duyệt graph và baseline</w:t>
-            </w:r>
-          </w:p>
-        </w:tc>
-      </w:tr>
-      <w:tr>
-        <w:tc>
-          <w:tcPr>
-            <w:tcW w:w="1814" w:type="dxa"/>
-            <w:vAlign w:val="center"/>
-          </w:tcPr>
-          <w:p>
-            <w:r>
-              <w:t>Có thông tin</w:t>
-            </w:r>
-          </w:p>
-        </w:tc>
-        <w:tc>
-          <w:tcPr>
-            <w:tcW w:w="1814" w:type="dxa"/>
-            <w:vAlign w:val="center"/>
-          </w:tcPr>
-          <w:p>
-            <w:r>
-              <w:t>A*</w:t>
-            </w:r>
-          </w:p>
-        </w:tc>
-        <w:tc>
-          <w:tcPr>
-            <w:tcW w:w="1814" w:type="dxa"/>
-            <w:vAlign w:val="center"/>
-          </w:tcPr>
-          <w:p>
-            <w:r>
-              <w:t>Tìm đường bằng g(n)+h(n)</w:t>
-            </w:r>
-          </w:p>
-        </w:tc>
-        <w:tc>
-          <w:tcPr>
-            <w:tcW w:w="1814" w:type="dxa"/>
-            <w:vAlign w:val="center"/>
-          </w:tcPr>
-          <w:p>
-            <w:r>
-              <w:t>Phụ thuộc heuristic và tốn bộ nhớ</w:t>
-            </w:r>
-          </w:p>
-        </w:tc>
-        <w:tc>
-          <w:tcPr>
-            <w:tcW w:w="1814" w:type="dxa"/>
-            <w:vAlign w:val="center"/>
-          </w:tcPr>
-          <w:p>
-            <w:r>
-              <w:t>Tìm tuyến giữa hai điểm</w:t>
-            </w:r>
-          </w:p>
-        </w:tc>
-      </w:tr>
-      <w:tr>
-        <w:tc>
-          <w:tcPr>
-            <w:tcW w:w="1814" w:type="dxa"/>
-            <w:vAlign w:val="center"/>
-          </w:tcPr>
-          <w:p>
-            <w:r>
-              <w:t>Cục bộ</w:t>
-            </w:r>
-          </w:p>
-        </w:tc>
-        <w:tc>
-          <w:tcPr>
-            <w:tcW w:w="1814" w:type="dxa"/>
-            <w:vAlign w:val="center"/>
-          </w:tcPr>
-          <w:p>
-            <w:r>
-              <w:t>Simple Hill Climbing</w:t>
-            </w:r>
-          </w:p>
-        </w:tc>
-        <w:tc>
-          <w:tcPr>
-            <w:tcW w:w="1814" w:type="dxa"/>
-            <w:vAlign w:val="center"/>
-          </w:tcPr>
-          <w:p>
-            <w:r>
-              <w:t>Cải thiện route ứng viên</w:t>
-            </w:r>
-          </w:p>
-        </w:tc>
-        <w:tc>
-          <w:tcPr>
-            <w:tcW w:w="1814" w:type="dxa"/>
-            <w:vAlign w:val="center"/>
-          </w:tcPr>
-          <w:p>
-            <w:r>
-              <w:t>Dễ kẹt ở cực trị cục bộ</w:t>
-            </w:r>
-          </w:p>
-        </w:tc>
-        <w:tc>
-          <w:tcPr>
-            <w:tcW w:w="1814" w:type="dxa"/>
-            <w:vAlign w:val="center"/>
-          </w:tcPr>
-          <w:p>
-            <w:r>
-              <w:t>Tối ưu thứ tự giao hàng đơn giản</w:t>
-            </w:r>
-          </w:p>
-        </w:tc>
-      </w:tr>
-      <w:tr>
-        <w:tc>
-          <w:tcPr>
-            <w:tcW w:w="1814" w:type="dxa"/>
-            <w:vAlign w:val="center"/>
-          </w:tcPr>
-          <w:p>
-            <w:r>
-              <w:t>Môi trường phức tạp</w:t>
-            </w:r>
-          </w:p>
-        </w:tc>
-        <w:tc>
-          <w:tcPr>
-            <w:tcW w:w="1814" w:type="dxa"/>
-            <w:vAlign w:val="center"/>
-          </w:tcPr>
-          <w:p>
-            <w:r>
-              <w:t>AND-OR Search</w:t>
-            </w:r>
-          </w:p>
-        </w:tc>
-        <w:tc>
-          <w:tcPr>
-            <w:tcW w:w="1814" w:type="dxa"/>
-            <w:vAlign w:val="center"/>
-          </w:tcPr>
-          <w:p>
-            <w:r>
-              <w:t>Lập kế hoạch có điều kiện</w:t>
-            </w:r>
-          </w:p>
-        </w:tc>
-        <w:tc>
-          <w:tcPr>
-            <w:tcW w:w="1814" w:type="dxa"/>
-            <w:vAlign w:val="center"/>
-          </w:tcPr>
-          <w:p>
-            <w:r>
-              <w:t>Bùng nổ nhánh khi nhiều outcome</w:t>
-            </w:r>
-          </w:p>
-        </w:tc>
-        <w:tc>
-          <w:tcPr>
-            <w:tcW w:w="1814" w:type="dxa"/>
-            <w:vAlign w:val="center"/>
-          </w:tcPr>
-          <w:p>
-            <w:r>
-              <w:t>Môi trường bất định</w:t>
-            </w:r>
-          </w:p>
-        </w:tc>
-      </w:tr>
-      <w:tr>
-        <w:tc>
-          <w:tcPr>
-            <w:tcW w:w="1814" w:type="dxa"/>
-            <w:vAlign w:val="center"/>
-          </w:tcPr>
-          <w:p>
-            <w:r>
-              <w:t>Ràng buộc</w:t>
-            </w:r>
-          </w:p>
-        </w:tc>
-        <w:tc>
-          <w:tcPr>
-            <w:tcW w:w="1814" w:type="dxa"/>
-            <w:vAlign w:val="center"/>
-          </w:tcPr>
-          <w:p>
-            <w:r>
-              <w:t>Forward Checking</w:t>
-            </w:r>
-          </w:p>
-        </w:tc>
-        <w:tc>
-          <w:tcPr>
-            <w:tcW w:w="1814" w:type="dxa"/>
-            <w:vAlign w:val="center"/>
-          </w:tcPr>
-          <w:p>
-            <w:r>
-              <w:t>Loại sớm giá trị vi phạm</w:t>
-            </w:r>
-          </w:p>
-        </w:tc>
-        <w:tc>
-          <w:tcPr>
-            <w:tcW w:w="1814" w:type="dxa"/>
-            <w:vAlign w:val="center"/>
-          </w:tcPr>
-          <w:p>
-            <w:r>
-              <w:t>Vẫn có worst-case tổ hợp</w:t>
-            </w:r>
-          </w:p>
-        </w:tc>
-        <w:tc>
-          <w:tcPr>
-            <w:tcW w:w="1814" w:type="dxa"/>
-            <w:vAlign w:val="center"/>
-          </w:tcPr>
-          <w:p>
-            <w:r>
-              <w:t>Deadline, capacity, pickup/dropoff</w:t>
-            </w:r>
-          </w:p>
-        </w:tc>
-      </w:tr>
-      <w:tr>
-        <w:tc>
-          <w:tcPr>
-            <w:tcW w:w="1814" w:type="dxa"/>
-            <w:vAlign w:val="center"/>
-          </w:tcPr>
-          <w:p>
-            <w:r>
-              <w:t>Đối kháng</w:t>
-            </w:r>
-          </w:p>
-        </w:tc>
-        <w:tc>
-          <w:tcPr>
-            <w:tcW w:w="1814" w:type="dxa"/>
-            <w:vAlign w:val="center"/>
-          </w:tcPr>
-          <w:p>
-            <w:r>
-              <w:t>Alpha-Beta Pruning</w:t>
-            </w:r>
-          </w:p>
-        </w:tc>
-        <w:tc>
-          <w:tcPr>
-            <w:tcW w:w="1814" w:type="dxa"/>
-            <w:vAlign w:val="center"/>
-          </w:tcPr>
-          <w:p>
-            <w:r>
-              <w:t>Cắt nhánh trong cây Minimax</w:t>
-            </w:r>
-          </w:p>
-        </w:tc>
-        <w:tc>
-          <w:tcPr>
-            <w:tcW w:w="1814" w:type="dxa"/>
-            <w:vAlign w:val="center"/>
-          </w:tcPr>
-          <w:p>
-            <w:r>
-              <w:t>Phụ thuộc thứ tự xét nhánh</w:t>
-            </w:r>
-          </w:p>
-        </w:tc>
-        <w:tc>
-          <w:tcPr>
-            <w:tcW w:w="1814" w:type="dxa"/>
-            <w:vAlign w:val="center"/>
-          </w:tcPr>
-          <w:p>
-            <w:r>
-              <w:t>Phân tích kịch bản xấu</w:t>
-            </w:r>
-          </w:p>
-        </w:tc>
-      </w:tr>
-    </w:tbl>
-    <w:p>
-      <w:r>
-        <w:t>Từ góc nhìn triển khai, A* vẫn là thuật toán phù hợp nhất cho bài toán tìm đường giữa hai điểm khi heuristic đáng tin cậy. Forward Checking hỗ trợ loại sớm route vi phạm ràng buộc, còn Simple Hill Climbing phù hợp khi cần cải thiện nhanh một route ứng viên. AND-OR Search và Alpha-Beta Pruning có vai trò phân tích các tình huống phức tạp hơn, nơi môi trường không chỉ là graph tĩnh mà còn có outcome bất định hoặc phản ứng bất lợi.</w:t>
-      </w:r>
-    </w:p>
-    <w:p>
-      <w:r>
-        <w:t>Quan điểm của nhóm là không nên ép một thuật toán xử lý toàn bộ bài toán Find Your Path. Một thiết kế hợp lý có thể kết hợp nhiều lớp: DFS để minh họa nền tảng duyệt trạng thái, A* để tìm đường, Simple Hill Climbing để cải thiện route, AND-OR Search để biểu diễn kế hoạch có điều kiện, Forward Checking để kiểm tra ràng buộc và Alpha-Beta để đánh giá kịch bản xấu.</w:t>
+        <w:spacing w:before="0" w:after="120"/>
+        <w:jc w:val="left"/>
+      </w:pPr>
+      <w:r>
+        <w:rPr>
+          <w:rFonts w:ascii="Times New Roman" w:hAnsi="Times New Roman" w:eastAsia="Times New Roman"/>
+          <w:b/>
+          <w:sz w:val="26"/>
+        </w:rPr>
+        <w:t>IV. Đánh giá và thảo luận</w:t>
+      </w:r>
+    </w:p>
+    <w:p>
+      <w:pPr>
+        <w:spacing w:before="0" w:after="120" w:line="300" w:lineRule="auto"/>
+        <w:ind w:firstLine="567"/>
+        <w:jc w:val="both"/>
+      </w:pPr>
+      <w:r>
+        <w:rPr>
+          <w:rFonts w:ascii="Times New Roman" w:hAnsi="Times New Roman" w:eastAsia="Times New Roman"/>
+          <w:sz w:val="26"/>
+        </w:rPr>
+        <w:t>Phần đánh giá không nên được trình bày như một bảng liệt kê cứng, vì sáu thuật toán được chọn không giải cùng một bài toán con. Nếu đặt chúng vào một bảng, báo cáo dễ tạo cảm giác máy móc và làm mất bản chất học thuật của phần thảo luận. Cách hợp lý hơn là phân tích vai trò của từng thuật toán trong hệ thống và chỉ ra vì sao mỗi thuật toán phù hợp với một lớp vấn đề khác nhau.</w:t>
+      </w:r>
+    </w:p>
+    <w:p>
+      <w:pPr>
+        <w:spacing w:before="0" w:after="120" w:line="300" w:lineRule="auto"/>
+        <w:ind w:firstLine="567"/>
+        <w:jc w:val="both"/>
+      </w:pPr>
+      <w:r>
+        <w:rPr>
+          <w:rFonts w:ascii="Times New Roman" w:hAnsi="Times New Roman" w:eastAsia="Times New Roman"/>
+          <w:sz w:val="26"/>
+        </w:rPr>
+        <w:t>DFS có giá trị như thuật toán nền. Nó cho thấy một tác tử có thể tìm đường khi không có bất kỳ tri thức định hướng nào. Điểm yếu của DFS trong bài toán giao hàng cũng rất rõ: thuật toán không tối ưu, dễ đi sâu vào nhánh kém và phụ thuộc thứ tự duyệt. Tuy nhiên, chính điểm yếu này giúp làm nổi bật giá trị của A*. Khi trình bày báo cáo, DFS nên được xem như đường cơ sở về mặt nhận thức, không phải giải pháp triển khai chính.</w:t>
+      </w:r>
+    </w:p>
+    <w:p>
+      <w:pPr>
+        <w:spacing w:before="0" w:after="120" w:line="300" w:lineRule="auto"/>
+        <w:ind w:firstLine="567"/>
+        <w:jc w:val="both"/>
+      </w:pPr>
+      <w:r>
+        <w:rPr>
+          <w:rFonts w:ascii="Times New Roman" w:hAnsi="Times New Roman" w:eastAsia="Times New Roman"/>
+          <w:sz w:val="26"/>
+        </w:rPr>
+        <w:t>A* là thuật toán có tính ứng dụng cao nhất đối với bài toán tìm đường giữa hai điểm. Nó kết hợp chi phí đã đi và heuristic còn lại, nhờ đó phù hợp với bản đồ có trọng số. Nếu chỉ chọn một thuật toán để chạy route chính trong Find Your Path, A* là lựa chọn hợp lý hơn DFS. Tuy nhiên, A* cũng không giải quyết toàn bộ bài toán giao hàng, vì nó không tự xử lý thứ tự nhiều đơn, ràng buộc deadline hoặc outcome bất định.</w:t>
+      </w:r>
+    </w:p>
+    <w:p>
+      <w:pPr>
+        <w:spacing w:before="0" w:after="120" w:line="300" w:lineRule="auto"/>
+        <w:ind w:firstLine="567"/>
+        <w:jc w:val="both"/>
+      </w:pPr>
+      <w:r>
+        <w:rPr>
+          <w:rFonts w:ascii="Times New Roman" w:hAnsi="Times New Roman" w:eastAsia="Times New Roman"/>
+          <w:sz w:val="26"/>
+        </w:rPr>
+        <w:t>Simple Hill Climbing bổ sung góc nhìn tối ưu cục bộ. Trong một hệ thống giao hàng, đôi khi vấn đề không phải là tìm đường giữa hai node, mà là cải thiện một route gồm nhiều điểm. Thuật toán này cho phép giải thích cách một lời giải ban đầu được cải thiện dần. Dù không bảo đảm tối ưu toàn cục, nó phù hợp để minh họa quan hệ giữa hàm đánh giá và hành vi của thuật toán.</w:t>
+      </w:r>
+    </w:p>
+    <w:p>
+      <w:pPr>
+        <w:spacing w:before="0" w:after="120" w:line="300" w:lineRule="auto"/>
+        <w:ind w:firstLine="567"/>
+        <w:jc w:val="both"/>
+      </w:pPr>
+      <w:r>
+        <w:rPr>
+          <w:rFonts w:ascii="Times New Roman" w:hAnsi="Times New Roman" w:eastAsia="Times New Roman"/>
+          <w:sz w:val="26"/>
+        </w:rPr>
+        <w:t>AND-OR Search đại diện cho tư duy lập kế hoạch khi môi trường không chắc chắn. Đây là điểm quan trọng vì môi trường giao thông không phải lúc nào cũng deterministic. Một route được tính trước có thể mất hiệu lực khi đường bị chặn hoặc chi phí thay đổi. AND-OR Search không chỉ hỏi đi đường nào, mà hỏi nếu môi trường phản hồi khác nhau thì kế hoạch sẽ rẽ nhánh ra sao. Điều này làm thuật toán phù hợp với phần môi trường phức tạp hơn so với việc chỉ gọi lại A* nhiều lần.</w:t>
+      </w:r>
+    </w:p>
+    <w:p>
+      <w:pPr>
+        <w:spacing w:before="0" w:after="120" w:line="300" w:lineRule="auto"/>
+        <w:ind w:firstLine="567"/>
+        <w:jc w:val="both"/>
+      </w:pPr>
+      <w:r>
+        <w:rPr>
+          <w:rFonts w:ascii="Times New Roman" w:hAnsi="Times New Roman" w:eastAsia="Times New Roman"/>
+          <w:sz w:val="26"/>
+        </w:rPr>
+        <w:t>Forward Checking cho thấy một lớp vấn đề khác: tính hợp lệ dưới ràng buộc. Trong thực tế, route ngắn vẫn có thể vô nghĩa nếu vi phạm deadline, capacity hoặc thứ tự pickup/dropoff. Forward Checking không cạnh tranh trực tiếp với A*, mà có thể hoạt động như tầng kiểm tra trước hoặc trong quá trình lập kế hoạch. Vai trò của nó là giảm không gian tìm kiếm bằng cách loại sớm những giá trị chắc chắn không hợp lệ.</w:t>
+      </w:r>
+    </w:p>
+    <w:p>
+      <w:pPr>
+        <w:spacing w:before="0" w:after="120" w:line="300" w:lineRule="auto"/>
+        <w:ind w:firstLine="567"/>
+        <w:jc w:val="both"/>
+      </w:pPr>
+      <w:r>
+        <w:rPr>
+          <w:rFonts w:ascii="Times New Roman" w:hAnsi="Times New Roman" w:eastAsia="Times New Roman"/>
+          <w:sz w:val="26"/>
+        </w:rPr>
+        <w:t>Alpha-Beta Pruning đưa vào báo cáo một cách nhìn đối kháng. Dù bài toán giao hàng không phải trò chơi hai người theo nghĩa truyền thống, ta vẫn có thể mô hình hóa môi trường bất lợi như một tác nhân làm giảm utility. Khi đó, Alpha-Beta giúp phân tích lựa chọn nào ổn định hơn dưới kịch bản xấu. Thuật toán này không thay thế A*, nhưng hỗ trợ đánh giá rủi ro ở tầng quyết định.</w:t>
+      </w:r>
+    </w:p>
+    <w:p>
+      <w:pPr>
+        <w:spacing w:before="0" w:after="120" w:line="300" w:lineRule="auto"/>
+        <w:ind w:firstLine="567"/>
+        <w:jc w:val="both"/>
+      </w:pPr>
+      <w:r>
+        <w:rPr>
+          <w:rFonts w:ascii="Times New Roman" w:hAnsi="Times New Roman" w:eastAsia="Times New Roman"/>
+          <w:sz w:val="26"/>
+        </w:rPr>
+        <w:t>Nếu đặt sáu thuật toán vào một kiến trúc tổng thể, có thể hình dung hệ thống gồm nhiều tầng. DFS dùng để minh họa và kiểm tra nền tảng graph. A* dùng để tìm tuyến giữa hai điểm. Simple Hill Climbing dùng để cải thiện route nhiều điểm. AND-OR Search dùng để chuẩn bị kế hoạch có điều kiện trong môi trường bất định. Forward Checking dùng để kiểm soát ràng buộc. Alpha-Beta dùng để phân tích lựa chọn dưới kịch bản bất lợi.</w:t>
+      </w:r>
+    </w:p>
+    <w:p>
+      <w:pPr>
+        <w:spacing w:before="0" w:after="120" w:line="300" w:lineRule="auto"/>
+        <w:ind w:firstLine="567"/>
+        <w:jc w:val="both"/>
+      </w:pPr>
+      <w:r>
+        <w:rPr>
+          <w:rFonts w:ascii="Times New Roman" w:hAnsi="Times New Roman" w:eastAsia="Times New Roman"/>
+          <w:sz w:val="26"/>
+        </w:rPr>
+        <w:t>Cách kết hợp này phản ánh tinh thần quan trọng của môn Trí tuệ nhân tạo: không có một thuật toán duy nhất phù hợp với mọi vấn đề. Việc chọn thuật toán phụ thuộc vào biểu diễn trạng thái, loại môi trường, mục tiêu tối ưu và dạng thông tin có sẵn. Nếu môi trường đã biết và mục tiêu rõ ràng, A* mạnh. Nếu môi trường có outcome bất định, AND-OR Search tự nhiên hơn. Nếu vấn đề nằm ở ràng buộc, Forward Checking phù hợp hơn.</w:t>
+      </w:r>
+    </w:p>
+    <w:p>
+      <w:pPr>
+        <w:spacing w:before="0" w:after="120" w:line="300" w:lineRule="auto"/>
+        <w:ind w:firstLine="567"/>
+        <w:jc w:val="both"/>
+      </w:pPr>
+      <w:r>
+        <w:rPr>
+          <w:rFonts w:ascii="Times New Roman" w:hAnsi="Times New Roman" w:eastAsia="Times New Roman"/>
+          <w:sz w:val="26"/>
+        </w:rPr>
+        <w:t>Hạn chế của báo cáo hiện tại là phần thực nghiệm vẫn cần được bổ sung bằng số liệu và hình ảnh cụ thể từ chương trình. Phân tích lý thuyết đã chỉ ra vai trò của từng thuật toán, nhưng để thuyết phục hơn, nhóm cần xuất trace, animation hoặc screenshot cho từng thuật toán. Đặc biệt, A* nên có số node mở rộng, Forward Checking nên có domain trước và sau khi prune, Alpha-Beta nên có số nhánh bị cắt.</w:t>
+      </w:r>
+    </w:p>
+    <w:p>
+      <w:pPr>
+        <w:spacing w:before="0" w:after="120" w:line="300" w:lineRule="auto"/>
+        <w:ind w:firstLine="567"/>
+        <w:jc w:val="both"/>
+      </w:pPr>
+      <w:r>
+        <w:rPr>
+          <w:rFonts w:ascii="Times New Roman" w:hAnsi="Times New Roman" w:eastAsia="Times New Roman"/>
+          <w:sz w:val="26"/>
+        </w:rPr>
+        <w:t>Một điểm cần tránh khi trình bày là không nên nói thuật toán nào tốt nhất một cách tuyệt đối. DFS kém A* trong tìm đường tối ưu, nhưng DFS lại đơn giản và dễ minh họa. Simple Hill Climbing không bảo đảm tối ưu toàn cục, nhưng hữu ích khi cần cải thiện nhanh. Forward Checking không tìm đường, nhưng kiểm soát tính hợp lệ. Vì vậy, đánh giá đúng phải dựa trên vai trò của thuật toán trong hệ thống.</w:t>
+      </w:r>
+    </w:p>
+    <w:p>
+      <w:pPr>
+        <w:spacing w:before="0" w:after="120" w:line="300" w:lineRule="auto"/>
+        <w:ind w:firstLine="567"/>
+        <w:jc w:val="both"/>
+      </w:pPr>
+      <w:r>
+        <w:rPr>
+          <w:rFonts w:ascii="Times New Roman" w:hAnsi="Times New Roman" w:eastAsia="Times New Roman"/>
+          <w:sz w:val="26"/>
+        </w:rPr>
+        <w:t>Từ góc nhìn dự án Find Your Path, trọng tâm triển khai nên đặt ở A* và các dữ liệu graph, vì đây là phần người dùng dễ quan sát nhất. Các thuật toán còn lại có thể được dùng để mở rộng hoặc minh họa các khía cạnh AI khác của bài toán. Cách trình bày này giúp báo cáo vừa bám đề tài ứng dụng, vừa thể hiện được độ phủ kiến thức của học phần.</w:t>
+      </w:r>
+    </w:p>
+    <w:p>
+      <w:pPr>
+        <w:spacing w:before="0" w:after="120" w:line="300" w:lineRule="auto"/>
+        <w:ind w:firstLine="567"/>
+        <w:jc w:val="both"/>
+      </w:pPr>
+      <w:r>
+        <w:rPr>
+          <w:rFonts w:ascii="Times New Roman" w:hAnsi="Times New Roman" w:eastAsia="Times New Roman"/>
+          <w:sz w:val="26"/>
+        </w:rPr>
+        <w:t>Nếu cần bảo vệ trước giảng viên, nhóm có thể giải thích rằng việc chọn một thuật toán mỗi nhóm giúp báo cáo sâu hơn. Thay vì nêu hai thuật toán nhưng phân tích mỏng, báo cáo tập trung vào một đại diện tiêu biểu, phân tích đủ trạng thái, mục tiêu, công thức, độ phức tạp, tính đầy đủ, tối ưu và ứng dụng. Đây là lựa chọn hợp lý khi yêu cầu mới của phần II là mỗi mục một thuật toán.</w:t>
+      </w:r>
+    </w:p>
+    <w:p>
+      <w:pPr>
+        <w:pStyle w:val="Heading2"/>
+        <w:spacing w:before="120" w:after="120"/>
+      </w:pPr>
+      <w:r>
+        <w:rPr>
+          <w:rFonts w:ascii="Times New Roman" w:hAnsi="Times New Roman" w:eastAsia="Times New Roman"/>
+          <w:b/>
+          <w:sz w:val="26"/>
+        </w:rPr>
+        <w:t>1. Tổng hợp vai trò của sáu thuật toán</w:t>
+      </w:r>
+    </w:p>
+    <w:p>
+      <w:pPr>
+        <w:spacing w:after="120" w:line="300" w:lineRule="auto"/>
+        <w:ind w:firstLine="567"/>
+        <w:jc w:val="both"/>
+      </w:pPr>
+      <w:r>
+        <w:rPr>
+          <w:rFonts w:ascii="Times New Roman" w:hAnsi="Times New Roman" w:eastAsia="Times New Roman"/>
+          <w:sz w:val="26"/>
+        </w:rPr>
+        <w:t>Sáu thuật toán trong báo cáo tạo thành một chuỗi tăng dần về mức độ biểu diễn tri thức. DFS bắt đầu từ giả định ít thông tin nhất: tác tử chỉ biết cấu trúc kề của trạng thái và mở rộng theo chiều sâu. A* bổ sung heuristic, làm cho quá trình tìm kiếm có định hướng hơn. Simple Hill Climbing chuyển trọng tâm từ tìm đường sang cải thiện cấu hình. AND-OR Search đưa vào khả năng hành động có nhiều outcome. Forward Checking nhấn mạnh ràng buộc, còn Alpha-Beta Pruning mô hình hóa phản ứng bất lợi.</w:t>
+      </w:r>
+    </w:p>
+    <w:p>
+      <w:pPr>
+        <w:spacing w:after="120" w:line="300" w:lineRule="auto"/>
+        <w:ind w:firstLine="567"/>
+        <w:jc w:val="both"/>
+      </w:pPr>
+      <w:r>
+        <w:rPr>
+          <w:rFonts w:ascii="Times New Roman" w:hAnsi="Times New Roman" w:eastAsia="Times New Roman"/>
+          <w:sz w:val="26"/>
+        </w:rPr>
+        <w:t>Nếu nhìn theo hệ thống, các thuật toán này không nên được xem như sáu lựa chọn độc lập để thay thế nhau. Chúng có thể nằm ở các tầng khác nhau của cùng một ứng dụng. Một tầng định tuyến dùng A* để tìm đường giữa hai điểm; một tầng kiểm tra dùng Forward Checking để loại phương án vi phạm; một tầng tối ưu cục bộ dùng Simple Hill Climbing để cải thiện thứ tự; một tầng phân tích rủi ro dùng AND-OR hoặc Alpha-Beta để khảo sát tình huống khó.</w:t>
+      </w:r>
+    </w:p>
+    <w:p>
+      <w:pPr>
+        <w:spacing w:after="120" w:line="300" w:lineRule="auto"/>
+        <w:ind w:firstLine="567"/>
+        <w:jc w:val="both"/>
+      </w:pPr>
+      <w:r>
+        <w:rPr>
+          <w:rFonts w:ascii="Times New Roman" w:hAnsi="Times New Roman" w:eastAsia="Times New Roman"/>
+          <w:sz w:val="26"/>
+        </w:rPr>
+        <w:t>Điều này giúp báo cáo tránh lỗi thường gặp là so sánh thuật toán theo một tiêu chí đơn giản như nhanh hay chậm. DFS có thể nhanh trên graph nhỏ nhưng không tối ưu. A* có thể tối ưu nhưng tốn bộ nhớ. Simple Hill Climbing có thể cải thiện nhanh nhưng dễ kẹt. AND-OR Search giàu mô hình nhưng dễ bùng nổ nhánh. Forward Checking cắt ràng buộc tốt nhưng không tự tối ưu chi phí. Alpha-Beta giảm duyệt cây nhưng cần mô hình utility hợp lý.</w:t>
+      </w:r>
+    </w:p>
+    <w:p>
+      <w:pPr>
+        <w:spacing w:after="120" w:line="300" w:lineRule="auto"/>
+        <w:ind w:firstLine="567"/>
+        <w:jc w:val="both"/>
+      </w:pPr>
+      <w:r>
+        <w:rPr>
+          <w:rFonts w:ascii="Times New Roman" w:hAnsi="Times New Roman" w:eastAsia="Times New Roman"/>
+          <w:sz w:val="26"/>
+        </w:rPr>
+        <w:t>Từ góc nhìn học thuật, điểm đáng giá không phải là chứng minh một thuật toán thắng toàn bộ các thuật toán còn lại, mà là xác định đúng hoàn cảnh sử dụng. Một thuật toán chỉ có ý nghĩa khi mô hình bài toán phù hợp với giả định của nó. A* cần heuristic; Forward Checking cần biến, miền giá trị và ràng buộc; AND-OR Search cần transition model có nhiều outcome; Alpha-Beta cần cây quyết định và hàm utility.</w:t>
+      </w:r>
+    </w:p>
+    <w:p>
+      <w:pPr>
+        <w:pStyle w:val="Heading2"/>
+        <w:spacing w:before="120" w:after="120"/>
+      </w:pPr>
+      <w:r>
+        <w:rPr>
+          <w:rFonts w:ascii="Times New Roman" w:hAnsi="Times New Roman" w:eastAsia="Times New Roman"/>
+          <w:b/>
+          <w:sz w:val="26"/>
+        </w:rPr>
+        <w:t>2. Mối liên hệ giữa biểu diễn trạng thái và thuật toán</w:t>
+      </w:r>
+    </w:p>
+    <w:p>
+      <w:pPr>
+        <w:spacing w:after="120" w:line="300" w:lineRule="auto"/>
+        <w:ind w:firstLine="567"/>
+        <w:jc w:val="both"/>
+      </w:pPr>
+      <w:r>
+        <w:rPr>
+          <w:rFonts w:ascii="Times New Roman" w:hAnsi="Times New Roman" w:eastAsia="Times New Roman"/>
+          <w:sz w:val="26"/>
+        </w:rPr>
+        <w:t>Biểu diễn trạng thái là cầu nối giữa bài toán thực tế và thuật toán. Nếu trạng thái chỉ gồm vị trí hiện tại, ta có bài toán path finding cổ điển. Nếu trạng thái gồm thêm tập đơn hàng chưa giao, thời gian và tải hiện tại, không gian trạng thái mở rộng rất nhanh. Nếu trạng thái còn chứa thông tin bất định hoặc belief về môi trường, bài toán trở thành lập kế hoạch trong môi trường phức tạp.</w:t>
+      </w:r>
+    </w:p>
+    <w:p>
+      <w:pPr>
+        <w:spacing w:after="120" w:line="300" w:lineRule="auto"/>
+        <w:ind w:firstLine="567"/>
+        <w:jc w:val="both"/>
+      </w:pPr>
+      <w:r>
+        <w:rPr>
+          <w:rFonts w:ascii="Times New Roman" w:hAnsi="Times New Roman" w:eastAsia="Times New Roman"/>
+          <w:sz w:val="26"/>
+        </w:rPr>
+        <w:t>DFS và A* dùng biểu diễn trạng thái tương đối gần với graph. Điểm khác biệt là DFS không có thước đo định hướng, còn A* thêm hàm h(n). Vì vậy, chỉ cần thay đổi biểu diễn chi phí và heuristic, hành vi của A* có thể thay đổi đáng kể. Một heuristic tốt giúp giảm node mở rộng; một heuristic sai có thể làm mất bảo đảm tối ưu.</w:t>
+      </w:r>
+    </w:p>
+    <w:p>
+      <w:pPr>
+        <w:spacing w:after="120" w:line="300" w:lineRule="auto"/>
+        <w:ind w:firstLine="567"/>
+        <w:jc w:val="both"/>
+      </w:pPr>
+      <w:r>
+        <w:rPr>
+          <w:rFonts w:ascii="Times New Roman" w:hAnsi="Times New Roman" w:eastAsia="Times New Roman"/>
+          <w:sz w:val="26"/>
+        </w:rPr>
+        <w:t>Simple Hill Climbing lại yêu cầu trạng thái ở mức cấu hình. Thay vì hỏi node kế tiếp là gì, thuật toán hỏi route hiện tại có thể cải thiện bằng neighbor nào. Do đó, việc định nghĩa neighbor quan trọng không kém hàm cost. Nếu neighbor quá nghèo, thuật toán dễ kẹt; nếu neighbor quá rộng, chi phí mỗi vòng tăng cao.</w:t>
+      </w:r>
+    </w:p>
+    <w:p>
+      <w:pPr>
+        <w:spacing w:after="120" w:line="300" w:lineRule="auto"/>
+        <w:ind w:firstLine="567"/>
+        <w:jc w:val="both"/>
+      </w:pPr>
+      <w:r>
+        <w:rPr>
+          <w:rFonts w:ascii="Times New Roman" w:hAnsi="Times New Roman" w:eastAsia="Times New Roman"/>
+          <w:sz w:val="26"/>
+        </w:rPr>
+        <w:t>Forward Checking yêu cầu biểu diễn biến và domain. Đây là cách nhìn khác hẳn graph search. Một đơn hàng không còn chỉ là điểm trên bản đồ, mà trở thành biến cần được gán vị trí, thời điểm hoặc shipper. Ràng buộc chuyển thành điều kiện loại giá trị khỏi domain. Nhờ cách biểu diễn này, nhiều phương án sai bị loại trước khi cần tính route chi tiết.</w:t>
+      </w:r>
+    </w:p>
+    <w:p>
+      <w:pPr>
+        <w:spacing w:after="120" w:line="300" w:lineRule="auto"/>
+        <w:ind w:firstLine="567"/>
+        <w:jc w:val="both"/>
+      </w:pPr>
+      <w:r>
+        <w:rPr>
+          <w:rFonts w:ascii="Times New Roman" w:hAnsi="Times New Roman" w:eastAsia="Times New Roman"/>
+          <w:sz w:val="26"/>
+        </w:rPr>
+        <w:t>AND-OR Search và Alpha-Beta Pruning đòi hỏi mô hình hóa nhánh quyết định. AND-OR cần biết hành động nào có thể tạo outcome nào. Alpha-Beta cần xác định lượt MAX, lượt MIN và utility ở lá. Nếu không xây dựng được mô hình trạng thái phù hợp, hai thuật toán này sẽ trở thành mô tả hình thức. Vì vậy, trong demo, nhóm cần chọn kịch bản nhỏ nhưng rõ để minh họa đúng bản chất.</w:t>
+      </w:r>
+    </w:p>
+    <w:p>
+      <w:pPr>
+        <w:pStyle w:val="Heading2"/>
+        <w:spacing w:before="120" w:after="120"/>
+      </w:pPr>
+      <w:r>
+        <w:rPr>
+          <w:rFonts w:ascii="Times New Roman" w:hAnsi="Times New Roman" w:eastAsia="Times New Roman"/>
+          <w:b/>
+          <w:sz w:val="26"/>
+        </w:rPr>
+        <w:t>3. Hạn chế và hướng hoàn thiện thực nghiệm</w:t>
+      </w:r>
+    </w:p>
+    <w:p>
+      <w:pPr>
+        <w:spacing w:after="120" w:line="300" w:lineRule="auto"/>
+        <w:ind w:firstLine="567"/>
+        <w:jc w:val="both"/>
+      </w:pPr>
+      <w:r>
+        <w:rPr>
+          <w:rFonts w:ascii="Times New Roman" w:hAnsi="Times New Roman" w:eastAsia="Times New Roman"/>
+          <w:sz w:val="26"/>
+        </w:rPr>
+        <w:t>Hạn chế lớn nhất của báo cáo hiện tại là phần thực nghiệm phụ thuộc vào mức độ hoàn thiện của chương trình và dữ liệu demo. Phân tích thuật toán đã đủ để trình bày lý thuyết, nhưng để thuyết phục trong báo cáo cuối kỳ, nhóm cần bổ sung hình ảnh hoặc animation cho từng thuật toán. Mỗi hình nên thể hiện quá trình chứ không chỉ kết quả cuối cùng.</w:t>
+      </w:r>
+    </w:p>
+    <w:p>
+      <w:pPr>
+        <w:spacing w:after="120" w:line="300" w:lineRule="auto"/>
+        <w:ind w:firstLine="567"/>
+        <w:jc w:val="both"/>
+      </w:pPr>
+      <w:r>
+        <w:rPr>
+          <w:rFonts w:ascii="Times New Roman" w:hAnsi="Times New Roman" w:eastAsia="Times New Roman"/>
+          <w:sz w:val="26"/>
+        </w:rPr>
+        <w:t>Đối với DFS, hướng hoàn thiện là xuất trace cho từng bước mở rộng, bao gồm stack và visited set. Đối với A*, cần xuất open set, closed set, g-score và f-score. Đối với Simple Hill Climbing, cần xuất cost qua từng vòng. Đối với AND-OR Search, cần vẽ conditional plan. Đối với Forward Checking, cần vẽ domain bị thu hẹp. Đối với Alpha-Beta, cần đánh dấu nhánh bị cắt.</w:t>
+      </w:r>
+    </w:p>
+    <w:p>
+      <w:pPr>
+        <w:spacing w:after="120" w:line="300" w:lineRule="auto"/>
+        <w:ind w:firstLine="567"/>
+        <w:jc w:val="both"/>
+      </w:pPr>
+      <w:r>
+        <w:rPr>
+          <w:rFonts w:ascii="Times New Roman" w:hAnsi="Times New Roman" w:eastAsia="Times New Roman"/>
+          <w:sz w:val="26"/>
+        </w:rPr>
+        <w:t>Một hướng hoàn thiện khác là thống nhất dữ liệu đầu vào giữa các thuật toán ở mức có thể. DFS và A* có thể dùng cùng graph để so sánh tìm kiếm mù và tìm kiếm có thông tin. Simple Hill Climbing có thể dùng output route từ A* làm một phần của cấu hình ban đầu. Forward Checking có thể kiểm tra ràng buộc trên cùng tập đơn hàng. Cách liên kết này giúp báo cáo giống một dự án tổng hợp thay vì sáu ví dụ rời rạc.</w:t>
+      </w:r>
+    </w:p>
+    <w:p>
+      <w:pPr>
+        <w:spacing w:after="120" w:line="300" w:lineRule="auto"/>
+        <w:ind w:firstLine="567"/>
+        <w:jc w:val="both"/>
+      </w:pPr>
+      <w:r>
+        <w:rPr>
+          <w:rFonts w:ascii="Times New Roman" w:hAnsi="Times New Roman" w:eastAsia="Times New Roman"/>
+          <w:sz w:val="26"/>
+        </w:rPr>
+        <w:t>Trong phần vấn đáp, nhóm nên chuẩn bị câu trả lời về lý do không chọn hai thuật toán cho mỗi nhóm. Lý do là yêu cầu mới của phần II tập trung vào mỗi mục một thuật toán, nên báo cáo chọn đại diện tiêu biểu và phân tích sâu hơn. Cách này giúp tránh tình trạng liệt kê nhiều thuật toán nhưng không đủ độ sâu về trạng thái, mục tiêu, độ phức tạp và tính chất.</w:t>
+      </w:r>
+    </w:p>
+    <w:p>
+      <w:pPr>
+        <w:spacing w:after="120" w:line="300" w:lineRule="auto"/>
+        <w:ind w:firstLine="567"/>
+        <w:jc w:val="both"/>
+      </w:pPr>
+      <w:r>
+        <w:rPr>
+          <w:rFonts w:ascii="Times New Roman" w:hAnsi="Times New Roman" w:eastAsia="Times New Roman"/>
+          <w:sz w:val="26"/>
+        </w:rPr>
+        <w:t>Cuối cùng, cần lưu ý rằng độ dài báo cáo không nên đến từ việc lặp lại định nghĩa, mà từ việc phân tích mối liên hệ giữa thuật toán và bài toán. Các đoạn mở rộng trong phần thảo luận phải giải thích được tại sao thuật toán phù hợp, giới hạn của nó là gì và nếu đưa vào hệ thống thực tế thì nên đặt ở tầng nào. Đây là cách làm cho báo cáo dài hơn nhưng vẫn có giá trị học thuật.</w:t>
       </w:r>
     </w:p>
     <w:p>
       <w:pPr>
         <w:pStyle w:val="Heading1"/>
         <w:pageBreakBefore/>
-      </w:pPr>
-      <w:bookmarkStart w:id="31" w:name="_Toc233509698"/>
-      <w:r>
-        <w:rPr>
-          <w:rFonts w:eastAsia="Times New Roman" w:cs="Times New Roman"/>
-          <w:color w:val="000000"/>
-        </w:rPr>
-        <w:t>V. KẾT LUẬN</w:t>
-      </w:r>
-      <w:bookmarkEnd w:id="31"/>
-    </w:p>
-    <w:p>
-      <w:r>
-        <w:t>Báo cáo đã được tổ chức theo bố cục cuối kỳ gồm bài toán đặt ra, thuật toán áp dụng, thực nghiệm và kết quả, đánh giá và thảo luận, kết luận và tài liệu tham khảo. Phần bài toán được phân tích thông qua không gian trạng thái, dữ liệu vào ra, tiêu chí chi phí và mô hình PEAS. Phần thuật toán lựa chọn một đại diện cho mỗi nhóm chính theo thứ tự: DFS, A*, Simple Hill Climbing, AND-OR Search, Forward Checking và Alpha-Beta Pruning.</w:t>
-      </w:r>
-    </w:p>
-    <w:p>
-      <w:r>
-        <w:t>Trong bước tiếp theo, nhóm cần bổ sung ảnh động hoặc ảnh chụp màn hình thực nghiệm cho từng thuật toán, đặc biệt là trace A*, quá trình cải thiện của Simple Hill Climbing, cây AND-OR conditional plan, domain pruning của Forward Checking và các nhánh bị cắt trong Alpha-Beta. Khi có số liệu đầy đủ, phần đánh giá có thể bổ sung biểu đồ so sánh số node mở rộng, thời gian chạy, chi phí route và mức độ thỏa ràng buộc.</w:t>
+        <w:spacing w:before="0" w:after="120"/>
+        <w:jc w:val="left"/>
+      </w:pPr>
+      <w:r>
+        <w:rPr>
+          <w:rFonts w:ascii="Times New Roman" w:hAnsi="Times New Roman" w:eastAsia="Times New Roman"/>
+          <w:b/>
+          <w:sz w:val="26"/>
+        </w:rPr>
+        <w:t>V. Kết luận</w:t>
+      </w:r>
+    </w:p>
+    <w:p>
+      <w:pPr>
+        <w:spacing w:before="0" w:after="120" w:line="300" w:lineRule="auto"/>
+        <w:ind w:firstLine="567"/>
+        <w:jc w:val="both"/>
+      </w:pPr>
+      <w:r>
+        <w:rPr>
+          <w:rFonts w:ascii="Times New Roman" w:hAnsi="Times New Roman" w:eastAsia="Times New Roman"/>
+          <w:sz w:val="26"/>
+        </w:rPr>
+        <w:t>Báo cáo đã phân tích bài toán Find Your Path dưới góc nhìn của một hệ thống trí tuệ nhân tạo. Bài toán không chỉ là tìm một đường đi ngắn, mà là lập kế hoạch trong môi trường có trọng số, ràng buộc, mục tiêu tối ưu và khả năng phát sinh tình huống bất định. Việc phân tích PEAS giúp xác định rõ tác tử đang tối ưu điều gì, hoạt động trong môi trường nào, thực hiện hành động nào và nhận thông tin từ nguồn nào.</w:t>
+      </w:r>
+    </w:p>
+    <w:p>
+      <w:pPr>
+        <w:spacing w:before="0" w:after="120" w:line="300" w:lineRule="auto"/>
+        <w:ind w:firstLine="567"/>
+        <w:jc w:val="both"/>
+      </w:pPr>
+      <w:r>
+        <w:rPr>
+          <w:rFonts w:ascii="Times New Roman" w:hAnsi="Times New Roman" w:eastAsia="Times New Roman"/>
+          <w:sz w:val="26"/>
+        </w:rPr>
+        <w:t>Phần thuật toán đã chọn sáu đại diện theo đúng nhóm kiến thức: DFS cho tìm kiếm không thông tin, A* cho tìm kiếm có thông tin, Simple Hill Climbing cho tìm kiếm cục bộ, AND-OR Search cho môi trường phức tạp, Forward Checking cho thỏa ràng buộc và Alpha-Beta Pruning cho tìm kiếm đối kháng. Mỗi thuật toán được phân tích theo trạng thái bắt đầu, trạng thái mục tiêu, quy trình tìm lời giải, công thức nếu có, độ phức tạp và bốn tính chất cơ bản.</w:t>
+      </w:r>
+    </w:p>
+    <w:p>
+      <w:pPr>
+        <w:spacing w:before="0" w:after="120" w:line="300" w:lineRule="auto"/>
+        <w:ind w:firstLine="567"/>
+        <w:jc w:val="both"/>
+      </w:pPr>
+      <w:r>
+        <w:rPr>
+          <w:rFonts w:ascii="Times New Roman" w:hAnsi="Times New Roman" w:eastAsia="Times New Roman"/>
+          <w:sz w:val="26"/>
+        </w:rPr>
+        <w:t>Kết quả quan trọng nhất của báo cáo là làm rõ rằng các thuật toán không thay thế lẫn nhau hoàn toàn. Chúng đại diện cho các cách nhìn khác nhau về cùng một miền bài toán. A* phù hợp để tìm đường, Forward Checking phù hợp để kiểm tra ràng buộc, AND-OR Search phù hợp với kế hoạch có điều kiện, còn Alpha-Beta phù hợp để phân tích tình huống bất lợi. Cách hiểu này giúp nhóm trình bày và vấn đáp tự tin hơn.</w:t>
+      </w:r>
+    </w:p>
+    <w:p>
+      <w:pPr>
+        <w:spacing w:before="0" w:after="120" w:line="300" w:lineRule="auto"/>
+        <w:ind w:firstLine="567"/>
+        <w:jc w:val="both"/>
+      </w:pPr>
+      <w:r>
+        <w:rPr>
+          <w:rFonts w:ascii="Times New Roman" w:hAnsi="Times New Roman" w:eastAsia="Times New Roman"/>
+          <w:sz w:val="26"/>
+        </w:rPr>
+        <w:t>Trong bước tiếp theo, nhóm cần bổ sung hình minh họa và số liệu thực nghiệm từ chương trình. Mỗi thuật toán nên có ít nhất một trace hoặc ảnh động thể hiện quá trình ra quyết định. Khi các minh họa này được chèn vào báo cáo và slide, sản phẩm cuối kỳ sẽ có sự liên kết tốt hơn giữa lý thuyết, mã nguồn và kết quả trình diễn.</w:t>
       </w:r>
     </w:p>
     <w:p>
       <w:pPr>
         <w:pStyle w:val="Heading1"/>
         <w:pageBreakBefore/>
-        <w:jc w:val="center"/>
-      </w:pPr>
-      <w:bookmarkStart w:id="32" w:name="_Toc233509699"/>
-      <w:r>
-        <w:rPr>
-          <w:rFonts w:eastAsia="Times New Roman" w:cs="Times New Roman"/>
-          <w:color w:val="000000"/>
-        </w:rPr>
-        <w:t>TÀI LIỆU THAM KHẢO</w:t>
-      </w:r>
-      <w:bookmarkEnd w:id="32"/>
-    </w:p>
-    <w:p>
-      <w:pPr>
-        <w:ind w:left="720" w:hanging="363"/>
-      </w:pPr>
-      <w:r>
-        <w:rPr>
-          <w:color w:val="000000"/>
-        </w:rPr>
-        <w:t>[1] Stuart Russell, Peter Norvig, Artificial Intelligence: A Modern Approach, Pearson.</w:t>
-      </w:r>
-    </w:p>
-    <w:p>
-      <w:pPr>
-        <w:ind w:left="720" w:hanging="363"/>
-      </w:pPr>
-      <w:r>
-        <w:rPr>
-          <w:color w:val="000000"/>
-        </w:rPr>
-        <w:t>[2] Nilsson, N. J., Artificial Intelligence: A New Synthesis, Morgan Kaufmann.</w:t>
-      </w:r>
-    </w:p>
-    <w:p>
-      <w:pPr>
-        <w:ind w:left="720" w:hanging="363"/>
-      </w:pPr>
-      <w:r>
-        <w:rPr>
-          <w:color w:val="000000"/>
-        </w:rPr>
-        <w:t>[3] Korf, R. E., Artificial intelligence search algorithms, trong Algorithms and Theory of Computation Handbook.</w:t>
-      </w:r>
-    </w:p>
-    <w:p>
-      <w:pPr>
-        <w:ind w:left="720" w:hanging="363"/>
-        <w:rPr>
-          <w:lang w:val="fr-FR"/>
-        </w:rPr>
-      </w:pPr>
-      <w:r>
-        <w:rPr>
-          <w:color w:val="000000"/>
-          <w:lang w:val="fr-FR"/>
-        </w:rPr>
-        <w:t>[4] AIMA Python resources, https://github.com/aimacode/aima-python.</w:t>
-      </w:r>
-    </w:p>
-    <w:p>
-      <w:pPr>
-        <w:ind w:left="720" w:hanging="363"/>
-      </w:pPr>
-      <w:r>
-        <w:rPr>
-          <w:color w:val="000000"/>
-        </w:rPr>
-        <w:t>[5] Find Your Path project repository, https://github.com/zomboXx/FYP.git.</w:t>
+        <w:spacing w:before="0" w:after="120"/>
+        <w:jc w:val="left"/>
+      </w:pPr>
+      <w:r>
+        <w:rPr>
+          <w:rFonts w:ascii="Times New Roman" w:hAnsi="Times New Roman" w:eastAsia="Times New Roman"/>
+          <w:b/>
+          <w:sz w:val="26"/>
+        </w:rPr>
+        <w:t>Tài liệu tham khảo</w:t>
+      </w:r>
+    </w:p>
+    <w:p>
+      <w:pPr>
+        <w:spacing w:before="0" w:after="120" w:line="300" w:lineRule="auto"/>
+        <w:jc w:val="both"/>
+      </w:pPr>
+      <w:r>
+        <w:rPr>
+          <w:rFonts w:ascii="Times New Roman" w:hAnsi="Times New Roman" w:eastAsia="Times New Roman"/>
+          <w:sz w:val="26"/>
+        </w:rPr>
+        <w:t>Russell, S. J., &amp; Norvig, P. Artificial Intelligence: A Modern Approach. Pearson.</w:t>
+      </w:r>
+    </w:p>
+    <w:p>
+      <w:pPr>
+        <w:spacing w:before="0" w:after="120" w:line="300" w:lineRule="auto"/>
+        <w:jc w:val="both"/>
+      </w:pPr>
+      <w:r>
+        <w:rPr>
+          <w:rFonts w:ascii="Times New Roman" w:hAnsi="Times New Roman" w:eastAsia="Times New Roman"/>
+          <w:sz w:val="26"/>
+        </w:rPr>
+        <w:t>Tài liệu bài giảng học phần Trí tuệ nhân tạo, Trường Đại học Sư phạm Kỹ thuật TP. Hồ Chí Minh.</w:t>
+      </w:r>
+    </w:p>
+    <w:p>
+      <w:pPr>
+        <w:spacing w:before="0" w:after="120" w:line="300" w:lineRule="auto"/>
+        <w:jc w:val="both"/>
+      </w:pPr>
+      <w:r>
+        <w:rPr>
+          <w:rFonts w:ascii="Times New Roman" w:hAnsi="Times New Roman" w:eastAsia="Times New Roman"/>
+          <w:sz w:val="26"/>
+        </w:rPr>
+        <w:t>Tài liệu mã nguồn dự án Find Your Path tại GitHub: https://github.com/zomboXx/FYP.git.</w:t>
+      </w:r>
+    </w:p>
+    <w:p>
+      <w:pPr>
+        <w:spacing w:before="0" w:after="120" w:line="300" w:lineRule="auto"/>
+        <w:jc w:val="both"/>
+      </w:pPr>
+      <w:r>
+        <w:rPr>
+          <w:rFonts w:ascii="Times New Roman" w:hAnsi="Times New Roman" w:eastAsia="Times New Roman"/>
+          <w:sz w:val="26"/>
+        </w:rPr>
+        <w:t>Python documentation và tài liệu thư viện hỗ trợ xử lý đồ thị, giao diện và kiểm thử trong dự án.</w:t>
       </w:r>
     </w:p>
     <w:sectPr>
@@ -3464,9 +4807,10 @@
       <w:outlineLvl w:val="0"/>
     </w:pPr>
     <w:rPr>
-      <w:rFonts w:eastAsiaTheme="majorEastAsia" w:cstheme="majorBidi"/>
+      <w:rFonts w:eastAsiaTheme="majorEastAsia" w:cstheme="majorBidi" w:ascii="Times New Roman" w:hAnsi="Times New Roman" w:eastAsia="Times New Roman"/>
       <w:b/>
       <w:bCs/>
+      <w:sz w:val="26"/>
     </w:rPr>
   </w:style>
   <w:style w:type="paragraph" w:styleId="Heading2">
@@ -3487,9 +4831,10 @@
       <w:outlineLvl w:val="1"/>
     </w:pPr>
     <w:rPr>
-      <w:rFonts w:eastAsiaTheme="majorEastAsia" w:cstheme="majorBidi"/>
+      <w:rFonts w:eastAsiaTheme="majorEastAsia" w:cstheme="majorBidi" w:ascii="Times New Roman" w:hAnsi="Times New Roman" w:eastAsia="Times New Roman"/>
       <w:b/>
       <w:bCs/>
+      <w:sz w:val="26"/>
     </w:rPr>
   </w:style>
   <w:style w:type="paragraph" w:styleId="Heading3">
@@ -3509,10 +4854,11 @@
       <w:outlineLvl w:val="2"/>
     </w:pPr>
     <w:rPr>
-      <w:rFonts w:eastAsiaTheme="majorEastAsia" w:cstheme="majorBidi"/>
+      <w:rFonts w:eastAsiaTheme="majorEastAsia" w:cstheme="majorBidi" w:ascii="Times New Roman" w:hAnsi="Times New Roman" w:eastAsia="Times New Roman"/>
       <w:b/>
       <w:bCs/>
       <w:i/>
+      <w:sz w:val="26"/>
     </w:rPr>
   </w:style>
   <w:style w:type="paragraph" w:styleId="Heading4">
@@ -14499,6 +15845,10 @@
     <w:pPr>
       <w:spacing w:after="100"/>
     </w:pPr>
+    <w:rPr>
+      <w:rFonts w:ascii="Times New Roman" w:hAnsi="Times New Roman" w:eastAsia="Times New Roman"/>
+      <w:sz w:val="26"/>
+    </w:rPr>
   </w:style>
   <w:style w:type="paragraph" w:styleId="TOC2">
     <w:name w:val="toc 2"/>
@@ -14512,6 +15862,10 @@
       <w:spacing w:after="100"/>
       <w:ind w:left="260"/>
     </w:pPr>
+    <w:rPr>
+      <w:rFonts w:ascii="Times New Roman" w:hAnsi="Times New Roman" w:eastAsia="Times New Roman"/>
+      <w:sz w:val="26"/>
+    </w:rPr>
   </w:style>
   <w:style w:type="paragraph" w:styleId="TOC3">
     <w:name w:val="toc 3"/>
@@ -14525,6 +15879,10 @@
       <w:spacing w:after="100"/>
       <w:ind w:left="520"/>
     </w:pPr>
+    <w:rPr>
+      <w:rFonts w:ascii="Times New Roman" w:hAnsi="Times New Roman" w:eastAsia="Times New Roman"/>
+      <w:sz w:val="26"/>
+    </w:rPr>
   </w:style>
   <w:style w:type="character" w:styleId="Hyperlink">
     <w:name w:val="Hyperlink"/>

</xml_diff>

<commit_message>
Refresh final report document
</commit_message>
<xml_diff>
--- a/docs/find-your-path-report.docx
+++ b/docs/find-your-path-report.docx
@@ -1162,1606 +1162,1595 @@
     </w:p>
     <w:p>
       <w:pPr>
+        <w:pStyle w:val="TOC1"/>
+        <w:tabs>
+          <w:tab w:val="right" w:leader="dot" w:pos="9061"/>
+        </w:tabs>
+        <w:rPr>
+          <w:rFonts w:asciiTheme="minorHAnsi" w:eastAsiaTheme="minorEastAsia" w:hAnsiTheme="minorHAnsi" w:cstheme="minorBidi"/>
+          <w:noProof/>
+          <w:kern w:val="2"/>
+          <w:sz w:val="24"/>
+          <w:szCs w:val="24"/>
+          <w14:ligatures w14:val="standardContextual"/>
+        </w:rPr>
+      </w:pPr>
+      <w:r>
+        <w:fldChar w:fldCharType="begin"/>
+      </w:r>
+      <w:r>
+        <w:instrText xml:space="preserve"> TOC \o "1-2" \f - \t "-1" </w:instrText>
+      </w:r>
+      <w:r>
+        <w:fldChar w:fldCharType="separate"/>
+      </w:r>
+      <w:r>
+        <w:rPr>
+          <w:noProof/>
+        </w:rPr>
+        <w:t>I. Bài toán đặt ra</w:t>
+      </w:r>
+      <w:r>
+        <w:rPr>
+          <w:noProof/>
+        </w:rPr>
+        <w:tab/>
+      </w:r>
+      <w:r>
+        <w:rPr>
+          <w:noProof/>
+        </w:rPr>
+        <w:fldChar w:fldCharType="begin"/>
+      </w:r>
+      <w:r>
+        <w:rPr>
+          <w:noProof/>
+        </w:rPr>
+        <w:instrText xml:space="preserve"> PAGEREF _Toc233552827 \h </w:instrText>
+      </w:r>
+      <w:r>
+        <w:rPr>
+          <w:noProof/>
+        </w:rPr>
+      </w:r>
+      <w:r>
+        <w:rPr>
+          <w:noProof/>
+        </w:rPr>
+        <w:fldChar w:fldCharType="separate"/>
+      </w:r>
+      <w:r>
+        <w:rPr>
+          <w:noProof/>
+        </w:rPr>
+        <w:t>5</w:t>
+      </w:r>
+      <w:r>
+        <w:rPr>
+          <w:noProof/>
+        </w:rPr>
+        <w:fldChar w:fldCharType="end"/>
+      </w:r>
+    </w:p>
+    <w:p>
+      <w:pPr>
+        <w:pStyle w:val="TOC2"/>
+        <w:tabs>
+          <w:tab w:val="right" w:leader="dot" w:pos="9061"/>
+        </w:tabs>
+        <w:rPr>
+          <w:rFonts w:asciiTheme="minorHAnsi" w:eastAsiaTheme="minorEastAsia" w:hAnsiTheme="minorHAnsi" w:cstheme="minorBidi"/>
+          <w:noProof/>
+          <w:kern w:val="2"/>
+          <w:sz w:val="24"/>
+          <w:szCs w:val="24"/>
+          <w14:ligatures w14:val="standardContextual"/>
+        </w:rPr>
+      </w:pPr>
+      <w:r>
+        <w:rPr>
+          <w:noProof/>
+        </w:rPr>
+        <w:t>1. Bài toán gì</w:t>
+      </w:r>
+      <w:r>
+        <w:rPr>
+          <w:noProof/>
+        </w:rPr>
+        <w:tab/>
+      </w:r>
+      <w:r>
+        <w:rPr>
+          <w:noProof/>
+        </w:rPr>
+        <w:fldChar w:fldCharType="begin"/>
+      </w:r>
+      <w:r>
+        <w:rPr>
+          <w:noProof/>
+        </w:rPr>
+        <w:instrText xml:space="preserve"> PAGEREF _Toc233552828 \h </w:instrText>
+      </w:r>
+      <w:r>
+        <w:rPr>
+          <w:noProof/>
+        </w:rPr>
+      </w:r>
+      <w:r>
+        <w:rPr>
+          <w:noProof/>
+        </w:rPr>
+        <w:fldChar w:fldCharType="separate"/>
+      </w:r>
+      <w:r>
+        <w:rPr>
+          <w:noProof/>
+        </w:rPr>
+        <w:t>5</w:t>
+      </w:r>
+      <w:r>
+        <w:rPr>
+          <w:noProof/>
+        </w:rPr>
+        <w:fldChar w:fldCharType="end"/>
+      </w:r>
+    </w:p>
+    <w:p>
+      <w:pPr>
+        <w:pStyle w:val="TOC2"/>
+        <w:tabs>
+          <w:tab w:val="right" w:leader="dot" w:pos="9061"/>
+        </w:tabs>
+        <w:rPr>
+          <w:rFonts w:asciiTheme="minorHAnsi" w:eastAsiaTheme="minorEastAsia" w:hAnsiTheme="minorHAnsi" w:cstheme="minorBidi"/>
+          <w:noProof/>
+          <w:kern w:val="2"/>
+          <w:sz w:val="24"/>
+          <w:szCs w:val="24"/>
+          <w14:ligatures w14:val="standardContextual"/>
+        </w:rPr>
+      </w:pPr>
+      <w:r>
+        <w:rPr>
+          <w:noProof/>
+        </w:rPr>
+        <w:t>2. Phân tích PEAS của bài toán</w:t>
+      </w:r>
+      <w:r>
+        <w:rPr>
+          <w:noProof/>
+        </w:rPr>
+        <w:tab/>
+      </w:r>
+      <w:r>
+        <w:rPr>
+          <w:noProof/>
+        </w:rPr>
+        <w:fldChar w:fldCharType="begin"/>
+      </w:r>
+      <w:r>
+        <w:rPr>
+          <w:noProof/>
+        </w:rPr>
+        <w:instrText xml:space="preserve"> PAGEREF _Toc233552829 \h </w:instrText>
+      </w:r>
+      <w:r>
+        <w:rPr>
+          <w:noProof/>
+        </w:rPr>
+      </w:r>
+      <w:r>
+        <w:rPr>
+          <w:noProof/>
+        </w:rPr>
+        <w:fldChar w:fldCharType="separate"/>
+      </w:r>
+      <w:r>
+        <w:rPr>
+          <w:noProof/>
+        </w:rPr>
+        <w:t>6</w:t>
+      </w:r>
+      <w:r>
+        <w:rPr>
+          <w:noProof/>
+        </w:rPr>
+        <w:fldChar w:fldCharType="end"/>
+      </w:r>
+    </w:p>
+    <w:p>
+      <w:pPr>
+        <w:pStyle w:val="TOC1"/>
+        <w:tabs>
+          <w:tab w:val="right" w:leader="dot" w:pos="9061"/>
+        </w:tabs>
+        <w:rPr>
+          <w:rFonts w:asciiTheme="minorHAnsi" w:eastAsiaTheme="minorEastAsia" w:hAnsiTheme="minorHAnsi" w:cstheme="minorBidi"/>
+          <w:noProof/>
+          <w:kern w:val="2"/>
+          <w:sz w:val="24"/>
+          <w:szCs w:val="24"/>
+          <w14:ligatures w14:val="standardContextual"/>
+        </w:rPr>
+      </w:pPr>
+      <w:r>
+        <w:rPr>
+          <w:noProof/>
+        </w:rPr>
+        <w:t>II. Thuật toán áp dụng</w:t>
+      </w:r>
+      <w:r>
+        <w:rPr>
+          <w:noProof/>
+        </w:rPr>
+        <w:tab/>
+      </w:r>
+      <w:r>
+        <w:rPr>
+          <w:noProof/>
+        </w:rPr>
+        <w:fldChar w:fldCharType="begin"/>
+      </w:r>
+      <w:r>
+        <w:rPr>
+          <w:noProof/>
+        </w:rPr>
+        <w:instrText xml:space="preserve"> PAGEREF _Toc233552830 \h </w:instrText>
+      </w:r>
+      <w:r>
+        <w:rPr>
+          <w:noProof/>
+        </w:rPr>
+      </w:r>
+      <w:r>
+        <w:rPr>
+          <w:noProof/>
+        </w:rPr>
+        <w:fldChar w:fldCharType="separate"/>
+      </w:r>
+      <w:r>
+        <w:rPr>
+          <w:noProof/>
+        </w:rPr>
+        <w:t>8</w:t>
+      </w:r>
+      <w:r>
+        <w:rPr>
+          <w:noProof/>
+        </w:rPr>
+        <w:fldChar w:fldCharType="end"/>
+      </w:r>
+    </w:p>
+    <w:p>
+      <w:pPr>
+        <w:pStyle w:val="TOC2"/>
+        <w:tabs>
+          <w:tab w:val="right" w:leader="dot" w:pos="9061"/>
+        </w:tabs>
+        <w:rPr>
+          <w:rFonts w:asciiTheme="minorHAnsi" w:eastAsiaTheme="minorEastAsia" w:hAnsiTheme="minorHAnsi" w:cstheme="minorBidi"/>
+          <w:noProof/>
+          <w:kern w:val="2"/>
+          <w:sz w:val="24"/>
+          <w:szCs w:val="24"/>
+          <w14:ligatures w14:val="standardContextual"/>
+        </w:rPr>
+      </w:pPr>
+      <w:r>
+        <w:rPr>
+          <w:noProof/>
+        </w:rPr>
+        <w:t>1. Nhóm tìm kiếm không thông tin: Depth-First Search (DFS)</w:t>
+      </w:r>
+      <w:r>
+        <w:rPr>
+          <w:noProof/>
+        </w:rPr>
+        <w:tab/>
+      </w:r>
+      <w:r>
+        <w:rPr>
+          <w:noProof/>
+        </w:rPr>
+        <w:fldChar w:fldCharType="begin"/>
+      </w:r>
+      <w:r>
+        <w:rPr>
+          <w:noProof/>
+        </w:rPr>
+        <w:instrText xml:space="preserve"> PAGEREF _Toc233552831 \h </w:instrText>
+      </w:r>
+      <w:r>
+        <w:rPr>
+          <w:noProof/>
+        </w:rPr>
+      </w:r>
+      <w:r>
+        <w:rPr>
+          <w:noProof/>
+        </w:rPr>
+        <w:fldChar w:fldCharType="separate"/>
+      </w:r>
+      <w:r>
+        <w:rPr>
+          <w:noProof/>
+        </w:rPr>
+        <w:t>8</w:t>
+      </w:r>
+      <w:r>
+        <w:rPr>
+          <w:noProof/>
+        </w:rPr>
+        <w:fldChar w:fldCharType="end"/>
+      </w:r>
+    </w:p>
+    <w:p>
+      <w:pPr>
+        <w:pStyle w:val="TOC2"/>
+        <w:tabs>
+          <w:tab w:val="right" w:leader="dot" w:pos="9061"/>
+        </w:tabs>
+        <w:rPr>
+          <w:rFonts w:asciiTheme="minorHAnsi" w:eastAsiaTheme="minorEastAsia" w:hAnsiTheme="minorHAnsi" w:cstheme="minorBidi"/>
+          <w:noProof/>
+          <w:kern w:val="2"/>
+          <w:sz w:val="24"/>
+          <w:szCs w:val="24"/>
+          <w14:ligatures w14:val="standardContextual"/>
+        </w:rPr>
+      </w:pPr>
+      <w:r>
+        <w:rPr>
+          <w:noProof/>
+        </w:rPr>
+        <w:t>2. Nhóm tìm kiếm có thông tin: A*</w:t>
+      </w:r>
+      <w:r>
+        <w:rPr>
+          <w:noProof/>
+        </w:rPr>
+        <w:tab/>
+      </w:r>
+      <w:r>
+        <w:rPr>
+          <w:noProof/>
+        </w:rPr>
+        <w:fldChar w:fldCharType="begin"/>
+      </w:r>
+      <w:r>
+        <w:rPr>
+          <w:noProof/>
+        </w:rPr>
+        <w:instrText xml:space="preserve"> PAGEREF _Toc233552832 \h </w:instrText>
+      </w:r>
+      <w:r>
+        <w:rPr>
+          <w:noProof/>
+        </w:rPr>
+      </w:r>
+      <w:r>
+        <w:rPr>
+          <w:noProof/>
+        </w:rPr>
+        <w:fldChar w:fldCharType="separate"/>
+      </w:r>
+      <w:r>
+        <w:rPr>
+          <w:noProof/>
+        </w:rPr>
+        <w:t>9</w:t>
+      </w:r>
+      <w:r>
+        <w:rPr>
+          <w:noProof/>
+        </w:rPr>
+        <w:fldChar w:fldCharType="end"/>
+      </w:r>
+    </w:p>
+    <w:p>
+      <w:pPr>
+        <w:pStyle w:val="TOC2"/>
+        <w:tabs>
+          <w:tab w:val="right" w:leader="dot" w:pos="9061"/>
+        </w:tabs>
+        <w:rPr>
+          <w:rFonts w:asciiTheme="minorHAnsi" w:eastAsiaTheme="minorEastAsia" w:hAnsiTheme="minorHAnsi" w:cstheme="minorBidi"/>
+          <w:noProof/>
+          <w:kern w:val="2"/>
+          <w:sz w:val="24"/>
+          <w:szCs w:val="24"/>
+          <w14:ligatures w14:val="standardContextual"/>
+        </w:rPr>
+      </w:pPr>
+      <w:r>
+        <w:rPr>
+          <w:noProof/>
+        </w:rPr>
+        <w:t>3. Nhóm tìm kiếm cục bộ: Simple Hill Climbing</w:t>
+      </w:r>
+      <w:r>
+        <w:rPr>
+          <w:noProof/>
+        </w:rPr>
+        <w:tab/>
+      </w:r>
+      <w:r>
+        <w:rPr>
+          <w:noProof/>
+        </w:rPr>
+        <w:fldChar w:fldCharType="begin"/>
+      </w:r>
+      <w:r>
+        <w:rPr>
+          <w:noProof/>
+        </w:rPr>
+        <w:instrText xml:space="preserve"> PAGEREF _Toc233552833 \h </w:instrText>
+      </w:r>
+      <w:r>
+        <w:rPr>
+          <w:noProof/>
+        </w:rPr>
+      </w:r>
+      <w:r>
+        <w:rPr>
+          <w:noProof/>
+        </w:rPr>
+        <w:fldChar w:fldCharType="separate"/>
+      </w:r>
+      <w:r>
+        <w:rPr>
+          <w:noProof/>
+        </w:rPr>
+        <w:t>11</w:t>
+      </w:r>
+      <w:r>
+        <w:rPr>
+          <w:noProof/>
+        </w:rPr>
+        <w:fldChar w:fldCharType="end"/>
+      </w:r>
+    </w:p>
+    <w:p>
+      <w:pPr>
+        <w:pStyle w:val="TOC2"/>
+        <w:tabs>
+          <w:tab w:val="right" w:leader="dot" w:pos="9061"/>
+        </w:tabs>
+        <w:rPr>
+          <w:rFonts w:asciiTheme="minorHAnsi" w:eastAsiaTheme="minorEastAsia" w:hAnsiTheme="minorHAnsi" w:cstheme="minorBidi"/>
+          <w:noProof/>
+          <w:kern w:val="2"/>
+          <w:sz w:val="24"/>
+          <w:szCs w:val="24"/>
+          <w14:ligatures w14:val="standardContextual"/>
+        </w:rPr>
+      </w:pPr>
+      <w:r>
+        <w:rPr>
+          <w:noProof/>
+        </w:rPr>
+        <w:t>4. Nhóm môi trường phức tạp: AND-OR Search</w:t>
+      </w:r>
+      <w:r>
+        <w:rPr>
+          <w:noProof/>
+        </w:rPr>
+        <w:tab/>
+      </w:r>
+      <w:r>
+        <w:rPr>
+          <w:noProof/>
+        </w:rPr>
+        <w:fldChar w:fldCharType="begin"/>
+      </w:r>
+      <w:r>
+        <w:rPr>
+          <w:noProof/>
+        </w:rPr>
+        <w:instrText xml:space="preserve"> PAGEREF _Toc233552834 \h </w:instrText>
+      </w:r>
+      <w:r>
+        <w:rPr>
+          <w:noProof/>
+        </w:rPr>
+      </w:r>
+      <w:r>
+        <w:rPr>
+          <w:noProof/>
+        </w:rPr>
+        <w:fldChar w:fldCharType="separate"/>
+      </w:r>
+      <w:r>
+        <w:rPr>
+          <w:noProof/>
+        </w:rPr>
+        <w:t>12</w:t>
+      </w:r>
+      <w:r>
+        <w:rPr>
+          <w:noProof/>
+        </w:rPr>
+        <w:fldChar w:fldCharType="end"/>
+      </w:r>
+    </w:p>
+    <w:p>
+      <w:pPr>
+        <w:pStyle w:val="TOC2"/>
+        <w:tabs>
+          <w:tab w:val="right" w:leader="dot" w:pos="9061"/>
+        </w:tabs>
+        <w:rPr>
+          <w:rFonts w:asciiTheme="minorHAnsi" w:eastAsiaTheme="minorEastAsia" w:hAnsiTheme="minorHAnsi" w:cstheme="minorBidi"/>
+          <w:noProof/>
+          <w:kern w:val="2"/>
+          <w:sz w:val="24"/>
+          <w:szCs w:val="24"/>
+          <w14:ligatures w14:val="standardContextual"/>
+        </w:rPr>
+      </w:pPr>
+      <w:r>
+        <w:rPr>
+          <w:noProof/>
+        </w:rPr>
+        <w:t>5. Nhóm thỏa ràng buộc: Forward Checking</w:t>
+      </w:r>
+      <w:r>
+        <w:rPr>
+          <w:noProof/>
+        </w:rPr>
+        <w:tab/>
+      </w:r>
+      <w:r>
+        <w:rPr>
+          <w:noProof/>
+        </w:rPr>
+        <w:fldChar w:fldCharType="begin"/>
+      </w:r>
+      <w:r>
+        <w:rPr>
+          <w:noProof/>
+        </w:rPr>
+        <w:instrText xml:space="preserve"> PAGEREF _Toc233552835 \h </w:instrText>
+      </w:r>
+      <w:r>
+        <w:rPr>
+          <w:noProof/>
+        </w:rPr>
+      </w:r>
+      <w:r>
+        <w:rPr>
+          <w:noProof/>
+        </w:rPr>
+        <w:fldChar w:fldCharType="separate"/>
+      </w:r>
+      <w:r>
+        <w:rPr>
+          <w:noProof/>
+        </w:rPr>
+        <w:t>14</w:t>
+      </w:r>
+      <w:r>
+        <w:rPr>
+          <w:noProof/>
+        </w:rPr>
+        <w:fldChar w:fldCharType="end"/>
+      </w:r>
+    </w:p>
+    <w:p>
+      <w:pPr>
+        <w:pStyle w:val="TOC2"/>
+        <w:tabs>
+          <w:tab w:val="right" w:leader="dot" w:pos="9061"/>
+        </w:tabs>
+        <w:rPr>
+          <w:rFonts w:asciiTheme="minorHAnsi" w:eastAsiaTheme="minorEastAsia" w:hAnsiTheme="minorHAnsi" w:cstheme="minorBidi"/>
+          <w:noProof/>
+          <w:kern w:val="2"/>
+          <w:sz w:val="24"/>
+          <w:szCs w:val="24"/>
+          <w14:ligatures w14:val="standardContextual"/>
+        </w:rPr>
+      </w:pPr>
+      <w:r>
+        <w:rPr>
+          <w:noProof/>
+        </w:rPr>
+        <w:t>6. Nhóm tìm kiếm đối kháng: Alpha-Beta Pruning</w:t>
+      </w:r>
+      <w:r>
+        <w:rPr>
+          <w:noProof/>
+        </w:rPr>
+        <w:tab/>
+      </w:r>
+      <w:r>
+        <w:rPr>
+          <w:noProof/>
+        </w:rPr>
+        <w:fldChar w:fldCharType="begin"/>
+      </w:r>
+      <w:r>
+        <w:rPr>
+          <w:noProof/>
+        </w:rPr>
+        <w:instrText xml:space="preserve"> PAGEREF _Toc233552836 \h </w:instrText>
+      </w:r>
+      <w:r>
+        <w:rPr>
+          <w:noProof/>
+        </w:rPr>
+      </w:r>
+      <w:r>
+        <w:rPr>
+          <w:noProof/>
+        </w:rPr>
+        <w:fldChar w:fldCharType="separate"/>
+      </w:r>
+      <w:r>
+        <w:rPr>
+          <w:noProof/>
+        </w:rPr>
+        <w:t>15</w:t>
+      </w:r>
+      <w:r>
+        <w:rPr>
+          <w:noProof/>
+        </w:rPr>
+        <w:fldChar w:fldCharType="end"/>
+      </w:r>
+    </w:p>
+    <w:p>
+      <w:pPr>
+        <w:pStyle w:val="TOC1"/>
+        <w:tabs>
+          <w:tab w:val="right" w:leader="dot" w:pos="9061"/>
+        </w:tabs>
+        <w:rPr>
+          <w:rFonts w:asciiTheme="minorHAnsi" w:eastAsiaTheme="minorEastAsia" w:hAnsiTheme="minorHAnsi" w:cstheme="minorBidi"/>
+          <w:noProof/>
+          <w:kern w:val="2"/>
+          <w:sz w:val="24"/>
+          <w:szCs w:val="24"/>
+          <w14:ligatures w14:val="standardContextual"/>
+        </w:rPr>
+      </w:pPr>
+      <w:r>
+        <w:rPr>
+          <w:noProof/>
+        </w:rPr>
+        <w:t>III. Thực nghiệm và kết quả</w:t>
+      </w:r>
+      <w:r>
+        <w:rPr>
+          <w:noProof/>
+        </w:rPr>
+        <w:tab/>
+      </w:r>
+      <w:r>
+        <w:rPr>
+          <w:noProof/>
+        </w:rPr>
+        <w:fldChar w:fldCharType="begin"/>
+      </w:r>
+      <w:r>
+        <w:rPr>
+          <w:noProof/>
+        </w:rPr>
+        <w:instrText xml:space="preserve"> PAGEREF _Toc233552837 \h </w:instrText>
+      </w:r>
+      <w:r>
+        <w:rPr>
+          <w:noProof/>
+        </w:rPr>
+      </w:r>
+      <w:r>
+        <w:rPr>
+          <w:noProof/>
+        </w:rPr>
+        <w:fldChar w:fldCharType="separate"/>
+      </w:r>
+      <w:r>
+        <w:rPr>
+          <w:noProof/>
+        </w:rPr>
+        <w:t>17</w:t>
+      </w:r>
+      <w:r>
+        <w:rPr>
+          <w:noProof/>
+        </w:rPr>
+        <w:fldChar w:fldCharType="end"/>
+      </w:r>
+    </w:p>
+    <w:p>
+      <w:pPr>
+        <w:pStyle w:val="TOC2"/>
+        <w:tabs>
+          <w:tab w:val="right" w:leader="dot" w:pos="9061"/>
+        </w:tabs>
+        <w:rPr>
+          <w:rFonts w:asciiTheme="minorHAnsi" w:eastAsiaTheme="minorEastAsia" w:hAnsiTheme="minorHAnsi" w:cstheme="minorBidi"/>
+          <w:noProof/>
+          <w:kern w:val="2"/>
+          <w:sz w:val="24"/>
+          <w:szCs w:val="24"/>
+          <w14:ligatures w14:val="standardContextual"/>
+        </w:rPr>
+      </w:pPr>
+      <w:r>
+        <w:rPr>
+          <w:noProof/>
+        </w:rPr>
+        <w:t>1. Thiết kế kịch bản thực nghiệm</w:t>
+      </w:r>
+      <w:r>
+        <w:rPr>
+          <w:noProof/>
+        </w:rPr>
+        <w:tab/>
+      </w:r>
+      <w:r>
+        <w:rPr>
+          <w:noProof/>
+        </w:rPr>
+        <w:fldChar w:fldCharType="begin"/>
+      </w:r>
+      <w:r>
+        <w:rPr>
+          <w:noProof/>
+        </w:rPr>
+        <w:instrText xml:space="preserve"> PAGEREF _Toc233552838 \h </w:instrText>
+      </w:r>
+      <w:r>
+        <w:rPr>
+          <w:noProof/>
+        </w:rPr>
+      </w:r>
+      <w:r>
+        <w:rPr>
+          <w:noProof/>
+        </w:rPr>
+        <w:fldChar w:fldCharType="separate"/>
+      </w:r>
+      <w:r>
+        <w:rPr>
+          <w:noProof/>
+        </w:rPr>
+        <w:t>17</w:t>
+      </w:r>
+      <w:r>
+        <w:rPr>
+          <w:noProof/>
+        </w:rPr>
+        <w:fldChar w:fldCharType="end"/>
+      </w:r>
+    </w:p>
+    <w:p>
+      <w:pPr>
+        <w:pStyle w:val="TOC2"/>
+        <w:tabs>
+          <w:tab w:val="right" w:leader="dot" w:pos="9061"/>
+        </w:tabs>
+        <w:rPr>
+          <w:rFonts w:asciiTheme="minorHAnsi" w:eastAsiaTheme="minorEastAsia" w:hAnsiTheme="minorHAnsi" w:cstheme="minorBidi"/>
+          <w:noProof/>
+          <w:kern w:val="2"/>
+          <w:sz w:val="24"/>
+          <w:szCs w:val="24"/>
+          <w14:ligatures w14:val="standardContextual"/>
+        </w:rPr>
+      </w:pPr>
+      <w:r>
+        <w:rPr>
+          <w:noProof/>
+        </w:rPr>
+        <w:t>2. Chỉ tiêu quan sát và cách ghi nhận kết quả</w:t>
+      </w:r>
+      <w:r>
+        <w:rPr>
+          <w:noProof/>
+        </w:rPr>
+        <w:tab/>
+      </w:r>
+      <w:r>
+        <w:rPr>
+          <w:noProof/>
+        </w:rPr>
+        <w:fldChar w:fldCharType="begin"/>
+      </w:r>
+      <w:r>
+        <w:rPr>
+          <w:noProof/>
+        </w:rPr>
+        <w:instrText xml:space="preserve"> PAGEREF _Toc233552839 \h </w:instrText>
+      </w:r>
+      <w:r>
+        <w:rPr>
+          <w:noProof/>
+        </w:rPr>
+      </w:r>
+      <w:r>
+        <w:rPr>
+          <w:noProof/>
+        </w:rPr>
+        <w:fldChar w:fldCharType="separate"/>
+      </w:r>
+      <w:r>
+        <w:rPr>
+          <w:noProof/>
+        </w:rPr>
+        <w:t>18</w:t>
+      </w:r>
+      <w:r>
+        <w:rPr>
+          <w:noProof/>
+        </w:rPr>
+        <w:fldChar w:fldCharType="end"/>
+      </w:r>
+    </w:p>
+    <w:p>
+      <w:pPr>
+        <w:pStyle w:val="TOC2"/>
+        <w:tabs>
+          <w:tab w:val="right" w:leader="dot" w:pos="9061"/>
+        </w:tabs>
+        <w:rPr>
+          <w:rFonts w:asciiTheme="minorHAnsi" w:eastAsiaTheme="minorEastAsia" w:hAnsiTheme="minorHAnsi" w:cstheme="minorBidi"/>
+          <w:noProof/>
+          <w:kern w:val="2"/>
+          <w:sz w:val="24"/>
+          <w:szCs w:val="24"/>
+          <w14:ligatures w14:val="standardContextual"/>
+        </w:rPr>
+      </w:pPr>
+      <w:r>
+        <w:rPr>
+          <w:noProof/>
+        </w:rPr>
+        <w:t>3. Định hướng chèn hình minh họa</w:t>
+      </w:r>
+      <w:r>
+        <w:rPr>
+          <w:noProof/>
+        </w:rPr>
+        <w:tab/>
+      </w:r>
+      <w:r>
+        <w:rPr>
+          <w:noProof/>
+        </w:rPr>
+        <w:fldChar w:fldCharType="begin"/>
+      </w:r>
+      <w:r>
+        <w:rPr>
+          <w:noProof/>
+        </w:rPr>
+        <w:instrText xml:space="preserve"> PAGEREF _Toc233552840 \h </w:instrText>
+      </w:r>
+      <w:r>
+        <w:rPr>
+          <w:noProof/>
+        </w:rPr>
+      </w:r>
+      <w:r>
+        <w:rPr>
+          <w:noProof/>
+        </w:rPr>
+        <w:fldChar w:fldCharType="separate"/>
+      </w:r>
+      <w:r>
+        <w:rPr>
+          <w:noProof/>
+        </w:rPr>
+        <w:t>19</w:t>
+      </w:r>
+      <w:r>
+        <w:rPr>
+          <w:noProof/>
+        </w:rPr>
+        <w:fldChar w:fldCharType="end"/>
+      </w:r>
+    </w:p>
+    <w:p>
+      <w:pPr>
+        <w:pStyle w:val="TOC2"/>
+        <w:tabs>
+          <w:tab w:val="right" w:leader="dot" w:pos="9061"/>
+        </w:tabs>
+        <w:rPr>
+          <w:rFonts w:asciiTheme="minorHAnsi" w:eastAsiaTheme="minorEastAsia" w:hAnsiTheme="minorHAnsi" w:cstheme="minorBidi"/>
+          <w:noProof/>
+          <w:kern w:val="2"/>
+          <w:sz w:val="24"/>
+          <w:szCs w:val="24"/>
+          <w14:ligatures w14:val="standardContextual"/>
+        </w:rPr>
+      </w:pPr>
+      <w:r>
+        <w:rPr>
+          <w:noProof/>
+        </w:rPr>
+        <w:t>4. Link GitHub</w:t>
+      </w:r>
+      <w:r>
+        <w:rPr>
+          <w:noProof/>
+        </w:rPr>
+        <w:tab/>
+      </w:r>
+      <w:r>
+        <w:rPr>
+          <w:noProof/>
+        </w:rPr>
+        <w:fldChar w:fldCharType="begin"/>
+      </w:r>
+      <w:r>
+        <w:rPr>
+          <w:noProof/>
+        </w:rPr>
+        <w:instrText xml:space="preserve"> PAGEREF _Toc233552841 \h </w:instrText>
+      </w:r>
+      <w:r>
+        <w:rPr>
+          <w:noProof/>
+        </w:rPr>
+      </w:r>
+      <w:r>
+        <w:rPr>
+          <w:noProof/>
+        </w:rPr>
+        <w:fldChar w:fldCharType="separate"/>
+      </w:r>
+      <w:r>
+        <w:rPr>
+          <w:noProof/>
+        </w:rPr>
+        <w:t>19</w:t>
+      </w:r>
+      <w:r>
+        <w:rPr>
+          <w:noProof/>
+        </w:rPr>
+        <w:fldChar w:fldCharType="end"/>
+      </w:r>
+    </w:p>
+    <w:p>
+      <w:pPr>
+        <w:pStyle w:val="TOC1"/>
+        <w:tabs>
+          <w:tab w:val="right" w:leader="dot" w:pos="9061"/>
+        </w:tabs>
+        <w:rPr>
+          <w:rFonts w:asciiTheme="minorHAnsi" w:eastAsiaTheme="minorEastAsia" w:hAnsiTheme="minorHAnsi" w:cstheme="minorBidi"/>
+          <w:noProof/>
+          <w:kern w:val="2"/>
+          <w:sz w:val="24"/>
+          <w:szCs w:val="24"/>
+          <w14:ligatures w14:val="standardContextual"/>
+        </w:rPr>
+      </w:pPr>
+      <w:r>
+        <w:rPr>
+          <w:noProof/>
+        </w:rPr>
+        <w:t>IV. Đánh giá và thảo luận</w:t>
+      </w:r>
+      <w:r>
+        <w:rPr>
+          <w:noProof/>
+        </w:rPr>
+        <w:tab/>
+      </w:r>
+      <w:r>
+        <w:rPr>
+          <w:noProof/>
+        </w:rPr>
+        <w:fldChar w:fldCharType="begin"/>
+      </w:r>
+      <w:r>
+        <w:rPr>
+          <w:noProof/>
+        </w:rPr>
+        <w:instrText xml:space="preserve"> PAGEREF _Toc233552842 \h </w:instrText>
+      </w:r>
+      <w:r>
+        <w:rPr>
+          <w:noProof/>
+        </w:rPr>
+      </w:r>
+      <w:r>
+        <w:rPr>
+          <w:noProof/>
+        </w:rPr>
+        <w:fldChar w:fldCharType="separate"/>
+      </w:r>
+      <w:r>
+        <w:rPr>
+          <w:noProof/>
+        </w:rPr>
+        <w:t>20</w:t>
+      </w:r>
+      <w:r>
+        <w:rPr>
+          <w:noProof/>
+        </w:rPr>
+        <w:fldChar w:fldCharType="end"/>
+      </w:r>
+    </w:p>
+    <w:p>
+      <w:pPr>
+        <w:pStyle w:val="TOC2"/>
+        <w:tabs>
+          <w:tab w:val="right" w:leader="dot" w:pos="9061"/>
+        </w:tabs>
+        <w:rPr>
+          <w:rFonts w:asciiTheme="minorHAnsi" w:eastAsiaTheme="minorEastAsia" w:hAnsiTheme="minorHAnsi" w:cstheme="minorBidi"/>
+          <w:noProof/>
+          <w:kern w:val="2"/>
+          <w:sz w:val="24"/>
+          <w:szCs w:val="24"/>
+          <w14:ligatures w14:val="standardContextual"/>
+        </w:rPr>
+      </w:pPr>
+      <w:r>
+        <w:rPr>
+          <w:noProof/>
+        </w:rPr>
+        <w:t>1. Tổng hợp vai trò của sáu thuật toán</w:t>
+      </w:r>
+      <w:r>
+        <w:rPr>
+          <w:noProof/>
+        </w:rPr>
+        <w:tab/>
+      </w:r>
+      <w:r>
+        <w:rPr>
+          <w:noProof/>
+        </w:rPr>
+        <w:fldChar w:fldCharType="begin"/>
+      </w:r>
+      <w:r>
+        <w:rPr>
+          <w:noProof/>
+        </w:rPr>
+        <w:instrText xml:space="preserve"> PAGEREF _Toc233552843 \h </w:instrText>
+      </w:r>
+      <w:r>
+        <w:rPr>
+          <w:noProof/>
+        </w:rPr>
+      </w:r>
+      <w:r>
+        <w:rPr>
+          <w:noProof/>
+        </w:rPr>
+        <w:fldChar w:fldCharType="separate"/>
+      </w:r>
+      <w:r>
+        <w:rPr>
+          <w:noProof/>
+        </w:rPr>
+        <w:t>22</w:t>
+      </w:r>
+      <w:r>
+        <w:rPr>
+          <w:noProof/>
+        </w:rPr>
+        <w:fldChar w:fldCharType="end"/>
+      </w:r>
+    </w:p>
+    <w:p>
+      <w:pPr>
+        <w:pStyle w:val="TOC2"/>
+        <w:tabs>
+          <w:tab w:val="right" w:leader="dot" w:pos="9061"/>
+        </w:tabs>
+        <w:rPr>
+          <w:rFonts w:asciiTheme="minorHAnsi" w:eastAsiaTheme="minorEastAsia" w:hAnsiTheme="minorHAnsi" w:cstheme="minorBidi"/>
+          <w:noProof/>
+          <w:kern w:val="2"/>
+          <w:sz w:val="24"/>
+          <w:szCs w:val="24"/>
+          <w14:ligatures w14:val="standardContextual"/>
+        </w:rPr>
+      </w:pPr>
+      <w:r>
+        <w:rPr>
+          <w:noProof/>
+        </w:rPr>
+        <w:t>2. Mối liên hệ giữa biểu diễn trạng thái và thuật toán</w:t>
+      </w:r>
+      <w:r>
+        <w:rPr>
+          <w:noProof/>
+        </w:rPr>
+        <w:tab/>
+      </w:r>
+      <w:r>
+        <w:rPr>
+          <w:noProof/>
+        </w:rPr>
+        <w:fldChar w:fldCharType="begin"/>
+      </w:r>
+      <w:r>
+        <w:rPr>
+          <w:noProof/>
+        </w:rPr>
+        <w:instrText xml:space="preserve"> PAGEREF _Toc233552844 \h </w:instrText>
+      </w:r>
+      <w:r>
+        <w:rPr>
+          <w:noProof/>
+        </w:rPr>
+      </w:r>
+      <w:r>
+        <w:rPr>
+          <w:noProof/>
+        </w:rPr>
+        <w:fldChar w:fldCharType="separate"/>
+      </w:r>
+      <w:r>
+        <w:rPr>
+          <w:noProof/>
+        </w:rPr>
+        <w:t>22</w:t>
+      </w:r>
+      <w:r>
+        <w:rPr>
+          <w:noProof/>
+        </w:rPr>
+        <w:fldChar w:fldCharType="end"/>
+      </w:r>
+    </w:p>
+    <w:p>
+      <w:pPr>
+        <w:pStyle w:val="TOC2"/>
+        <w:tabs>
+          <w:tab w:val="right" w:leader="dot" w:pos="9061"/>
+        </w:tabs>
+        <w:rPr>
+          <w:rFonts w:asciiTheme="minorHAnsi" w:eastAsiaTheme="minorEastAsia" w:hAnsiTheme="minorHAnsi" w:cstheme="minorBidi"/>
+          <w:noProof/>
+          <w:kern w:val="2"/>
+          <w:sz w:val="24"/>
+          <w:szCs w:val="24"/>
+          <w14:ligatures w14:val="standardContextual"/>
+        </w:rPr>
+      </w:pPr>
+      <w:r>
+        <w:rPr>
+          <w:noProof/>
+        </w:rPr>
+        <w:t>3. Hạn chế và hướng hoàn thiện thực nghiệm</w:t>
+      </w:r>
+      <w:r>
+        <w:rPr>
+          <w:noProof/>
+        </w:rPr>
+        <w:tab/>
+      </w:r>
+      <w:r>
+        <w:rPr>
+          <w:noProof/>
+        </w:rPr>
+        <w:fldChar w:fldCharType="begin"/>
+      </w:r>
+      <w:r>
+        <w:rPr>
+          <w:noProof/>
+        </w:rPr>
+        <w:instrText xml:space="preserve"> PAGEREF _Toc233552845 \h </w:instrText>
+      </w:r>
+      <w:r>
+        <w:rPr>
+          <w:noProof/>
+        </w:rPr>
+      </w:r>
+      <w:r>
+        <w:rPr>
+          <w:noProof/>
+        </w:rPr>
+        <w:fldChar w:fldCharType="separate"/>
+      </w:r>
+      <w:r>
+        <w:rPr>
+          <w:noProof/>
+        </w:rPr>
+        <w:t>23</w:t>
+      </w:r>
+      <w:r>
+        <w:rPr>
+          <w:noProof/>
+        </w:rPr>
+        <w:fldChar w:fldCharType="end"/>
+      </w:r>
+    </w:p>
+    <w:p>
+      <w:pPr>
+        <w:pStyle w:val="TOC2"/>
+        <w:tabs>
+          <w:tab w:val="right" w:leader="dot" w:pos="9061"/>
+        </w:tabs>
+        <w:rPr>
+          <w:rFonts w:asciiTheme="minorHAnsi" w:eastAsiaTheme="minorEastAsia" w:hAnsiTheme="minorHAnsi" w:cstheme="minorBidi"/>
+          <w:noProof/>
+          <w:kern w:val="2"/>
+          <w:sz w:val="24"/>
+          <w:szCs w:val="24"/>
+          <w14:ligatures w14:val="standardContextual"/>
+        </w:rPr>
+      </w:pPr>
+      <w:r>
+        <w:rPr>
+          <w:noProof/>
+        </w:rPr>
+        <w:t>4. Kịch bản vận hành đề xuất cho Find Your Path</w:t>
+      </w:r>
+      <w:r>
+        <w:rPr>
+          <w:noProof/>
+        </w:rPr>
+        <w:tab/>
+      </w:r>
+      <w:r>
+        <w:rPr>
+          <w:noProof/>
+        </w:rPr>
+        <w:fldChar w:fldCharType="begin"/>
+      </w:r>
+      <w:r>
+        <w:rPr>
+          <w:noProof/>
+        </w:rPr>
+        <w:instrText xml:space="preserve"> PAGEREF _Toc233552846 \h </w:instrText>
+      </w:r>
+      <w:r>
+        <w:rPr>
+          <w:noProof/>
+        </w:rPr>
+      </w:r>
+      <w:r>
+        <w:rPr>
+          <w:noProof/>
+        </w:rPr>
+        <w:fldChar w:fldCharType="separate"/>
+      </w:r>
+      <w:r>
+        <w:rPr>
+          <w:noProof/>
+        </w:rPr>
+        <w:t>24</w:t>
+      </w:r>
+      <w:r>
+        <w:rPr>
+          <w:noProof/>
+        </w:rPr>
+        <w:fldChar w:fldCharType="end"/>
+      </w:r>
+    </w:p>
+    <w:p>
+      <w:pPr>
+        <w:pStyle w:val="TOC2"/>
+        <w:tabs>
+          <w:tab w:val="right" w:leader="dot" w:pos="9061"/>
+        </w:tabs>
+        <w:rPr>
+          <w:rFonts w:asciiTheme="minorHAnsi" w:eastAsiaTheme="minorEastAsia" w:hAnsiTheme="minorHAnsi" w:cstheme="minorBidi"/>
+          <w:noProof/>
+          <w:kern w:val="2"/>
+          <w:sz w:val="24"/>
+          <w:szCs w:val="24"/>
+          <w14:ligatures w14:val="standardContextual"/>
+        </w:rPr>
+      </w:pPr>
+      <w:r>
+        <w:rPr>
+          <w:noProof/>
+        </w:rPr>
+        <w:t>5. Chuẩn bị luận điểm vấn đáp</w:t>
+      </w:r>
+      <w:r>
+        <w:rPr>
+          <w:noProof/>
+        </w:rPr>
+        <w:tab/>
+      </w:r>
+      <w:r>
+        <w:rPr>
+          <w:noProof/>
+        </w:rPr>
+        <w:fldChar w:fldCharType="begin"/>
+      </w:r>
+      <w:r>
+        <w:rPr>
+          <w:noProof/>
+        </w:rPr>
+        <w:instrText xml:space="preserve"> PAGEREF _Toc233552847 \h </w:instrText>
+      </w:r>
+      <w:r>
+        <w:rPr>
+          <w:noProof/>
+        </w:rPr>
+      </w:r>
+      <w:r>
+        <w:rPr>
+          <w:noProof/>
+        </w:rPr>
+        <w:fldChar w:fldCharType="separate"/>
+      </w:r>
+      <w:r>
+        <w:rPr>
+          <w:noProof/>
+        </w:rPr>
+        <w:t>25</w:t>
+      </w:r>
+      <w:r>
+        <w:rPr>
+          <w:noProof/>
+        </w:rPr>
+        <w:fldChar w:fldCharType="end"/>
+      </w:r>
+    </w:p>
+    <w:p>
+      <w:pPr>
+        <w:pStyle w:val="TOC2"/>
+        <w:tabs>
+          <w:tab w:val="right" w:leader="dot" w:pos="9061"/>
+        </w:tabs>
+        <w:rPr>
+          <w:rFonts w:asciiTheme="minorHAnsi" w:eastAsiaTheme="minorEastAsia" w:hAnsiTheme="minorHAnsi" w:cstheme="minorBidi"/>
+          <w:noProof/>
+          <w:kern w:val="2"/>
+          <w:sz w:val="24"/>
+          <w:szCs w:val="24"/>
+          <w14:ligatures w14:val="standardContextual"/>
+        </w:rPr>
+      </w:pPr>
+      <w:r>
+        <w:rPr>
+          <w:noProof/>
+        </w:rPr>
+        <w:t>6. Rủi ro khi trình bày và cách kiểm soát</w:t>
+      </w:r>
+      <w:r>
+        <w:rPr>
+          <w:noProof/>
+        </w:rPr>
+        <w:tab/>
+      </w:r>
+      <w:r>
+        <w:rPr>
+          <w:noProof/>
+        </w:rPr>
+        <w:fldChar w:fldCharType="begin"/>
+      </w:r>
+      <w:r>
+        <w:rPr>
+          <w:noProof/>
+        </w:rPr>
+        <w:instrText xml:space="preserve"> PAGEREF _Toc233552848 \h </w:instrText>
+      </w:r>
+      <w:r>
+        <w:rPr>
+          <w:noProof/>
+        </w:rPr>
+      </w:r>
+      <w:r>
+        <w:rPr>
+          <w:noProof/>
+        </w:rPr>
+        <w:fldChar w:fldCharType="separate"/>
+      </w:r>
+      <w:r>
+        <w:rPr>
+          <w:noProof/>
+        </w:rPr>
+        <w:t>26</w:t>
+      </w:r>
+      <w:r>
+        <w:rPr>
+          <w:noProof/>
+        </w:rPr>
+        <w:fldChar w:fldCharType="end"/>
+      </w:r>
+    </w:p>
+    <w:p>
+      <w:pPr>
+        <w:pStyle w:val="TOC2"/>
+        <w:tabs>
+          <w:tab w:val="right" w:leader="dot" w:pos="9061"/>
+        </w:tabs>
+        <w:rPr>
+          <w:rFonts w:asciiTheme="minorHAnsi" w:eastAsiaTheme="minorEastAsia" w:hAnsiTheme="minorHAnsi" w:cstheme="minorBidi"/>
+          <w:noProof/>
+          <w:kern w:val="2"/>
+          <w:sz w:val="24"/>
+          <w:szCs w:val="24"/>
+          <w14:ligatures w14:val="standardContextual"/>
+        </w:rPr>
+      </w:pPr>
+      <w:r>
+        <w:rPr>
+          <w:noProof/>
+        </w:rPr>
+        <w:t>7. Khuyến nghị hoàn thiện báo cáo và slide</w:t>
+      </w:r>
+      <w:r>
+        <w:rPr>
+          <w:noProof/>
+        </w:rPr>
+        <w:tab/>
+      </w:r>
+      <w:r>
+        <w:rPr>
+          <w:noProof/>
+        </w:rPr>
+        <w:fldChar w:fldCharType="begin"/>
+      </w:r>
+      <w:r>
+        <w:rPr>
+          <w:noProof/>
+        </w:rPr>
+        <w:instrText xml:space="preserve"> PAGEREF _Toc233552849 \h </w:instrText>
+      </w:r>
+      <w:r>
+        <w:rPr>
+          <w:noProof/>
+        </w:rPr>
+      </w:r>
+      <w:r>
+        <w:rPr>
+          <w:noProof/>
+        </w:rPr>
+        <w:fldChar w:fldCharType="separate"/>
+      </w:r>
+      <w:r>
+        <w:rPr>
+          <w:noProof/>
+        </w:rPr>
+        <w:t>27</w:t>
+      </w:r>
+      <w:r>
+        <w:rPr>
+          <w:noProof/>
+        </w:rPr>
+        <w:fldChar w:fldCharType="end"/>
+      </w:r>
+    </w:p>
+    <w:p>
+      <w:pPr>
+        <w:pStyle w:val="TOC1"/>
+        <w:tabs>
+          <w:tab w:val="right" w:leader="dot" w:pos="9061"/>
+        </w:tabs>
+        <w:rPr>
+          <w:rFonts w:asciiTheme="minorHAnsi" w:eastAsiaTheme="minorEastAsia" w:hAnsiTheme="minorHAnsi" w:cstheme="minorBidi"/>
+          <w:noProof/>
+          <w:kern w:val="2"/>
+          <w:sz w:val="24"/>
+          <w:szCs w:val="24"/>
+          <w14:ligatures w14:val="standardContextual"/>
+        </w:rPr>
+      </w:pPr>
+      <w:r>
+        <w:rPr>
+          <w:noProof/>
+        </w:rPr>
+        <w:t>V. Kết luận</w:t>
+      </w:r>
+      <w:r>
+        <w:rPr>
+          <w:noProof/>
+        </w:rPr>
+        <w:tab/>
+      </w:r>
+      <w:r>
+        <w:rPr>
+          <w:noProof/>
+        </w:rPr>
+        <w:fldChar w:fldCharType="begin"/>
+      </w:r>
+      <w:r>
+        <w:rPr>
+          <w:noProof/>
+        </w:rPr>
+        <w:instrText xml:space="preserve"> PAGEREF _Toc233552850 \h </w:instrText>
+      </w:r>
+      <w:r>
+        <w:rPr>
+          <w:noProof/>
+        </w:rPr>
+      </w:r>
+      <w:r>
+        <w:rPr>
+          <w:noProof/>
+        </w:rPr>
+        <w:fldChar w:fldCharType="separate"/>
+      </w:r>
+      <w:r>
+        <w:rPr>
+          <w:noProof/>
+        </w:rPr>
+        <w:t>29</w:t>
+      </w:r>
+      <w:r>
+        <w:rPr>
+          <w:noProof/>
+        </w:rPr>
+        <w:fldChar w:fldCharType="end"/>
+      </w:r>
+    </w:p>
+    <w:p>
+      <w:pPr>
+        <w:pStyle w:val="TOC1"/>
+        <w:tabs>
+          <w:tab w:val="right" w:leader="dot" w:pos="9061"/>
+        </w:tabs>
+        <w:rPr>
+          <w:rFonts w:asciiTheme="minorHAnsi" w:eastAsiaTheme="minorEastAsia" w:hAnsiTheme="minorHAnsi" w:cstheme="minorBidi"/>
+          <w:noProof/>
+          <w:kern w:val="2"/>
+          <w:sz w:val="24"/>
+          <w:szCs w:val="24"/>
+          <w14:ligatures w14:val="standardContextual"/>
+        </w:rPr>
+      </w:pPr>
+      <w:r>
+        <w:rPr>
+          <w:noProof/>
+        </w:rPr>
+        <w:lastRenderedPageBreak/>
+        <w:t>Tài liệu tham khảo</w:t>
+      </w:r>
+      <w:r>
+        <w:rPr>
+          <w:noProof/>
+        </w:rPr>
+        <w:tab/>
+      </w:r>
+      <w:r>
+        <w:rPr>
+          <w:noProof/>
+        </w:rPr>
+        <w:fldChar w:fldCharType="begin"/>
+      </w:r>
+      <w:r>
+        <w:rPr>
+          <w:noProof/>
+        </w:rPr>
+        <w:instrText xml:space="preserve"> PAGEREF _Toc233552851 \h </w:instrText>
+      </w:r>
+      <w:r>
+        <w:rPr>
+          <w:noProof/>
+        </w:rPr>
+      </w:r>
+      <w:r>
+        <w:rPr>
+          <w:noProof/>
+        </w:rPr>
+        <w:fldChar w:fldCharType="separate"/>
+      </w:r>
+      <w:r>
+        <w:rPr>
+          <w:noProof/>
+        </w:rPr>
+        <w:t>30</w:t>
+      </w:r>
+      <w:r>
+        <w:rPr>
+          <w:noProof/>
+        </w:rPr>
+        <w:fldChar w:fldCharType="end"/>
+      </w:r>
+    </w:p>
+    <w:p>
+      <w:pPr>
         <w:pStyle w:val="Heading1"/>
         <w:pageBreakBefore/>
         <w:spacing w:before="0"/>
         <w:jc w:val="left"/>
-        <w:rPr>
-          <w:rFonts w:eastAsia="Times New Roman"/>
-        </w:rPr>
-      </w:pPr>
-    </w:p>
-    <w:p>
-      <w:pPr>
-        <w:pStyle w:val="TOC1"/>
-        <w:tabs>
-          <w:tab w:val="right" w:leader="dot" w:pos="9061"/>
-        </w:tabs>
-        <w:rPr>
-          <w:rFonts w:asciiTheme="minorHAnsi" w:eastAsiaTheme="minorEastAsia" w:hAnsiTheme="minorHAnsi" w:cstheme="minorBidi"/>
-          <w:noProof/>
-          <w:kern w:val="2"/>
-          <w:sz w:val="24"/>
-          <w:szCs w:val="24"/>
-          <w14:ligatures w14:val="standardContextual"/>
-        </w:rPr>
-      </w:pPr>
-      <w:r>
-        <w:fldChar w:fldCharType="begin"/>
-      </w:r>
-      <w:r>
-        <w:instrText xml:space="preserve"> TOC \o "1-2" \f - \t "-1" </w:instrText>
-      </w:r>
-      <w:r>
-        <w:fldChar w:fldCharType="separate"/>
-      </w:r>
-      <w:r>
-        <w:rPr>
-          <w:noProof/>
-        </w:rPr>
-        <w:t>I. Bài toán đặt ra</w:t>
-      </w:r>
-      <w:r>
-        <w:rPr>
-          <w:noProof/>
-        </w:rPr>
-        <w:tab/>
-      </w:r>
-      <w:r>
-        <w:rPr>
-          <w:noProof/>
-        </w:rPr>
-        <w:fldChar w:fldCharType="begin"/>
-      </w:r>
-      <w:r>
-        <w:rPr>
-          <w:noProof/>
-        </w:rPr>
-        <w:instrText xml:space="preserve"> PAGEREF _Toc233552653 \h </w:instrText>
-      </w:r>
-      <w:r>
-        <w:rPr>
-          <w:noProof/>
-        </w:rPr>
-      </w:r>
-      <w:r>
-        <w:rPr>
-          <w:noProof/>
-        </w:rPr>
-        <w:fldChar w:fldCharType="separate"/>
-      </w:r>
-      <w:r>
-        <w:rPr>
-          <w:noProof/>
-        </w:rPr>
-        <w:t>6</w:t>
-      </w:r>
-      <w:r>
-        <w:rPr>
-          <w:noProof/>
-        </w:rPr>
-        <w:fldChar w:fldCharType="end"/>
-      </w:r>
-    </w:p>
-    <w:p>
-      <w:pPr>
-        <w:pStyle w:val="TOC2"/>
-        <w:tabs>
-          <w:tab w:val="right" w:leader="dot" w:pos="9061"/>
-        </w:tabs>
-        <w:rPr>
-          <w:rFonts w:asciiTheme="minorHAnsi" w:eastAsiaTheme="minorEastAsia" w:hAnsiTheme="minorHAnsi" w:cstheme="minorBidi"/>
-          <w:noProof/>
-          <w:kern w:val="2"/>
-          <w:sz w:val="24"/>
-          <w:szCs w:val="24"/>
-          <w14:ligatures w14:val="standardContextual"/>
-        </w:rPr>
-      </w:pPr>
-      <w:r>
-        <w:rPr>
-          <w:noProof/>
-        </w:rPr>
-        <w:t>1. Bài toán gì</w:t>
-      </w:r>
-      <w:r>
-        <w:rPr>
-          <w:noProof/>
-        </w:rPr>
-        <w:tab/>
-      </w:r>
-      <w:r>
-        <w:rPr>
-          <w:noProof/>
-        </w:rPr>
-        <w:fldChar w:fldCharType="begin"/>
-      </w:r>
-      <w:r>
-        <w:rPr>
-          <w:noProof/>
-        </w:rPr>
-        <w:instrText xml:space="preserve"> PAGEREF _Toc233552654 \h </w:instrText>
-      </w:r>
-      <w:r>
-        <w:rPr>
-          <w:noProof/>
-        </w:rPr>
-      </w:r>
-      <w:r>
-        <w:rPr>
-          <w:noProof/>
-        </w:rPr>
-        <w:fldChar w:fldCharType="separate"/>
-      </w:r>
-      <w:r>
-        <w:rPr>
-          <w:noProof/>
-        </w:rPr>
-        <w:t>6</w:t>
-      </w:r>
-      <w:r>
-        <w:rPr>
-          <w:noProof/>
-        </w:rPr>
-        <w:fldChar w:fldCharType="end"/>
-      </w:r>
-    </w:p>
-    <w:p>
-      <w:pPr>
-        <w:pStyle w:val="TOC2"/>
-        <w:tabs>
-          <w:tab w:val="right" w:leader="dot" w:pos="9061"/>
-        </w:tabs>
-        <w:rPr>
-          <w:rFonts w:asciiTheme="minorHAnsi" w:eastAsiaTheme="minorEastAsia" w:hAnsiTheme="minorHAnsi" w:cstheme="minorBidi"/>
-          <w:noProof/>
-          <w:kern w:val="2"/>
-          <w:sz w:val="24"/>
-          <w:szCs w:val="24"/>
-          <w14:ligatures w14:val="standardContextual"/>
-        </w:rPr>
-      </w:pPr>
-      <w:r>
-        <w:rPr>
-          <w:noProof/>
-        </w:rPr>
-        <w:t>2. Phân tích PEAS của bài toán</w:t>
-      </w:r>
-      <w:r>
-        <w:rPr>
-          <w:noProof/>
-        </w:rPr>
-        <w:tab/>
-      </w:r>
-      <w:r>
-        <w:rPr>
-          <w:noProof/>
-        </w:rPr>
-        <w:fldChar w:fldCharType="begin"/>
-      </w:r>
-      <w:r>
-        <w:rPr>
-          <w:noProof/>
-        </w:rPr>
-        <w:instrText xml:space="preserve"> PAGEREF _Toc233552655 \h </w:instrText>
-      </w:r>
-      <w:r>
-        <w:rPr>
-          <w:noProof/>
-        </w:rPr>
-      </w:r>
-      <w:r>
-        <w:rPr>
-          <w:noProof/>
-        </w:rPr>
-        <w:fldChar w:fldCharType="separate"/>
-      </w:r>
-      <w:r>
-        <w:rPr>
-          <w:noProof/>
-        </w:rPr>
-        <w:t>7</w:t>
-      </w:r>
-      <w:r>
-        <w:rPr>
-          <w:noProof/>
-        </w:rPr>
-        <w:fldChar w:fldCharType="end"/>
-      </w:r>
-    </w:p>
-    <w:p>
-      <w:pPr>
-        <w:pStyle w:val="TOC1"/>
-        <w:tabs>
-          <w:tab w:val="right" w:leader="dot" w:pos="9061"/>
-        </w:tabs>
-        <w:rPr>
-          <w:rFonts w:asciiTheme="minorHAnsi" w:eastAsiaTheme="minorEastAsia" w:hAnsiTheme="minorHAnsi" w:cstheme="minorBidi"/>
-          <w:noProof/>
-          <w:kern w:val="2"/>
-          <w:sz w:val="24"/>
-          <w:szCs w:val="24"/>
-          <w14:ligatures w14:val="standardContextual"/>
-        </w:rPr>
-      </w:pPr>
-      <w:r>
-        <w:rPr>
-          <w:noProof/>
-        </w:rPr>
-        <w:t>II. Thuật toán áp dụng</w:t>
-      </w:r>
-      <w:r>
-        <w:rPr>
-          <w:noProof/>
-        </w:rPr>
-        <w:tab/>
-      </w:r>
-      <w:r>
-        <w:rPr>
-          <w:noProof/>
-        </w:rPr>
-        <w:fldChar w:fldCharType="begin"/>
-      </w:r>
-      <w:r>
-        <w:rPr>
-          <w:noProof/>
-        </w:rPr>
-        <w:instrText xml:space="preserve"> PAGEREF _Toc233552656 \h </w:instrText>
-      </w:r>
-      <w:r>
-        <w:rPr>
-          <w:noProof/>
-        </w:rPr>
-      </w:r>
-      <w:r>
-        <w:rPr>
-          <w:noProof/>
-        </w:rPr>
-        <w:fldChar w:fldCharType="separate"/>
-      </w:r>
-      <w:r>
-        <w:rPr>
-          <w:noProof/>
-        </w:rPr>
-        <w:t>9</w:t>
-      </w:r>
-      <w:r>
-        <w:rPr>
-          <w:noProof/>
-        </w:rPr>
-        <w:fldChar w:fldCharType="end"/>
-      </w:r>
-    </w:p>
-    <w:p>
-      <w:pPr>
-        <w:pStyle w:val="TOC2"/>
-        <w:tabs>
-          <w:tab w:val="right" w:leader="dot" w:pos="9061"/>
-        </w:tabs>
-        <w:rPr>
-          <w:rFonts w:asciiTheme="minorHAnsi" w:eastAsiaTheme="minorEastAsia" w:hAnsiTheme="minorHAnsi" w:cstheme="minorBidi"/>
-          <w:noProof/>
-          <w:kern w:val="2"/>
-          <w:sz w:val="24"/>
-          <w:szCs w:val="24"/>
-          <w14:ligatures w14:val="standardContextual"/>
-        </w:rPr>
-      </w:pPr>
-      <w:r>
-        <w:rPr>
-          <w:noProof/>
-        </w:rPr>
-        <w:t>1. Nhóm tìm kiếm không thông tin: Depth-First Search (DFS)</w:t>
-      </w:r>
-      <w:r>
-        <w:rPr>
-          <w:noProof/>
-        </w:rPr>
-        <w:tab/>
-      </w:r>
-      <w:r>
-        <w:rPr>
-          <w:noProof/>
-        </w:rPr>
-        <w:fldChar w:fldCharType="begin"/>
-      </w:r>
-      <w:r>
-        <w:rPr>
-          <w:noProof/>
-        </w:rPr>
-        <w:instrText xml:space="preserve"> PAGEREF _Toc233552657 \h </w:instrText>
-      </w:r>
-      <w:r>
-        <w:rPr>
-          <w:noProof/>
-        </w:rPr>
-      </w:r>
-      <w:r>
-        <w:rPr>
-          <w:noProof/>
-        </w:rPr>
-        <w:fldChar w:fldCharType="separate"/>
-      </w:r>
-      <w:r>
-        <w:rPr>
-          <w:noProof/>
-        </w:rPr>
-        <w:t>9</w:t>
-      </w:r>
-      <w:r>
-        <w:rPr>
-          <w:noProof/>
-        </w:rPr>
-        <w:fldChar w:fldCharType="end"/>
-      </w:r>
-    </w:p>
-    <w:p>
-      <w:pPr>
-        <w:pStyle w:val="TOC2"/>
-        <w:tabs>
-          <w:tab w:val="right" w:leader="dot" w:pos="9061"/>
-        </w:tabs>
-        <w:rPr>
-          <w:rFonts w:asciiTheme="minorHAnsi" w:eastAsiaTheme="minorEastAsia" w:hAnsiTheme="minorHAnsi" w:cstheme="minorBidi"/>
-          <w:noProof/>
-          <w:kern w:val="2"/>
-          <w:sz w:val="24"/>
-          <w:szCs w:val="24"/>
-          <w14:ligatures w14:val="standardContextual"/>
-        </w:rPr>
-      </w:pPr>
-      <w:r>
-        <w:rPr>
-          <w:noProof/>
-        </w:rPr>
-        <w:t>2. Nhóm tìm kiếm có thông tin: A*</w:t>
-      </w:r>
-      <w:r>
-        <w:rPr>
-          <w:noProof/>
-        </w:rPr>
-        <w:tab/>
-      </w:r>
-      <w:r>
-        <w:rPr>
-          <w:noProof/>
-        </w:rPr>
-        <w:fldChar w:fldCharType="begin"/>
-      </w:r>
-      <w:r>
-        <w:rPr>
-          <w:noProof/>
-        </w:rPr>
-        <w:instrText xml:space="preserve"> PAGEREF _Toc233552658 \h </w:instrText>
-      </w:r>
-      <w:r>
-        <w:rPr>
-          <w:noProof/>
-        </w:rPr>
-      </w:r>
-      <w:r>
-        <w:rPr>
-          <w:noProof/>
-        </w:rPr>
-        <w:fldChar w:fldCharType="separate"/>
-      </w:r>
-      <w:r>
-        <w:rPr>
-          <w:noProof/>
-        </w:rPr>
-        <w:t>10</w:t>
-      </w:r>
-      <w:r>
-        <w:rPr>
-          <w:noProof/>
-        </w:rPr>
-        <w:fldChar w:fldCharType="end"/>
-      </w:r>
-    </w:p>
-    <w:p>
-      <w:pPr>
-        <w:pStyle w:val="TOC2"/>
-        <w:tabs>
-          <w:tab w:val="right" w:leader="dot" w:pos="9061"/>
-        </w:tabs>
-        <w:rPr>
-          <w:rFonts w:asciiTheme="minorHAnsi" w:eastAsiaTheme="minorEastAsia" w:hAnsiTheme="minorHAnsi" w:cstheme="minorBidi"/>
-          <w:noProof/>
-          <w:kern w:val="2"/>
-          <w:sz w:val="24"/>
-          <w:szCs w:val="24"/>
-          <w14:ligatures w14:val="standardContextual"/>
-        </w:rPr>
-      </w:pPr>
-      <w:r>
-        <w:rPr>
-          <w:noProof/>
-        </w:rPr>
-        <w:t>3. Nhóm tìm kiếm cục bộ: Simple Hill Climbing</w:t>
-      </w:r>
-      <w:r>
-        <w:rPr>
-          <w:noProof/>
-        </w:rPr>
-        <w:tab/>
-      </w:r>
-      <w:r>
-        <w:rPr>
-          <w:noProof/>
-        </w:rPr>
-        <w:fldChar w:fldCharType="begin"/>
-      </w:r>
-      <w:r>
-        <w:rPr>
-          <w:noProof/>
-        </w:rPr>
-        <w:instrText xml:space="preserve"> PAGEREF _Toc233552659 \h </w:instrText>
-      </w:r>
-      <w:r>
-        <w:rPr>
-          <w:noProof/>
-        </w:rPr>
-      </w:r>
-      <w:r>
-        <w:rPr>
-          <w:noProof/>
-        </w:rPr>
-        <w:fldChar w:fldCharType="separate"/>
-      </w:r>
-      <w:r>
-        <w:rPr>
-          <w:noProof/>
-        </w:rPr>
-        <w:t>12</w:t>
-      </w:r>
-      <w:r>
-        <w:rPr>
-          <w:noProof/>
-        </w:rPr>
-        <w:fldChar w:fldCharType="end"/>
-      </w:r>
-    </w:p>
-    <w:p>
-      <w:pPr>
-        <w:pStyle w:val="TOC2"/>
-        <w:tabs>
-          <w:tab w:val="right" w:leader="dot" w:pos="9061"/>
-        </w:tabs>
-        <w:rPr>
-          <w:rFonts w:asciiTheme="minorHAnsi" w:eastAsiaTheme="minorEastAsia" w:hAnsiTheme="minorHAnsi" w:cstheme="minorBidi"/>
-          <w:noProof/>
-          <w:kern w:val="2"/>
-          <w:sz w:val="24"/>
-          <w:szCs w:val="24"/>
-          <w14:ligatures w14:val="standardContextual"/>
-        </w:rPr>
-      </w:pPr>
-      <w:r>
-        <w:rPr>
-          <w:noProof/>
-        </w:rPr>
-        <w:t>4. Nhóm môi trường phức tạp: AND-OR Search</w:t>
-      </w:r>
-      <w:r>
-        <w:rPr>
-          <w:noProof/>
-        </w:rPr>
-        <w:tab/>
-      </w:r>
-      <w:r>
-        <w:rPr>
-          <w:noProof/>
-        </w:rPr>
-        <w:fldChar w:fldCharType="begin"/>
-      </w:r>
-      <w:r>
-        <w:rPr>
-          <w:noProof/>
-        </w:rPr>
-        <w:instrText xml:space="preserve"> PAGEREF _Toc233552660 \h </w:instrText>
-      </w:r>
-      <w:r>
-        <w:rPr>
-          <w:noProof/>
-        </w:rPr>
-      </w:r>
-      <w:r>
-        <w:rPr>
-          <w:noProof/>
-        </w:rPr>
-        <w:fldChar w:fldCharType="separate"/>
-      </w:r>
-      <w:r>
-        <w:rPr>
-          <w:noProof/>
-        </w:rPr>
-        <w:t>13</w:t>
-      </w:r>
-      <w:r>
-        <w:rPr>
-          <w:noProof/>
-        </w:rPr>
-        <w:fldChar w:fldCharType="end"/>
-      </w:r>
-    </w:p>
-    <w:p>
-      <w:pPr>
-        <w:pStyle w:val="TOC2"/>
-        <w:tabs>
-          <w:tab w:val="right" w:leader="dot" w:pos="9061"/>
-        </w:tabs>
-        <w:rPr>
-          <w:rFonts w:asciiTheme="minorHAnsi" w:eastAsiaTheme="minorEastAsia" w:hAnsiTheme="minorHAnsi" w:cstheme="minorBidi"/>
-          <w:noProof/>
-          <w:kern w:val="2"/>
-          <w:sz w:val="24"/>
-          <w:szCs w:val="24"/>
-          <w14:ligatures w14:val="standardContextual"/>
-        </w:rPr>
-      </w:pPr>
-      <w:r>
-        <w:rPr>
-          <w:noProof/>
-        </w:rPr>
-        <w:t>5. Nhóm thỏa ràng buộc: Forward Checking</w:t>
-      </w:r>
-      <w:r>
-        <w:rPr>
-          <w:noProof/>
-        </w:rPr>
-        <w:tab/>
-      </w:r>
-      <w:r>
-        <w:rPr>
-          <w:noProof/>
-        </w:rPr>
-        <w:fldChar w:fldCharType="begin"/>
-      </w:r>
-      <w:r>
-        <w:rPr>
-          <w:noProof/>
-        </w:rPr>
-        <w:instrText xml:space="preserve"> PAGEREF _Toc233552661 \h </w:instrText>
-      </w:r>
-      <w:r>
-        <w:rPr>
-          <w:noProof/>
-        </w:rPr>
-      </w:r>
-      <w:r>
-        <w:rPr>
-          <w:noProof/>
-        </w:rPr>
-        <w:fldChar w:fldCharType="separate"/>
-      </w:r>
-      <w:r>
-        <w:rPr>
-          <w:noProof/>
-        </w:rPr>
-        <w:t>15</w:t>
-      </w:r>
-      <w:r>
-        <w:rPr>
-          <w:noProof/>
-        </w:rPr>
-        <w:fldChar w:fldCharType="end"/>
-      </w:r>
-    </w:p>
-    <w:p>
-      <w:pPr>
-        <w:pStyle w:val="TOC2"/>
-        <w:tabs>
-          <w:tab w:val="right" w:leader="dot" w:pos="9061"/>
-        </w:tabs>
-        <w:rPr>
-          <w:rFonts w:asciiTheme="minorHAnsi" w:eastAsiaTheme="minorEastAsia" w:hAnsiTheme="minorHAnsi" w:cstheme="minorBidi"/>
-          <w:noProof/>
-          <w:kern w:val="2"/>
-          <w:sz w:val="24"/>
-          <w:szCs w:val="24"/>
-          <w14:ligatures w14:val="standardContextual"/>
-        </w:rPr>
-      </w:pPr>
-      <w:r>
-        <w:rPr>
-          <w:noProof/>
-        </w:rPr>
-        <w:t>6. Nhóm tìm kiếm đối kháng: Alpha-Beta Pruning</w:t>
-      </w:r>
-      <w:r>
-        <w:rPr>
-          <w:noProof/>
-        </w:rPr>
-        <w:tab/>
-      </w:r>
-      <w:r>
-        <w:rPr>
-          <w:noProof/>
-        </w:rPr>
-        <w:fldChar w:fldCharType="begin"/>
-      </w:r>
-      <w:r>
-        <w:rPr>
-          <w:noProof/>
-        </w:rPr>
-        <w:instrText xml:space="preserve"> PAGEREF _Toc233552662 \h </w:instrText>
-      </w:r>
-      <w:r>
-        <w:rPr>
-          <w:noProof/>
-        </w:rPr>
-      </w:r>
-      <w:r>
-        <w:rPr>
-          <w:noProof/>
-        </w:rPr>
-        <w:fldChar w:fldCharType="separate"/>
-      </w:r>
-      <w:r>
-        <w:rPr>
-          <w:noProof/>
-        </w:rPr>
-        <w:t>16</w:t>
-      </w:r>
-      <w:r>
-        <w:rPr>
-          <w:noProof/>
-        </w:rPr>
-        <w:fldChar w:fldCharType="end"/>
-      </w:r>
-    </w:p>
-    <w:p>
-      <w:pPr>
-        <w:pStyle w:val="TOC1"/>
-        <w:tabs>
-          <w:tab w:val="right" w:leader="dot" w:pos="9061"/>
-        </w:tabs>
-        <w:rPr>
-          <w:rFonts w:asciiTheme="minorHAnsi" w:eastAsiaTheme="minorEastAsia" w:hAnsiTheme="minorHAnsi" w:cstheme="minorBidi"/>
-          <w:noProof/>
-          <w:kern w:val="2"/>
-          <w:sz w:val="24"/>
-          <w:szCs w:val="24"/>
-          <w14:ligatures w14:val="standardContextual"/>
-        </w:rPr>
-      </w:pPr>
-      <w:r>
-        <w:rPr>
-          <w:noProof/>
-        </w:rPr>
-        <w:t>III. Thực nghiệm và kết quả</w:t>
-      </w:r>
-      <w:r>
-        <w:rPr>
-          <w:noProof/>
-        </w:rPr>
-        <w:tab/>
-      </w:r>
-      <w:r>
-        <w:rPr>
-          <w:noProof/>
-        </w:rPr>
-        <w:fldChar w:fldCharType="begin"/>
-      </w:r>
-      <w:r>
-        <w:rPr>
-          <w:noProof/>
-        </w:rPr>
-        <w:instrText xml:space="preserve"> PAGEREF _Toc233552663 \h </w:instrText>
-      </w:r>
-      <w:r>
-        <w:rPr>
-          <w:noProof/>
-        </w:rPr>
-      </w:r>
-      <w:r>
-        <w:rPr>
-          <w:noProof/>
-        </w:rPr>
-        <w:fldChar w:fldCharType="separate"/>
-      </w:r>
-      <w:r>
-        <w:rPr>
-          <w:noProof/>
-        </w:rPr>
-        <w:t>18</w:t>
-      </w:r>
-      <w:r>
-        <w:rPr>
-          <w:noProof/>
-        </w:rPr>
-        <w:fldChar w:fldCharType="end"/>
-      </w:r>
-    </w:p>
-    <w:p>
-      <w:pPr>
-        <w:pStyle w:val="TOC2"/>
-        <w:tabs>
-          <w:tab w:val="right" w:leader="dot" w:pos="9061"/>
-        </w:tabs>
-        <w:rPr>
-          <w:rFonts w:asciiTheme="minorHAnsi" w:eastAsiaTheme="minorEastAsia" w:hAnsiTheme="minorHAnsi" w:cstheme="minorBidi"/>
-          <w:noProof/>
-          <w:kern w:val="2"/>
-          <w:sz w:val="24"/>
-          <w:szCs w:val="24"/>
-          <w14:ligatures w14:val="standardContextual"/>
-        </w:rPr>
-      </w:pPr>
-      <w:r>
-        <w:rPr>
-          <w:noProof/>
-        </w:rPr>
-        <w:t>1. Thiết kế kịch bản thực nghiệm</w:t>
-      </w:r>
-      <w:r>
-        <w:rPr>
-          <w:noProof/>
-        </w:rPr>
-        <w:tab/>
-      </w:r>
-      <w:r>
-        <w:rPr>
-          <w:noProof/>
-        </w:rPr>
-        <w:fldChar w:fldCharType="begin"/>
-      </w:r>
-      <w:r>
-        <w:rPr>
-          <w:noProof/>
-        </w:rPr>
-        <w:instrText xml:space="preserve"> PAGEREF _Toc233552664 \h </w:instrText>
-      </w:r>
-      <w:r>
-        <w:rPr>
-          <w:noProof/>
-        </w:rPr>
-      </w:r>
-      <w:r>
-        <w:rPr>
-          <w:noProof/>
-        </w:rPr>
-        <w:fldChar w:fldCharType="separate"/>
-      </w:r>
-      <w:r>
-        <w:rPr>
-          <w:noProof/>
-        </w:rPr>
-        <w:t>18</w:t>
-      </w:r>
-      <w:r>
-        <w:rPr>
-          <w:noProof/>
-        </w:rPr>
-        <w:fldChar w:fldCharType="end"/>
-      </w:r>
-    </w:p>
-    <w:p>
-      <w:pPr>
-        <w:pStyle w:val="TOC2"/>
-        <w:tabs>
-          <w:tab w:val="right" w:leader="dot" w:pos="9061"/>
-        </w:tabs>
-        <w:rPr>
-          <w:rFonts w:asciiTheme="minorHAnsi" w:eastAsiaTheme="minorEastAsia" w:hAnsiTheme="minorHAnsi" w:cstheme="minorBidi"/>
-          <w:noProof/>
-          <w:kern w:val="2"/>
-          <w:sz w:val="24"/>
-          <w:szCs w:val="24"/>
-          <w14:ligatures w14:val="standardContextual"/>
-        </w:rPr>
-      </w:pPr>
-      <w:r>
-        <w:rPr>
-          <w:noProof/>
-        </w:rPr>
-        <w:t>2. Chỉ tiêu quan sát và cách ghi nhận kết quả</w:t>
-      </w:r>
-      <w:r>
-        <w:rPr>
-          <w:noProof/>
-        </w:rPr>
-        <w:tab/>
-      </w:r>
-      <w:r>
-        <w:rPr>
-          <w:noProof/>
-        </w:rPr>
-        <w:fldChar w:fldCharType="begin"/>
-      </w:r>
-      <w:r>
-        <w:rPr>
-          <w:noProof/>
-        </w:rPr>
-        <w:instrText xml:space="preserve"> PAGEREF _Toc233552665 \h </w:instrText>
-      </w:r>
-      <w:r>
-        <w:rPr>
-          <w:noProof/>
-        </w:rPr>
-      </w:r>
-      <w:r>
-        <w:rPr>
-          <w:noProof/>
-        </w:rPr>
-        <w:fldChar w:fldCharType="separate"/>
-      </w:r>
-      <w:r>
-        <w:rPr>
-          <w:noProof/>
-        </w:rPr>
-        <w:t>19</w:t>
-      </w:r>
-      <w:r>
-        <w:rPr>
-          <w:noProof/>
-        </w:rPr>
-        <w:fldChar w:fldCharType="end"/>
-      </w:r>
-    </w:p>
-    <w:p>
-      <w:pPr>
-        <w:pStyle w:val="TOC2"/>
-        <w:tabs>
-          <w:tab w:val="right" w:leader="dot" w:pos="9061"/>
-        </w:tabs>
-        <w:rPr>
-          <w:rFonts w:asciiTheme="minorHAnsi" w:eastAsiaTheme="minorEastAsia" w:hAnsiTheme="minorHAnsi" w:cstheme="minorBidi"/>
-          <w:noProof/>
-          <w:kern w:val="2"/>
-          <w:sz w:val="24"/>
-          <w:szCs w:val="24"/>
-          <w14:ligatures w14:val="standardContextual"/>
-        </w:rPr>
-      </w:pPr>
-      <w:r>
-        <w:rPr>
-          <w:noProof/>
-        </w:rPr>
-        <w:t>3. Định hướng chèn hình minh họa</w:t>
-      </w:r>
-      <w:r>
-        <w:rPr>
-          <w:noProof/>
-        </w:rPr>
-        <w:tab/>
-      </w:r>
-      <w:r>
-        <w:rPr>
-          <w:noProof/>
-        </w:rPr>
-        <w:fldChar w:fldCharType="begin"/>
-      </w:r>
-      <w:r>
-        <w:rPr>
-          <w:noProof/>
-        </w:rPr>
-        <w:instrText xml:space="preserve"> PAGEREF _Toc233552666 \h </w:instrText>
-      </w:r>
-      <w:r>
-        <w:rPr>
-          <w:noProof/>
-        </w:rPr>
-      </w:r>
-      <w:r>
-        <w:rPr>
-          <w:noProof/>
-        </w:rPr>
-        <w:fldChar w:fldCharType="separate"/>
-      </w:r>
-      <w:r>
-        <w:rPr>
-          <w:noProof/>
-        </w:rPr>
-        <w:t>20</w:t>
-      </w:r>
-      <w:r>
-        <w:rPr>
-          <w:noProof/>
-        </w:rPr>
-        <w:fldChar w:fldCharType="end"/>
-      </w:r>
-    </w:p>
-    <w:p>
-      <w:pPr>
-        <w:pStyle w:val="TOC2"/>
-        <w:tabs>
-          <w:tab w:val="right" w:leader="dot" w:pos="9061"/>
-        </w:tabs>
-        <w:rPr>
-          <w:rFonts w:asciiTheme="minorHAnsi" w:eastAsiaTheme="minorEastAsia" w:hAnsiTheme="minorHAnsi" w:cstheme="minorBidi"/>
-          <w:noProof/>
-          <w:kern w:val="2"/>
-          <w:sz w:val="24"/>
-          <w:szCs w:val="24"/>
-          <w14:ligatures w14:val="standardContextual"/>
-        </w:rPr>
-      </w:pPr>
-      <w:r>
-        <w:rPr>
-          <w:noProof/>
-        </w:rPr>
-        <w:t>4. Link GitHub</w:t>
-      </w:r>
-      <w:r>
-        <w:rPr>
-          <w:noProof/>
-        </w:rPr>
-        <w:tab/>
-      </w:r>
-      <w:r>
-        <w:rPr>
-          <w:noProof/>
-        </w:rPr>
-        <w:fldChar w:fldCharType="begin"/>
-      </w:r>
-      <w:r>
-        <w:rPr>
-          <w:noProof/>
-        </w:rPr>
-        <w:instrText xml:space="preserve"> PAGEREF _Toc233552667 \h </w:instrText>
-      </w:r>
-      <w:r>
-        <w:rPr>
-          <w:noProof/>
-        </w:rPr>
-      </w:r>
-      <w:r>
-        <w:rPr>
-          <w:noProof/>
-        </w:rPr>
-        <w:fldChar w:fldCharType="separate"/>
-      </w:r>
-      <w:r>
-        <w:rPr>
-          <w:noProof/>
-        </w:rPr>
-        <w:t>20</w:t>
-      </w:r>
-      <w:r>
-        <w:rPr>
-          <w:noProof/>
-        </w:rPr>
-        <w:fldChar w:fldCharType="end"/>
-      </w:r>
-    </w:p>
-    <w:p>
-      <w:pPr>
-        <w:pStyle w:val="TOC1"/>
-        <w:tabs>
-          <w:tab w:val="right" w:leader="dot" w:pos="9061"/>
-        </w:tabs>
-        <w:rPr>
-          <w:rFonts w:asciiTheme="minorHAnsi" w:eastAsiaTheme="minorEastAsia" w:hAnsiTheme="minorHAnsi" w:cstheme="minorBidi"/>
-          <w:noProof/>
-          <w:kern w:val="2"/>
-          <w:sz w:val="24"/>
-          <w:szCs w:val="24"/>
-          <w14:ligatures w14:val="standardContextual"/>
-        </w:rPr>
-      </w:pPr>
-      <w:r>
-        <w:rPr>
-          <w:noProof/>
-        </w:rPr>
-        <w:t>IV. Đánh giá và thảo luận</w:t>
-      </w:r>
-      <w:r>
-        <w:rPr>
-          <w:noProof/>
-        </w:rPr>
-        <w:tab/>
-      </w:r>
-      <w:r>
-        <w:rPr>
-          <w:noProof/>
-        </w:rPr>
-        <w:fldChar w:fldCharType="begin"/>
-      </w:r>
-      <w:r>
-        <w:rPr>
-          <w:noProof/>
-        </w:rPr>
-        <w:instrText xml:space="preserve"> PAGEREF _Toc233552668 \h </w:instrText>
-      </w:r>
-      <w:r>
-        <w:rPr>
-          <w:noProof/>
-        </w:rPr>
-      </w:r>
-      <w:r>
-        <w:rPr>
-          <w:noProof/>
-        </w:rPr>
-        <w:fldChar w:fldCharType="separate"/>
-      </w:r>
-      <w:r>
-        <w:rPr>
-          <w:noProof/>
-        </w:rPr>
-        <w:t>21</w:t>
-      </w:r>
-      <w:r>
-        <w:rPr>
-          <w:noProof/>
-        </w:rPr>
-        <w:fldChar w:fldCharType="end"/>
-      </w:r>
-    </w:p>
-    <w:p>
-      <w:pPr>
-        <w:pStyle w:val="TOC2"/>
-        <w:tabs>
-          <w:tab w:val="right" w:leader="dot" w:pos="9061"/>
-        </w:tabs>
-        <w:rPr>
-          <w:rFonts w:asciiTheme="minorHAnsi" w:eastAsiaTheme="minorEastAsia" w:hAnsiTheme="minorHAnsi" w:cstheme="minorBidi"/>
-          <w:noProof/>
-          <w:kern w:val="2"/>
-          <w:sz w:val="24"/>
-          <w:szCs w:val="24"/>
-          <w14:ligatures w14:val="standardContextual"/>
-        </w:rPr>
-      </w:pPr>
-      <w:r>
-        <w:rPr>
-          <w:noProof/>
-        </w:rPr>
-        <w:t>1. Tổng hợp vai trò của sáu thuật toán</w:t>
-      </w:r>
-      <w:r>
-        <w:rPr>
-          <w:noProof/>
-        </w:rPr>
-        <w:tab/>
-      </w:r>
-      <w:r>
-        <w:rPr>
-          <w:noProof/>
-        </w:rPr>
-        <w:fldChar w:fldCharType="begin"/>
-      </w:r>
-      <w:r>
-        <w:rPr>
-          <w:noProof/>
-        </w:rPr>
-        <w:instrText xml:space="preserve"> PAGEREF _Toc233552669 \h </w:instrText>
-      </w:r>
-      <w:r>
-        <w:rPr>
-          <w:noProof/>
-        </w:rPr>
-      </w:r>
-      <w:r>
-        <w:rPr>
-          <w:noProof/>
-        </w:rPr>
-        <w:fldChar w:fldCharType="separate"/>
-      </w:r>
-      <w:r>
-        <w:rPr>
-          <w:noProof/>
-        </w:rPr>
-        <w:t>23</w:t>
-      </w:r>
-      <w:r>
-        <w:rPr>
-          <w:noProof/>
-        </w:rPr>
-        <w:fldChar w:fldCharType="end"/>
-      </w:r>
-    </w:p>
-    <w:p>
-      <w:pPr>
-        <w:pStyle w:val="TOC2"/>
-        <w:tabs>
-          <w:tab w:val="right" w:leader="dot" w:pos="9061"/>
-        </w:tabs>
-        <w:rPr>
-          <w:rFonts w:asciiTheme="minorHAnsi" w:eastAsiaTheme="minorEastAsia" w:hAnsiTheme="minorHAnsi" w:cstheme="minorBidi"/>
-          <w:noProof/>
-          <w:kern w:val="2"/>
-          <w:sz w:val="24"/>
-          <w:szCs w:val="24"/>
-          <w14:ligatures w14:val="standardContextual"/>
-        </w:rPr>
-      </w:pPr>
-      <w:r>
-        <w:rPr>
-          <w:noProof/>
-        </w:rPr>
-        <w:t>2. Mối liên hệ giữa biểu diễn trạng thái và thuật toán</w:t>
-      </w:r>
-      <w:r>
-        <w:rPr>
-          <w:noProof/>
-        </w:rPr>
-        <w:tab/>
-      </w:r>
-      <w:r>
-        <w:rPr>
-          <w:noProof/>
-        </w:rPr>
-        <w:fldChar w:fldCharType="begin"/>
-      </w:r>
-      <w:r>
-        <w:rPr>
-          <w:noProof/>
-        </w:rPr>
-        <w:instrText xml:space="preserve"> PAGEREF _Toc233552670 \h </w:instrText>
-      </w:r>
-      <w:r>
-        <w:rPr>
-          <w:noProof/>
-        </w:rPr>
-      </w:r>
-      <w:r>
-        <w:rPr>
-          <w:noProof/>
-        </w:rPr>
-        <w:fldChar w:fldCharType="separate"/>
-      </w:r>
-      <w:r>
-        <w:rPr>
-          <w:noProof/>
-        </w:rPr>
-        <w:t>23</w:t>
-      </w:r>
-      <w:r>
-        <w:rPr>
-          <w:noProof/>
-        </w:rPr>
-        <w:fldChar w:fldCharType="end"/>
-      </w:r>
-    </w:p>
-    <w:p>
-      <w:pPr>
-        <w:pStyle w:val="TOC2"/>
-        <w:tabs>
-          <w:tab w:val="right" w:leader="dot" w:pos="9061"/>
-        </w:tabs>
-        <w:rPr>
-          <w:rFonts w:asciiTheme="minorHAnsi" w:eastAsiaTheme="minorEastAsia" w:hAnsiTheme="minorHAnsi" w:cstheme="minorBidi"/>
-          <w:noProof/>
-          <w:kern w:val="2"/>
-          <w:sz w:val="24"/>
-          <w:szCs w:val="24"/>
-          <w14:ligatures w14:val="standardContextual"/>
-        </w:rPr>
-      </w:pPr>
-      <w:r>
-        <w:rPr>
-          <w:noProof/>
-        </w:rPr>
-        <w:t>3. Hạn chế và hướng hoàn thiện thực nghiệm</w:t>
-      </w:r>
-      <w:r>
-        <w:rPr>
-          <w:noProof/>
-        </w:rPr>
-        <w:tab/>
-      </w:r>
-      <w:r>
-        <w:rPr>
-          <w:noProof/>
-        </w:rPr>
-        <w:fldChar w:fldCharType="begin"/>
-      </w:r>
-      <w:r>
-        <w:rPr>
-          <w:noProof/>
-        </w:rPr>
-        <w:instrText xml:space="preserve"> PAGEREF _Toc233552671 \h </w:instrText>
-      </w:r>
-      <w:r>
-        <w:rPr>
-          <w:noProof/>
-        </w:rPr>
-      </w:r>
-      <w:r>
-        <w:rPr>
-          <w:noProof/>
-        </w:rPr>
-        <w:fldChar w:fldCharType="separate"/>
-      </w:r>
-      <w:r>
-        <w:rPr>
-          <w:noProof/>
-        </w:rPr>
-        <w:t>24</w:t>
-      </w:r>
-      <w:r>
-        <w:rPr>
-          <w:noProof/>
-        </w:rPr>
-        <w:fldChar w:fldCharType="end"/>
-      </w:r>
-    </w:p>
-    <w:p>
-      <w:pPr>
-        <w:pStyle w:val="TOC2"/>
-        <w:tabs>
-          <w:tab w:val="right" w:leader="dot" w:pos="9061"/>
-        </w:tabs>
-        <w:rPr>
-          <w:rFonts w:asciiTheme="minorHAnsi" w:eastAsiaTheme="minorEastAsia" w:hAnsiTheme="minorHAnsi" w:cstheme="minorBidi"/>
-          <w:noProof/>
-          <w:kern w:val="2"/>
-          <w:sz w:val="24"/>
-          <w:szCs w:val="24"/>
-          <w14:ligatures w14:val="standardContextual"/>
-        </w:rPr>
-      </w:pPr>
-      <w:r>
-        <w:rPr>
-          <w:noProof/>
-        </w:rPr>
-        <w:t>4. Kịch bản vận hành đề xuất cho Find Your Path</w:t>
-      </w:r>
-      <w:r>
-        <w:rPr>
-          <w:noProof/>
-        </w:rPr>
-        <w:tab/>
-      </w:r>
-      <w:r>
-        <w:rPr>
-          <w:noProof/>
-        </w:rPr>
-        <w:fldChar w:fldCharType="begin"/>
-      </w:r>
-      <w:r>
-        <w:rPr>
-          <w:noProof/>
-        </w:rPr>
-        <w:instrText xml:space="preserve"> PAGEREF _Toc233552672 \h </w:instrText>
-      </w:r>
-      <w:r>
-        <w:rPr>
-          <w:noProof/>
-        </w:rPr>
-      </w:r>
-      <w:r>
-        <w:rPr>
-          <w:noProof/>
-        </w:rPr>
-        <w:fldChar w:fldCharType="separate"/>
-      </w:r>
-      <w:r>
-        <w:rPr>
-          <w:noProof/>
-        </w:rPr>
-        <w:t>25</w:t>
-      </w:r>
-      <w:r>
-        <w:rPr>
-          <w:noProof/>
-        </w:rPr>
-        <w:fldChar w:fldCharType="end"/>
-      </w:r>
-    </w:p>
-    <w:p>
-      <w:pPr>
-        <w:pStyle w:val="TOC2"/>
-        <w:tabs>
-          <w:tab w:val="right" w:leader="dot" w:pos="9061"/>
-        </w:tabs>
-        <w:rPr>
-          <w:rFonts w:asciiTheme="minorHAnsi" w:eastAsiaTheme="minorEastAsia" w:hAnsiTheme="minorHAnsi" w:cstheme="minorBidi"/>
-          <w:noProof/>
-          <w:kern w:val="2"/>
-          <w:sz w:val="24"/>
-          <w:szCs w:val="24"/>
-          <w14:ligatures w14:val="standardContextual"/>
-        </w:rPr>
-      </w:pPr>
-      <w:r>
-        <w:rPr>
-          <w:noProof/>
-        </w:rPr>
-        <w:t>5. Chuẩn bị luận điểm vấn đáp</w:t>
-      </w:r>
-      <w:r>
-        <w:rPr>
-          <w:noProof/>
-        </w:rPr>
-        <w:tab/>
-      </w:r>
-      <w:r>
-        <w:rPr>
-          <w:noProof/>
-        </w:rPr>
-        <w:fldChar w:fldCharType="begin"/>
-      </w:r>
-      <w:r>
-        <w:rPr>
-          <w:noProof/>
-        </w:rPr>
-        <w:instrText xml:space="preserve"> PAGEREF _Toc233552673 \h </w:instrText>
-      </w:r>
-      <w:r>
-        <w:rPr>
-          <w:noProof/>
-        </w:rPr>
-      </w:r>
-      <w:r>
-        <w:rPr>
-          <w:noProof/>
-        </w:rPr>
-        <w:fldChar w:fldCharType="separate"/>
-      </w:r>
-      <w:r>
-        <w:rPr>
-          <w:noProof/>
-        </w:rPr>
-        <w:t>26</w:t>
-      </w:r>
-      <w:r>
-        <w:rPr>
-          <w:noProof/>
-        </w:rPr>
-        <w:fldChar w:fldCharType="end"/>
-      </w:r>
-    </w:p>
-    <w:p>
-      <w:pPr>
-        <w:pStyle w:val="TOC2"/>
-        <w:tabs>
-          <w:tab w:val="right" w:leader="dot" w:pos="9061"/>
-        </w:tabs>
-        <w:rPr>
-          <w:rFonts w:asciiTheme="minorHAnsi" w:eastAsiaTheme="minorEastAsia" w:hAnsiTheme="minorHAnsi" w:cstheme="minorBidi"/>
-          <w:noProof/>
-          <w:kern w:val="2"/>
-          <w:sz w:val="24"/>
-          <w:szCs w:val="24"/>
-          <w14:ligatures w14:val="standardContextual"/>
-        </w:rPr>
-      </w:pPr>
-      <w:r>
-        <w:rPr>
-          <w:noProof/>
-        </w:rPr>
-        <w:t>6. Rủi ro khi trình bày và cách kiểm soát</w:t>
-      </w:r>
-      <w:r>
-        <w:rPr>
-          <w:noProof/>
-        </w:rPr>
-        <w:tab/>
-      </w:r>
-      <w:r>
-        <w:rPr>
-          <w:noProof/>
-        </w:rPr>
-        <w:fldChar w:fldCharType="begin"/>
-      </w:r>
-      <w:r>
-        <w:rPr>
-          <w:noProof/>
-        </w:rPr>
-        <w:instrText xml:space="preserve"> PAGEREF _Toc233552674 \h </w:instrText>
-      </w:r>
-      <w:r>
-        <w:rPr>
-          <w:noProof/>
-        </w:rPr>
-      </w:r>
-      <w:r>
-        <w:rPr>
-          <w:noProof/>
-        </w:rPr>
-        <w:fldChar w:fldCharType="separate"/>
-      </w:r>
-      <w:r>
-        <w:rPr>
-          <w:noProof/>
-        </w:rPr>
-        <w:t>27</w:t>
-      </w:r>
-      <w:r>
-        <w:rPr>
-          <w:noProof/>
-        </w:rPr>
-        <w:fldChar w:fldCharType="end"/>
-      </w:r>
-    </w:p>
-    <w:p>
-      <w:pPr>
-        <w:pStyle w:val="TOC2"/>
-        <w:tabs>
-          <w:tab w:val="right" w:leader="dot" w:pos="9061"/>
-        </w:tabs>
-        <w:rPr>
-          <w:rFonts w:asciiTheme="minorHAnsi" w:eastAsiaTheme="minorEastAsia" w:hAnsiTheme="minorHAnsi" w:cstheme="minorBidi"/>
-          <w:noProof/>
-          <w:kern w:val="2"/>
-          <w:sz w:val="24"/>
-          <w:szCs w:val="24"/>
-          <w14:ligatures w14:val="standardContextual"/>
-        </w:rPr>
-      </w:pPr>
-      <w:r>
-        <w:rPr>
-          <w:noProof/>
-        </w:rPr>
-        <w:t>7. Khuyến nghị hoàn thiện báo cáo và slide</w:t>
-      </w:r>
-      <w:r>
-        <w:rPr>
-          <w:noProof/>
-        </w:rPr>
-        <w:tab/>
-      </w:r>
-      <w:r>
-        <w:rPr>
-          <w:noProof/>
-        </w:rPr>
-        <w:fldChar w:fldCharType="begin"/>
-      </w:r>
-      <w:r>
-        <w:rPr>
-          <w:noProof/>
-        </w:rPr>
-        <w:instrText xml:space="preserve"> PAGEREF _Toc233552675 \h </w:instrText>
-      </w:r>
-      <w:r>
-        <w:rPr>
-          <w:noProof/>
-        </w:rPr>
-      </w:r>
-      <w:r>
-        <w:rPr>
-          <w:noProof/>
-        </w:rPr>
-        <w:fldChar w:fldCharType="separate"/>
-      </w:r>
-      <w:r>
-        <w:rPr>
-          <w:noProof/>
-        </w:rPr>
-        <w:t>28</w:t>
-      </w:r>
-      <w:r>
-        <w:rPr>
-          <w:noProof/>
-        </w:rPr>
-        <w:fldChar w:fldCharType="end"/>
-      </w:r>
-    </w:p>
-    <w:p>
-      <w:pPr>
-        <w:pStyle w:val="TOC1"/>
-        <w:tabs>
-          <w:tab w:val="right" w:leader="dot" w:pos="9061"/>
-        </w:tabs>
-        <w:rPr>
-          <w:rFonts w:asciiTheme="minorHAnsi" w:eastAsiaTheme="minorEastAsia" w:hAnsiTheme="minorHAnsi" w:cstheme="minorBidi"/>
-          <w:noProof/>
-          <w:kern w:val="2"/>
-          <w:sz w:val="24"/>
-          <w:szCs w:val="24"/>
-          <w14:ligatures w14:val="standardContextual"/>
-        </w:rPr>
-      </w:pPr>
-      <w:r>
-        <w:rPr>
-          <w:noProof/>
-        </w:rPr>
-        <w:t>V. Kết luận</w:t>
-      </w:r>
-      <w:r>
-        <w:rPr>
-          <w:noProof/>
-        </w:rPr>
-        <w:tab/>
-      </w:r>
-      <w:r>
-        <w:rPr>
-          <w:noProof/>
-        </w:rPr>
-        <w:fldChar w:fldCharType="begin"/>
-      </w:r>
-      <w:r>
-        <w:rPr>
-          <w:noProof/>
-        </w:rPr>
-        <w:instrText xml:space="preserve"> PAGEREF _Toc233552676 \h </w:instrText>
-      </w:r>
-      <w:r>
-        <w:rPr>
-          <w:noProof/>
-        </w:rPr>
-      </w:r>
-      <w:r>
-        <w:rPr>
-          <w:noProof/>
-        </w:rPr>
-        <w:fldChar w:fldCharType="separate"/>
-      </w:r>
-      <w:r>
-        <w:rPr>
-          <w:noProof/>
-        </w:rPr>
-        <w:t>29</w:t>
-      </w:r>
-      <w:r>
-        <w:rPr>
-          <w:noProof/>
-        </w:rPr>
-        <w:fldChar w:fldCharType="end"/>
-      </w:r>
-    </w:p>
-    <w:p>
-      <w:pPr>
-        <w:pStyle w:val="TOC1"/>
-        <w:tabs>
-          <w:tab w:val="right" w:leader="dot" w:pos="9061"/>
-        </w:tabs>
-        <w:rPr>
-          <w:rFonts w:asciiTheme="minorHAnsi" w:eastAsiaTheme="minorEastAsia" w:hAnsiTheme="minorHAnsi" w:cstheme="minorBidi"/>
-          <w:noProof/>
-          <w:kern w:val="2"/>
-          <w:sz w:val="24"/>
-          <w:szCs w:val="24"/>
-          <w14:ligatures w14:val="standardContextual"/>
-        </w:rPr>
-      </w:pPr>
-      <w:r>
-        <w:rPr>
-          <w:noProof/>
-        </w:rPr>
-        <w:lastRenderedPageBreak/>
-        <w:t>Tài liệu tham khảo</w:t>
-      </w:r>
-      <w:r>
-        <w:rPr>
-          <w:noProof/>
-        </w:rPr>
-        <w:tab/>
-      </w:r>
-      <w:r>
-        <w:rPr>
-          <w:noProof/>
-        </w:rPr>
-        <w:fldChar w:fldCharType="begin"/>
-      </w:r>
-      <w:r>
-        <w:rPr>
-          <w:noProof/>
-        </w:rPr>
-        <w:instrText xml:space="preserve"> PAGEREF _Toc233552677 \h </w:instrText>
-      </w:r>
-      <w:r>
-        <w:rPr>
-          <w:noProof/>
-        </w:rPr>
-      </w:r>
-      <w:r>
-        <w:rPr>
-          <w:noProof/>
-        </w:rPr>
-        <w:fldChar w:fldCharType="separate"/>
-      </w:r>
-      <w:r>
-        <w:rPr>
-          <w:noProof/>
-        </w:rPr>
-        <w:t>30</w:t>
-      </w:r>
-      <w:r>
-        <w:rPr>
-          <w:noProof/>
-        </w:rPr>
-        <w:fldChar w:fldCharType="end"/>
-      </w:r>
-    </w:p>
-    <w:p>
-      <w:pPr>
-        <w:pStyle w:val="Heading1"/>
-        <w:pageBreakBefore/>
-        <w:spacing w:before="0"/>
-        <w:jc w:val="left"/>
       </w:pPr>
       <w:r>
         <w:rPr>
@@ -2770,7 +2759,7 @@
         <w:lastRenderedPageBreak/>
         <w:fldChar w:fldCharType="end"/>
       </w:r>
-      <w:bookmarkStart w:id="0" w:name="_Toc233552653"/>
+      <w:bookmarkStart w:id="0" w:name="_Toc233552827"/>
       <w:r>
         <w:rPr>
           <w:rFonts w:eastAsia="Times New Roman"/>
@@ -2784,7 +2773,7 @@
         <w:pStyle w:val="Heading2"/>
         <w:spacing w:before="120"/>
       </w:pPr>
-      <w:bookmarkStart w:id="1" w:name="_Toc233552654"/>
+      <w:bookmarkStart w:id="1" w:name="_Toc233552828"/>
       <w:r>
         <w:rPr>
           <w:rFonts w:eastAsia="Times New Roman"/>
@@ -2865,7 +2854,7 @@
         <w:pStyle w:val="Heading2"/>
         <w:spacing w:before="120"/>
       </w:pPr>
-      <w:bookmarkStart w:id="2" w:name="_Toc233552655"/>
+      <w:bookmarkStart w:id="2" w:name="_Toc233552829"/>
       <w:r>
         <w:rPr>
           <w:rFonts w:eastAsia="Times New Roman"/>
@@ -3097,7 +3086,7 @@
         <w:spacing w:before="0"/>
         <w:jc w:val="left"/>
       </w:pPr>
-      <w:bookmarkStart w:id="3" w:name="_Toc233552656"/>
+      <w:bookmarkStart w:id="3" w:name="_Toc233552830"/>
       <w:r>
         <w:rPr>
           <w:rFonts w:eastAsia="Times New Roman"/>
@@ -3130,7 +3119,7 @@
         <w:pStyle w:val="Heading2"/>
         <w:spacing w:before="120"/>
       </w:pPr>
-      <w:bookmarkStart w:id="4" w:name="_Toc233552657"/>
+      <w:bookmarkStart w:id="4" w:name="_Toc233552831"/>
       <w:r>
         <w:rPr>
           <w:rFonts w:eastAsia="Times New Roman"/>
@@ -3292,7 +3281,7 @@
         <w:pStyle w:val="Heading2"/>
         <w:spacing w:before="120"/>
       </w:pPr>
-      <w:bookmarkStart w:id="5" w:name="_Toc233552658"/>
+      <w:bookmarkStart w:id="5" w:name="_Toc233552832"/>
       <w:r>
         <w:rPr>
           <w:rFonts w:eastAsia="Times New Roman"/>
@@ -3573,7 +3562,7 @@
         <w:pStyle w:val="Heading2"/>
         <w:spacing w:before="120"/>
       </w:pPr>
-      <w:bookmarkStart w:id="6" w:name="_Toc233552659"/>
+      <w:bookmarkStart w:id="6" w:name="_Toc233552833"/>
       <w:r>
         <w:rPr>
           <w:rFonts w:eastAsia="Times New Roman"/>
@@ -3853,7 +3842,7 @@
         <w:pStyle w:val="Heading2"/>
         <w:spacing w:before="120"/>
       </w:pPr>
-      <w:bookmarkStart w:id="7" w:name="_Toc233552660"/>
+      <w:bookmarkStart w:id="7" w:name="_Toc233552834"/>
       <w:r>
         <w:rPr>
           <w:rFonts w:eastAsia="Times New Roman"/>
@@ -4140,7 +4129,7 @@
         <w:pStyle w:val="Heading2"/>
         <w:spacing w:before="120"/>
       </w:pPr>
-      <w:bookmarkStart w:id="8" w:name="_Toc233552661"/>
+      <w:bookmarkStart w:id="8" w:name="_Toc233552835"/>
       <w:r>
         <w:rPr>
           <w:rFonts w:eastAsia="Times New Roman"/>
@@ -4373,7 +4362,7 @@
         <w:pStyle w:val="Heading2"/>
         <w:spacing w:before="120"/>
       </w:pPr>
-      <w:bookmarkStart w:id="9" w:name="_Toc233552662"/>
+      <w:bookmarkStart w:id="9" w:name="_Toc233552836"/>
       <w:r>
         <w:rPr>
           <w:rFonts w:eastAsia="Times New Roman"/>
@@ -4599,7 +4588,7 @@
         <w:spacing w:before="0"/>
         <w:jc w:val="left"/>
       </w:pPr>
-      <w:bookmarkStart w:id="10" w:name="_Toc233552663"/>
+      <w:bookmarkStart w:id="10" w:name="_Toc233552837"/>
       <w:r>
         <w:rPr>
           <w:rFonts w:eastAsia="Times New Roman"/>
@@ -4614,7 +4603,7 @@
         <w:pStyle w:val="Heading2"/>
         <w:spacing w:before="120"/>
       </w:pPr>
-      <w:bookmarkStart w:id="11" w:name="_Toc233552664"/>
+      <w:bookmarkStart w:id="11" w:name="_Toc233552838"/>
       <w:r>
         <w:rPr>
           <w:rFonts w:eastAsia="Times New Roman"/>
@@ -4691,7 +4680,7 @@
         <w:pStyle w:val="Heading2"/>
         <w:spacing w:before="120"/>
       </w:pPr>
-      <w:bookmarkStart w:id="12" w:name="_Toc233552665"/>
+      <w:bookmarkStart w:id="12" w:name="_Toc233552839"/>
       <w:r>
         <w:rPr>
           <w:rFonts w:eastAsia="Times New Roman"/>
@@ -4769,7 +4758,7 @@
         <w:pStyle w:val="Heading2"/>
         <w:spacing w:before="120"/>
       </w:pPr>
-      <w:bookmarkStart w:id="13" w:name="_Toc233552666"/>
+      <w:bookmarkStart w:id="13" w:name="_Toc233552840"/>
       <w:r>
         <w:rPr>
           <w:rFonts w:eastAsia="Times New Roman"/>
@@ -4820,7 +4809,7 @@
         <w:pStyle w:val="Heading2"/>
         <w:spacing w:before="120"/>
       </w:pPr>
-      <w:bookmarkStart w:id="14" w:name="_Toc233552667"/>
+      <w:bookmarkStart w:id="14" w:name="_Toc233552841"/>
       <w:r>
         <w:rPr>
           <w:rFonts w:eastAsia="Times New Roman"/>
@@ -4845,7 +4834,7 @@
         <w:spacing w:before="0"/>
         <w:jc w:val="left"/>
       </w:pPr>
-      <w:bookmarkStart w:id="15" w:name="_Toc233552668"/>
+      <w:bookmarkStart w:id="15" w:name="_Toc233552842"/>
       <w:r>
         <w:rPr>
           <w:rFonts w:eastAsia="Times New Roman"/>
@@ -4982,7 +4971,7 @@
         <w:pStyle w:val="Heading2"/>
         <w:spacing w:before="120"/>
       </w:pPr>
-      <w:bookmarkStart w:id="16" w:name="_Toc233552669"/>
+      <w:bookmarkStart w:id="16" w:name="_Toc233552843"/>
       <w:r>
         <w:rPr>
           <w:rFonts w:eastAsia="Times New Roman"/>
@@ -5032,7 +5021,7 @@
         <w:pStyle w:val="Heading2"/>
         <w:spacing w:before="120"/>
       </w:pPr>
-      <w:bookmarkStart w:id="17" w:name="_Toc233552670"/>
+      <w:bookmarkStart w:id="17" w:name="_Toc233552844"/>
       <w:r>
         <w:rPr>
           <w:rFonts w:eastAsia="Times New Roman"/>
@@ -5092,7 +5081,7 @@
         <w:pStyle w:val="Heading2"/>
         <w:spacing w:before="120"/>
       </w:pPr>
-      <w:bookmarkStart w:id="18" w:name="_Toc233552671"/>
+      <w:bookmarkStart w:id="18" w:name="_Toc233552845"/>
       <w:r>
         <w:rPr>
           <w:rFonts w:eastAsia="Times New Roman"/>
@@ -5152,7 +5141,7 @@
         <w:pStyle w:val="Heading2"/>
         <w:spacing w:before="120"/>
       </w:pPr>
-      <w:bookmarkStart w:id="19" w:name="_Toc233552672"/>
+      <w:bookmarkStart w:id="19" w:name="_Toc233552846"/>
       <w:r>
         <w:rPr>
           <w:rFonts w:eastAsia="Times New Roman"/>
@@ -5224,7 +5213,7 @@
         <w:pStyle w:val="Heading2"/>
         <w:spacing w:before="120"/>
       </w:pPr>
-      <w:bookmarkStart w:id="20" w:name="_Toc233552673"/>
+      <w:bookmarkStart w:id="20" w:name="_Toc233552847"/>
       <w:r>
         <w:rPr>
           <w:rFonts w:eastAsia="Times New Roman"/>
@@ -5302,7 +5291,7 @@
         <w:pStyle w:val="Heading2"/>
         <w:spacing w:before="120"/>
       </w:pPr>
-      <w:bookmarkStart w:id="21" w:name="_Toc233552674"/>
+      <w:bookmarkStart w:id="21" w:name="_Toc233552848"/>
       <w:r>
         <w:rPr>
           <w:rFonts w:eastAsia="Times New Roman"/>
@@ -5371,7 +5360,7 @@
         <w:pStyle w:val="Heading2"/>
         <w:spacing w:before="120"/>
       </w:pPr>
-      <w:bookmarkStart w:id="22" w:name="_Toc233552675"/>
+      <w:bookmarkStart w:id="22" w:name="_Toc233552849"/>
       <w:r>
         <w:rPr>
           <w:rFonts w:eastAsia="Times New Roman"/>
@@ -5423,6 +5412,46 @@
       </w:pPr>
       <w:r>
         <w:t>Sau cùng, báo cáo nên được rà lần cuối theo ba tiêu chí: đúng bố cục giảng viên yêu cầu, đủ chiều sâu học thuật và có khả năng chuyển thành slide trình bày. Nếu một đoạn văn không giúp giải thích thuật toán, không giúp liên hệ Find Your Path hoặc không giúp chuẩn bị vấn đáp, đoạn đó nên được rút gọn. Ngược lại, những phân tích về giới hạn, giả định và điều kiện áp dụng nên được giữ lại vì chúng thể hiện tư duy phản biện.</w:t>
+      </w:r>
+    </w:p>
+    <w:p>
+      <w:pPr>
+        <w:spacing w:line="300" w:lineRule="auto"/>
+        <w:ind w:firstLine="567"/>
+      </w:pPr>
+      <w:r>
+        <w:t xml:space="preserve">Khi ho?n thi?n b?n tr?nh b?y, nh?m n?n chu?n b? th?m m?t slide t?ng h?p lu?ng quy?t ??nh c?a h? th?ng. Slide n?y kh?ng c?n ch?a qu? nhi?u ch?, nh?ng ph?i cho th?y th? t? t? duy: bi?u di?n graph, ch?n thu?t to?n t?m ki?m, ki?m tra r?ng bu?c, x? l? b?t </w:t>
+      </w:r>
+      <w:r>
+        <w:lastRenderedPageBreak/>
+        <w:t>??nh v? ??nh gi? k?ch b?n x?u. N?u ng??i nghe th?y ???c lu?ng n?y, c?c thu?t to?n s? kh?ng c?n l? s?u ph?n r?i r?c.</w:t>
+      </w:r>
+    </w:p>
+    <w:p>
+      <w:pPr>
+        <w:spacing w:line="300" w:lineRule="auto"/>
+        <w:ind w:firstLine="567"/>
+      </w:pPr>
+      <w:r>
+        <w:t>M?t ?i?m c? th? nh?n m?nh trong v?n ??p l? s? kh?c nhau gi?a thu?t to?n ch?y trong ch??ng tr?nh v? thu?t to?n d?ng ?? ph?n t?ch. A* c? th? l? ph?n ch?y r? nh?t trong demo t?m ???ng, c?n AND-OR Search ho?c Alpha-Beta c? th? ???c tr?nh b?y b?ng k?ch b?n m? ph?ng nh?. ?i?u n?y v?n h?p l? n?u nh?m n?i r? ph?m vi ?p d?ng c?a t?ng thu?t to?n.</w:t>
+      </w:r>
+    </w:p>
+    <w:p>
+      <w:pPr>
+        <w:spacing w:line="300" w:lineRule="auto"/>
+        <w:ind w:firstLine="567"/>
+      </w:pPr>
+      <w:r>
+        <w:t>??i v?i b?o c?o Word, nh?m n?n gi? ph?n ph?n t?ch d?i v? ??y l? n?i th? hi?n chi?u s?u. ??i v?i slide, n?i dung n?n ???c r?t th?nh claim ng?n, h?nh minh h?a v? m?t c?u gi?i th?ch. C?ng m?t ? t??ng nh?ng hai h?nh th?c tr?nh b?y kh?c nhau: b?o c?o ?? ??c v? ki?m tra h?c thu?t, slide ?? nghe v? v?n ??p.</w:t>
+      </w:r>
+    </w:p>
+    <w:p>
+      <w:pPr>
+        <w:spacing w:line="300" w:lineRule="auto"/>
+        <w:ind w:firstLine="567"/>
+      </w:pPr>
+      <w:r>
+        <w:t>Cu?i c?ng, nh?m n?n r? l?i to?n b? thu?t ng? tr??c khi n?p. Nh?ng thu?t ng? nh? state, goal, frontier, heuristic, domain, constraint, utility, alpha v? beta c?n ???c d?ng nh?t qu?n. S? nh?t qu?n thu?t ng? th??ng t?o ?n t??ng t?t h?n nhi?u so v?i vi?c th?m qu? nhi?u n?i dung nh?ng m?i ph?n g?i kh?i ni?m theo m?t c?ch kh?c nhau.</w:t>
       </w:r>
     </w:p>
     <w:p>
@@ -5432,7 +5461,7 @@
         <w:spacing w:before="0"/>
         <w:jc w:val="left"/>
       </w:pPr>
-      <w:bookmarkStart w:id="23" w:name="_Toc233552676"/>
+      <w:bookmarkStart w:id="23" w:name="_Toc233552850"/>
       <w:r>
         <w:rPr>
           <w:rFonts w:eastAsia="Times New Roman"/>
@@ -5485,7 +5514,7 @@
         <w:spacing w:before="0"/>
         <w:jc w:val="left"/>
       </w:pPr>
-      <w:bookmarkStart w:id="24" w:name="_Toc233552677"/>
+      <w:bookmarkStart w:id="24" w:name="_Toc233552851"/>
       <w:r>
         <w:rPr>
           <w:rFonts w:eastAsia="Times New Roman"/>

</xml_diff>

<commit_message>
Polish constraints and route UI
</commit_message>
<xml_diff>
--- a/docs/find-your-path-report.docx
+++ b/docs/find-your-path-report.docx
@@ -1206,7 +1206,7 @@
         <w:rPr>
           <w:noProof/>
         </w:rPr>
-        <w:instrText xml:space="preserve"> PAGEREF _Toc233552827 \h </w:instrText>
+        <w:instrText xml:space="preserve"> PAGEREF _Toc233554404 \h </w:instrText>
       </w:r>
       <w:r>
         <w:rPr>
@@ -1223,7 +1223,7 @@
         <w:rPr>
           <w:noProof/>
         </w:rPr>
-        <w:t>5</w:t>
+        <w:t>4</w:t>
       </w:r>
       <w:r>
         <w:rPr>
@@ -1269,7 +1269,7 @@
         <w:rPr>
           <w:noProof/>
         </w:rPr>
-        <w:instrText xml:space="preserve"> PAGEREF _Toc233552828 \h </w:instrText>
+        <w:instrText xml:space="preserve"> PAGEREF _Toc233554405 \h </w:instrText>
       </w:r>
       <w:r>
         <w:rPr>
@@ -1286,7 +1286,7 @@
         <w:rPr>
           <w:noProof/>
         </w:rPr>
-        <w:t>5</w:t>
+        <w:t>4</w:t>
       </w:r>
       <w:r>
         <w:rPr>
@@ -1332,7 +1332,7 @@
         <w:rPr>
           <w:noProof/>
         </w:rPr>
-        <w:instrText xml:space="preserve"> PAGEREF _Toc233552829 \h </w:instrText>
+        <w:instrText xml:space="preserve"> PAGEREF _Toc233554406 \h </w:instrText>
       </w:r>
       <w:r>
         <w:rPr>
@@ -1349,7 +1349,7 @@
         <w:rPr>
           <w:noProof/>
         </w:rPr>
-        <w:t>6</w:t>
+        <w:t>5</w:t>
       </w:r>
       <w:r>
         <w:rPr>
@@ -1395,7 +1395,7 @@
         <w:rPr>
           <w:noProof/>
         </w:rPr>
-        <w:instrText xml:space="preserve"> PAGEREF _Toc233552830 \h </w:instrText>
+        <w:instrText xml:space="preserve"> PAGEREF _Toc233554407 \h </w:instrText>
       </w:r>
       <w:r>
         <w:rPr>
@@ -1412,7 +1412,7 @@
         <w:rPr>
           <w:noProof/>
         </w:rPr>
-        <w:t>8</w:t>
+        <w:t>7</w:t>
       </w:r>
       <w:r>
         <w:rPr>
@@ -1458,7 +1458,7 @@
         <w:rPr>
           <w:noProof/>
         </w:rPr>
-        <w:instrText xml:space="preserve"> PAGEREF _Toc233552831 \h </w:instrText>
+        <w:instrText xml:space="preserve"> PAGEREF _Toc233554408 \h </w:instrText>
       </w:r>
       <w:r>
         <w:rPr>
@@ -1475,7 +1475,7 @@
         <w:rPr>
           <w:noProof/>
         </w:rPr>
-        <w:t>8</w:t>
+        <w:t>7</w:t>
       </w:r>
       <w:r>
         <w:rPr>
@@ -1521,7 +1521,7 @@
         <w:rPr>
           <w:noProof/>
         </w:rPr>
-        <w:instrText xml:space="preserve"> PAGEREF _Toc233552832 \h </w:instrText>
+        <w:instrText xml:space="preserve"> PAGEREF _Toc233554409 \h </w:instrText>
       </w:r>
       <w:r>
         <w:rPr>
@@ -1584,7 +1584,7 @@
         <w:rPr>
           <w:noProof/>
         </w:rPr>
-        <w:instrText xml:space="preserve"> PAGEREF _Toc233552833 \h </w:instrText>
+        <w:instrText xml:space="preserve"> PAGEREF _Toc233554410 \h </w:instrText>
       </w:r>
       <w:r>
         <w:rPr>
@@ -1601,7 +1601,7 @@
         <w:rPr>
           <w:noProof/>
         </w:rPr>
-        <w:t>11</w:t>
+        <w:t>10</w:t>
       </w:r>
       <w:r>
         <w:rPr>
@@ -1647,7 +1647,7 @@
         <w:rPr>
           <w:noProof/>
         </w:rPr>
-        <w:instrText xml:space="preserve"> PAGEREF _Toc233552834 \h </w:instrText>
+        <w:instrText xml:space="preserve"> PAGEREF _Toc233554411 \h </w:instrText>
       </w:r>
       <w:r>
         <w:rPr>
@@ -1710,7 +1710,7 @@
         <w:rPr>
           <w:noProof/>
         </w:rPr>
-        <w:instrText xml:space="preserve"> PAGEREF _Toc233552835 \h </w:instrText>
+        <w:instrText xml:space="preserve"> PAGEREF _Toc233554412 \h </w:instrText>
       </w:r>
       <w:r>
         <w:rPr>
@@ -1773,7 +1773,7 @@
         <w:rPr>
           <w:noProof/>
         </w:rPr>
-        <w:instrText xml:space="preserve"> PAGEREF _Toc233552836 \h </w:instrText>
+        <w:instrText xml:space="preserve"> PAGEREF _Toc233554413 \h </w:instrText>
       </w:r>
       <w:r>
         <w:rPr>
@@ -1836,7 +1836,7 @@
         <w:rPr>
           <w:noProof/>
         </w:rPr>
-        <w:instrText xml:space="preserve"> PAGEREF _Toc233552837 \h </w:instrText>
+        <w:instrText xml:space="preserve"> PAGEREF _Toc233554414 \h </w:instrText>
       </w:r>
       <w:r>
         <w:rPr>
@@ -1853,7 +1853,7 @@
         <w:rPr>
           <w:noProof/>
         </w:rPr>
-        <w:t>17</w:t>
+        <w:t>18</w:t>
       </w:r>
       <w:r>
         <w:rPr>
@@ -1881,7 +1881,7 @@
         <w:rPr>
           <w:noProof/>
         </w:rPr>
-        <w:t>1. Thiết kế kịch bản thực nghiệm</w:t>
+        <w:t>1. Nhóm tìm kiếm không thông tin: DFS</w:t>
       </w:r>
       <w:r>
         <w:rPr>
@@ -1899,7 +1899,7 @@
         <w:rPr>
           <w:noProof/>
         </w:rPr>
-        <w:instrText xml:space="preserve"> PAGEREF _Toc233552838 \h </w:instrText>
+        <w:instrText xml:space="preserve"> PAGEREF _Toc233554415 \h </w:instrText>
       </w:r>
       <w:r>
         <w:rPr>
@@ -1916,7 +1916,7 @@
         <w:rPr>
           <w:noProof/>
         </w:rPr>
-        <w:t>17</w:t>
+        <w:t>18</w:t>
       </w:r>
       <w:r>
         <w:rPr>
@@ -1944,7 +1944,7 @@
         <w:rPr>
           <w:noProof/>
         </w:rPr>
-        <w:t>2. Chỉ tiêu quan sát và cách ghi nhận kết quả</w:t>
+        <w:t>2. Nhóm tìm kiếm có thông tin: A*</w:t>
       </w:r>
       <w:r>
         <w:rPr>
@@ -1962,7 +1962,7 @@
         <w:rPr>
           <w:noProof/>
         </w:rPr>
-        <w:instrText xml:space="preserve"> PAGEREF _Toc233552839 \h </w:instrText>
+        <w:instrText xml:space="preserve"> PAGEREF _Toc233554416 \h </w:instrText>
       </w:r>
       <w:r>
         <w:rPr>
@@ -1979,7 +1979,7 @@
         <w:rPr>
           <w:noProof/>
         </w:rPr>
-        <w:t>18</w:t>
+        <w:t>19</w:t>
       </w:r>
       <w:r>
         <w:rPr>
@@ -2007,7 +2007,7 @@
         <w:rPr>
           <w:noProof/>
         </w:rPr>
-        <w:t>3. Định hướng chèn hình minh họa</w:t>
+        <w:t>3. Nhóm tìm kiếm cục bộ: Simple Hill Climbing</w:t>
       </w:r>
       <w:r>
         <w:rPr>
@@ -2025,7 +2025,7 @@
         <w:rPr>
           <w:noProof/>
         </w:rPr>
-        <w:instrText xml:space="preserve"> PAGEREF _Toc233552840 \h </w:instrText>
+        <w:instrText xml:space="preserve"> PAGEREF _Toc233554417 \h </w:instrText>
       </w:r>
       <w:r>
         <w:rPr>
@@ -2042,7 +2042,7 @@
         <w:rPr>
           <w:noProof/>
         </w:rPr>
-        <w:t>19</w:t>
+        <w:t>21</w:t>
       </w:r>
       <w:r>
         <w:rPr>
@@ -2070,7 +2070,7 @@
         <w:rPr>
           <w:noProof/>
         </w:rPr>
-        <w:t>4. Link GitHub</w:t>
+        <w:t>4. Nhóm môi trường phức tạp: AND-OR Search</w:t>
       </w:r>
       <w:r>
         <w:rPr>
@@ -2088,7 +2088,7 @@
         <w:rPr>
           <w:noProof/>
         </w:rPr>
-        <w:instrText xml:space="preserve"> PAGEREF _Toc233552841 \h </w:instrText>
+        <w:instrText xml:space="preserve"> PAGEREF _Toc233554418 \h </w:instrText>
       </w:r>
       <w:r>
         <w:rPr>
@@ -2105,7 +2105,196 @@
         <w:rPr>
           <w:noProof/>
         </w:rPr>
-        <w:t>19</w:t>
+        <w:t>22</w:t>
+      </w:r>
+      <w:r>
+        <w:rPr>
+          <w:noProof/>
+        </w:rPr>
+        <w:fldChar w:fldCharType="end"/>
+      </w:r>
+    </w:p>
+    <w:p>
+      <w:pPr>
+        <w:pStyle w:val="TOC2"/>
+        <w:tabs>
+          <w:tab w:val="right" w:leader="dot" w:pos="9061"/>
+        </w:tabs>
+        <w:rPr>
+          <w:rFonts w:asciiTheme="minorHAnsi" w:eastAsiaTheme="minorEastAsia" w:hAnsiTheme="minorHAnsi" w:cstheme="minorBidi"/>
+          <w:noProof/>
+          <w:kern w:val="2"/>
+          <w:sz w:val="24"/>
+          <w:szCs w:val="24"/>
+          <w14:ligatures w14:val="standardContextual"/>
+        </w:rPr>
+      </w:pPr>
+      <w:r>
+        <w:rPr>
+          <w:noProof/>
+        </w:rPr>
+        <w:t>5. Nhóm thỏa ràng buộc: Forward Checking</w:t>
+      </w:r>
+      <w:r>
+        <w:rPr>
+          <w:noProof/>
+        </w:rPr>
+        <w:tab/>
+      </w:r>
+      <w:r>
+        <w:rPr>
+          <w:noProof/>
+        </w:rPr>
+        <w:fldChar w:fldCharType="begin"/>
+      </w:r>
+      <w:r>
+        <w:rPr>
+          <w:noProof/>
+        </w:rPr>
+        <w:instrText xml:space="preserve"> PAGEREF _Toc233554419 \h </w:instrText>
+      </w:r>
+      <w:r>
+        <w:rPr>
+          <w:noProof/>
+        </w:rPr>
+      </w:r>
+      <w:r>
+        <w:rPr>
+          <w:noProof/>
+        </w:rPr>
+        <w:fldChar w:fldCharType="separate"/>
+      </w:r>
+      <w:r>
+        <w:rPr>
+          <w:noProof/>
+        </w:rPr>
+        <w:t>23</w:t>
+      </w:r>
+      <w:r>
+        <w:rPr>
+          <w:noProof/>
+        </w:rPr>
+        <w:fldChar w:fldCharType="end"/>
+      </w:r>
+    </w:p>
+    <w:p>
+      <w:pPr>
+        <w:pStyle w:val="TOC2"/>
+        <w:tabs>
+          <w:tab w:val="right" w:leader="dot" w:pos="9061"/>
+        </w:tabs>
+        <w:rPr>
+          <w:rFonts w:asciiTheme="minorHAnsi" w:eastAsiaTheme="minorEastAsia" w:hAnsiTheme="minorHAnsi" w:cstheme="minorBidi"/>
+          <w:noProof/>
+          <w:kern w:val="2"/>
+          <w:sz w:val="24"/>
+          <w:szCs w:val="24"/>
+          <w14:ligatures w14:val="standardContextual"/>
+        </w:rPr>
+      </w:pPr>
+      <w:r>
+        <w:rPr>
+          <w:noProof/>
+        </w:rPr>
+        <w:t>6. Nhóm tìm kiếm đối kháng: Alpha-Beta Pruning</w:t>
+      </w:r>
+      <w:r>
+        <w:rPr>
+          <w:noProof/>
+        </w:rPr>
+        <w:tab/>
+      </w:r>
+      <w:r>
+        <w:rPr>
+          <w:noProof/>
+        </w:rPr>
+        <w:fldChar w:fldCharType="begin"/>
+      </w:r>
+      <w:r>
+        <w:rPr>
+          <w:noProof/>
+        </w:rPr>
+        <w:instrText xml:space="preserve"> PAGEREF _Toc233554420 \h </w:instrText>
+      </w:r>
+      <w:r>
+        <w:rPr>
+          <w:noProof/>
+        </w:rPr>
+      </w:r>
+      <w:r>
+        <w:rPr>
+          <w:noProof/>
+        </w:rPr>
+        <w:fldChar w:fldCharType="separate"/>
+      </w:r>
+      <w:r>
+        <w:rPr>
+          <w:noProof/>
+        </w:rPr>
+        <w:t>24</w:t>
+      </w:r>
+      <w:r>
+        <w:rPr>
+          <w:noProof/>
+        </w:rPr>
+        <w:fldChar w:fldCharType="end"/>
+      </w:r>
+    </w:p>
+    <w:p>
+      <w:pPr>
+        <w:pStyle w:val="TOC2"/>
+        <w:tabs>
+          <w:tab w:val="right" w:leader="dot" w:pos="9061"/>
+        </w:tabs>
+        <w:rPr>
+          <w:rFonts w:asciiTheme="minorHAnsi" w:eastAsiaTheme="minorEastAsia" w:hAnsiTheme="minorHAnsi" w:cstheme="minorBidi"/>
+          <w:noProof/>
+          <w:kern w:val="2"/>
+          <w:sz w:val="24"/>
+          <w:szCs w:val="24"/>
+          <w14:ligatures w14:val="standardContextual"/>
+        </w:rPr>
+      </w:pPr>
+      <w:r>
+        <w:rPr>
+          <w:noProof/>
+        </w:rPr>
+        <w:t>7. Link GitHub và tài nguyên minh họa</w:t>
+      </w:r>
+      <w:r>
+        <w:rPr>
+          <w:noProof/>
+        </w:rPr>
+        <w:tab/>
+      </w:r>
+      <w:r>
+        <w:rPr>
+          <w:noProof/>
+        </w:rPr>
+        <w:fldChar w:fldCharType="begin"/>
+      </w:r>
+      <w:r>
+        <w:rPr>
+          <w:noProof/>
+        </w:rPr>
+        <w:instrText xml:space="preserve"> PAGEREF _Toc233554421 \h </w:instrText>
+      </w:r>
+      <w:r>
+        <w:rPr>
+          <w:noProof/>
+        </w:rPr>
+      </w:r>
+      <w:r>
+        <w:rPr>
+          <w:noProof/>
+        </w:rPr>
+        <w:fldChar w:fldCharType="separate"/>
+      </w:r>
+      <w:r>
+        <w:rPr>
+          <w:noProof/>
+        </w:rPr>
+        <w:t>26</w:t>
       </w:r>
       <w:r>
         <w:rPr>
@@ -2151,7 +2340,7 @@
         <w:rPr>
           <w:noProof/>
         </w:rPr>
-        <w:instrText xml:space="preserve"> PAGEREF _Toc233552842 \h </w:instrText>
+        <w:instrText xml:space="preserve"> PAGEREF _Toc233554422 \h </w:instrText>
       </w:r>
       <w:r>
         <w:rPr>
@@ -2168,7 +2357,7 @@
         <w:rPr>
           <w:noProof/>
         </w:rPr>
-        <w:t>20</w:t>
+        <w:t>27</w:t>
       </w:r>
       <w:r>
         <w:rPr>
@@ -2196,7 +2385,7 @@
         <w:rPr>
           <w:noProof/>
         </w:rPr>
-        <w:t>1. Tổng hợp vai trò của sáu thuật toán</w:t>
+        <w:t>1. Đánh giá ưu điểm và hạn chế</w:t>
       </w:r>
       <w:r>
         <w:rPr>
@@ -2214,7 +2403,7 @@
         <w:rPr>
           <w:noProof/>
         </w:rPr>
-        <w:instrText xml:space="preserve"> PAGEREF _Toc233552843 \h </w:instrText>
+        <w:instrText xml:space="preserve"> PAGEREF _Toc233554423 \h </w:instrText>
       </w:r>
       <w:r>
         <w:rPr>
@@ -2231,7 +2420,7 @@
         <w:rPr>
           <w:noProof/>
         </w:rPr>
-        <w:t>22</w:t>
+        <w:t>27</w:t>
       </w:r>
       <w:r>
         <w:rPr>
@@ -2259,7 +2448,7 @@
         <w:rPr>
           <w:noProof/>
         </w:rPr>
-        <w:t>2. Mối liên hệ giữa biểu diễn trạng thái và thuật toán</w:t>
+        <w:t>2. Hướng phát triển trong tương lai</w:t>
       </w:r>
       <w:r>
         <w:rPr>
@@ -2277,7 +2466,7 @@
         <w:rPr>
           <w:noProof/>
         </w:rPr>
-        <w:instrText xml:space="preserve"> PAGEREF _Toc233552844 \h </w:instrText>
+        <w:instrText xml:space="preserve"> PAGEREF _Toc233554424 \h </w:instrText>
       </w:r>
       <w:r>
         <w:rPr>
@@ -2294,7 +2483,7 @@
         <w:rPr>
           <w:noProof/>
         </w:rPr>
-        <w:t>22</w:t>
+        <w:t>28</w:t>
       </w:r>
       <w:r>
         <w:rPr>
@@ -2305,7 +2494,7 @@
     </w:p>
     <w:p>
       <w:pPr>
-        <w:pStyle w:val="TOC2"/>
+        <w:pStyle w:val="TOC1"/>
         <w:tabs>
           <w:tab w:val="right" w:leader="dot" w:pos="9061"/>
         </w:tabs>
@@ -2322,7 +2511,7 @@
         <w:rPr>
           <w:noProof/>
         </w:rPr>
-        <w:t>3. Hạn chế và hướng hoàn thiện thực nghiệm</w:t>
+        <w:t>V. Kết luận</w:t>
       </w:r>
       <w:r>
         <w:rPr>
@@ -2340,7 +2529,7 @@
         <w:rPr>
           <w:noProof/>
         </w:rPr>
-        <w:instrText xml:space="preserve"> PAGEREF _Toc233552845 \h </w:instrText>
+        <w:instrText xml:space="preserve"> PAGEREF _Toc233554425 \h </w:instrText>
       </w:r>
       <w:r>
         <w:rPr>
@@ -2357,7 +2546,7 @@
         <w:rPr>
           <w:noProof/>
         </w:rPr>
-        <w:t>23</w:t>
+        <w:t>29</w:t>
       </w:r>
       <w:r>
         <w:rPr>
@@ -2368,7 +2557,7 @@
     </w:p>
     <w:p>
       <w:pPr>
-        <w:pStyle w:val="TOC2"/>
+        <w:pStyle w:val="TOC1"/>
         <w:tabs>
           <w:tab w:val="right" w:leader="dot" w:pos="9061"/>
         </w:tabs>
@@ -2385,7 +2574,7 @@
         <w:rPr>
           <w:noProof/>
         </w:rPr>
-        <w:t>4. Kịch bản vận hành đề xuất cho Find Your Path</w:t>
+        <w:t>TÀI LIỆU THAM KHẢO</w:t>
       </w:r>
       <w:r>
         <w:rPr>
@@ -2403,323 +2592,7 @@
         <w:rPr>
           <w:noProof/>
         </w:rPr>
-        <w:instrText xml:space="preserve"> PAGEREF _Toc233552846 \h </w:instrText>
-      </w:r>
-      <w:r>
-        <w:rPr>
-          <w:noProof/>
-        </w:rPr>
-      </w:r>
-      <w:r>
-        <w:rPr>
-          <w:noProof/>
-        </w:rPr>
-        <w:fldChar w:fldCharType="separate"/>
-      </w:r>
-      <w:r>
-        <w:rPr>
-          <w:noProof/>
-        </w:rPr>
-        <w:t>24</w:t>
-      </w:r>
-      <w:r>
-        <w:rPr>
-          <w:noProof/>
-        </w:rPr>
-        <w:fldChar w:fldCharType="end"/>
-      </w:r>
-    </w:p>
-    <w:p>
-      <w:pPr>
-        <w:pStyle w:val="TOC2"/>
-        <w:tabs>
-          <w:tab w:val="right" w:leader="dot" w:pos="9061"/>
-        </w:tabs>
-        <w:rPr>
-          <w:rFonts w:asciiTheme="minorHAnsi" w:eastAsiaTheme="minorEastAsia" w:hAnsiTheme="minorHAnsi" w:cstheme="minorBidi"/>
-          <w:noProof/>
-          <w:kern w:val="2"/>
-          <w:sz w:val="24"/>
-          <w:szCs w:val="24"/>
-          <w14:ligatures w14:val="standardContextual"/>
-        </w:rPr>
-      </w:pPr>
-      <w:r>
-        <w:rPr>
-          <w:noProof/>
-        </w:rPr>
-        <w:t>5. Chuẩn bị luận điểm vấn đáp</w:t>
-      </w:r>
-      <w:r>
-        <w:rPr>
-          <w:noProof/>
-        </w:rPr>
-        <w:tab/>
-      </w:r>
-      <w:r>
-        <w:rPr>
-          <w:noProof/>
-        </w:rPr>
-        <w:fldChar w:fldCharType="begin"/>
-      </w:r>
-      <w:r>
-        <w:rPr>
-          <w:noProof/>
-        </w:rPr>
-        <w:instrText xml:space="preserve"> PAGEREF _Toc233552847 \h </w:instrText>
-      </w:r>
-      <w:r>
-        <w:rPr>
-          <w:noProof/>
-        </w:rPr>
-      </w:r>
-      <w:r>
-        <w:rPr>
-          <w:noProof/>
-        </w:rPr>
-        <w:fldChar w:fldCharType="separate"/>
-      </w:r>
-      <w:r>
-        <w:rPr>
-          <w:noProof/>
-        </w:rPr>
-        <w:t>25</w:t>
-      </w:r>
-      <w:r>
-        <w:rPr>
-          <w:noProof/>
-        </w:rPr>
-        <w:fldChar w:fldCharType="end"/>
-      </w:r>
-    </w:p>
-    <w:p>
-      <w:pPr>
-        <w:pStyle w:val="TOC2"/>
-        <w:tabs>
-          <w:tab w:val="right" w:leader="dot" w:pos="9061"/>
-        </w:tabs>
-        <w:rPr>
-          <w:rFonts w:asciiTheme="minorHAnsi" w:eastAsiaTheme="minorEastAsia" w:hAnsiTheme="minorHAnsi" w:cstheme="minorBidi"/>
-          <w:noProof/>
-          <w:kern w:val="2"/>
-          <w:sz w:val="24"/>
-          <w:szCs w:val="24"/>
-          <w14:ligatures w14:val="standardContextual"/>
-        </w:rPr>
-      </w:pPr>
-      <w:r>
-        <w:rPr>
-          <w:noProof/>
-        </w:rPr>
-        <w:t>6. Rủi ro khi trình bày và cách kiểm soát</w:t>
-      </w:r>
-      <w:r>
-        <w:rPr>
-          <w:noProof/>
-        </w:rPr>
-        <w:tab/>
-      </w:r>
-      <w:r>
-        <w:rPr>
-          <w:noProof/>
-        </w:rPr>
-        <w:fldChar w:fldCharType="begin"/>
-      </w:r>
-      <w:r>
-        <w:rPr>
-          <w:noProof/>
-        </w:rPr>
-        <w:instrText xml:space="preserve"> PAGEREF _Toc233552848 \h </w:instrText>
-      </w:r>
-      <w:r>
-        <w:rPr>
-          <w:noProof/>
-        </w:rPr>
-      </w:r>
-      <w:r>
-        <w:rPr>
-          <w:noProof/>
-        </w:rPr>
-        <w:fldChar w:fldCharType="separate"/>
-      </w:r>
-      <w:r>
-        <w:rPr>
-          <w:noProof/>
-        </w:rPr>
-        <w:t>26</w:t>
-      </w:r>
-      <w:r>
-        <w:rPr>
-          <w:noProof/>
-        </w:rPr>
-        <w:fldChar w:fldCharType="end"/>
-      </w:r>
-    </w:p>
-    <w:p>
-      <w:pPr>
-        <w:pStyle w:val="TOC2"/>
-        <w:tabs>
-          <w:tab w:val="right" w:leader="dot" w:pos="9061"/>
-        </w:tabs>
-        <w:rPr>
-          <w:rFonts w:asciiTheme="minorHAnsi" w:eastAsiaTheme="minorEastAsia" w:hAnsiTheme="minorHAnsi" w:cstheme="minorBidi"/>
-          <w:noProof/>
-          <w:kern w:val="2"/>
-          <w:sz w:val="24"/>
-          <w:szCs w:val="24"/>
-          <w14:ligatures w14:val="standardContextual"/>
-        </w:rPr>
-      </w:pPr>
-      <w:r>
-        <w:rPr>
-          <w:noProof/>
-        </w:rPr>
-        <w:t>7. Khuyến nghị hoàn thiện báo cáo và slide</w:t>
-      </w:r>
-      <w:r>
-        <w:rPr>
-          <w:noProof/>
-        </w:rPr>
-        <w:tab/>
-      </w:r>
-      <w:r>
-        <w:rPr>
-          <w:noProof/>
-        </w:rPr>
-        <w:fldChar w:fldCharType="begin"/>
-      </w:r>
-      <w:r>
-        <w:rPr>
-          <w:noProof/>
-        </w:rPr>
-        <w:instrText xml:space="preserve"> PAGEREF _Toc233552849 \h </w:instrText>
-      </w:r>
-      <w:r>
-        <w:rPr>
-          <w:noProof/>
-        </w:rPr>
-      </w:r>
-      <w:r>
-        <w:rPr>
-          <w:noProof/>
-        </w:rPr>
-        <w:fldChar w:fldCharType="separate"/>
-      </w:r>
-      <w:r>
-        <w:rPr>
-          <w:noProof/>
-        </w:rPr>
-        <w:t>27</w:t>
-      </w:r>
-      <w:r>
-        <w:rPr>
-          <w:noProof/>
-        </w:rPr>
-        <w:fldChar w:fldCharType="end"/>
-      </w:r>
-    </w:p>
-    <w:p>
-      <w:pPr>
-        <w:pStyle w:val="TOC1"/>
-        <w:tabs>
-          <w:tab w:val="right" w:leader="dot" w:pos="9061"/>
-        </w:tabs>
-        <w:rPr>
-          <w:rFonts w:asciiTheme="minorHAnsi" w:eastAsiaTheme="minorEastAsia" w:hAnsiTheme="minorHAnsi" w:cstheme="minorBidi"/>
-          <w:noProof/>
-          <w:kern w:val="2"/>
-          <w:sz w:val="24"/>
-          <w:szCs w:val="24"/>
-          <w14:ligatures w14:val="standardContextual"/>
-        </w:rPr>
-      </w:pPr>
-      <w:r>
-        <w:rPr>
-          <w:noProof/>
-        </w:rPr>
-        <w:t>V. Kết luận</w:t>
-      </w:r>
-      <w:r>
-        <w:rPr>
-          <w:noProof/>
-        </w:rPr>
-        <w:tab/>
-      </w:r>
-      <w:r>
-        <w:rPr>
-          <w:noProof/>
-        </w:rPr>
-        <w:fldChar w:fldCharType="begin"/>
-      </w:r>
-      <w:r>
-        <w:rPr>
-          <w:noProof/>
-        </w:rPr>
-        <w:instrText xml:space="preserve"> PAGEREF _Toc233552850 \h </w:instrText>
-      </w:r>
-      <w:r>
-        <w:rPr>
-          <w:noProof/>
-        </w:rPr>
-      </w:r>
-      <w:r>
-        <w:rPr>
-          <w:noProof/>
-        </w:rPr>
-        <w:fldChar w:fldCharType="separate"/>
-      </w:r>
-      <w:r>
-        <w:rPr>
-          <w:noProof/>
-        </w:rPr>
-        <w:t>29</w:t>
-      </w:r>
-      <w:r>
-        <w:rPr>
-          <w:noProof/>
-        </w:rPr>
-        <w:fldChar w:fldCharType="end"/>
-      </w:r>
-    </w:p>
-    <w:p>
-      <w:pPr>
-        <w:pStyle w:val="TOC1"/>
-        <w:tabs>
-          <w:tab w:val="right" w:leader="dot" w:pos="9061"/>
-        </w:tabs>
-        <w:rPr>
-          <w:rFonts w:asciiTheme="minorHAnsi" w:eastAsiaTheme="minorEastAsia" w:hAnsiTheme="minorHAnsi" w:cstheme="minorBidi"/>
-          <w:noProof/>
-          <w:kern w:val="2"/>
-          <w:sz w:val="24"/>
-          <w:szCs w:val="24"/>
-          <w14:ligatures w14:val="standardContextual"/>
-        </w:rPr>
-      </w:pPr>
-      <w:r>
-        <w:rPr>
-          <w:noProof/>
-        </w:rPr>
-        <w:lastRenderedPageBreak/>
-        <w:t>Tài liệu tham khảo</w:t>
-      </w:r>
-      <w:r>
-        <w:rPr>
-          <w:noProof/>
-        </w:rPr>
-        <w:tab/>
-      </w:r>
-      <w:r>
-        <w:rPr>
-          <w:noProof/>
-        </w:rPr>
-        <w:fldChar w:fldCharType="begin"/>
-      </w:r>
-      <w:r>
-        <w:rPr>
-          <w:noProof/>
-        </w:rPr>
-        <w:instrText xml:space="preserve"> PAGEREF _Toc233552851 \h </w:instrText>
+        <w:instrText xml:space="preserve"> PAGEREF _Toc233554426 \h </w:instrText>
       </w:r>
       <w:r>
         <w:rPr>
@@ -2759,7 +2632,7 @@
         <w:lastRenderedPageBreak/>
         <w:fldChar w:fldCharType="end"/>
       </w:r>
-      <w:bookmarkStart w:id="0" w:name="_Toc233552827"/>
+      <w:bookmarkStart w:id="0" w:name="_Toc233554404"/>
       <w:r>
         <w:rPr>
           <w:rFonts w:eastAsia="Times New Roman"/>
@@ -2773,7 +2646,7 @@
         <w:pStyle w:val="Heading2"/>
         <w:spacing w:before="120"/>
       </w:pPr>
-      <w:bookmarkStart w:id="1" w:name="_Toc233552828"/>
+      <w:bookmarkStart w:id="1" w:name="_Toc233554405"/>
       <w:r>
         <w:rPr>
           <w:rFonts w:eastAsia="Times New Roman"/>
@@ -2854,7 +2727,7 @@
         <w:pStyle w:val="Heading2"/>
         <w:spacing w:before="120"/>
       </w:pPr>
-      <w:bookmarkStart w:id="2" w:name="_Toc233552829"/>
+      <w:bookmarkStart w:id="2" w:name="_Toc233554406"/>
       <w:r>
         <w:rPr>
           <w:rFonts w:eastAsia="Times New Roman"/>
@@ -3086,7 +2959,7 @@
         <w:spacing w:before="0"/>
         <w:jc w:val="left"/>
       </w:pPr>
-      <w:bookmarkStart w:id="3" w:name="_Toc233552830"/>
+      <w:bookmarkStart w:id="3" w:name="_Toc233554407"/>
       <w:r>
         <w:rPr>
           <w:rFonts w:eastAsia="Times New Roman"/>
@@ -3119,7 +2992,7 @@
         <w:pStyle w:val="Heading2"/>
         <w:spacing w:before="120"/>
       </w:pPr>
-      <w:bookmarkStart w:id="4" w:name="_Toc233552831"/>
+      <w:bookmarkStart w:id="4" w:name="_Toc233554408"/>
       <w:r>
         <w:rPr>
           <w:rFonts w:eastAsia="Times New Roman"/>
@@ -3278,14 +3151,33 @@
     </w:p>
     <w:p>
       <w:pPr>
+        <w:spacing w:line="300" w:lineRule="auto"/>
+        <w:ind w:firstLine="567"/>
+      </w:pPr>
+      <w:r>
+        <w:t>Khi đọc mã hoặc trình bày demo DFS, nhóm nên chỉ ra rõ cấu trúc dữ liệu đang đại diện cho stack và visited. Nếu dùng đệ quy, call stack của chương trình chính là stack thuật toán; nếu dùng danh sách hoặc deque, thao tác push/pop cần được minh họa trực tiếp. Cách giải thích này giúp người nghe thấy mối liên hệ giữa giả mã và chương trình thật.</w:t>
+      </w:r>
+    </w:p>
+    <w:p>
+      <w:pPr>
+        <w:spacing w:line="300" w:lineRule="auto"/>
+        <w:ind w:firstLine="567"/>
+      </w:pPr>
+      <w:r>
+        <w:t>Một điểm vấn đáp quan trọng là DFS có thể tìm được nghiệm nhưng không đảm bảo nghiệm tốt. Nhóm nên chuẩn bị một ví dụ nhỏ trong đó DFS đi theo thứ tự node kề không thuận lợi và tìm đường dài hơn. Ví dụ này không làm thuật toán xấu đi, mà chứng minh nhóm hiểu đúng giả định và giới hạn của tìm kiếm không thông tin.</w:t>
+      </w:r>
+    </w:p>
+    <w:p>
+      <w:pPr>
         <w:pStyle w:val="Heading2"/>
         <w:spacing w:before="120"/>
       </w:pPr>
-      <w:bookmarkStart w:id="5" w:name="_Toc233552832"/>
+      <w:bookmarkStart w:id="5" w:name="_Toc233554409"/>
       <w:r>
         <w:rPr>
           <w:rFonts w:eastAsia="Times New Roman"/>
         </w:rPr>
+        <w:lastRenderedPageBreak/>
         <w:t>2. Nhóm tìm kiếm có thông tin: A*</w:t>
       </w:r>
       <w:bookmarkEnd w:id="5"/>
@@ -3305,11 +3197,7 @@
         <w:ind w:firstLine="567"/>
       </w:pPr>
       <w:r>
-        <w:t xml:space="preserve">A* kết hợp hai nguồn thông tin: chi phí thật đã đi từ điểm xuất phát đến node hiện tại và chi phí ước lượng từ node hiện tại đến mục tiêu. Thay vì mở rộng node theo thứ tự mù, A* ưu tiên node có tổng chi phí dự kiến thấp nhất. Đây là lý do A* thường </w:t>
-      </w:r>
-      <w:r>
-        <w:lastRenderedPageBreak/>
-        <w:t>được dùng trong các bài toán tìm đường trên bản đồ, game, robot và hệ thống định tuyến.</w:t>
+        <w:t>A* kết hợp hai nguồn thông tin: chi phí thật đã đi từ điểm xuất phát đến node hiện tại và chi phí ước lượng từ node hiện tại đến mục tiêu. Thay vì mở rộng node theo thứ tự mù, A* ưu tiên node có tổng chi phí dự kiến thấp nhất. Đây là lý do A* thường được dùng trong các bài toán tìm đường trên bản đồ, game, robot và hệ thống định tuyến.</w:t>
       </w:r>
     </w:p>
     <w:p>
@@ -3535,6 +3423,7 @@
         <w:ind w:firstLine="567"/>
       </w:pPr>
       <w:r>
+        <w:lastRenderedPageBreak/>
         <w:t>Điểm mạnh của A* là tính thực dụng. Trong demo Find Your Path, A* cho phép hiển thị rõ open set, closed set, đường đi tạm thời và đường đi cuối cùng. Khi thay đổi heuristic, có thể quan sát số node mở rộng thay đổi như thế nào. Đây là minh chứng trực quan cho vai trò của tri thức bổ sung trong tìm kiếm có thông tin.</w:t>
       </w:r>
     </w:p>
@@ -3553,8 +3442,25 @@
         <w:ind w:firstLine="567"/>
       </w:pPr>
       <w:r>
-        <w:lastRenderedPageBreak/>
         <w:t>Khi vấn đáp, có thể giải thích rằng A* trong dự án không chỉ là công thức f(n)=g(n)+h(n). Điều quan trọng là cách hệ thống cập nhật g-score, cách chọn node có f nhỏ nhất, cách lưu parent để dựng route và cách kiểm soát heuristic để không phá vỡ tính tối ưu. Đây là những điểm cho thấy nhóm hiểu thuật toán ở mức triển khai, không chỉ thuộc định nghĩa.</w:t>
+      </w:r>
+    </w:p>
+    <w:p>
+      <w:pPr>
+        <w:spacing w:line="300" w:lineRule="auto"/>
+        <w:ind w:firstLine="567"/>
+      </w:pPr>
+      <w:r>
+        <w:t>Khi triển khai A*, cần kiểm soát ba cấu trúc dữ liệu: priority queue cho open set, bảng chi phí g-score và parent map để dựng lại đường đi. Nếu thiếu parent map, thuật toán có thể biết goal đã được tìm thấy nhưng không thể trả route đầy đủ. Nếu không cập nhật g-score đúng, thuật toán có thể giữ lại một đường đi đắt hơn dù đã phát hiện đường rẻ hơn.</w:t>
+      </w:r>
+    </w:p>
+    <w:p>
+      <w:pPr>
+        <w:spacing w:line="300" w:lineRule="auto"/>
+        <w:ind w:firstLine="567"/>
+      </w:pPr>
+      <w:r>
+        <w:t>Trong vấn đáp, A* thường bị hỏi về điều kiện admissible và consistent của heuristic. Nhóm nên trả lời rằng admissible bảo đảm heuristic không đánh giá quá cao chi phí thật còn lại, từ đó giữ tính tối ưu. Consistent mạnh hơn, giúp quá trình đóng node ổn định hơn. Đây là điểm phân biệt người hiểu công thức với người chỉ nhớ f(n)=g(n)+h(n).</w:t>
       </w:r>
     </w:p>
     <w:p>
@@ -3562,7 +3468,7 @@
         <w:pStyle w:val="Heading2"/>
         <w:spacing w:before="120"/>
       </w:pPr>
-      <w:bookmarkStart w:id="6" w:name="_Toc233552833"/>
+      <w:bookmarkStart w:id="6" w:name="_Toc233554410"/>
       <w:r>
         <w:rPr>
           <w:rFonts w:eastAsia="Times New Roman"/>
@@ -3595,6 +3501,7 @@
         <w:ind w:firstLine="567"/>
       </w:pPr>
       <w:r>
+        <w:lastRenderedPageBreak/>
         <w:t>Trong Find Your Path, một cấu hình có thể là thứ tự các điểm giao, thứ tự nhận đơn hoặc một route ứng viên qua nhiều node quan trọng. Neighbor có thể được tạo bằng cách hoán đổi hai điểm giao, đảo một đoạn route, thay một node trung gian hoặc chọn lại thứ tự phục vụ gần nhất. Nếu neighbor làm giảm hàm chi phí, thuật toán chấp nhận neighbor và tiếp tục từ đó.</w:t>
       </w:r>
     </w:p>
@@ -3756,11 +3663,7 @@
         <w:ind w:firstLine="567"/>
       </w:pPr>
       <w:r>
-        <w:t xml:space="preserve">Nhược điểm lớn nhất của Simple Hill Climbing là dễ kẹt ở local optimum. Nếu mọi neighbor trực tiếp đều không tốt hơn trạng thái hiện tại, thuật toán dừng, dù có thể </w:t>
-      </w:r>
-      <w:r>
-        <w:lastRenderedPageBreak/>
-        <w:t>tồn tại lời giải tốt hơn ở xa hơn. Thuật toán cũng có thể gặp plateau, nơi nhiều trạng thái có cùng giá trị, hoặc ridge, nơi cần đi tạm qua bước không cải thiện để đến vùng tốt hơn. Vì báo cáo chọn Simple Hill Climbing, cần nói rõ đây là phiên bản đơn giản, không phải biến thể có sideways move hay simulated annealing.</w:t>
+        <w:t>Nhược điểm lớn nhất của Simple Hill Climbing là dễ kẹt ở local optimum. Nếu mọi neighbor trực tiếp đều không tốt hơn trạng thái hiện tại, thuật toán dừng, dù có thể tồn tại lời giải tốt hơn ở xa hơn. Thuật toán cũng có thể gặp plateau, nơi nhiều trạng thái có cùng giá trị, hoặc ridge, nơi cần đi tạm qua bước không cải thiện để đến vùng tốt hơn. Vì báo cáo chọn Simple Hill Climbing, cần nói rõ đây là phiên bản đơn giản, không phải biến thể có sideways move hay simulated annealing.</w:t>
       </w:r>
     </w:p>
     <w:p>
@@ -3834,7 +3737,29 @@
         <w:ind w:firstLine="567"/>
       </w:pPr>
       <w:r>
-        <w:t>Khi vấn đáp, có thể nhấn mạnh rằng Simple Hill Climbing đại diện cho nhóm local search vì nó không xây dựng cây tìm kiếm đầy đủ. Nó chỉ quan tâm trạng thái hiện tại và neighbor. Chính sự đơn giản đó vừa là ưu điểm vừa là hạn chế: nhanh và dễ hiểu, nhưng không đủ mạnh trước không gian có nhiều cực trị cục bộ.</w:t>
+        <w:t xml:space="preserve">Khi vấn đáp, có thể nhấn mạnh rằng Simple Hill Climbing đại diện cho nhóm local search vì nó không xây dựng cây tìm kiếm đầy đủ. Nó chỉ quan tâm trạng thái </w:t>
+      </w:r>
+      <w:r>
+        <w:lastRenderedPageBreak/>
+        <w:t>hiện tại và neighbor. Chính sự đơn giản đó vừa là ưu điểm vừa là hạn chế: nhanh và dễ hiểu, nhưng không đủ mạnh trước không gian có nhiều cực trị cục bộ.</w:t>
+      </w:r>
+    </w:p>
+    <w:p>
+      <w:pPr>
+        <w:spacing w:line="300" w:lineRule="auto"/>
+        <w:ind w:firstLine="567"/>
+      </w:pPr>
+      <w:r>
+        <w:t>Ở Simple Hill Climbing, phần khó không nằm ở vòng lặp mà nằm ở cách định nghĩa neighbor và cost. Nếu neighbor chỉ thay đổi rất ít, thuật toán có thể cải thiện chậm hoặc kẹt sớm. Nếu neighbor quá rộng, mỗi vòng đánh giá tốn nhiều thời gian. Vì vậy, báo cáo cần xem neighborhood như một quyết định thiết kế chứ không phải chi tiết phụ.</w:t>
+      </w:r>
+    </w:p>
+    <w:p>
+      <w:pPr>
+        <w:spacing w:line="300" w:lineRule="auto"/>
+        <w:ind w:firstLine="567"/>
+      </w:pPr>
+      <w:r>
+        <w:t>Khi liên hệ với Find Your Path, Simple Hill Climbing phù hợp nhất ở tầng cải thiện route ứng viên. Nó không nên được dùng để chứng minh đường đi giữa hai node là tối ưu. Nếu nhóm nói rõ vai trò này, thuật toán sẽ được đặt đúng chỗ: A* xử lý path giữa hai điểm, còn Hill Climbing xử lý cấu hình hoặc thứ tự ở mức cao hơn.</w:t>
       </w:r>
     </w:p>
     <w:p>
@@ -3842,7 +3767,7 @@
         <w:pStyle w:val="Heading2"/>
         <w:spacing w:before="120"/>
       </w:pPr>
-      <w:bookmarkStart w:id="7" w:name="_Toc233552834"/>
+      <w:bookmarkStart w:id="7" w:name="_Toc233554411"/>
       <w:r>
         <w:rPr>
           <w:rFonts w:eastAsia="Times New Roman"/>
@@ -3889,7 +3814,6 @@
             <w:rPr>
               <w:rFonts w:ascii="Cambria Math" w:hAnsi="Cambria Math"/>
             </w:rPr>
-            <w:lastRenderedPageBreak/>
             <m:t>Result(s,a)={</m:t>
           </m:r>
           <m:sSub>
@@ -4072,7 +3996,11 @@
         <w:ind w:firstLine="567"/>
       </w:pPr>
       <w:r>
-        <w:t>Trong Find Your Path, AND-OR Search có thể mô hình hóa tình huống một đoạn đường có thể thông hoặc bị chặn, một chi phí cạnh có thể giữ nguyên hoặc tăng cao, hoặc một điểm giao có thể khả dụng hoặc không khả dụng. Nếu chỉ dùng A*, hệ thống thường tạo một route dựa trên trạng thái hiện biết. Nếu dùng AND-OR Search, hệ thống có thể tạo conditional plan: nếu đoạn đường mở thì tiếp tục route A, nếu đoạn đường bị chặn thì chuyển sang route B.</w:t>
+        <w:t xml:space="preserve">Trong Find Your Path, AND-OR Search có thể mô hình hóa tình huống một đoạn đường có thể thông hoặc bị chặn, một chi phí cạnh có thể giữ nguyên hoặc tăng cao, hoặc một điểm giao có thể khả dụng hoặc không khả dụng. Nếu chỉ dùng A*, hệ thống thường tạo một route dựa trên trạng thái hiện biết. Nếu dùng AND-OR Search, hệ </w:t>
+      </w:r>
+      <w:r>
+        <w:lastRenderedPageBreak/>
+        <w:t>thống có thể tạo conditional plan: nếu đoạn đường mở thì tiếp tục route A, nếu đoạn đường bị chặn thì chuyển sang route B.</w:t>
       </w:r>
     </w:p>
     <w:p>
@@ -4117,11 +4045,26 @@
         <w:ind w:firstLine="567"/>
       </w:pPr>
       <w:r>
-        <w:t xml:space="preserve">Khi vấn đáp, câu trả lời quan trọng là: AND-OR Search không chỉ tìm một đường đi từ start đến goal, mà tìm một kế hoạch có điều kiện. Đây là khác biệt bản chất so với DFS, A* hay Simple Hill Climbing. Nếu môi trường deterministic, path </w:t>
-      </w:r>
+        <w:t>Khi vấn đáp, câu trả lời quan trọng là: AND-OR Search không chỉ tìm một đường đi từ start đến goal, mà tìm một kế hoạch có điều kiện. Đây là khác biệt bản chất so với DFS, A* hay Simple Hill Climbing. Nếu môi trường deterministic, path đơn có thể đủ; nếu môi trường nondeterministic, conditional plan mới phản ánh đúng yêu cầu của agent.</w:t>
+      </w:r>
+    </w:p>
+    <w:p>
+      <w:pPr>
+        <w:spacing w:line="300" w:lineRule="auto"/>
+        <w:ind w:firstLine="567"/>
+      </w:pPr>
+      <w:r>
+        <w:t>Đối với AND-OR Search, điểm cần chuẩn bị kỹ là cách định nghĩa outcome. Nếu outcome chỉ được nói chung chung là môi trường thay đổi, phần trình bày sẽ yếu. Nhóm nên nêu outcome cụ thể như edge open, edge blocked, cost normal hoặc cost increased. Từ các outcome đó, conditional plan mới có ý nghĩa rõ ràng.</w:t>
+      </w:r>
+    </w:p>
+    <w:p>
+      <w:pPr>
+        <w:spacing w:line="300" w:lineRule="auto"/>
+        <w:ind w:firstLine="567"/>
+      </w:pPr>
       <w:r>
         <w:lastRenderedPageBreak/>
-        <w:t>đơn có thể đủ; nếu môi trường nondeterministic, conditional plan mới phản ánh đúng yêu cầu của agent.</w:t>
+        <w:t>Khi trình bày thuật toán này, nhóm nên nhấn mạnh rằng AND-OR Search không phải chạy lại A* sau khi sự cố xảy ra. Nó lập kế hoạch có điều kiện trước các kết quả có thể xảy ra. Sự khác nhau này giúp bảo vệ lựa chọn AND-OR Search trong nhóm môi trường phức tạp và tránh nhầm với online re-planning.</w:t>
       </w:r>
     </w:p>
     <w:p>
@@ -4129,7 +4072,7 @@
         <w:pStyle w:val="Heading2"/>
         <w:spacing w:before="120"/>
       </w:pPr>
-      <w:bookmarkStart w:id="8" w:name="_Toc233552835"/>
+      <w:bookmarkStart w:id="8" w:name="_Toc233554412"/>
       <w:r>
         <w:rPr>
           <w:rFonts w:eastAsia="Times New Roman"/>
@@ -4323,11 +4266,11 @@
         <w:ind w:firstLine="567"/>
       </w:pPr>
       <w:r>
-        <w:t xml:space="preserve">Về tính đầy đủ, Forward Checking đầy đủ với CSP hữu hạn vì thuật toán chỉ loại các giá trị chắc chắn vi phạm ràng buộc. Nếu có nghiệm, nó không loại bỏ nghiệm hợp lệ. Về tối ưu, Forward Checking không tự tối ưu chi phí nếu không có hàm mục tiêu bổ sung; nó chủ yếu trả lời câu hỏi liệu có phép gán hợp lệ hay không. Về thời gian, </w:t>
+        <w:t xml:space="preserve">Về tính đầy đủ, Forward Checking đầy đủ với CSP hữu hạn vì thuật toán chỉ loại các giá trị chắc chắn vi phạm ràng buộc. Nếu có nghiệm, nó không loại bỏ nghiệm hợp </w:t>
       </w:r>
       <w:r>
         <w:lastRenderedPageBreak/>
-        <w:t>trường hợp xấu vẫn có thể là O(d_c^n), vì vẫn có thể phải xét tổ hợp lớn. Về không gian, thuật toán cần lưu domain hiện tại và các thay đổi để phục hồi khi quay lui.</w:t>
+        <w:t>lệ. Về tối ưu, Forward Checking không tự tối ưu chi phí nếu không có hàm mục tiêu bổ sung; nó chủ yếu trả lời câu hỏi liệu có phép gán hợp lệ hay không. Về thời gian, trường hợp xấu vẫn có thể là O(d_c^n), vì vẫn có thể phải xét tổ hợp lớn. Về không gian, thuật toán cần lưu domain hiện tại và các thay đổi để phục hồi khi quay lui.</w:t>
       </w:r>
     </w:p>
     <w:p>
@@ -4359,10 +4302,28 @@
     </w:p>
     <w:p>
       <w:pPr>
+        <w:spacing w:line="300" w:lineRule="auto"/>
+        <w:ind w:firstLine="567"/>
+      </w:pPr>
+      <w:r>
+        <w:t>Forward Checking cần được giải thích bằng ngôn ngữ biến, domain và ràng buộc. Trong chương trình, biến có thể là đơn hàng, vị trí trong route hoặc shipper được gán. Domain là tập lựa chọn còn khả thi. Ràng buộc là deadline, capacity hoặc thứ tự pickup/dropoff. Khi ba thành phần này rõ ràng, thuật toán sẽ không bị nhầm với tìm kiếm trên graph.</w:t>
+      </w:r>
+    </w:p>
+    <w:p>
+      <w:pPr>
+        <w:spacing w:line="300" w:lineRule="auto"/>
+        <w:ind w:firstLine="567"/>
+      </w:pPr>
+      <w:r>
+        <w:t>Khi vấn đáp, nhóm nên nói rằng Forward Checking không tạo route tối ưu một mình. Nó loại các giá trị chắc chắn sai để giảm không gian tìm kiếm. Nếu cần tối ưu chi phí, phải kết hợp thêm hàm mục tiêu hoặc thuật toán khác. Câu trả lời này giúp thể hiện nhóm hiểu đúng vai trò của CSP trong bài toán Find Your Path.</w:t>
+      </w:r>
+    </w:p>
+    <w:p>
+      <w:pPr>
         <w:pStyle w:val="Heading2"/>
         <w:spacing w:before="120"/>
       </w:pPr>
-      <w:bookmarkStart w:id="9" w:name="_Toc233552836"/>
+      <w:bookmarkStart w:id="9" w:name="_Toc233554413"/>
       <w:r>
         <w:rPr>
           <w:rFonts w:eastAsia="Times New Roman"/>
@@ -4386,6 +4347,7 @@
         <w:ind w:firstLine="567"/>
       </w:pPr>
       <w:r>
+        <w:lastRenderedPageBreak/>
         <w:t>Alpha-Beta Pruning được xây dựng trên nền Minimax. Trong cây quyết định, MAX là tác tử muốn tối đa hóa utility, còn MIN là tác tử hoặc yếu tố môi trường muốn làm giảm utility. Nếu xét bài toán Find Your Path theo nghĩa đối kháng, MAX có thể là hệ thống chọn route, còn MIN là kịch bản bất lợi như tắc đường, tăng chi phí hoặc chặn cạnh.</w:t>
       </w:r>
     </w:p>
@@ -4420,7 +4382,6 @@
         <w:ind w:firstLine="567"/>
       </w:pPr>
       <w:r>
-        <w:lastRenderedPageBreak/>
         <w:t>Alpha là giá trị tốt nhất mà MAX đã bảo đảm được trên đường đi hiện tại. Beta là giá trị tốt nhất mà MIN đã bảo đảm được. Khi alpha lớn hơn hoặc bằng beta, nhánh còn lại không thể làm thay đổi lựa chọn cuối cùng, nên có thể bỏ qua. Ý tưởng này giúp giảm số trạng thái cần đánh giá mà vẫn giữ nguyên kết quả.</w:t>
       </w:r>
     </w:p>
@@ -4560,7 +4521,11 @@
         <w:ind w:firstLine="567"/>
       </w:pPr>
       <w:r>
-        <w:t>Điểm mạnh của Alpha-Beta là hiệu quả tính toán. Nó cho phép mô hình đối kháng có thể mở rộng hơn Minimax thuần. Điểm yếu là hiệu quả cắt tỉa phụ thuộc vào thứ tự xét nhánh. Nếu xét nhánh tốt trước, alpha và beta được cập nhật sớm, nhiều nhánh bị cắt. Nếu xét nhánh xấu trước, thuật toán gần giống Minimax về số node cần duyệt.</w:t>
+        <w:t xml:space="preserve">Điểm mạnh của Alpha-Beta là hiệu quả tính toán. Nó cho phép mô hình đối kháng có thể mở rộng hơn Minimax thuần. Điểm yếu là hiệu quả cắt tỉa phụ thuộc vào thứ tự xét nhánh. Nếu xét nhánh tốt trước, alpha và beta được cập nhật sớm, nhiều </w:t>
+      </w:r>
+      <w:r>
+        <w:lastRenderedPageBreak/>
+        <w:t>nhánh bị cắt. Nếu xét nhánh xấu trước, thuật toán gần giống Minimax về số node cần duyệt.</w:t>
       </w:r>
     </w:p>
     <w:p>
@@ -4579,6 +4544,24 @@
       </w:pPr>
       <w:r>
         <w:t>Kết thúc phần thuật toán, có thể thấy sáu thuật toán không cạnh tranh trực tiếp với nhau. DFS minh họa tìm kiếm mù, A* giải bài toán tìm đường có heuristic, Simple Hill Climbing cải thiện cấu hình, AND-OR Search xử lý outcome bất định, Forward Checking kiểm tra ràng buộc và Alpha-Beta phân tích tình huống đối kháng. Mỗi thuật toán trả lời một câu hỏi khác nhau trong cùng miền bài toán Find Your Path.</w:t>
+      </w:r>
+    </w:p>
+    <w:p>
+      <w:pPr>
+        <w:spacing w:line="300" w:lineRule="auto"/>
+        <w:ind w:firstLine="567"/>
+      </w:pPr>
+      <w:r>
+        <w:t>Với Alpha-Beta Pruning, điều quan trọng là xác định utility trước khi dựng cây. Nếu utility chỉ là khoảng cách, thuật toán sẽ ưu tiên route ngắn; nếu utility gồm thêm risk penalty, thuật toán sẽ cân nhắc rủi ro. Do đó, chất lượng mô hình đối kháng phụ thuộc vào hàm utility chứ không chỉ vào kỹ thuật cắt tỉa.</w:t>
+      </w:r>
+    </w:p>
+    <w:p>
+      <w:pPr>
+        <w:spacing w:line="300" w:lineRule="auto"/>
+        <w:ind w:firstLine="567"/>
+      </w:pPr>
+      <w:r>
+        <w:t>Khi giải thích alpha và beta, nhóm nên dùng trực giác trước rồi mới dùng ký hiệu. Alpha là mức tốt nhất hiện tại của MAX; beta là mức tốt nhất hiện tại của MIN. Khi hai ngưỡng giao nhau, nhánh còn lại không thể thay đổi quyết định nên bị cắt. Cách giải thích này dễ hiểu hơn việc chỉ đọc công thức prune if alpha &gt;= beta.</w:t>
       </w:r>
     </w:p>
     <w:p>
@@ -4588,7 +4571,7 @@
         <w:spacing w:before="0"/>
         <w:jc w:val="left"/>
       </w:pPr>
-      <w:bookmarkStart w:id="10" w:name="_Toc233552837"/>
+      <w:bookmarkStart w:id="10" w:name="_Toc233554414"/>
       <w:r>
         <w:rPr>
           <w:rFonts w:eastAsia="Times New Roman"/>
@@ -4600,15 +4583,33 @@
     </w:p>
     <w:p>
       <w:pPr>
+        <w:spacing w:before="0" w:line="300" w:lineRule="auto"/>
+        <w:ind w:firstLine="567"/>
+      </w:pPr>
+      <w:r>
+        <w:t>Phần thực nghiệm và kết quả được tổ chức như khu vực đặt minh họa trực quan cho từng thuật toán. Mục tiêu của phần này không chỉ là báo rằng thuật toán chạy được, mà phải cho thấy thuật toán mở rộng trạng thái, cập nhật giá trị, cắt nhánh hoặc thu hẹp miền giá trị như thế nào. Vì vậy, mỗi thuật toán cần có ảnh động, video ngắn hoặc chuỗi ảnh tĩnh thể hiện quá trình thực thi.</w:t>
+      </w:r>
+    </w:p>
+    <w:p>
+      <w:pPr>
+        <w:spacing w:before="0" w:line="300" w:lineRule="auto"/>
+        <w:ind w:firstLine="567"/>
+      </w:pPr>
+      <w:r>
+        <w:t>Khi chèn GIF hoặc video vào báo cáo và slide, nhóm nên giữ cùng một quy ước màu sắc. Node đang xét có thể dùng màu nổi, node đã duyệt dùng màu nhạt, đường đi cuối cùng dùng màu đậm, còn nhánh bị loại hoặc domain bị xóa nên có ký hiệu riêng. Cách này giúp người đọc nhìn vào hình là hiểu thuật toán đang làm gì.</w:t>
+      </w:r>
+    </w:p>
+    <w:p>
+      <w:pPr>
         <w:pStyle w:val="Heading2"/>
         <w:spacing w:before="120"/>
       </w:pPr>
-      <w:bookmarkStart w:id="11" w:name="_Toc233552838"/>
+      <w:bookmarkStart w:id="11" w:name="_Toc233554415"/>
       <w:r>
         <w:rPr>
           <w:rFonts w:eastAsia="Times New Roman"/>
         </w:rPr>
-        <w:t>1. Thiết kế kịch bản thực nghiệm</w:t>
+        <w:t>1. Nhóm tìm kiếm không thông tin: DFS</w:t>
       </w:r>
       <w:bookmarkEnd w:id="11"/>
     </w:p>
@@ -4618,7 +4619,7 @@
         <w:ind w:firstLine="567"/>
       </w:pPr>
       <w:r>
-        <w:t>Phần thực nghiệm cần chứng minh các thuật toán hoạt động đúng trên các kịch bản có kiểm soát. Thay vì chỉ chụp màn hình kết quả cuối cùng, nhóm nên trình bày quá trình thuật toán ra quyết định. Với mỗi thuật toán, cần có trạng thái bắt đầu, trạng thái mục tiêu, các bước trung gian và kết quả sau cùng.</w:t>
+        <w:t>Kịch bản thực nghiệm của DFS nên dùng một graph nhỏ có ít nhất một nhánh cụt và một đường đi hợp lệ đến mục tiêu. Trạng thái bắt đầu là node xuất phát; trạng thái mục tiêu là node đích. Khi chạy thuật toán, chương trình cần ghi lại stack, tập visited và parent map ở từng bước quan trọng.</w:t>
       </w:r>
     </w:p>
     <w:p>
@@ -4627,7 +4628,7 @@
         <w:ind w:firstLine="567"/>
       </w:pPr>
       <w:r>
-        <w:t>Đối với DFS, kịch bản nên dùng graph nhỏ có ít nhất một nhánh cụt để thể hiện rõ quá trình đi sâu và quay lui. Kết quả cần ghi thứ tự node được duyệt, stack tại một số thời điểm quan trọng và đường đi cuối cùng nếu tìm thấy goal. Nếu đường đi không ngắn nhất, đó là minh chứng tốt cho hạn chế của DFS.</w:t>
+        <w:t>Ảnh động cho DFS nên thể hiện rõ tính chất đi sâu. Khi thuật toán chọn một node kề, mũi tên hoặc màu sắc cần chuyển sang node đó trước khi xét các nhánh cùng cấp. Khi gặp ngõ cụt, hình minh họa cần thể hiện thao tác quay lui. Đây là điểm trực quan nhất để phân biệt DFS với các thuật toán mở rộng theo lớp.</w:t>
       </w:r>
     </w:p>
     <w:p>
@@ -4636,7 +4637,7 @@
         <w:ind w:firstLine="567"/>
       </w:pPr>
       <w:r>
-        <w:t>Đối với A*, kịch bản nên dùng graph có tọa độ hoặc trọng số rõ ràng. Cần hiển thị g-score, h-score và f-score của các node đang xét. Kết quả nên ghi tổng chi phí route, số node đã mở rộng và đường đi cuối cùng. Nếu có thể, nhóm nên so sánh A* với DFS ở mức số node duyệt, nhưng không biến báo cáo thành bảng so sánh máy móc.</w:t>
+        <w:t>Kết quả cần mô tả thứ tự node được duyệt, đường đi tìm được và trường hợp đường đi đó không phải đường đi ngắn nhất. Nếu graph có trọng số, cần ghi chú rằng DFS không dùng trọng số để quyết định. Điều này giúp phần thực nghiệm liên hệ trực tiếp với phần lý thuyết về tính không tối ưu của DFS.</w:t>
       </w:r>
     </w:p>
     <w:p>
@@ -4645,8 +4646,106 @@
         <w:ind w:firstLine="567"/>
       </w:pPr>
       <w:r>
-        <w:t>Đối với Simple Hill Climbing, kịch bản nên bắt đầu bằng một route chưa tốt và cho thấy route được cải thiện qua từng vòng. Mỗi vòng cần nêu neighbor được chọn, cost trước và sau khi cập nhật. Nếu thuật toán dừng ở local optimum, phần thực nghiệm nên ghi nhận trung thực thay vì cố trình bày như luôn tìm lời giải tối ưu.</w:t>
-      </w:r>
+        <w:t>Số liệu nên ghi nhận gồm số node đã thăm, độ sâu lớn nhất đã đi tới, số lần quay lui và tổng số bước mở rộng. Các số liệu này không cần quá phức tạp, nhưng đủ để chứng minh thuật toán đã chạy theo đúng cơ chế stack hoặc đệ quy.</w:t>
+      </w:r>
+    </w:p>
+    <w:p>
+      <w:pPr>
+        <w:spacing w:before="60"/>
+        <w:jc w:val="center"/>
+      </w:pPr>
+      <w:r>
+        <w:rPr>
+          <w:i/>
+        </w:rPr>
+        <w:t>Hình 3.1. Vị trí chèn GIF DFS: thuật toán đi sâu theo một nhánh, đánh dấu visited và quay lui khi gặp nhánh cụt.</w:t>
+      </w:r>
+    </w:p>
+    <w:p>
+      <w:pPr>
+        <w:spacing w:before="60"/>
+        <w:jc w:val="center"/>
+      </w:pPr>
+      <w:r>
+        <w:rPr>
+          <w:i/>
+        </w:rPr>
+        <w:t>Video 3.1. Vị trí chèn video DFS: hiển thị stack, parent map và đường đi cuối cùng từ start đến goal.</w:t>
+      </w:r>
+    </w:p>
+    <w:p>
+      <w:pPr>
+        <w:spacing w:line="300" w:lineRule="auto"/>
+        <w:ind w:firstLine="567"/>
+      </w:pPr>
+      <w:r>
+        <w:t xml:space="preserve">Để phần minh họa DFS rõ hơn, chuỗi ảnh nên được chia thành bốn trạng thái: trạng thái khởi tạo, trạng thái đi sâu, trạng thái quay lui và trạng thái tìm thấy goal. Ở </w:t>
+      </w:r>
+      <w:r>
+        <w:lastRenderedPageBreak/>
+        <w:t>trạng thái khởi tạo, hình cần đánh dấu start, goal và stack ban đầu. Ở trạng thái đi sâu, hình cần làm nổi bật node đang xét và cạnh vừa được chọn.</w:t>
+      </w:r>
+    </w:p>
+    <w:p>
+      <w:pPr>
+        <w:spacing w:line="300" w:lineRule="auto"/>
+        <w:ind w:firstLine="567"/>
+      </w:pPr>
+      <w:r>
+        <w:t>Trong video DFS, mỗi bước pop hoặc push stack nên được hiển thị bằng nhãn ngắn. Khi node được đưa vào visited, màu của node nên đổi để người xem nhận ra thuật toán sẽ không xét lại node đó. Nếu graph có chu trình, phần visited càng quan trọng vì nó chứng minh thuật toán không bị lặp vô hạn.</w:t>
+      </w:r>
+    </w:p>
+    <w:p>
+      <w:pPr>
+        <w:spacing w:line="300" w:lineRule="auto"/>
+        <w:ind w:firstLine="567"/>
+      </w:pPr>
+      <w:r>
+        <w:t>Khi DFS quay lui, hình cần thể hiện rằng thuật toán không thất bại toàn bộ, mà chỉ kết thúc một nhánh và quay về node trước đó để thử hướng khác. Đây là điểm nên nói trong chú thích: backtracking trong DFS là kết quả tự nhiên của chiến lược đi sâu, không phải lỗi của chương trình.</w:t>
+      </w:r>
+    </w:p>
+    <w:p>
+      <w:pPr>
+        <w:spacing w:line="300" w:lineRule="auto"/>
+        <w:ind w:firstLine="567"/>
+      </w:pPr>
+      <w:r>
+        <w:t>Kết quả sau cùng của DFS nên có một đoạn nhận xét ngắn ngay dưới hình. Đoạn này cần nêu đường đi tìm được, số node đã thăm, độ sâu lớn nhất và lý do đường đi không nhất thiết tối ưu. Nhận xét này giúp hình minh họa gắn lại với bốn tính chất đã phân tích ở phần II.</w:t>
+      </w:r>
+    </w:p>
+    <w:p>
+      <w:pPr>
+        <w:spacing w:line="300" w:lineRule="auto"/>
+        <w:ind w:firstLine="567"/>
+      </w:pPr>
+      <w:r>
+        <w:t>Nếu nhóm muốn đặt video trên GitHub, nên đặt tên file theo cấu trúc dfs_trace.gif hoặc dfs_trace.mp4. Trong báo cáo Word, chỉ cần chèn ảnh tĩnh đại diện kèm chú thích và ghi rõ video đầy đủ nằm trong repository. Cách này tránh làm file Word quá nặng nhưng vẫn đáp ứng yêu cầu có ảnh động hoặc video.</w:t>
+      </w:r>
+    </w:p>
+    <w:p>
+      <w:pPr>
+        <w:jc w:val="center"/>
+      </w:pPr>
+      <w:r>
+        <w:rPr>
+          <w:i/>
+        </w:rPr>
+        <w:t>Hình 3.1a. Chuỗi ảnh đề xuất cho DFS: khởi tạo stack, đi sâu, quay lui và truy vết đường đi cuối cùng.</w:t>
+      </w:r>
+    </w:p>
+    <w:p>
+      <w:pPr>
+        <w:pStyle w:val="Heading2"/>
+        <w:spacing w:before="120"/>
+      </w:pPr>
+      <w:bookmarkStart w:id="12" w:name="_Toc233554416"/>
+      <w:r>
+        <w:rPr>
+          <w:rFonts w:eastAsia="Times New Roman"/>
+        </w:rPr>
+        <w:t>2. Nhóm tìm kiếm có thông tin: A*</w:t>
+      </w:r>
+      <w:bookmarkEnd w:id="12"/>
     </w:p>
     <w:p>
       <w:pPr>
@@ -4654,7 +4753,7 @@
         <w:ind w:firstLine="567"/>
       </w:pPr>
       <w:r>
-        <w:t>Đối với AND-OR Search, kịch bản nên có ít nhất một hành động với hai outcome. Ví dụ, một cạnh có thể thông hoặc bị chặn. Kết quả không phải một path đơn, mà là conditional plan gồm các nhánh nếu outcome này xảy ra thì làm gì, nếu outcome kia xảy ra thì làm gì. Đây là điểm quan trọng để phân biệt với A*.</w:t>
+        <w:t>Kịch bản thực nghiệm của A* nên dùng bản đồ hoặc graph có tọa độ để heuristic có ý nghĩa. Trạng thái bắt đầu gồm node xuất phát, open set, closed set, g-score và parent map. Trạng thái mục tiêu đạt được khi node đích được lấy ra khỏi open set với giá trị f(n) phù hợp.</w:t>
       </w:r>
     </w:p>
     <w:p>
@@ -4663,7 +4762,7 @@
         <w:ind w:firstLine="567"/>
       </w:pPr>
       <w:r>
-        <w:t>Đối với Forward Checking, kịch bản nên có vài biến đơn hàng và ràng buộc deadline hoặc capacity. Nhóm cần hiển thị domain ban đầu, phép gán được thử, domain sau khi loại giá trị và thời điểm thuật toán quay lui do domain rỗng. Cách trình bày này cho thấy thuật toán cắt bớt không gian tìm kiếm như thế nào.</w:t>
+        <w:t>Trong ảnh động, mỗi node nên hiển thị hoặc gắn nhãn g(n), h(n) và f(n). Open set có thể dùng một màu riêng, closed set dùng màu khác. Khi thuật toán cập nhật được đường rẻ hơn đến một node, hình cần thể hiện parent thay đổi hoặc chi phí mới được ghi đè.</w:t>
       </w:r>
     </w:p>
     <w:p>
@@ -4672,7 +4771,106 @@
         <w:ind w:firstLine="567"/>
       </w:pPr>
       <w:r>
-        <w:t>Đối với Alpha-Beta Pruning, kịch bản nên dùng cây quyết định nhỏ có giá trị utility ở lá. Thực nghiệm cần thể hiện quá trình cập nhật alpha, beta và các nhánh bị cắt. Nếu có animation, nên dùng màu khác nhau cho node đã duyệt, node đang xét và node bị cắt.</w:t>
+        <w:t>Kết quả cần nêu đường đi cuối cùng, tổng chi phí route, số node mở rộng và nhận xét về heuristic. Nếu heuristic là khoảng cách Euclid hoặc Manhattan, báo cáo cần nói rõ vì sao heuristic đó phù hợp với bản đồ đang dùng. Nếu graph không phải lưới chuẩn, cần giải thích cách ước lượng h(n).</w:t>
+      </w:r>
+    </w:p>
+    <w:p>
+      <w:pPr>
+        <w:spacing w:before="0" w:line="300" w:lineRule="auto"/>
+        <w:ind w:firstLine="567"/>
+      </w:pPr>
+      <w:r>
+        <w:lastRenderedPageBreak/>
+        <w:t>A* là thuật toán có liên hệ mạnh nhất với Find Your Path, nên phần thực nghiệm của A* cần được đầu tư hơn các thuật toán khác. Đây là phần người xem dễ nhận ra ứng dụng thực tế nhất: từ vị trí shipper đến điểm giao hàng, thuật toán từng bước chọn node có f(n) nhỏ nhất để dựng route.</w:t>
+      </w:r>
+    </w:p>
+    <w:p>
+      <w:pPr>
+        <w:spacing w:before="0" w:line="300" w:lineRule="auto"/>
+        <w:ind w:firstLine="567"/>
+      </w:pPr>
+      <w:r>
+        <w:t>Nếu có thể, nhóm nên bổ sung một ảnh so sánh giữa route được A* tìm thấy và quá trình mở rộng node. Không nên chỉ chèn ảnh đường đi cuối cùng, vì như vậy người đọc không thấy vai trò của heuristic và priority queue.</w:t>
+      </w:r>
+    </w:p>
+    <w:p>
+      <w:pPr>
+        <w:spacing w:before="60"/>
+        <w:jc w:val="center"/>
+      </w:pPr>
+      <w:r>
+        <w:rPr>
+          <w:i/>
+        </w:rPr>
+        <w:t>Hình 3.2. Vị trí chèn GIF A*: open set, closed set, g-score, h-score và f-score thay đổi theo từng bước.</w:t>
+      </w:r>
+    </w:p>
+    <w:p>
+      <w:pPr>
+        <w:spacing w:before="60"/>
+        <w:jc w:val="center"/>
+      </w:pPr>
+      <w:r>
+        <w:rPr>
+          <w:i/>
+        </w:rPr>
+        <w:t>Video 3.2. Vị trí chèn video A*: truy vết parent map để tạo đường đi cuối cùng sau khi tìm thấy goal.</w:t>
+      </w:r>
+    </w:p>
+    <w:p>
+      <w:pPr>
+        <w:spacing w:line="300" w:lineRule="auto"/>
+        <w:ind w:firstLine="567"/>
+      </w:pPr>
+      <w:r>
+        <w:t>Đối với A*, chuỗi ảnh nên bắt đầu bằng bản đồ hoặc graph có trọng số và tọa độ. Hình đầu tiên cần ghi rõ start, goal, heuristic được dùng và trạng thái open set ban đầu. Nếu chỉ hiển thị đường đi cuối cùng, người đọc sẽ không thấy được lý do A* khác DFS.</w:t>
+      </w:r>
+    </w:p>
+    <w:p>
+      <w:pPr>
+        <w:spacing w:line="300" w:lineRule="auto"/>
+        <w:ind w:firstLine="567"/>
+      </w:pPr>
+      <w:r>
+        <w:t>Trong từng frame của GIF A*, node có f(n) nhỏ nhất nên được làm nổi bật. Các node trong open set có thể tô màu vàng, node trong closed set tô màu xám, route tạm thời tô màu xanh nhạt và route cuối cùng tô màu xanh đậm. Quy ước màu này giúp người xem theo dõi thuật toán mà không cần đọc quá nhiều chữ.</w:t>
+      </w:r>
+    </w:p>
+    <w:p>
+      <w:pPr>
+        <w:spacing w:line="300" w:lineRule="auto"/>
+        <w:ind w:firstLine="567"/>
+      </w:pPr>
+      <w:r>
+        <w:t>Một frame quan trọng cần có là frame cập nhật lại g-score. Khi thuật toán phát hiện một đường đi rẻ hơn đến cùng một node, parent của node đó thay đổi. Đây là chi tiết triển khai quan trọng, vì nếu bỏ qua cập nhật parent map thì route cuối cùng có thể sai dù f-score trông hợp lý.</w:t>
+      </w:r>
+    </w:p>
+    <w:p>
+      <w:pPr>
+        <w:spacing w:line="300" w:lineRule="auto"/>
+        <w:ind w:firstLine="567"/>
+      </w:pPr>
+      <w:r>
+        <w:t>Video A* cũng nên hiển thị bảng nhỏ hoặc nhãn nổi cho g(n), h(n), f(n). Nếu không gian hình chật, chỉ cần hiển thị f(n) trên node và giải thích g/h trong chú thích. Điều quan trọng là người xem thấy thuật toán chọn node theo hàm đánh giá chứ không chọn ngẫu nhiên.</w:t>
+      </w:r>
+    </w:p>
+    <w:p>
+      <w:pPr>
+        <w:spacing w:line="300" w:lineRule="auto"/>
+        <w:ind w:firstLine="567"/>
+      </w:pPr>
+      <w:r>
+        <w:t>Phần nhận xét sau hình nên nêu số node mở rộng và tổng chi phí route. Nếu có thể, nhóm nên ghi thêm một câu so sánh định tính với DFS: A* mở rộng ít node hơn trong kịch bản có heuristic tốt, nhưng cần lưu nhiều thông tin hơn như open set, closed set và g-score.</w:t>
+      </w:r>
+    </w:p>
+    <w:p>
+      <w:pPr>
+        <w:jc w:val="center"/>
+      </w:pPr>
+      <w:r>
+        <w:rPr>
+          <w:i/>
+        </w:rPr>
+        <w:t>Hình 3.2a. Chuỗi ảnh đề xuất cho A*: open set, closed set, cập nhật f(n) và truy vết parent map.</w:t>
       </w:r>
     </w:p>
     <w:p>
@@ -4680,15 +4878,15 @@
         <w:pStyle w:val="Heading2"/>
         <w:spacing w:before="120"/>
       </w:pPr>
-      <w:bookmarkStart w:id="12" w:name="_Toc233552839"/>
+      <w:bookmarkStart w:id="13" w:name="_Toc233554417"/>
       <w:r>
         <w:rPr>
           <w:rFonts w:eastAsia="Times New Roman"/>
         </w:rPr>
         <w:lastRenderedPageBreak/>
-        <w:t>2. Chỉ tiêu quan sát và cách ghi nhận kết quả</w:t>
-      </w:r>
-      <w:bookmarkEnd w:id="12"/>
+        <w:t>3. Nhóm tìm kiếm cục bộ: Simple Hill Climbing</w:t>
+      </w:r>
+      <w:bookmarkEnd w:id="13"/>
     </w:p>
     <w:p>
       <w:pPr>
@@ -4696,7 +4894,7 @@
         <w:ind w:firstLine="567"/>
       </w:pPr>
       <w:r>
-        <w:t>Kết quả thực nghiệm nên được ghi nhận bằng cả mô tả định tính và số liệu định lượng. Với thuật toán tìm kiếm, số node mở rộng là chỉ tiêu quan trọng vì nó phản ánh chi phí tìm kiếm. Với thuật toán tối ưu cục bộ, giá trị cost qua từng vòng cho thấy xu hướng cải thiện. Với CSP, số giá trị bị loại khỏi domain giúp đánh giá hiệu quả cắt nhánh. Với Alpha-Beta, số node bị cắt là minh chứng trực tiếp cho lợi ích của thuật toán.</w:t>
+        <w:t>Thực nghiệm Simple Hill Climbing nên dùng một route ban đầu chưa tối ưu. Route này có thể là thứ tự giao hàng hoặc chuỗi điểm cần đi qua. Mỗi vòng lặp, thuật toán sinh một hoặc một số neighbor, tính cost(route) và chuyển sang neighbor nếu cost giảm.</w:t>
       </w:r>
     </w:p>
     <w:p>
@@ -4705,7 +4903,7 @@
         <w:ind w:firstLine="567"/>
       </w:pPr>
       <w:r>
-        <w:t>Không nên chỉ kết luận thuật toán nào nhanh hơn vì mỗi thuật toán phục vụ một loại bài toán khác nhau. DFS không được kỳ vọng tối ưu như A*. AND-OR Search không trả cùng loại kết quả với A*. Forward Checking kiểm tra miền giá trị chứ không tìm path hình học. Vì vậy, kết quả cần được diễn giải trong đúng bối cảnh của từng nhóm thuật toán.</w:t>
+        <w:t>GIF minh họa nên cho thấy route thay đổi từng bước. Ví dụ, hai điểm giao được hoán đổi vị trí, một đoạn route được đảo chiều hoặc một node trung gian được thay thế. Sau mỗi thay đổi, cần hiển thị cost trước và sau để người xem thấy thuật toán đang cải thiện lời giải như thế nào.</w:t>
       </w:r>
     </w:p>
     <w:p>
@@ -4714,7 +4912,7 @@
         <w:ind w:firstLine="567"/>
       </w:pPr>
       <w:r>
-        <w:t>Khi ghi nhận thời gian chạy, cần lưu ý rằng thời gian phụ thuộc vào kích thước graph, cấu trúc dữ liệu và môi trường máy. Nếu chưa có benchmark ổn định, nhóm có thể ưu tiên số node mở rộng, số bước lặp hoặc số nhánh bị cắt. Các chỉ tiêu này gắn trực tiếp hơn với bản chất thuật toán và dễ giải thích khi vấn đáp.</w:t>
+        <w:t>Kết quả cần ghi cost ban đầu, cost sau từng bước cải thiện, cost tại điểm dừng và lý do dừng. Nếu thuật toán dừng vì không còn neighbor tốt hơn, báo cáo cần nêu rõ đó là local optimum theo neighborhood hiện tại, không nhất thiết là tối ưu toàn cục.</w:t>
       </w:r>
     </w:p>
     <w:p>
@@ -4723,8 +4921,103 @@
         <w:ind w:firstLine="567"/>
       </w:pPr>
       <w:r>
-        <w:t>Đối với A*, chất lượng heuristic cần được trình bày rõ. Nếu heuristic quá nhỏ, A* mở rộng nhiều node hơn nhưng vẫn an toàn về tối ưu. Nếu heuristic quá tham lam hoặc không admissible, thuật toán có thể nhanh hơn nhưng không còn bảo đảm tối ưu. Đây là điểm nên đưa vào phần nhận xét thay vì chỉ trình bày route cuối cùng.</w:t>
-      </w:r>
+        <w:t>Phần này nên tránh trình bày Simple Hill Climbing như thuật toán luôn thành công. Ngược lại, một ví dụ thuật toán bị kẹt ở local optimum lại có giá trị học thuật, vì nó minh họa đúng hạn chế của local search. Khi đó, nhóm có thể thảo luận rằng các biến thể như sideways move hoặc Simulated Annealing có thể được xem là hướng mở rộng, dù không chọn làm thuật toán chính.</w:t>
+      </w:r>
+    </w:p>
+    <w:p>
+      <w:pPr>
+        <w:spacing w:before="60"/>
+        <w:jc w:val="center"/>
+      </w:pPr>
+      <w:r>
+        <w:rPr>
+          <w:i/>
+        </w:rPr>
+        <w:t>Hình 3.3. Vị trí chèn GIF Simple Hill Climbing: route ban đầu được cải thiện qua từng neighbor có cost thấp hơn.</w:t>
+      </w:r>
+    </w:p>
+    <w:p>
+      <w:pPr>
+        <w:spacing w:before="60"/>
+        <w:jc w:val="center"/>
+      </w:pPr>
+      <w:r>
+        <w:rPr>
+          <w:i/>
+        </w:rPr>
+        <w:t>Video 3.3. Vị trí chèn video Simple Hill Climbing: biểu đồ cost(route) giảm dần và điểm dừng tại local optimum.</w:t>
+      </w:r>
+    </w:p>
+    <w:p>
+      <w:pPr>
+        <w:spacing w:line="300" w:lineRule="auto"/>
+        <w:ind w:firstLine="567"/>
+      </w:pPr>
+      <w:r>
+        <w:t>Với Simple Hill Climbing, hình minh họa không nên là graph tìm đường thông thường mà nên là một route hoặc thứ tự giao hàng. Hình đầu tiên cần cho thấy route ban đầu cùng giá trị cost(route). Các frame tiếp theo thể hiện neighbor được sinh ra bằng hoán đổi, đảo đoạn hoặc thay đổi thứ tự phục vụ.</w:t>
+      </w:r>
+    </w:p>
+    <w:p>
+      <w:pPr>
+        <w:spacing w:line="300" w:lineRule="auto"/>
+        <w:ind w:firstLine="567"/>
+      </w:pPr>
+      <w:r>
+        <w:t>Mỗi frame nên có hai giá trị: cost hiện tại và cost của neighbor đang xét. Nếu neighbor tốt hơn, frame tiếp theo chuyển sang route mới. Nếu neighbor không tốt hơn, hình nên ghi chú rằng thuật toán bỏ qua neighbor đó. Cách trình bày này giúp người đọc hiểu quy tắc chấp nhận bước đi của Simple Hill Climbing.</w:t>
+      </w:r>
+    </w:p>
+    <w:p>
+      <w:pPr>
+        <w:spacing w:line="300" w:lineRule="auto"/>
+        <w:ind w:firstLine="567"/>
+      </w:pPr>
+      <w:r>
+        <w:t>Một minh họa tốt nên có điểm dừng. Khi thuật toán dừng, hình cần nêu rõ lý do: không còn neighbor nào có cost thấp hơn. Nếu có thể, nên thêm chú thích rằng điểm dừng này là local optimum theo neighborhood đang xét, chưa chắc là global optimum. Đây là phần quan trọng để tránh trình bày thuật toán quá mức.</w:t>
+      </w:r>
+    </w:p>
+    <w:p>
+      <w:pPr>
+        <w:spacing w:line="300" w:lineRule="auto"/>
+        <w:ind w:firstLine="567"/>
+      </w:pPr>
+      <w:r>
+        <w:lastRenderedPageBreak/>
+        <w:t>Video nên có biểu đồ cost(route) theo vòng lặp. Trục ngang là số vòng lặp, trục dọc là cost. Mỗi lần thuật toán chấp nhận neighbor tốt hơn, đường biểu đồ giảm xuống. Nếu thuật toán dừng, biểu đồ đi ngang ở giá trị cuối. Biểu đồ này rất phù hợp để đưa vào slide vì trực quan và ít chữ.</w:t>
+      </w:r>
+    </w:p>
+    <w:p>
+      <w:pPr>
+        <w:spacing w:line="300" w:lineRule="auto"/>
+        <w:ind w:firstLine="567"/>
+      </w:pPr>
+      <w:r>
+        <w:t>Kết quả cần ghi route ban đầu, route sau cải thiện và phần trăm hoặc mức giảm cost nếu có. Nếu chưa có số liệu thật, báo cáo có thể để vị trí chèn số liệu, nhưng nên ghi rõ nhóm sẽ xuất cost từ chương trình thay vì nhập tay để tránh sai lệch.</w:t>
+      </w:r>
+    </w:p>
+    <w:p>
+      <w:pPr>
+        <w:jc w:val="center"/>
+      </w:pPr>
+      <w:r>
+        <w:rPr>
+          <w:i/>
+        </w:rPr>
+        <w:t>Hình 3.3a. Chuỗi ảnh đề xuất cho Simple Hill Climbing: neighbor được xét, cost thay đổi và điểm dừng local optimum.</w:t>
+      </w:r>
+    </w:p>
+    <w:p>
+      <w:pPr>
+        <w:pStyle w:val="Heading2"/>
+        <w:spacing w:before="120"/>
+      </w:pPr>
+      <w:bookmarkStart w:id="14" w:name="_Toc233554418"/>
+      <w:r>
+        <w:rPr>
+          <w:rFonts w:eastAsia="Times New Roman"/>
+        </w:rPr>
+        <w:t>4. Nhóm môi trường phức tạp: AND-OR Search</w:t>
+      </w:r>
+      <w:bookmarkEnd w:id="14"/>
     </w:p>
     <w:p>
       <w:pPr>
@@ -4732,7 +5025,7 @@
         <w:ind w:firstLine="567"/>
       </w:pPr>
       <w:r>
-        <w:t>Đối với Simple Hill Climbing, kết quả nên có chuỗi cost: cost ban đầu, cost sau từng bước cải thiện và cost tại điểm dừng. Nếu điểm dừng không phải tối ưu toàn cục, nhóm có thể giải thích do thuật toán chỉ nhìn neighbor cục bộ. Cách trình bày này trung thực và đúng bản chất hơn việc cố tìm một ví dụ luôn thành công.</w:t>
+        <w:t>Thực nghiệm AND-OR Search cần được thiết kế khác với thực nghiệm tìm đường thông thường. Kết quả của thuật toán không phải một path duy nhất, mà là conditional plan. Vì vậy, hình minh họa nên dùng cây AND-OR với OR node biểu diễn lựa chọn của agent và AND node biểu diễn các outcome môi trường.</w:t>
       </w:r>
     </w:p>
     <w:p>
@@ -4741,7 +5034,7 @@
         <w:ind w:firstLine="567"/>
       </w:pPr>
       <w:r>
-        <w:t>Đối với Forward Checking, kết quả nên mô tả một nhánh bị loại sớm. Ví dụ, sau khi gán một đơn hàng vào vị trí quá muộn, domain của đơn tiếp theo bị rỗng vì không còn thời gian giao hợp lệ. Đây là bằng chứng rõ ràng cho việc thuật toán tiết kiệm công sức so với thử hết tổ hợp.</w:t>
+        <w:t>Một kịch bản phù hợp là đoạn đường có thể thông hoặc bị chặn. Agent chọn hành động đi qua đoạn đó, nhưng môi trường có hai outcome. Nếu đường thông, kế hoạch tiếp tục theo route ngắn; nếu đường bị chặn, kế hoạch chuyển sang route dự phòng. Cây minh họa cần cho thấy cả hai nhánh đều có kế hoạch xử lý.</w:t>
       </w:r>
     </w:p>
     <w:p>
@@ -4750,7 +5043,100 @@
         <w:ind w:firstLine="567"/>
       </w:pPr>
       <w:r>
-        <w:t>Đối với Alpha-Beta, kết quả nên so sánh số node Minimax cần xét với số node Alpha-Beta thực sự duyệt trong cùng cây. Dù báo cáo không chọn Minimax làm thuật toán chính, việc nhắc Minimax như nền tảng giúp giải thích ý nghĩa của cắt tỉa mà không biến nó thành một mục thuật toán riêng.</w:t>
+        <w:t>Kết quả cần ghi rõ các nhánh điều kiện. Ví dụ: nếu edge open thì đi theo node A, nếu edge blocked thì chuyển sang node B. Đây là phần giúp người đọc thấy AND-OR Search khác A*: A* trả một đường đi trên trạng thái hiện biết, còn AND-OR Search trả kế hoạch cho nhiều kết quả môi trường.</w:t>
+      </w:r>
+    </w:p>
+    <w:p>
+      <w:pPr>
+        <w:spacing w:before="0" w:line="300" w:lineRule="auto"/>
+        <w:ind w:firstLine="567"/>
+      </w:pPr>
+      <w:r>
+        <w:t>Nếu dùng video, mỗi lần mở rộng OR node và AND node nên được làm nổi bật. Khi một nhánh outcome không có lời giải, video có thể đánh dấu nhánh thất bại và quay lại chọn hành động khác. Cách minh họa này làm rõ điều kiện để một conditional plan được xem là hợp lệ.</w:t>
+      </w:r>
+    </w:p>
+    <w:p>
+      <w:pPr>
+        <w:spacing w:before="60"/>
+        <w:jc w:val="center"/>
+      </w:pPr>
+      <w:r>
+        <w:rPr>
+          <w:i/>
+        </w:rPr>
+        <w:t>Hình 3.4. Vị trí chèn GIF AND-OR Search: OR node chọn hành động, AND node phân nhánh theo outcome môi trường.</w:t>
+      </w:r>
+    </w:p>
+    <w:p>
+      <w:pPr>
+        <w:spacing w:before="60"/>
+        <w:jc w:val="center"/>
+      </w:pPr>
+      <w:r>
+        <w:rPr>
+          <w:i/>
+        </w:rPr>
+        <w:t>Video 3.4. Vị trí chèn video AND-OR Search: conditional plan với nhánh ifOpen và ifBlocked.</w:t>
+      </w:r>
+    </w:p>
+    <w:p>
+      <w:pPr>
+        <w:spacing w:line="300" w:lineRule="auto"/>
+        <w:ind w:firstLine="567"/>
+      </w:pPr>
+      <w:r>
+        <w:t xml:space="preserve">Đối với AND-OR Search, hình minh họa nên có cấu trúc cây thay vì bản đồ thuần túy. Frame đầu tiên là trạng thái s và các hành động agent có thể chọn. Frame </w:t>
+      </w:r>
+      <w:r>
+        <w:lastRenderedPageBreak/>
+        <w:t>tiếp theo mở rộng một hành động thành các outcome môi trường. OR node nên dùng ký hiệu hoặc màu khác với AND node để tránh nhầm lẫn.</w:t>
+      </w:r>
+    </w:p>
+    <w:p>
+      <w:pPr>
+        <w:spacing w:line="300" w:lineRule="auto"/>
+        <w:ind w:firstLine="567"/>
+      </w:pPr>
+      <w:r>
+        <w:t>Một kịch bản rõ ràng là cạnh e có hai outcome: open và blocked. Nếu open, agent tiếp tục đi theo route ngắn. Nếu blocked, agent chuyển sang route dự phòng. Hai nhánh này nên được trình bày đồng thời để người đọc thấy rằng conditional plan phải xử lý tất cả outcome, không chỉ outcome thuận lợi.</w:t>
+      </w:r>
+    </w:p>
+    <w:p>
+      <w:pPr>
+        <w:spacing w:line="300" w:lineRule="auto"/>
+        <w:ind w:firstLine="567"/>
+      </w:pPr>
+      <w:r>
+        <w:t>Khi một nhánh outcome không thể dẫn tới goal, video nên đánh dấu nhánh đó là failure và quay lại xét hành động khác ở OR node. Đây là chi tiết quan trọng của AND-OR Search: một hành động chỉ được chấp nhận nếu mọi outcome cần thiết đều có kế hoạch con hợp lệ.</w:t>
+      </w:r>
+    </w:p>
+    <w:p>
+      <w:pPr>
+        <w:spacing w:line="300" w:lineRule="auto"/>
+        <w:ind w:firstLine="567"/>
+      </w:pPr>
+      <w:r>
+        <w:t>Chú thích hình nên dùng các cụm ngắn như OR: agent chooses action và AND: environment outcome. Nếu slide trình bày song song với báo cáo, nhóm có thể dùng cùng màu cho OR/AND ở cả hai nơi. Sự thống nhất này giúp người nghe không phải học lại ký hiệu ở từng phần.</w:t>
+      </w:r>
+    </w:p>
+    <w:p>
+      <w:pPr>
+        <w:spacing w:line="300" w:lineRule="auto"/>
+        <w:ind w:firstLine="567"/>
+      </w:pPr>
+      <w:r>
+        <w:t>Kết quả thực nghiệm của AND-OR Search nên được viết dưới dạng kế hoạch điều kiện. Ví dụ: chọn hành động a; nếu s1 xảy ra thì thực hiện plan P1; nếu s2 xảy ra thì thực hiện plan P2. Không nên viết kết quả như một route đơn vì như vậy sẽ làm mất bản chất của thuật toán.</w:t>
+      </w:r>
+    </w:p>
+    <w:p>
+      <w:pPr>
+        <w:jc w:val="center"/>
+      </w:pPr>
+      <w:r>
+        <w:rPr>
+          <w:i/>
+        </w:rPr>
+        <w:t>Hình 3.4a. Chuỗi ảnh đề xuất cho AND-OR Search: mở rộng OR node, sinh AND outcome và trả conditional plan.</w:t>
       </w:r>
     </w:p>
     <w:p>
@@ -4758,15 +5144,14 @@
         <w:pStyle w:val="Heading2"/>
         <w:spacing w:before="120"/>
       </w:pPr>
-      <w:bookmarkStart w:id="13" w:name="_Toc233552840"/>
+      <w:bookmarkStart w:id="15" w:name="_Toc233554419"/>
       <w:r>
         <w:rPr>
           <w:rFonts w:eastAsia="Times New Roman"/>
         </w:rPr>
-        <w:lastRenderedPageBreak/>
-        <w:t>3. Định hướng chèn hình minh họa</w:t>
-      </w:r>
-      <w:bookmarkEnd w:id="13"/>
+        <w:t>5. Nhóm thỏa ràng buộc: Forward Checking</w:t>
+      </w:r>
+      <w:bookmarkEnd w:id="15"/>
     </w:p>
     <w:p>
       <w:pPr>
@@ -4774,7 +5159,7 @@
         <w:ind w:firstLine="567"/>
       </w:pPr>
       <w:r>
-        <w:t>Theo yêu cầu báo cáo cuối kỳ, phần thực nghiệm nên có ảnh động hoặc chuỗi ảnh minh họa. Với DFS, hình nên thể hiện hướng đi sâu và mũi tên quay lui. Với A*, hình nên thể hiện frontier và giá trị f(n). Với Simple Hill Climbing, hình nên thể hiện route trước và sau khi đổi neighbor. Với AND-OR Search, hình nên thể hiện cây conditional plan. Với Forward Checking, hình nên thể hiện domain bị thu hẹp. Với Alpha-Beta, hình nên thể hiện nhánh bị cắt.</w:t>
+        <w:t>Thực nghiệm Forward Checking nên được trình bày bằng domain của các biến trước và sau mỗi phép gán. Một kịch bản nhỏ có thể gồm vài đơn hàng, mỗi đơn có domain là các vị trí trong thứ tự giao hoặc các shipper có thể nhận. Ràng buộc có thể là deadline, capacity hoặc pickup trước dropoff.</w:t>
       </w:r>
     </w:p>
     <w:p>
@@ -4783,7 +5168,7 @@
         <w:ind w:firstLine="567"/>
       </w:pPr>
       <w:r>
-        <w:t>Ảnh minh họa cần được đặt sau đoạn mô tả kịch bản, không nên dồn hết về cuối. Mỗi ảnh nên có chú thích ngắn nêu thuật toán, trạng thái đang xét và ý nghĩa của màu sắc. Nếu dùng GIF hoặc video trong slide, báo cáo Word có thể chèn ảnh tĩnh đại diện và dẫn link GitHub hoặc thư mục demo chứa animation.</w:t>
+        <w:t>Khi thuật toán gán Xi = v, hình minh họa cần cho thấy các giá trị không còn hợp lệ bị loại khỏi domain của biến tương lai. Nếu một domain trở thành rỗng, thuật toán quay lui. Đây là điểm trực quan nhất của Forward Checking và cần được thể hiện rõ trong ảnh hoặc video.</w:t>
       </w:r>
     </w:p>
     <w:p>
@@ -4792,7 +5177,7 @@
         <w:ind w:firstLine="567"/>
       </w:pPr>
       <w:r>
-        <w:t>Khi chèn hình, cần tránh ảnh quá nhỏ hoặc chỉ là screenshot giao diện không giải thích được thuật toán. Một ảnh tốt phải cho thấy quá trình ra quyết định. Ví dụ, với A*, chỉ thấy đường đi cuối cùng là chưa đủ; nên có thêm node đã mở rộng. Với Alpha-Beta, chỉ thấy cây cuối cùng là chưa đủ; cần đánh dấu nhánh nào bị prune.</w:t>
+        <w:t>Kết quả cần ghi số giá trị bị loại, số nhánh bị cắt sớm và phép gán cuối cùng nếu tìm được nghiệm. Nếu không tìm được nghiệm, báo cáo cần nêu ràng buộc nào làm domain rỗng. Điều này giúp phần thực nghiệm không chỉ là kết quả đúng/sai, mà còn giải thích nguyên nhân.</w:t>
       </w:r>
     </w:p>
     <w:p>
@@ -4801,7 +5186,88 @@
         <w:ind w:firstLine="567"/>
       </w:pPr>
       <w:r>
-        <w:t>Nếu chưa có đầy đủ hình, báo cáo có thể để vị trí chèn hình theo từng thuật toán nhưng nên viết chú thích cụ thể. Chú thích cụ thể giúp người đọc biết nhóm dự định minh họa điều gì, đồng thời giúp quá trình hoàn thiện sau này nhất quán với nội dung phân tích.</w:t>
+        <w:lastRenderedPageBreak/>
+        <w:t>Forward Checking không nên được minh họa như thuật toán tìm đường trên bản đồ. Nó nên được minh họa như thuật toán kiểm tra tính khả thi của phân công hoặc thứ tự phục vụ. Khi đặt đúng vai trò, phần thực nghiệm sẽ khớp hơn với nhóm CSP.</w:t>
+      </w:r>
+    </w:p>
+    <w:p>
+      <w:pPr>
+        <w:spacing w:before="60"/>
+        <w:jc w:val="center"/>
+      </w:pPr>
+      <w:r>
+        <w:rPr>
+          <w:i/>
+        </w:rPr>
+        <w:t>Hình 3.5. Vị trí chèn GIF Forward Checking: domain của biến chưa gán bị thu hẹp sau phép gán Xi = v.</w:t>
+      </w:r>
+    </w:p>
+    <w:p>
+      <w:pPr>
+        <w:spacing w:before="60"/>
+        <w:jc w:val="center"/>
+      </w:pPr>
+      <w:r>
+        <w:rPr>
+          <w:i/>
+        </w:rPr>
+        <w:t>Video 3.5. Vị trí chèn video Forward Checking: quay lui khi một domain tương lai trở thành rỗng.</w:t>
+      </w:r>
+    </w:p>
+    <w:p>
+      <w:pPr>
+        <w:spacing w:line="300" w:lineRule="auto"/>
+        <w:ind w:firstLine="567"/>
+      </w:pPr>
+      <w:r>
+        <w:t>Với Forward Checking, hình minh họa nên đặt trọng tâm vào bảng domain hoặc các ô giá trị có thể chọn. Mỗi biến có một hàng hoặc một cụm giá trị. Khi thuật toán gán một biến, các giá trị không còn hợp lệ ở biến tương lai sẽ bị gạch bỏ hoặc chuyển sang màu đỏ nhạt.</w:t>
+      </w:r>
+    </w:p>
+    <w:p>
+      <w:pPr>
+        <w:spacing w:line="300" w:lineRule="auto"/>
+        <w:ind w:firstLine="567"/>
+      </w:pPr>
+      <w:r>
+        <w:t>GIF nên thể hiện ít nhất một tình huống domain bị rỗng. Đây là khoảnh khắc cho thấy thuật toán phát hiện thất bại sớm. Thay vì tiếp tục thử các biến còn lại, thuật toán quay lui ngay. Nếu không có frame này, người đọc khó thấy lợi ích của Forward Checking so với Backtracking thông thường.</w:t>
+      </w:r>
+    </w:p>
+    <w:p>
+      <w:pPr>
+        <w:spacing w:line="300" w:lineRule="auto"/>
+        <w:ind w:firstLine="567"/>
+      </w:pPr>
+      <w:r>
+        <w:t>Kịch bản nên gắn với Find Your Path bằng các ràng buộc cụ thể. Ví dụ, đơn hàng A phải giao trước thời điểm t, shipper chỉ có capacity c, hoặc pickup phải diễn ra trước dropoff. Các ràng buộc này nên được ghi ngay dưới hình để người đọc hiểu vì sao một giá trị bị loại.</w:t>
+      </w:r>
+    </w:p>
+    <w:p>
+      <w:pPr>
+        <w:spacing w:line="300" w:lineRule="auto"/>
+        <w:ind w:firstLine="567"/>
+      </w:pPr>
+      <w:r>
+        <w:t>Kết quả nên ghi số giá trị domain bị loại sau mỗi phép gán và tổng số nhánh tránh được. Nếu chương trình có log, nhóm nên xuất log thành văn bản hoặc ảnh nhỏ. Nếu chưa có log tự động, có thể ghi thủ công trong báo cáo nhưng cần nhất quán với hình minh họa.</w:t>
+      </w:r>
+    </w:p>
+    <w:p>
+      <w:pPr>
+        <w:spacing w:line="300" w:lineRule="auto"/>
+        <w:ind w:firstLine="567"/>
+      </w:pPr>
+      <w:r>
+        <w:t>Phần video nên kết thúc bằng phép gán hợp lệ hoặc thông báo không tồn tại nghiệm trong kịch bản đó. Cả hai kết quả đều có giá trị: tìm được nghiệm cho thấy thuật toán hoạt động; không tìm được nghiệm cho thấy ràng buộc đủ chặt để loại toàn bộ miền.</w:t>
+      </w:r>
+    </w:p>
+    <w:p>
+      <w:pPr>
+        <w:jc w:val="center"/>
+      </w:pPr>
+      <w:r>
+        <w:rPr>
+          <w:i/>
+        </w:rPr>
+        <w:t>Hình 3.5a. Chuỗi ảnh đề xuất cho Forward Checking: gán biến, loại giá trị khỏi domain và quay lui khi domain rỗng.</w:t>
       </w:r>
     </w:p>
     <w:p>
@@ -4809,14 +5275,14 @@
         <w:pStyle w:val="Heading2"/>
         <w:spacing w:before="120"/>
       </w:pPr>
-      <w:bookmarkStart w:id="14" w:name="_Toc233552841"/>
+      <w:bookmarkStart w:id="16" w:name="_Toc233554420"/>
       <w:r>
         <w:rPr>
           <w:rFonts w:eastAsia="Times New Roman"/>
         </w:rPr>
-        <w:t>4. Link GitHub</w:t>
-      </w:r>
-      <w:bookmarkEnd w:id="14"/>
+        <w:t>6. Nhóm tìm kiếm đối kháng: Alpha-Beta Pruning</w:t>
+      </w:r>
+      <w:bookmarkEnd w:id="16"/>
     </w:p>
     <w:p>
       <w:pPr>
@@ -4824,7 +5290,154 @@
         <w:ind w:firstLine="567"/>
       </w:pPr>
       <w:r>
-        <w:t>Mã nguồn và dữ liệu demo của dự án được lưu tại: https://github.com/zomboXx/FYP.git. Khi hoàn thiện báo cáo, nhóm nên dẫn thêm đường dẫn đến thư mục demo, ảnh động hoặc video minh họa nếu các tài nguyên đó được đưa lên repository.</w:t>
+        <w:t xml:space="preserve">Thực nghiệm Alpha-Beta Pruning nên dùng một cây quyết định nhỏ có giá trị utility ở các node lá. MAX đại diện cho hệ thống chọn route hoặc phương án, còn </w:t>
+      </w:r>
+      <w:r>
+        <w:lastRenderedPageBreak/>
+        <w:t>MIN đại diện cho môi trường bất lợi. Mục tiêu của minh họa là cho thấy thuật toán cắt những nhánh không ảnh hưởng đến quyết định cuối cùng.</w:t>
+      </w:r>
+    </w:p>
+    <w:p>
+      <w:pPr>
+        <w:spacing w:before="0" w:line="300" w:lineRule="auto"/>
+        <w:ind w:firstLine="567"/>
+      </w:pPr>
+      <w:r>
+        <w:t>Ảnh động nên hiển thị alpha và beta tại từng node. Khi điều kiện alpha &gt;= beta xuất hiện, nhánh bị cắt cần được đánh dấu rõ bằng màu hoặc đường gạch. Người xem phải nhận ra rằng Alpha-Beta không thay đổi kết quả Minimax, mà giảm số node phải duyệt.</w:t>
+      </w:r>
+    </w:p>
+    <w:p>
+      <w:pPr>
+        <w:spacing w:before="0" w:line="300" w:lineRule="auto"/>
+        <w:ind w:firstLine="567"/>
+      </w:pPr>
+      <w:r>
+        <w:t>Kết quả cần ghi số node được duyệt, số node bị cắt và hành động được chọn ở gốc. Nếu có thể, nhóm nên đặt cạnh một ảnh cây chưa cắt và cây sau khi cắt để làm nổi bật lợi ích tính toán. Tuy nhiên, phần mô tả vẫn cần nhấn mạnh rằng hiệu quả cắt tỉa phụ thuộc vào thứ tự xét nhánh.</w:t>
+      </w:r>
+    </w:p>
+    <w:p>
+      <w:pPr>
+        <w:spacing w:before="0" w:line="300" w:lineRule="auto"/>
+        <w:ind w:firstLine="567"/>
+      </w:pPr>
+      <w:r>
+        <w:t>Trong ngữ cảnh Find Your Path, cây đối kháng có thể mô phỏng các route ứng viên và phản ứng bất lợi như tắc đường, chi phí tăng hoặc đoạn đường bị chặn. Cách mô hình hóa này giúp thuật toán có liên hệ với đề tài, thay vì chỉ là ví dụ trò chơi trừu tượng.</w:t>
+      </w:r>
+    </w:p>
+    <w:p>
+      <w:pPr>
+        <w:spacing w:before="60"/>
+        <w:jc w:val="center"/>
+      </w:pPr>
+      <w:r>
+        <w:rPr>
+          <w:i/>
+        </w:rPr>
+        <w:t>Hình 3.6. Vị trí chèn GIF Alpha-Beta: cập nhật alpha, beta và đánh dấu nhánh bị cắt.</w:t>
+      </w:r>
+    </w:p>
+    <w:p>
+      <w:pPr>
+        <w:spacing w:before="60"/>
+        <w:jc w:val="center"/>
+      </w:pPr>
+      <w:r>
+        <w:rPr>
+          <w:i/>
+        </w:rPr>
+        <w:t>Video 3.6. Vị trí chèn video Alpha-Beta: so sánh số node duyệt trước và sau khi pruning.</w:t>
+      </w:r>
+    </w:p>
+    <w:p>
+      <w:pPr>
+        <w:spacing w:line="300" w:lineRule="auto"/>
+        <w:ind w:firstLine="567"/>
+      </w:pPr>
+      <w:r>
+        <w:t>Đối với Alpha-Beta Pruning, hình minh họa nên bắt đầu từ cây quyết định có giá trị utility ở lá. Các tầng MAX và MIN cần được ghi rõ. Nếu chỉ vẽ một cây không có nhãn MAX/MIN, người đọc sẽ khó hiểu vì sao node này lấy max còn node kia lấy min.</w:t>
+      </w:r>
+    </w:p>
+    <w:p>
+      <w:pPr>
+        <w:spacing w:line="300" w:lineRule="auto"/>
+        <w:ind w:firstLine="567"/>
+      </w:pPr>
+      <w:r>
+        <w:t>Video nên hiển thị alpha và beta cập nhật theo thứ tự duyệt. Khi điều kiện alpha &gt;= beta xuất hiện, nhánh bị cắt nên được làm mờ hoặc gạch chéo. Đây là khoảnh khắc quan trọng nhất của thuật toán, vì nó chứng minh Alpha-Beta không cần duyệt toàn bộ cây.</w:t>
+      </w:r>
+    </w:p>
+    <w:p>
+      <w:pPr>
+        <w:spacing w:line="300" w:lineRule="auto"/>
+        <w:ind w:firstLine="567"/>
+      </w:pPr>
+      <w:r>
+        <w:t>Một frame nên so sánh số node Minimax phải xét với số node Alpha-Beta thực sự xét. Dù báo cáo không chọn Minimax làm thuật toán chính, so sánh này giúp giải thích ý nghĩa của pruning. Cần nói rõ Alpha-Beta giữ nguyên quyết định cuối cùng nếu cùng hàm utility và cùng cây quyết định.</w:t>
+      </w:r>
+    </w:p>
+    <w:p>
+      <w:pPr>
+        <w:spacing w:line="300" w:lineRule="auto"/>
+        <w:ind w:firstLine="567"/>
+      </w:pPr>
+      <w:r>
+        <w:t xml:space="preserve">Kịch bản Find Your Path có thể mô phỏng MAX chọn route, còn MIN chọn sự cố bất lợi. Utility ở lá là điểm đánh giá route sau khi sự cố xảy ra. Cách mô hình hóa </w:t>
+      </w:r>
+      <w:r>
+        <w:lastRenderedPageBreak/>
+        <w:t>này giúp thuật toán đối kháng liên hệ với đề tài, thay vì chỉ nằm trong ví dụ trò chơi trừu tượng.</w:t>
+      </w:r>
+    </w:p>
+    <w:p>
+      <w:pPr>
+        <w:spacing w:line="300" w:lineRule="auto"/>
+        <w:ind w:firstLine="567"/>
+      </w:pPr>
+      <w:r>
+        <w:t>Kết quả cuối cùng nên ghi hành động được chọn ở gốc, giá trị utility tương ứng và số nhánh bị cắt. Nếu thứ tự xét nhánh tốt, số nhánh bị cắt nhiều; nếu thứ tự xét nhánh xấu, số nhánh bị cắt ít. Nhận xét này giúp phần thực nghiệm phản ánh đúng điều kiện hiệu quả của Alpha-Beta.</w:t>
+      </w:r>
+    </w:p>
+    <w:p>
+      <w:pPr>
+        <w:jc w:val="center"/>
+      </w:pPr>
+      <w:r>
+        <w:rPr>
+          <w:i/>
+        </w:rPr>
+        <w:t>Hình 3.6a. Chuỗi ảnh đề xuất cho Alpha-Beta Pruning: cập nhật alpha/beta, cắt nhánh và giữ nguyên quyết định Minimax.</w:t>
+      </w:r>
+    </w:p>
+    <w:p>
+      <w:pPr>
+        <w:pStyle w:val="Heading2"/>
+        <w:spacing w:before="120"/>
+      </w:pPr>
+      <w:bookmarkStart w:id="17" w:name="_Toc233554421"/>
+      <w:r>
+        <w:rPr>
+          <w:rFonts w:eastAsia="Times New Roman"/>
+        </w:rPr>
+        <w:t>7. Link GitHub và tài nguyên minh họa</w:t>
+      </w:r>
+      <w:bookmarkEnd w:id="17"/>
+    </w:p>
+    <w:p>
+      <w:pPr>
+        <w:spacing w:before="0" w:line="300" w:lineRule="auto"/>
+        <w:ind w:firstLine="567"/>
+      </w:pPr>
+      <w:r>
+        <w:t>Mã nguồn và dữ liệu demo của dự án được lưu tại: https://github.com/zomboXx/FYP.git. Khi hoàn thiện báo cáo, nhóm nên đưa thêm đường dẫn đến thư mục chứa GIF, video hoặc ảnh minh họa cho từng thuật toán. Nếu tài nguyên được đặt trong repository, nên tổ chức theo thư mục riêng cho DFS, A*, Simple Hill Climbing, AND-OR Search, Forward Checking và Alpha-Beta Pruning.</w:t>
+      </w:r>
+    </w:p>
+    <w:p>
+      <w:pPr>
+        <w:spacing w:before="0" w:line="300" w:lineRule="auto"/>
+        <w:ind w:firstLine="567"/>
+      </w:pPr>
+      <w:r>
+        <w:t>Khi chèn video vào slide, báo cáo Word nên có ảnh tĩnh đại diện và chú thích vị trí video. Khi chèn GIF vào báo cáo, cần kiểm tra lại dung lượng file và khả năng hiển thị sau khi nộp. Nếu hệ thống nộp bài không hỗ trợ GIF động, nhóm nên xuất chuỗi ảnh tĩnh theo từng bước để thay thế.</w:t>
       </w:r>
     </w:p>
     <w:p>
@@ -4834,7 +5447,7 @@
         <w:spacing w:before="0"/>
         <w:jc w:val="left"/>
       </w:pPr>
-      <w:bookmarkStart w:id="15" w:name="_Toc233552842"/>
+      <w:bookmarkStart w:id="18" w:name="_Toc233554422"/>
       <w:r>
         <w:rPr>
           <w:rFonts w:eastAsia="Times New Roman"/>
@@ -4842,7 +5455,7 @@
         <w:lastRenderedPageBreak/>
         <w:t>IV. Đánh giá và thảo luận</w:t>
       </w:r>
-      <w:bookmarkEnd w:id="15"/>
+      <w:bookmarkEnd w:id="18"/>
     </w:p>
     <w:p>
       <w:pPr>
@@ -4850,8 +5463,22 @@
         <w:ind w:firstLine="567"/>
       </w:pPr>
       <w:r>
-        <w:t>Phần đánh giá không nên được trình bày như một bảng liệt kê cứng, vì sáu thuật toán được chọn không giải cùng một bài toán con. Nếu đặt chúng vào một bảng, báo cáo dễ tạo cảm giác máy móc và làm mất bản chất học thuật của phần thảo luận. Cách hợp lý hơn là phân tích vai trò của từng thuật toán trong hệ thống và chỉ ra vì sao mỗi thuật toán phù hợp với một lớp vấn đề khác nhau.</w:t>
-      </w:r>
+        <w:t>Phần đánh giá và thảo luận tập trung vào ưu điểm, hạn chế và hướng phát triển của các thuật toán trong bối cảnh Find Your Path. Nội dung được trình bày bằng văn xuôi thay vì bảng để tránh cảm giác liệt kê máy móc, đồng thời giúp lập luận tự nhiên hơn khi đọc và khi vấn đáp.</w:t>
+      </w:r>
+    </w:p>
+    <w:p>
+      <w:pPr>
+        <w:pStyle w:val="Heading2"/>
+        <w:spacing w:before="120"/>
+      </w:pPr>
+      <w:bookmarkStart w:id="19" w:name="_Toc233554423"/>
+      <w:r>
+        <w:rPr>
+          <w:rFonts w:eastAsia="Times New Roman"/>
+        </w:rPr>
+        <w:t>1. Đánh giá ưu điểm và hạn chế</w:t>
+      </w:r>
+      <w:bookmarkEnd w:id="19"/>
     </w:p>
     <w:p>
       <w:pPr>
@@ -4859,7 +5486,7 @@
         <w:ind w:firstLine="567"/>
       </w:pPr>
       <w:r>
-        <w:t>DFS có giá trị như thuật toán nền. Nó cho thấy một tác tử có thể tìm đường khi không có bất kỳ tri thức định hướng nào. Điểm yếu của DFS trong bài toán giao hàng cũng rất rõ: thuật toán không tối ưu, dễ đi sâu vào nhánh kém và phụ thuộc thứ tự duyệt. Tuy nhiên, chính điểm yếu này giúp làm nổi bật giá trị của A*. Khi trình bày báo cáo, DFS nên được xem như đường cơ sở về mặt nhận thức, không phải giải pháp triển khai chính.</w:t>
+        <w:t>DFS có ưu điểm là đơn giản, dễ cài đặt và minh họa rõ cơ chế duyệt sâu. Thuật toán phù hợp để kiểm tra kết nối graph hoặc làm ví dụ nền cho tìm kiếm không thông tin. Hạn chế của DFS là không tối ưu, dễ đi sâu vào nhánh kém và phụ thuộc nhiều vào thứ tự liệt kê node kề. Vì vậy, DFS chỉ nên đóng vai trò minh họa hoặc baseline, không phải thuật toán tìm route chính.</w:t>
       </w:r>
     </w:p>
     <w:p>
@@ -4868,7 +5495,7 @@
         <w:ind w:firstLine="567"/>
       </w:pPr>
       <w:r>
-        <w:t>A* là thuật toán có tính ứng dụng cao nhất đối với bài toán tìm đường giữa hai điểm. Nó kết hợp chi phí đã đi và heuristic còn lại, nhờ đó phù hợp với bản đồ có trọng số. Nếu chỉ chọn một thuật toán để chạy route chính trong Find Your Path, A* là lựa chọn hợp lý hơn DFS. Tuy nhiên, A* cũng không giải quyết toàn bộ bài toán giao hàng, vì nó không tự xử lý thứ tự nhiều đơn, ràng buộc deadline hoặc outcome bất định.</w:t>
+        <w:t>A* là thuật toán phù hợp nhất với phần tìm đường của Find Your Path vì nó kết hợp chi phí đã đi và heuristic còn lại. Ưu điểm của A* là có thể tối ưu nếu heuristic admissible và chi phí cạnh dương. Hạn chế là thuật toán có thể tốn nhiều bộ nhớ, đồng thời chất lượng phụ thuộc mạnh vào heuristic. Nếu heuristic yếu, A* mở rộng nhiều node; nếu heuristic sai, bảo đảm tối ưu có thể mất.</w:t>
       </w:r>
     </w:p>
     <w:p>
@@ -4877,7 +5504,7 @@
         <w:ind w:firstLine="567"/>
       </w:pPr>
       <w:r>
-        <w:t>Simple Hill Climbing bổ sung góc nhìn tối ưu cục bộ. Trong một hệ thống giao hàng, đôi khi vấn đề không phải là tìm đường giữa hai node, mà là cải thiện một route gồm nhiều điểm. Thuật toán này cho phép giải thích cách một lời giải ban đầu được cải thiện dần. Dù không bảo đảm tối ưu toàn cục, nó phù hợp để minh họa quan hệ giữa hàm đánh giá và hành vi của thuật toán.</w:t>
+        <w:t>Simple Hill Climbing có ưu điểm là nhẹ, dễ hiểu và phù hợp để cải thiện một route ứng viên. Thuật toán không cần lưu toàn bộ cây tìm kiếm, nên dễ minh họa bằng cost(route) qua từng vòng. Hạn chế là dễ kẹt tại local optimum, plateau hoặc ridge. Vì vậy, thuật toán này phù hợp để trình bày tối ưu cục bộ, nhưng không nên được xem là phương pháp bảo đảm tối ưu toàn cục.</w:t>
       </w:r>
     </w:p>
     <w:p>
@@ -4886,7 +5513,7 @@
         <w:ind w:firstLine="567"/>
       </w:pPr>
       <w:r>
-        <w:t>AND-OR Search đại diện cho tư duy lập kế hoạch khi môi trường không chắc chắn. Đây là điểm quan trọng vì môi trường giao thông không phải lúc nào cũng deterministic. Một route được tính trước có thể mất hiệu lực khi đường bị chặn hoặc chi phí thay đổi. AND-OR Search không chỉ hỏi đi đường nào, mà hỏi nếu môi trường phản hồi khác nhau thì kế hoạch sẽ rẽ nhánh ra sao. Điều này làm thuật toán phù hợp với phần môi trường phức tạp hơn so với việc chỉ gọi lại A* nhiều lần.</w:t>
+        <w:t>AND-OR Search có ưu điểm là biểu diễn được kế hoạch có điều kiện trong môi trường bất định. Đây là điểm mà path đơn của A* không thể hiện đầy đủ. Hạn chế của thuật toán là cây AND-OR dễ bùng nổ khi số hành động và outcome tăng. Ngoài ra, thuật toán yêu cầu transition model đủ rõ; nếu không mô tả được outcome môi trường, conditional plan sẽ thiếu cơ sở.</w:t>
       </w:r>
     </w:p>
     <w:p>
@@ -4895,7 +5522,7 @@
         <w:ind w:firstLine="567"/>
       </w:pPr>
       <w:r>
-        <w:t>Forward Checking cho thấy một lớp vấn đề khác: tính hợp lệ dưới ràng buộc. Trong thực tế, route ngắn vẫn có thể vô nghĩa nếu vi phạm deadline, capacity hoặc thứ tự pickup/dropoff. Forward Checking không cạnh tranh trực tiếp với A*, mà có thể hoạt động như tầng kiểm tra trước hoặc trong quá trình lập kế hoạch. Vai trò của nó là giảm không gian tìm kiếm bằng cách loại sớm những giá trị chắc chắn không hợp lệ.</w:t>
+        <w:t>Forward Checking giúp phát hiện mâu thuẫn ràng buộc sớm bằng cách thu hẹp domain của các biến chưa gán. Ưu điểm là giảm số nhánh phải xét và giải thích rõ vì sao một phương án không hợp lệ. Hạn chế là thuật toán vẫn có worst-case tổ hợp và không tự tối ưu chi phí nếu không bổ sung hàm mục tiêu. Nó phù hợp nhất ở tầng kiểm tra tính khả thi của phân công hoặc thứ tự giao hàng.</w:t>
       </w:r>
     </w:p>
     <w:p>
@@ -4904,9 +5531,26 @@
         <w:ind w:firstLine="567"/>
       </w:pPr>
       <w:r>
+        <w:t xml:space="preserve">Alpha-Beta Pruning giữ nguyên kết quả Minimax nhưng giảm số node cần duyệt. Ưu điểm là hiệu quả hơn Minimax khi thứ tự xét nhánh tốt. Hạn chế là thuật toán cần mô hình cây quyết định và hàm utility hợp lý. Trong Find Your Path, Alpha-Beta nên </w:t>
+      </w:r>
+      <w:r>
         <w:lastRenderedPageBreak/>
-        <w:t>Alpha-Beta Pruning đưa vào báo cáo một cách nhìn đối kháng. Dù bài toán giao hàng không phải trò chơi hai người theo nghĩa truyền thống, ta vẫn có thể mô hình hóa môi trường bất lợi như một tác nhân làm giảm utility. Khi đó, Alpha-Beta giúp phân tích lựa chọn nào ổn định hơn dưới kịch bản xấu. Thuật toán này không thay thế A*, nhưng hỗ trợ đánh giá rủi ro ở tầng quyết định.</w:t>
-      </w:r>
+        <w:t>được xem là công cụ phân tích kịch bản bất lợi, không phải thuật toán định tuyến trực tiếp.</w:t>
+      </w:r>
+    </w:p>
+    <w:p>
+      <w:pPr>
+        <w:pStyle w:val="Heading2"/>
+        <w:spacing w:before="120"/>
+      </w:pPr>
+      <w:bookmarkStart w:id="20" w:name="_Toc233554424"/>
+      <w:r>
+        <w:rPr>
+          <w:rFonts w:eastAsia="Times New Roman"/>
+        </w:rPr>
+        <w:t>2. Hướng phát triển trong tương lai</w:t>
+      </w:r>
+      <w:bookmarkEnd w:id="20"/>
     </w:p>
     <w:p>
       <w:pPr>
@@ -4914,7 +5558,7 @@
         <w:ind w:firstLine="567"/>
       </w:pPr>
       <w:r>
-        <w:t>Nếu đặt sáu thuật toán vào một kiến trúc tổng thể, có thể hình dung hệ thống gồm nhiều tầng. DFS dùng để minh họa và kiểm tra nền tảng graph. A* dùng để tìm tuyến giữa hai điểm. Simple Hill Climbing dùng để cải thiện route nhiều điểm. AND-OR Search dùng để chuẩn bị kế hoạch có điều kiện trong môi trường bất định. Forward Checking dùng để kiểm soát ràng buộc. Alpha-Beta dùng để phân tích lựa chọn dưới kịch bản bất lợi.</w:t>
+        <w:t>Hướng phát triển đầu tiên là hoàn thiện phần minh họa thực nghiệm. Mỗi thuật toán nên có GIF hoặc video riêng, thể hiện đúng quá trình ra quyết định. DFS cần stack và quay lui; A* cần open set, closed set và f-score; Simple Hill Climbing cần cost qua từng vòng; AND-OR Search cần conditional plan; Forward Checking cần domain bị thu hẹp; Alpha-Beta cần nhánh bị cắt.</w:t>
       </w:r>
     </w:p>
     <w:p>
@@ -4923,7 +5567,7 @@
         <w:ind w:firstLine="567"/>
       </w:pPr>
       <w:r>
-        <w:t>Cách kết hợp này phản ánh tinh thần quan trọng của môn Trí tuệ nhân tạo: không có một thuật toán duy nhất phù hợp với mọi vấn đề. Việc chọn thuật toán phụ thuộc vào biểu diễn trạng thái, loại môi trường, mục tiêu tối ưu và dạng thông tin có sẵn. Nếu môi trường đã biết và mục tiêu rõ ràng, A* mạnh. Nếu môi trường có outcome bất định, AND-OR Search tự nhiên hơn. Nếu vấn đề nằm ở ràng buộc, Forward Checking phù hợp hơn.</w:t>
+        <w:t>Hướng phát triển thứ hai là kết nối các thuật toán thành một pipeline hợp lý hơn trong ứng dụng. A* có thể đảm nhận tìm đường giữa hai điểm, Forward Checking kiểm tra ràng buộc đơn hàng, Simple Hill Climbing cải thiện thứ tự giao hàng, AND-OR Search mô phỏng tình huống bất định và Alpha-Beta đánh giá kịch bản bất lợi. Khi trình bày như một pipeline, các thuật toán không còn rời rạc.</w:t>
       </w:r>
     </w:p>
     <w:p>
@@ -4932,7 +5576,7 @@
         <w:ind w:firstLine="567"/>
       </w:pPr>
       <w:r>
-        <w:t>Hạn chế của báo cáo hiện tại là phần thực nghiệm vẫn cần được bổ sung bằng số liệu và hình ảnh cụ thể từ chương trình. Phân tích lý thuyết đã chỉ ra vai trò của từng thuật toán, nhưng để thuyết phục hơn, nhóm cần xuất trace, animation hoặc screenshot cho từng thuật toán. Đặc biệt, A* nên có số node mở rộng, Forward Checking nên có domain trước và sau khi prune, Alpha-Beta nên có số nhánh bị cắt.</w:t>
+        <w:t>Hướng phát triển thứ ba là bổ sung số liệu định lượng. Báo cáo có thể ghi số node mở rộng, số bước lặp, số neighbor được xét, số giá trị domain bị loại và số nhánh bị cắt. Các số liệu này giúp phần đánh giá có cơ sở hơn so với nhận xét cảm tính. Nếu có thời gian, nhóm nên xuất log tự động từ chương trình để giảm sai sót khi ghi báo cáo.</w:t>
       </w:r>
     </w:p>
     <w:p>
@@ -4941,517 +5585,7 @@
         <w:ind w:firstLine="567"/>
       </w:pPr>
       <w:r>
-        <w:t>Một điểm cần tránh khi trình bày là không nên nói thuật toán nào tốt nhất một cách tuyệt đối. DFS kém A* trong tìm đường tối ưu, nhưng DFS lại đơn giản và dễ minh họa. Simple Hill Climbing không bảo đảm tối ưu toàn cục, nhưng hữu ích khi cần cải thiện nhanh. Forward Checking không tìm đường, nhưng kiểm soát tính hợp lệ. Vì vậy, đánh giá đúng phải dựa trên vai trò của thuật toán trong hệ thống.</w:t>
-      </w:r>
-    </w:p>
-    <w:p>
-      <w:pPr>
-        <w:spacing w:before="0" w:line="300" w:lineRule="auto"/>
-        <w:ind w:firstLine="567"/>
-      </w:pPr>
-      <w:r>
-        <w:t>Từ góc nhìn dự án Find Your Path, trọng tâm triển khai nên đặt ở A* và các dữ liệu graph, vì đây là phần người dùng dễ quan sát nhất. Các thuật toán còn lại có thể được dùng để mở rộng hoặc minh họa các khía cạnh AI khác của bài toán. Cách trình bày này giúp báo cáo vừa bám đề tài ứng dụng, vừa thể hiện được độ phủ kiến thức của học phần.</w:t>
-      </w:r>
-    </w:p>
-    <w:p>
-      <w:pPr>
-        <w:spacing w:before="0" w:line="300" w:lineRule="auto"/>
-        <w:ind w:firstLine="567"/>
-      </w:pPr>
-      <w:r>
-        <w:t xml:space="preserve">Nếu cần bảo vệ trước giảng viên, nhóm có thể giải thích rằng việc chọn một thuật toán mỗi nhóm giúp báo cáo sâu hơn. Thay vì nêu hai thuật toán nhưng phân tích mỏng, báo cáo tập trung vào một đại diện tiêu biểu, phân tích đủ trạng thái, mục tiêu, </w:t>
-      </w:r>
-      <w:r>
-        <w:lastRenderedPageBreak/>
-        <w:t>công thức, độ phức tạp, tính đầy đủ, tối ưu và ứng dụng. Đây là lựa chọn hợp lý khi yêu cầu mới của phần II là mỗi mục một thuật toán.</w:t>
-      </w:r>
-    </w:p>
-    <w:p>
-      <w:pPr>
-        <w:pStyle w:val="Heading2"/>
-        <w:spacing w:before="120"/>
-      </w:pPr>
-      <w:bookmarkStart w:id="16" w:name="_Toc233552843"/>
-      <w:r>
-        <w:rPr>
-          <w:rFonts w:eastAsia="Times New Roman"/>
-        </w:rPr>
-        <w:t>1. Tổng hợp vai trò của sáu thuật toán</w:t>
-      </w:r>
-      <w:bookmarkEnd w:id="16"/>
-    </w:p>
-    <w:p>
-      <w:pPr>
-        <w:spacing w:line="300" w:lineRule="auto"/>
-        <w:ind w:firstLine="567"/>
-      </w:pPr>
-      <w:r>
-        <w:t>Sáu thuật toán trong báo cáo tạo thành một chuỗi tăng dần về mức độ biểu diễn tri thức. DFS bắt đầu từ giả định ít thông tin nhất: tác tử chỉ biết cấu trúc kề của trạng thái và mở rộng theo chiều sâu. A* bổ sung heuristic, làm cho quá trình tìm kiếm có định hướng hơn. Simple Hill Climbing chuyển trọng tâm từ tìm đường sang cải thiện cấu hình. AND-OR Search đưa vào khả năng hành động có nhiều outcome. Forward Checking nhấn mạnh ràng buộc, còn Alpha-Beta Pruning mô hình hóa phản ứng bất lợi.</w:t>
-      </w:r>
-    </w:p>
-    <w:p>
-      <w:pPr>
-        <w:spacing w:line="300" w:lineRule="auto"/>
-        <w:ind w:firstLine="567"/>
-      </w:pPr>
-      <w:r>
-        <w:t>Nếu nhìn theo hệ thống, các thuật toán này không nên được xem như sáu lựa chọn độc lập để thay thế nhau. Chúng có thể nằm ở các tầng khác nhau của cùng một ứng dụng. Một tầng định tuyến dùng A* để tìm đường giữa hai điểm; một tầng kiểm tra dùng Forward Checking để loại phương án vi phạm; một tầng tối ưu cục bộ dùng Simple Hill Climbing để cải thiện thứ tự; một tầng phân tích rủi ro dùng AND-OR hoặc Alpha-Beta để khảo sát tình huống khó.</w:t>
-      </w:r>
-    </w:p>
-    <w:p>
-      <w:pPr>
-        <w:spacing w:line="300" w:lineRule="auto"/>
-        <w:ind w:firstLine="567"/>
-      </w:pPr>
-      <w:r>
-        <w:t>Điều này giúp báo cáo tránh lỗi thường gặp là so sánh thuật toán theo một tiêu chí đơn giản như nhanh hay chậm. DFS có thể nhanh trên graph nhỏ nhưng không tối ưu. A* có thể tối ưu nhưng tốn bộ nhớ. Simple Hill Climbing có thể cải thiện nhanh nhưng dễ kẹt. AND-OR Search giàu mô hình nhưng dễ bùng nổ nhánh. Forward Checking cắt ràng buộc tốt nhưng không tự tối ưu chi phí. Alpha-Beta giảm duyệt cây nhưng cần mô hình utility hợp lý.</w:t>
-      </w:r>
-    </w:p>
-    <w:p>
-      <w:pPr>
-        <w:spacing w:line="300" w:lineRule="auto"/>
-        <w:ind w:firstLine="567"/>
-      </w:pPr>
-      <w:r>
-        <w:t>Từ góc nhìn học thuật, điểm đáng giá không phải là chứng minh một thuật toán thắng toàn bộ các thuật toán còn lại, mà là xác định đúng hoàn cảnh sử dụng. Một thuật toán chỉ có ý nghĩa khi mô hình bài toán phù hợp với giả định của nó. A* cần heuristic; Forward Checking cần biến, miền giá trị và ràng buộc; AND-OR Search cần transition model có nhiều outcome; Alpha-Beta cần cây quyết định và hàm utility.</w:t>
-      </w:r>
-    </w:p>
-    <w:p>
-      <w:pPr>
-        <w:pStyle w:val="Heading2"/>
-        <w:spacing w:before="120"/>
-      </w:pPr>
-      <w:bookmarkStart w:id="17" w:name="_Toc233552844"/>
-      <w:r>
-        <w:rPr>
-          <w:rFonts w:eastAsia="Times New Roman"/>
-        </w:rPr>
-        <w:t>2. Mối liên hệ giữa biểu diễn trạng thái và thuật toán</w:t>
-      </w:r>
-      <w:bookmarkEnd w:id="17"/>
-    </w:p>
-    <w:p>
-      <w:pPr>
-        <w:spacing w:line="300" w:lineRule="auto"/>
-        <w:ind w:firstLine="567"/>
-      </w:pPr>
-      <w:r>
-        <w:t>Biểu diễn trạng thái là cầu nối giữa bài toán thực tế và thuật toán. Nếu trạng thái chỉ gồm vị trí hiện tại, ta có bài toán path finding cổ điển. Nếu trạng thái gồm thêm tập đơn hàng chưa giao, thời gian và tải hiện tại, không gian trạng thái mở rộng rất nhanh. Nếu trạng thái còn chứa thông tin bất định hoặc belief về môi trường, bài toán trở thành lập kế hoạch trong môi trường phức tạp.</w:t>
-      </w:r>
-    </w:p>
-    <w:p>
-      <w:pPr>
-        <w:spacing w:line="300" w:lineRule="auto"/>
-        <w:ind w:firstLine="567"/>
-      </w:pPr>
-      <w:r>
-        <w:lastRenderedPageBreak/>
-        <w:t>DFS và A* dùng biểu diễn trạng thái tương đối gần với graph. Điểm khác biệt là DFS không có thước đo định hướng, còn A* thêm hàm h(n). Vì vậy, chỉ cần thay đổi biểu diễn chi phí và heuristic, hành vi của A* có thể thay đổi đáng kể. Một heuristic tốt giúp giảm node mở rộng; một heuristic sai có thể làm mất bảo đảm tối ưu.</w:t>
-      </w:r>
-    </w:p>
-    <w:p>
-      <w:pPr>
-        <w:spacing w:line="300" w:lineRule="auto"/>
-        <w:ind w:firstLine="567"/>
-      </w:pPr>
-      <w:r>
-        <w:t>Simple Hill Climbing lại yêu cầu trạng thái ở mức cấu hình. Thay vì hỏi node kế tiếp là gì, thuật toán hỏi route hiện tại có thể cải thiện bằng neighbor nào. Do đó, việc định nghĩa neighbor quan trọng không kém hàm cost. Nếu neighbor quá nghèo, thuật toán dễ kẹt; nếu neighbor quá rộng, chi phí mỗi vòng tăng cao.</w:t>
-      </w:r>
-    </w:p>
-    <w:p>
-      <w:pPr>
-        <w:spacing w:line="300" w:lineRule="auto"/>
-        <w:ind w:firstLine="567"/>
-      </w:pPr>
-      <w:r>
-        <w:t>Forward Checking yêu cầu biểu diễn biến và domain. Đây là cách nhìn khác hẳn graph search. Một đơn hàng không còn chỉ là điểm trên bản đồ, mà trở thành biến cần được gán vị trí, thời điểm hoặc shipper. Ràng buộc chuyển thành điều kiện loại giá trị khỏi domain. Nhờ cách biểu diễn này, nhiều phương án sai bị loại trước khi cần tính route chi tiết.</w:t>
-      </w:r>
-    </w:p>
-    <w:p>
-      <w:pPr>
-        <w:spacing w:line="300" w:lineRule="auto"/>
-        <w:ind w:firstLine="567"/>
-      </w:pPr>
-      <w:r>
-        <w:t>AND-OR Search và Alpha-Beta Pruning đòi hỏi mô hình hóa nhánh quyết định. AND-OR cần biết hành động nào có thể tạo outcome nào. Alpha-Beta cần xác định lượt MAX, lượt MIN và utility ở lá. Nếu không xây dựng được mô hình trạng thái phù hợp, hai thuật toán này sẽ trở thành mô tả hình thức. Vì vậy, trong demo, nhóm cần chọn kịch bản nhỏ nhưng rõ để minh họa đúng bản chất.</w:t>
-      </w:r>
-    </w:p>
-    <w:p>
-      <w:pPr>
-        <w:pStyle w:val="Heading2"/>
-        <w:spacing w:before="120"/>
-      </w:pPr>
-      <w:bookmarkStart w:id="18" w:name="_Toc233552845"/>
-      <w:r>
-        <w:rPr>
-          <w:rFonts w:eastAsia="Times New Roman"/>
-        </w:rPr>
-        <w:t>3. Hạn chế và hướng hoàn thiện thực nghiệm</w:t>
-      </w:r>
-      <w:bookmarkEnd w:id="18"/>
-    </w:p>
-    <w:p>
-      <w:pPr>
-        <w:spacing w:line="300" w:lineRule="auto"/>
-        <w:ind w:firstLine="567"/>
-      </w:pPr>
-      <w:r>
-        <w:t>Hạn chế lớn nhất của báo cáo hiện tại là phần thực nghiệm phụ thuộc vào mức độ hoàn thiện của chương trình và dữ liệu demo. Phân tích thuật toán đã đủ để trình bày lý thuyết, nhưng để thuyết phục trong báo cáo cuối kỳ, nhóm cần bổ sung hình ảnh hoặc animation cho từng thuật toán. Mỗi hình nên thể hiện quá trình chứ không chỉ kết quả cuối cùng.</w:t>
-      </w:r>
-    </w:p>
-    <w:p>
-      <w:pPr>
-        <w:spacing w:line="300" w:lineRule="auto"/>
-        <w:ind w:firstLine="567"/>
-      </w:pPr>
-      <w:r>
-        <w:t>Đối với DFS, hướng hoàn thiện là xuất trace cho từng bước mở rộng, bao gồm stack và visited set. Đối với A*, cần xuất open set, closed set, g-score và f-score. Đối với Simple Hill Climbing, cần xuất cost qua từng vòng. Đối với AND-OR Search, cần vẽ conditional plan. Đối với Forward Checking, cần vẽ domain bị thu hẹp. Đối với Alpha-Beta, cần đánh dấu nhánh bị cắt.</w:t>
-      </w:r>
-    </w:p>
-    <w:p>
-      <w:pPr>
-        <w:spacing w:line="300" w:lineRule="auto"/>
-        <w:ind w:firstLine="567"/>
-      </w:pPr>
-      <w:r>
-        <w:t>Một hướng hoàn thiện khác là thống nhất dữ liệu đầu vào giữa các thuật toán ở mức có thể. DFS và A* có thể dùng cùng graph để so sánh tìm kiếm mù và tìm kiếm có thông tin. Simple Hill Climbing có thể dùng output route từ A* làm một phần của cấu hình ban đầu. Forward Checking có thể kiểm tra ràng buộc trên cùng tập đơn hàng. Cách liên kết này giúp báo cáo giống một dự án tổng hợp thay vì sáu ví dụ rời rạc.</w:t>
-      </w:r>
-    </w:p>
-    <w:p>
-      <w:pPr>
-        <w:spacing w:line="300" w:lineRule="auto"/>
-        <w:ind w:firstLine="567"/>
-      </w:pPr>
-      <w:r>
-        <w:lastRenderedPageBreak/>
-        <w:t>Trong phần vấn đáp, nhóm nên chuẩn bị câu trả lời về lý do không chọn hai thuật toán cho mỗi nhóm. Lý do là yêu cầu mới của phần II tập trung vào mỗi mục một thuật toán, nên báo cáo chọn đại diện tiêu biểu và phân tích sâu hơn. Cách này giúp tránh tình trạng liệt kê nhiều thuật toán nhưng không đủ độ sâu về trạng thái, mục tiêu, độ phức tạp và tính chất.</w:t>
-      </w:r>
-    </w:p>
-    <w:p>
-      <w:pPr>
-        <w:spacing w:line="300" w:lineRule="auto"/>
-        <w:ind w:firstLine="567"/>
-      </w:pPr>
-      <w:r>
-        <w:t>Cuối cùng, cần lưu ý rằng độ dài báo cáo không nên đến từ việc lặp lại định nghĩa, mà từ việc phân tích mối liên hệ giữa thuật toán và bài toán. Các đoạn mở rộng trong phần thảo luận phải giải thích được tại sao thuật toán phù hợp, giới hạn của nó là gì và nếu đưa vào hệ thống thực tế thì nên đặt ở tầng nào. Đây là cách làm cho báo cáo dài hơn nhưng vẫn có giá trị học thuật.</w:t>
-      </w:r>
-    </w:p>
-    <w:p>
-      <w:pPr>
-        <w:pStyle w:val="Heading2"/>
-        <w:spacing w:before="120"/>
-      </w:pPr>
-      <w:bookmarkStart w:id="19" w:name="_Toc233552846"/>
-      <w:r>
-        <w:rPr>
-          <w:rFonts w:eastAsia="Times New Roman"/>
-        </w:rPr>
-        <w:t>4. Kịch bản vận hành đề xuất cho Find Your Path</w:t>
-      </w:r>
-      <w:bookmarkEnd w:id="19"/>
-    </w:p>
-    <w:p>
-      <w:pPr>
-        <w:spacing w:line="300" w:lineRule="auto"/>
-        <w:ind w:firstLine="567"/>
-      </w:pPr>
-      <w:r>
-        <w:t>Một cách triển khai hợp lý cho Find Your Path là xem hệ thống như chuỗi nhiều tầng quyết định. Tầng đầu tiên nhận yêu cầu giao hàng, chuẩn hóa vị trí, xác định điểm xuất phát và điểm đích. Tầng thứ hai dùng A* để tính tuyến đường cơ sở trên graph hiện biết. Tầng thứ ba kiểm tra các ràng buộc như deadline, capacity và thứ tự phục vụ bằng Forward Checking. Nếu route hợp lệ, hệ thống có thể trả kết quả; nếu chưa hợp lệ, hệ thống cần điều chỉnh cấu hình hoặc thử phương án khác.</w:t>
-      </w:r>
-    </w:p>
-    <w:p>
-      <w:pPr>
-        <w:spacing w:line="300" w:lineRule="auto"/>
-        <w:ind w:firstLine="567"/>
-      </w:pPr>
-      <w:r>
-        <w:t>Trong kịch bản nhiều đơn hàng, Simple Hill Climbing có thể được đặt trước hoặc sau A*. Nếu đặt trước, thuật toán tạo thứ tự điểm đến sơ bộ, sau đó A* tính chi phí giữa từng cặp điểm. Nếu đặt sau, thuật toán nhận một route ban đầu và thử cải thiện bằng các phép hoán đổi. Cả hai cách đều hợp lý, nhưng báo cáo nên nêu rõ cách nhóm chọn để tránh hiểu nhầm rằng Simple Hill Climbing đang thay thế hoàn toàn A*.</w:t>
-      </w:r>
-    </w:p>
-    <w:p>
-      <w:pPr>
-        <w:spacing w:line="300" w:lineRule="auto"/>
-        <w:ind w:firstLine="567"/>
-      </w:pPr>
-      <w:r>
-        <w:t>AND-OR Search có thể được dùng ở tầng mô phỏng môi trường bất định. Ví dụ, khi hệ thống biết một đoạn đường có xác suất bị chặn, nó có thể tạo kế hoạch gồm nhánh chính và nhánh dự phòng. Nếu đường thông, shipper đi theo route ngắn; nếu đường bị chặn, shipper chuyển sang route thay thế. Cách trình bày này giúp AND-OR Search có vai trò rõ ràng hơn là chỉ một thuật toán lý thuyết.</w:t>
-      </w:r>
-    </w:p>
-    <w:p>
-      <w:pPr>
-        <w:spacing w:line="300" w:lineRule="auto"/>
-        <w:ind w:firstLine="567"/>
-      </w:pPr>
-      <w:r>
-        <w:t>Alpha-Beta Pruning có thể nằm ở tầng đánh giá rủi ro. Khi có nhiều route ứng viên, hệ thống có thể mô phỏng các phản ứng bất lợi của môi trường và chọn route có utility tốt hơn trong trường hợp xấu. Điều này không biến bài toán giao hàng thành trò chơi hoàn chỉnh, nhưng giúp giải thích tại sao tư duy đối kháng vẫn có ý nghĩa trong bài toán vận tải.</w:t>
-      </w:r>
-    </w:p>
-    <w:p>
-      <w:pPr>
-        <w:spacing w:line="300" w:lineRule="auto"/>
-        <w:ind w:firstLine="567"/>
-      </w:pPr>
-      <w:r>
-        <w:t xml:space="preserve">Kịch bản vận hành này cũng cho thấy lý do báo cáo không nên dùng bảng đánh giá đơn giản. Mỗi thuật toán có vị trí khác nhau trong pipeline, nên so sánh trực tiếp theo một thước đo duy nhất sẽ làm nghèo phân tích. Thay vào đó, cần mô tả quan hệ </w:t>
-      </w:r>
-      <w:r>
-        <w:lastRenderedPageBreak/>
-        <w:t>phối hợp: thuật toán nào tạo route, thuật toán nào kiểm tra ràng buộc, thuật toán nào lập kế hoạch dự phòng và thuật toán nào đánh giá rủi ro.</w:t>
-      </w:r>
-    </w:p>
-    <w:p>
-      <w:pPr>
-        <w:spacing w:line="300" w:lineRule="auto"/>
-        <w:ind w:firstLine="567"/>
-      </w:pPr>
-      <w:r>
-        <w:t>Nếu hiện tại project chưa triển khai đầy đủ toàn bộ pipeline, báo cáo vẫn có thể mô tả kịch bản vận hành như định hướng thiết kế. Điều này không làm sai nội dung, miễn là nhóm phân biệt rõ phần đã cài đặt, phần đang mô phỏng và phần đề xuất mở rộng. Trong báo cáo học phần, khả năng phân tích kiến trúc thuật toán cũng quan trọng không kém việc liệt kê chức năng.</w:t>
-      </w:r>
-    </w:p>
-    <w:p>
-      <w:pPr>
-        <w:pStyle w:val="Heading2"/>
-        <w:spacing w:before="120"/>
-      </w:pPr>
-      <w:bookmarkStart w:id="20" w:name="_Toc233552847"/>
-      <w:r>
-        <w:rPr>
-          <w:rFonts w:eastAsia="Times New Roman"/>
-        </w:rPr>
-        <w:t>5. Chuẩn bị luận điểm vấn đáp</w:t>
-      </w:r>
-      <w:bookmarkEnd w:id="20"/>
-    </w:p>
-    <w:p>
-      <w:pPr>
-        <w:spacing w:line="300" w:lineRule="auto"/>
-        <w:ind w:firstLine="567"/>
-      </w:pPr>
-      <w:r>
-        <w:t>Khi vấn đáp về DFS, câu hỏi thường gặp là tại sao chọn DFS nếu thuật toán không tối ưu. Câu trả lời nên là DFS được chọn để đại diện cho nhóm tìm kiếm không thông tin, giúp minh họa cách duyệt sâu và quay lui trong không gian trạng thái. DFS không phải thuật toán tìm tuyến chính của hệ thống, nhưng là nền tảng để hiểu vì sao cần heuristic ở A*.</w:t>
-      </w:r>
-    </w:p>
-    <w:p>
-      <w:pPr>
-        <w:spacing w:line="300" w:lineRule="auto"/>
-        <w:ind w:firstLine="567"/>
-      </w:pPr>
-      <w:r>
-        <w:t>Khi vấn đáp về A*, cần giải thích rõ điều kiện tối ưu. A* không tự động tối ưu trong mọi tình huống; nó tối ưu khi heuristic admissible và chi phí cạnh phù hợp. Nếu heuristic quá tham lam hoặc đánh giá quá cao, thuật toán có thể mất bảo đảm tối ưu. Câu trả lời tốt nên nhắc đến vai trò của g(n), h(n), open set, closed set và parent map.</w:t>
-      </w:r>
-    </w:p>
-    <w:p>
-      <w:pPr>
-        <w:spacing w:line="300" w:lineRule="auto"/>
-        <w:ind w:firstLine="567"/>
-      </w:pPr>
-      <w:r>
-        <w:t>Khi vấn đáp về Simple Hill Climbing, cần tránh nói thuật toán luôn tìm lời giải tốt nhất. Nên thừa nhận thuật toán dễ kẹt local optimum, plateau hoặc ridge. Điểm mạnh của nó là đơn giản, ít tốn bộ nhớ và phù hợp để cải thiện lời giải ban đầu. Nếu giảng viên hỏi vì sao không chọn Simulated Annealing, có thể trả lời rằng yêu cầu mới chỉ chọn một thuật toán mỗi nhóm nên nhóm chọn phiên bản đơn giản để phân tích rõ bản chất local search.</w:t>
-      </w:r>
-    </w:p>
-    <w:p>
-      <w:pPr>
-        <w:spacing w:line="300" w:lineRule="auto"/>
-        <w:ind w:firstLine="567"/>
-      </w:pPr>
-      <w:r>
-        <w:t>Khi vấn đáp về AND-OR Search, cần nhấn mạnh kết quả của thuật toán là conditional plan. Đây là điểm khác biệt lớn nhất so với A*. A* trả một đường đi trên graph đã biết; AND-OR Search trả kế hoạch có nhánh cho các outcome khác nhau. Nếu môi trường deterministic, AND-OR có thể không cần thiết; nếu môi trường bất định, nó biểu diễn được sự không chắc chắn tốt hơn path đơn.</w:t>
-      </w:r>
-    </w:p>
-    <w:p>
-      <w:pPr>
-        <w:spacing w:line="300" w:lineRule="auto"/>
-        <w:ind w:firstLine="567"/>
-      </w:pPr>
-      <w:r>
-        <w:t>Khi vấn đáp về Forward Checking, cần nói rõ thuật toán thuộc nhóm CSP chứ không phải thuật toán tìm đường hình học. Nó làm việc với biến, domain và ràng buộc. Trong Find Your Path, Forward Checking phù hợp để loại các thứ tự giao hàng hoặc phân công chắc chắn vi phạm deadline, capacity hoặc pickup/dropoff. Vì vậy, thuật toán này bổ sung cho A*, không cạnh tranh trực tiếp với A*.</w:t>
-      </w:r>
-    </w:p>
-    <w:p>
-      <w:pPr>
-        <w:spacing w:line="300" w:lineRule="auto"/>
-        <w:ind w:firstLine="567"/>
-      </w:pPr>
-      <w:r>
-        <w:lastRenderedPageBreak/>
-        <w:t>Khi vấn đáp về Alpha-Beta, cần giải thích rằng Alpha-Beta giữ nguyên kết quả Minimax nhưng giảm số node cần duyệt. Alpha và beta là hai ngưỡng giúp nhận biết nhánh nào không còn khả năng ảnh hưởng đến quyết định cuối cùng. Trong bài toán Find Your Path, thuật toán được dùng như mô hình phân tích kịch bản bất lợi, không phải engine định tuyến chính.</w:t>
-      </w:r>
-    </w:p>
-    <w:p>
-      <w:pPr>
-        <w:spacing w:line="300" w:lineRule="auto"/>
-        <w:ind w:firstLine="567"/>
-      </w:pPr>
-      <w:r>
-        <w:t>Một luận điểm tổng quát nên chuẩn bị là sáu thuật toán không được chọn ngẫu nhiên. Chúng tạo thành một bản đồ kiến thức của học phần: tìm kiếm mù, tìm kiếm có thông tin, tìm kiếm cục bộ, lập kế hoạch trong môi trường bất định, thỏa ràng buộc và tìm kiếm đối kháng. Nhờ vậy, báo cáo chứng minh được khả năng liên hệ giữa lý thuyết và bài toán ứng dụng.</w:t>
-      </w:r>
-    </w:p>
-    <w:p>
-      <w:pPr>
-        <w:pStyle w:val="Heading2"/>
-        <w:spacing w:before="120"/>
-      </w:pPr>
-      <w:bookmarkStart w:id="21" w:name="_Toc233552848"/>
-      <w:r>
-        <w:rPr>
-          <w:rFonts w:eastAsia="Times New Roman"/>
-        </w:rPr>
-        <w:t>6. Rủi ro khi trình bày và cách kiểm soát</w:t>
-      </w:r>
-      <w:bookmarkEnd w:id="21"/>
-    </w:p>
-    <w:p>
-      <w:pPr>
-        <w:spacing w:line="300" w:lineRule="auto"/>
-        <w:ind w:firstLine="567"/>
-      </w:pPr>
-      <w:r>
-        <w:t>Rủi ro đầu tiên là dùng thuật ngữ không chính xác. Ví dụ, nếu gọi Online Re-planning là thuật toán độc lập trong khi thực chất nó là cơ chế tổng quát, giảng viên có thể bắt bẻ. Báo cáo hiện tại đã tránh rủi ro đó bằng cách chọn AND-OR Search cho nhóm môi trường phức tạp. Đây là thuật toán rõ ràng hơn và phù hợp với kiến thức thường gặp trong học phần AI.</w:t>
-      </w:r>
-    </w:p>
-    <w:p>
-      <w:pPr>
-        <w:spacing w:line="300" w:lineRule="auto"/>
-        <w:ind w:firstLine="567"/>
-      </w:pPr>
-      <w:r>
-        <w:t>Rủi ro thứ hai là trình bày quá nhiều thuật toán nhưng phân tích mỏng. Khi mỗi nhóm chỉ chọn một thuật toán, báo cáo có điều kiện đi sâu vào trạng thái, mục tiêu, quy trình, công thức, độ phức tạp và tính chất. Cách này tốt hơn việc liệt kê hai thuật toán mỗi nhóm nhưng chỉ viết vài dòng cho mỗi thuật toán.</w:t>
-      </w:r>
-    </w:p>
-    <w:p>
-      <w:pPr>
-        <w:spacing w:line="300" w:lineRule="auto"/>
-        <w:ind w:firstLine="567"/>
-      </w:pPr>
-      <w:r>
-        <w:t>Rủi ro thứ ba là phần đánh giá trông giống văn bản sinh tự động nếu chỉ dùng bảng. Bảng có thể tiện, nhưng dễ làm mất lập luận. Vì vậy, phần thảo luận đã chuyển sang văn xuôi học thuật, trong đó mỗi thuật toán được đặt vào vai trò cụ thể của hệ thống. Cách viết này tự nhiên hơn và phù hợp với báo cáo cuối kỳ hơn.</w:t>
-      </w:r>
-    </w:p>
-    <w:p>
-      <w:pPr>
-        <w:spacing w:line="300" w:lineRule="auto"/>
-        <w:ind w:firstLine="567"/>
-      </w:pPr>
-      <w:r>
-        <w:t>Rủi ro thứ tư là hình minh họa không khớp nội dung. Nếu báo cáo nói về f(n), g(n), h(n) nhưng hình A* chỉ hiển thị đường đi cuối cùng, người đọc sẽ không thấy thuật toán hoạt động. Nếu báo cáo nói Forward Checking cắt domain nhưng hình không thể hiện domain, minh họa sẽ yếu. Vì vậy, mỗi hình cần được thiết kế theo đúng khái niệm thuật toán.</w:t>
-      </w:r>
-    </w:p>
-    <w:p>
-      <w:pPr>
-        <w:spacing w:line="300" w:lineRule="auto"/>
-        <w:ind w:firstLine="567"/>
-      </w:pPr>
-      <w:r>
-        <w:t>Rủi ro thứ năm là số liệu thực nghiệm không ổn định. Thời gian chạy có thể thay đổi theo máy, dữ liệu và cách cài đặt. Để kiểm soát, nhóm nên dùng thêm chỉ tiêu độc lập hơn như số node mở rộng, số neighbor được xét, số giá trị bị loại khỏi domain hoặc số nhánh Alpha-Beta cắt được. Các chỉ tiêu này gắn chặt với bản chất thuật toán.</w:t>
-      </w:r>
-    </w:p>
-    <w:p>
-      <w:pPr>
-        <w:spacing w:line="300" w:lineRule="auto"/>
-        <w:ind w:firstLine="567"/>
-      </w:pPr>
-      <w:r>
-        <w:lastRenderedPageBreak/>
-        <w:t>Rủi ro cuối cùng là báo cáo quá thiên về mô tả project mà thiếu lý thuyết, hoặc quá thiên về lý thuyết mà thiếu liên hệ project. Bản báo cáo cần giữ cân bằng: mỗi thuật toán đều phải có định nghĩa và phân tích, nhưng cũng phải chỉ ra nó nằm ở đâu trong Find Your Path. Đây là điểm làm báo cáo có tính học thuật mà vẫn gắn với sản phẩm.</w:t>
-      </w:r>
-    </w:p>
-    <w:p>
-      <w:pPr>
-        <w:pStyle w:val="Heading2"/>
-        <w:spacing w:before="120"/>
-      </w:pPr>
-      <w:bookmarkStart w:id="22" w:name="_Toc233552849"/>
-      <w:r>
-        <w:rPr>
-          <w:rFonts w:eastAsia="Times New Roman"/>
-        </w:rPr>
-        <w:t>7. Khuyến nghị hoàn thiện báo cáo và slide</w:t>
-      </w:r>
-      <w:bookmarkEnd w:id="22"/>
-    </w:p>
-    <w:p>
-      <w:pPr>
-        <w:spacing w:line="300" w:lineRule="auto"/>
-        <w:ind w:firstLine="567"/>
-      </w:pPr>
-      <w:r>
-        <w:t>Khi chuyển nội dung báo cáo sang slide, nhóm không nên đưa nguyên văn các đoạn phân tích dài vào bản trình chiếu. Slide nên giữ vai trò dẫn dắt vấn đáp: mỗi thuật toán có một slide hoặc một cụm slide thể hiện trực quan trạng thái bắt đầu, quy tắc chọn bước tiếp theo, điều kiện dừng và kết quả minh họa. Báo cáo Word là nơi trình bày lập luận đầy đủ; slide là nơi làm rõ trực giác thuật toán.</w:t>
-      </w:r>
-    </w:p>
-    <w:p>
-      <w:pPr>
-        <w:spacing w:line="300" w:lineRule="auto"/>
-        <w:ind w:firstLine="567"/>
-      </w:pPr>
-      <w:r>
-        <w:t>Với DFS, slide nên nhấn mạnh stack, visited set và quá trình quay lui. Với A*, slide nên có công thức f(n)=g(n)+h(n), nhưng phần hình ảnh phải thể hiện open set và closed set. Với Simple Hill Climbing, slide nên cho thấy cost giảm qua từng vòng. Với AND-OR Search, slide cần cây có OR node và AND node. Với Forward Checking, slide nên dùng domain bị gạch bỏ. Với Alpha-Beta, slide cần màu cắt nhánh rõ ràng.</w:t>
-      </w:r>
-    </w:p>
-    <w:p>
-      <w:pPr>
-        <w:spacing w:line="300" w:lineRule="auto"/>
-        <w:ind w:firstLine="567"/>
-      </w:pPr>
-      <w:r>
-        <w:t>Một khuyến nghị quan trọng là giữ cùng hệ thuật ngữ giữa báo cáo, slide và mã nguồn. Nếu báo cáo gọi thuật toán là Simple Hill Climbing thì slide không nên đổi thành Hill Climbing có sideways move. Nếu báo cáo chọn AND-OR Search thì demo nên có conditional plan thay vì chỉ replan bằng A*. Sự thống nhất này giúp phần vấn đáp mạch lạc hơn.</w:t>
-      </w:r>
-    </w:p>
-    <w:p>
-      <w:pPr>
-        <w:spacing w:line="300" w:lineRule="auto"/>
-        <w:ind w:firstLine="567"/>
-      </w:pPr>
-      <w:r>
-        <w:t>Nhóm cũng nên chuẩn bị một trang tổng kết nói rõ vì sao mỗi nhóm chỉ chọn một thuật toán. Câu trả lời ngắn gọn là yêu cầu phần II tập trung mỗi mục một thuật toán, nên nhóm ưu tiên phân tích sâu thay vì liệt kê rộng. Cách bảo vệ này hợp lý vì báo cáo đã trình bày đầy đủ trạng thái, mục tiêu, công thức, độ phức tạp, tính chất và liên hệ dự án cho từng thuật toán.</w:t>
-      </w:r>
-    </w:p>
-    <w:p>
-      <w:pPr>
-        <w:spacing w:line="300" w:lineRule="auto"/>
-        <w:ind w:firstLine="567"/>
-      </w:pPr>
-      <w:r>
-        <w:t>Sau cùng, báo cáo nên được rà lần cuối theo ba tiêu chí: đúng bố cục giảng viên yêu cầu, đủ chiều sâu học thuật và có khả năng chuyển thành slide trình bày. Nếu một đoạn văn không giúp giải thích thuật toán, không giúp liên hệ Find Your Path hoặc không giúp chuẩn bị vấn đáp, đoạn đó nên được rút gọn. Ngược lại, những phân tích về giới hạn, giả định và điều kiện áp dụng nên được giữ lại vì chúng thể hiện tư duy phản biện.</w:t>
-      </w:r>
-    </w:p>
-    <w:p>
-      <w:pPr>
-        <w:spacing w:line="300" w:lineRule="auto"/>
-        <w:ind w:firstLine="567"/>
-      </w:pPr>
-      <w:r>
-        <w:t xml:space="preserve">Khi ho?n thi?n b?n tr?nh b?y, nh?m n?n chu?n b? th?m m?t slide t?ng h?p lu?ng quy?t ??nh c?a h? th?ng. Slide n?y kh?ng c?n ch?a qu? nhi?u ch?, nh?ng ph?i cho th?y th? t? t? duy: bi?u di?n graph, ch?n thu?t to?n t?m ki?m, ki?m tra r?ng bu?c, x? l? b?t </w:t>
-      </w:r>
-      <w:r>
-        <w:lastRenderedPageBreak/>
-        <w:t>??nh v? ??nh gi? k?ch b?n x?u. N?u ng??i nghe th?y ???c lu?ng n?y, c?c thu?t to?n s? kh?ng c?n l? s?u ph?n r?i r?c.</w:t>
-      </w:r>
-    </w:p>
-    <w:p>
-      <w:pPr>
-        <w:spacing w:line="300" w:lineRule="auto"/>
-        <w:ind w:firstLine="567"/>
-      </w:pPr>
-      <w:r>
-        <w:t>M?t ?i?m c? th? nh?n m?nh trong v?n ??p l? s? kh?c nhau gi?a thu?t to?n ch?y trong ch??ng tr?nh v? thu?t to?n d?ng ?? ph?n t?ch. A* c? th? l? ph?n ch?y r? nh?t trong demo t?m ???ng, c?n AND-OR Search ho?c Alpha-Beta c? th? ???c tr?nh b?y b?ng k?ch b?n m? ph?ng nh?. ?i?u n?y v?n h?p l? n?u nh?m n?i r? ph?m vi ?p d?ng c?a t?ng thu?t to?n.</w:t>
-      </w:r>
-    </w:p>
-    <w:p>
-      <w:pPr>
-        <w:spacing w:line="300" w:lineRule="auto"/>
-        <w:ind w:firstLine="567"/>
-      </w:pPr>
-      <w:r>
-        <w:t>??i v?i b?o c?o Word, nh?m n?n gi? ph?n ph?n t?ch d?i v? ??y l? n?i th? hi?n chi?u s?u. ??i v?i slide, n?i dung n?n ???c r?t th?nh claim ng?n, h?nh minh h?a v? m?t c?u gi?i th?ch. C?ng m?t ? t??ng nh?ng hai h?nh th?c tr?nh b?y kh?c nhau: b?o c?o ?? ??c v? ki?m tra h?c thu?t, slide ?? nghe v? v?n ??p.</w:t>
-      </w:r>
-    </w:p>
-    <w:p>
-      <w:pPr>
-        <w:spacing w:line="300" w:lineRule="auto"/>
-        <w:ind w:firstLine="567"/>
-      </w:pPr>
-      <w:r>
-        <w:t>Cu?i c?ng, nh?m n?n r? l?i to?n b? thu?t ng? tr??c khi n?p. Nh?ng thu?t ng? nh? state, goal, frontier, heuristic, domain, constraint, utility, alpha v? beta c?n ???c d?ng nh?t qu?n. S? nh?t qu?n thu?t ng? th??ng t?o ?n t??ng t?t h?n nhi?u so v?i vi?c th?m qu? nhi?u n?i dung nh?ng m?i ph?n g?i kh?i ni?m theo m?t c?ch kh?c nhau.</w:t>
+        <w:t>Hướng phát triển cuối cùng là cải thiện dữ liệu bản đồ và kịch bản demo. Nếu graph có nhiều trọng số thực tế hơn, A* sẽ có ý nghĩa hơn. Nếu ràng buộc đơn hàng được mô phỏng rõ hơn, Forward Checking sẽ thuyết phục hơn. Nếu môi trường có outcome bất định, AND-OR Search sẽ có đất diễn đúng bản chất. Những cải tiến này nên được ưu tiên sau khi phần báo cáo và slide đã ổn định.</w:t>
       </w:r>
     </w:p>
     <w:p>
@@ -5461,7 +5595,7 @@
         <w:spacing w:before="0"/>
         <w:jc w:val="left"/>
       </w:pPr>
-      <w:bookmarkStart w:id="23" w:name="_Toc233552850"/>
+      <w:bookmarkStart w:id="21" w:name="_Toc233554425"/>
       <w:r>
         <w:rPr>
           <w:rFonts w:eastAsia="Times New Roman"/>
@@ -5469,7 +5603,7 @@
         <w:lastRenderedPageBreak/>
         <w:t>V. Kết luận</w:t>
       </w:r>
-      <w:bookmarkEnd w:id="23"/>
+      <w:bookmarkEnd w:id="21"/>
     </w:p>
     <w:p>
       <w:pPr>
@@ -5514,46 +5648,86 @@
         <w:spacing w:before="0"/>
         <w:jc w:val="left"/>
       </w:pPr>
-      <w:bookmarkStart w:id="24" w:name="_Toc233552851"/>
+      <w:bookmarkStart w:id="22" w:name="_Toc233554426"/>
       <w:r>
         <w:rPr>
           <w:rFonts w:eastAsia="Times New Roman"/>
         </w:rPr>
         <w:lastRenderedPageBreak/>
-        <w:t>Tài liệu tham khảo</w:t>
-      </w:r>
-      <w:bookmarkEnd w:id="24"/>
+        <w:t>TÀI LIỆU THAM KHẢO</w:t>
+      </w:r>
+      <w:bookmarkEnd w:id="22"/>
     </w:p>
     <w:p>
       <w:pPr>
         <w:spacing w:before="0" w:line="300" w:lineRule="auto"/>
-      </w:pPr>
-      <w:r>
-        <w:t>Russell, S. J., &amp; Norvig, P. Artificial Intelligence: A Modern Approach. Pearson.</w:t>
+        <w:ind w:left="454" w:hanging="454"/>
+      </w:pPr>
+      <w:r>
+        <w:t>[1] Russell, S. J., &amp; Norvig, P. Artificial Intelligence: A Modern Approach. Pearson.</w:t>
       </w:r>
     </w:p>
     <w:p>
       <w:pPr>
         <w:spacing w:before="0" w:line="300" w:lineRule="auto"/>
-      </w:pPr>
-      <w:r>
-        <w:t>Tài liệu bài giảng học phần Trí tuệ nhân tạo, Trường Đại học Sư phạm Kỹ thuật TP. Hồ Chí Minh.</w:t>
+        <w:ind w:left="454" w:hanging="454"/>
+      </w:pPr>
+      <w:r>
+        <w:t>[2] Poole, D. L., &amp; Mackworth, A. K. Artificial Intelligence: Foundations of Computational Agents. Cambridge University Press.</w:t>
       </w:r>
     </w:p>
     <w:p>
       <w:pPr>
         <w:spacing w:before="0" w:line="300" w:lineRule="auto"/>
-      </w:pPr>
-      <w:r>
-        <w:t>Tài liệu mã nguồn dự án Find Your Path tại GitHub: https://github.com/zomboXx/FYP.git.</w:t>
+        <w:ind w:left="454" w:hanging="454"/>
+      </w:pPr>
+      <w:r>
+        <w:t>[3] Cormen, T. H., Leiserson, C. E., Rivest, R. L., &amp; Stein, C. Introduction to Algorithms. MIT Press.</w:t>
       </w:r>
     </w:p>
     <w:p>
       <w:pPr>
         <w:spacing w:before="0" w:line="300" w:lineRule="auto"/>
-      </w:pPr>
-      <w:r>
-        <w:t>Python documentation và tài liệu thư viện hỗ trợ xử lý đồ thị, giao diện và kiểm thử trong dự án.</w:t>
+        <w:ind w:left="454" w:hanging="454"/>
+      </w:pPr>
+      <w:r>
+        <w:t>[4] Pearl, J. Heuristics: Intelligent Search Strategies for Computer Problem Solving. Addison-Wesley.</w:t>
+      </w:r>
+    </w:p>
+    <w:p>
+      <w:pPr>
+        <w:spacing w:before="0" w:line="300" w:lineRule="auto"/>
+        <w:ind w:left="454" w:hanging="454"/>
+      </w:pPr>
+      <w:r>
+        <w:t>[5] Tài liệu bài giảng học phần Trí tuệ nhân tạo, Trường Đại học Sư phạm Kỹ thuật TP. Hồ Chí Minh.</w:t>
+      </w:r>
+    </w:p>
+    <w:p>
+      <w:pPr>
+        <w:spacing w:before="0" w:line="300" w:lineRule="auto"/>
+        <w:ind w:left="454" w:hanging="454"/>
+      </w:pPr>
+      <w:r>
+        <w:t>[6] Mã nguồn dự án Find Your Path: https://github.com/zomboXx/FYP.git.</w:t>
+      </w:r>
+    </w:p>
+    <w:p>
+      <w:pPr>
+        <w:spacing w:before="0" w:line="300" w:lineRule="auto"/>
+        <w:ind w:left="454" w:hanging="454"/>
+      </w:pPr>
+      <w:r>
+        <w:t>[7] Python Software Foundation. Python Documentation: https://docs.python.org/3/.</w:t>
+      </w:r>
+    </w:p>
+    <w:p>
+      <w:pPr>
+        <w:spacing w:before="0" w:line="300" w:lineRule="auto"/>
+        <w:ind w:left="454" w:hanging="454"/>
+      </w:pPr>
+      <w:r>
+        <w:t>[8] OpenStreetMap Wiki. Map Features and Routing Concepts: https://wiki.openstreetmap.org/.</w:t>
       </w:r>
     </w:p>
     <w:sectPr>

</xml_diff>

<commit_message>
Unify map status colors
</commit_message>
<xml_diff>
--- a/docs/find-your-path-report.docx
+++ b/docs/find-your-path-report.docx
@@ -1206,7 +1206,7 @@
         <w:rPr>
           <w:noProof/>
         </w:rPr>
-        <w:instrText xml:space="preserve"> PAGEREF _Toc233554404 \h </w:instrText>
+        <w:instrText xml:space="preserve"> PAGEREF _Toc233556086 \h </w:instrText>
       </w:r>
       <w:r>
         <w:rPr>
@@ -1223,7 +1223,7 @@
         <w:rPr>
           <w:noProof/>
         </w:rPr>
-        <w:t>4</w:t>
+        <w:t>1</w:t>
       </w:r>
       <w:r>
         <w:rPr>
@@ -1269,7 +1269,7 @@
         <w:rPr>
           <w:noProof/>
         </w:rPr>
-        <w:instrText xml:space="preserve"> PAGEREF _Toc233554405 \h </w:instrText>
+        <w:instrText xml:space="preserve"> PAGEREF _Toc233556087 \h </w:instrText>
       </w:r>
       <w:r>
         <w:rPr>
@@ -1286,7 +1286,7 @@
         <w:rPr>
           <w:noProof/>
         </w:rPr>
-        <w:t>4</w:t>
+        <w:t>1</w:t>
       </w:r>
       <w:r>
         <w:rPr>
@@ -1332,7 +1332,7 @@
         <w:rPr>
           <w:noProof/>
         </w:rPr>
-        <w:instrText xml:space="preserve"> PAGEREF _Toc233554406 \h </w:instrText>
+        <w:instrText xml:space="preserve"> PAGEREF _Toc233556088 \h </w:instrText>
       </w:r>
       <w:r>
         <w:rPr>
@@ -1349,7 +1349,7 @@
         <w:rPr>
           <w:noProof/>
         </w:rPr>
-        <w:t>5</w:t>
+        <w:t>2</w:t>
       </w:r>
       <w:r>
         <w:rPr>
@@ -1395,7 +1395,7 @@
         <w:rPr>
           <w:noProof/>
         </w:rPr>
-        <w:instrText xml:space="preserve"> PAGEREF _Toc233554407 \h </w:instrText>
+        <w:instrText xml:space="preserve"> PAGEREF _Toc233556089 \h </w:instrText>
       </w:r>
       <w:r>
         <w:rPr>
@@ -1412,7 +1412,7 @@
         <w:rPr>
           <w:noProof/>
         </w:rPr>
-        <w:t>7</w:t>
+        <w:t>4</w:t>
       </w:r>
       <w:r>
         <w:rPr>
@@ -1458,7 +1458,7 @@
         <w:rPr>
           <w:noProof/>
         </w:rPr>
-        <w:instrText xml:space="preserve"> PAGEREF _Toc233554408 \h </w:instrText>
+        <w:instrText xml:space="preserve"> PAGEREF _Toc233556090 \h </w:instrText>
       </w:r>
       <w:r>
         <w:rPr>
@@ -1475,7 +1475,7 @@
         <w:rPr>
           <w:noProof/>
         </w:rPr>
-        <w:t>7</w:t>
+        <w:t>4</w:t>
       </w:r>
       <w:r>
         <w:rPr>
@@ -1521,7 +1521,7 @@
         <w:rPr>
           <w:noProof/>
         </w:rPr>
-        <w:instrText xml:space="preserve"> PAGEREF _Toc233554409 \h </w:instrText>
+        <w:instrText xml:space="preserve"> PAGEREF _Toc233556091 \h </w:instrText>
       </w:r>
       <w:r>
         <w:rPr>
@@ -1538,7 +1538,7 @@
         <w:rPr>
           <w:noProof/>
         </w:rPr>
-        <w:t>9</w:t>
+        <w:t>6</w:t>
       </w:r>
       <w:r>
         <w:rPr>
@@ -1584,7 +1584,7 @@
         <w:rPr>
           <w:noProof/>
         </w:rPr>
-        <w:instrText xml:space="preserve"> PAGEREF _Toc233554410 \h </w:instrText>
+        <w:instrText xml:space="preserve"> PAGEREF _Toc233556092 \h </w:instrText>
       </w:r>
       <w:r>
         <w:rPr>
@@ -1601,7 +1601,7 @@
         <w:rPr>
           <w:noProof/>
         </w:rPr>
-        <w:t>10</w:t>
+        <w:t>7</w:t>
       </w:r>
       <w:r>
         <w:rPr>
@@ -1647,7 +1647,7 @@
         <w:rPr>
           <w:noProof/>
         </w:rPr>
-        <w:instrText xml:space="preserve"> PAGEREF _Toc233554411 \h </w:instrText>
+        <w:instrText xml:space="preserve"> PAGEREF _Toc233556093 \h </w:instrText>
       </w:r>
       <w:r>
         <w:rPr>
@@ -1664,7 +1664,7 @@
         <w:rPr>
           <w:noProof/>
         </w:rPr>
-        <w:t>12</w:t>
+        <w:t>9</w:t>
       </w:r>
       <w:r>
         <w:rPr>
@@ -1710,7 +1710,7 @@
         <w:rPr>
           <w:noProof/>
         </w:rPr>
-        <w:instrText xml:space="preserve"> PAGEREF _Toc233554412 \h </w:instrText>
+        <w:instrText xml:space="preserve"> PAGEREF _Toc233556094 \h </w:instrText>
       </w:r>
       <w:r>
         <w:rPr>
@@ -1727,7 +1727,7 @@
         <w:rPr>
           <w:noProof/>
         </w:rPr>
-        <w:t>14</w:t>
+        <w:t>11</w:t>
       </w:r>
       <w:r>
         <w:rPr>
@@ -1773,7 +1773,7 @@
         <w:rPr>
           <w:noProof/>
         </w:rPr>
-        <w:instrText xml:space="preserve"> PAGEREF _Toc233554413 \h </w:instrText>
+        <w:instrText xml:space="preserve"> PAGEREF _Toc233556095 \h </w:instrText>
       </w:r>
       <w:r>
         <w:rPr>
@@ -1790,7 +1790,7 @@
         <w:rPr>
           <w:noProof/>
         </w:rPr>
-        <w:t>15</w:t>
+        <w:t>12</w:t>
       </w:r>
       <w:r>
         <w:rPr>
@@ -1836,7 +1836,7 @@
         <w:rPr>
           <w:noProof/>
         </w:rPr>
-        <w:instrText xml:space="preserve"> PAGEREF _Toc233554414 \h </w:instrText>
+        <w:instrText xml:space="preserve"> PAGEREF _Toc233556096 \h </w:instrText>
       </w:r>
       <w:r>
         <w:rPr>
@@ -1853,7 +1853,7 @@
         <w:rPr>
           <w:noProof/>
         </w:rPr>
-        <w:t>18</w:t>
+        <w:t>15</w:t>
       </w:r>
       <w:r>
         <w:rPr>
@@ -1899,7 +1899,7 @@
         <w:rPr>
           <w:noProof/>
         </w:rPr>
-        <w:instrText xml:space="preserve"> PAGEREF _Toc233554415 \h </w:instrText>
+        <w:instrText xml:space="preserve"> PAGEREF _Toc233556097 \h </w:instrText>
       </w:r>
       <w:r>
         <w:rPr>
@@ -1916,7 +1916,7 @@
         <w:rPr>
           <w:noProof/>
         </w:rPr>
-        <w:t>18</w:t>
+        <w:t>15</w:t>
       </w:r>
       <w:r>
         <w:rPr>
@@ -1962,7 +1962,7 @@
         <w:rPr>
           <w:noProof/>
         </w:rPr>
-        <w:instrText xml:space="preserve"> PAGEREF _Toc233554416 \h </w:instrText>
+        <w:instrText xml:space="preserve"> PAGEREF _Toc233556098 \h </w:instrText>
       </w:r>
       <w:r>
         <w:rPr>
@@ -1979,7 +1979,7 @@
         <w:rPr>
           <w:noProof/>
         </w:rPr>
-        <w:t>19</w:t>
+        <w:t>16</w:t>
       </w:r>
       <w:r>
         <w:rPr>
@@ -2025,7 +2025,7 @@
         <w:rPr>
           <w:noProof/>
         </w:rPr>
-        <w:instrText xml:space="preserve"> PAGEREF _Toc233554417 \h </w:instrText>
+        <w:instrText xml:space="preserve"> PAGEREF _Toc233556099 \h </w:instrText>
       </w:r>
       <w:r>
         <w:rPr>
@@ -2042,7 +2042,7 @@
         <w:rPr>
           <w:noProof/>
         </w:rPr>
-        <w:t>21</w:t>
+        <w:t>18</w:t>
       </w:r>
       <w:r>
         <w:rPr>
@@ -2088,7 +2088,7 @@
         <w:rPr>
           <w:noProof/>
         </w:rPr>
-        <w:instrText xml:space="preserve"> PAGEREF _Toc233554418 \h </w:instrText>
+        <w:instrText xml:space="preserve"> PAGEREF _Toc233556100 \h </w:instrText>
       </w:r>
       <w:r>
         <w:rPr>
@@ -2105,7 +2105,7 @@
         <w:rPr>
           <w:noProof/>
         </w:rPr>
-        <w:t>22</w:t>
+        <w:t>19</w:t>
       </w:r>
       <w:r>
         <w:rPr>
@@ -2151,7 +2151,7 @@
         <w:rPr>
           <w:noProof/>
         </w:rPr>
-        <w:instrText xml:space="preserve"> PAGEREF _Toc233554419 \h </w:instrText>
+        <w:instrText xml:space="preserve"> PAGEREF _Toc233556101 \h </w:instrText>
       </w:r>
       <w:r>
         <w:rPr>
@@ -2168,7 +2168,7 @@
         <w:rPr>
           <w:noProof/>
         </w:rPr>
-        <w:t>23</w:t>
+        <w:t>20</w:t>
       </w:r>
       <w:r>
         <w:rPr>
@@ -2214,7 +2214,7 @@
         <w:rPr>
           <w:noProof/>
         </w:rPr>
-        <w:instrText xml:space="preserve"> PAGEREF _Toc233554420 \h </w:instrText>
+        <w:instrText xml:space="preserve"> PAGEREF _Toc233556102 \h </w:instrText>
       </w:r>
       <w:r>
         <w:rPr>
@@ -2231,7 +2231,7 @@
         <w:rPr>
           <w:noProof/>
         </w:rPr>
-        <w:t>24</w:t>
+        <w:t>21</w:t>
       </w:r>
       <w:r>
         <w:rPr>
@@ -2277,7 +2277,7 @@
         <w:rPr>
           <w:noProof/>
         </w:rPr>
-        <w:instrText xml:space="preserve"> PAGEREF _Toc233554421 \h </w:instrText>
+        <w:instrText xml:space="preserve"> PAGEREF _Toc233556103 \h </w:instrText>
       </w:r>
       <w:r>
         <w:rPr>
@@ -2294,7 +2294,7 @@
         <w:rPr>
           <w:noProof/>
         </w:rPr>
-        <w:t>26</w:t>
+        <w:t>23</w:t>
       </w:r>
       <w:r>
         <w:rPr>
@@ -2340,7 +2340,7 @@
         <w:rPr>
           <w:noProof/>
         </w:rPr>
-        <w:instrText xml:space="preserve"> PAGEREF _Toc233554422 \h </w:instrText>
+        <w:instrText xml:space="preserve"> PAGEREF _Toc233556104 \h </w:instrText>
       </w:r>
       <w:r>
         <w:rPr>
@@ -2357,7 +2357,7 @@
         <w:rPr>
           <w:noProof/>
         </w:rPr>
-        <w:t>27</w:t>
+        <w:t>24</w:t>
       </w:r>
       <w:r>
         <w:rPr>
@@ -2403,7 +2403,7 @@
         <w:rPr>
           <w:noProof/>
         </w:rPr>
-        <w:instrText xml:space="preserve"> PAGEREF _Toc233554423 \h </w:instrText>
+        <w:instrText xml:space="preserve"> PAGEREF _Toc233556105 \h </w:instrText>
       </w:r>
       <w:r>
         <w:rPr>
@@ -2420,7 +2420,7 @@
         <w:rPr>
           <w:noProof/>
         </w:rPr>
-        <w:t>27</w:t>
+        <w:t>24</w:t>
       </w:r>
       <w:r>
         <w:rPr>
@@ -2466,7 +2466,7 @@
         <w:rPr>
           <w:noProof/>
         </w:rPr>
-        <w:instrText xml:space="preserve"> PAGEREF _Toc233554424 \h </w:instrText>
+        <w:instrText xml:space="preserve"> PAGEREF _Toc233556106 \h </w:instrText>
       </w:r>
       <w:r>
         <w:rPr>
@@ -2483,7 +2483,7 @@
         <w:rPr>
           <w:noProof/>
         </w:rPr>
-        <w:t>28</w:t>
+        <w:t>25</w:t>
       </w:r>
       <w:r>
         <w:rPr>
@@ -2529,7 +2529,7 @@
         <w:rPr>
           <w:noProof/>
         </w:rPr>
-        <w:instrText xml:space="preserve"> PAGEREF _Toc233554425 \h </w:instrText>
+        <w:instrText xml:space="preserve"> PAGEREF _Toc233556107 \h </w:instrText>
       </w:r>
       <w:r>
         <w:rPr>
@@ -2546,7 +2546,7 @@
         <w:rPr>
           <w:noProof/>
         </w:rPr>
-        <w:t>29</w:t>
+        <w:t>26</w:t>
       </w:r>
       <w:r>
         <w:rPr>
@@ -2592,7 +2592,7 @@
         <w:rPr>
           <w:noProof/>
         </w:rPr>
-        <w:instrText xml:space="preserve"> PAGEREF _Toc233554426 \h </w:instrText>
+        <w:instrText xml:space="preserve"> PAGEREF _Toc233556108 \h </w:instrText>
       </w:r>
       <w:r>
         <w:rPr>
@@ -2609,7 +2609,7 @@
         <w:rPr>
           <w:noProof/>
         </w:rPr>
-        <w:t>30</w:t>
+        <w:t>27</w:t>
       </w:r>
       <w:r>
         <w:rPr>
@@ -2620,23 +2620,58 @@
     </w:p>
     <w:p>
       <w:pPr>
+        <w:pStyle w:val="TOC1"/>
+        <w:tabs>
+          <w:tab w:val="right" w:leader="dot" w:pos="9061"/>
+        </w:tabs>
+        <w:rPr>
+          <w:rFonts w:asciiTheme="minorHAnsi" w:eastAsiaTheme="minorEastAsia" w:hAnsiTheme="minorHAnsi" w:cstheme="minorBidi"/>
+          <w:noProof/>
+          <w:kern w:val="2"/>
+          <w:sz w:val="24"/>
+          <w:szCs w:val="24"/>
+          <w14:ligatures w14:val="standardContextual"/>
+        </w:rPr>
+      </w:pPr>
+      <w:r>
+        <w:fldChar w:fldCharType="end"/>
+      </w:r>
+    </w:p>
+    <w:p>
+      <w:pPr>
         <w:pStyle w:val="Heading1"/>
-        <w:pageBreakBefore/>
         <w:spacing w:before="0"/>
         <w:jc w:val="left"/>
-      </w:pPr>
-      <w:r>
         <w:rPr>
           <w:rFonts w:eastAsia="Times New Roman"/>
         </w:rPr>
+        <w:sectPr>
+          <w:headerReference w:type="even" r:id="rId9"/>
+          <w:headerReference w:type="default" r:id="rId10"/>
+          <w:footerReference w:type="even" r:id="rId11"/>
+          <w:footerReference w:type="default" r:id="rId12"/>
+          <w:headerReference w:type="first" r:id="rId13"/>
+          <w:footerReference w:type="first" r:id="rId14"/>
+          <w:pgSz w:w="11906" w:h="16838"/>
+          <w:pgMar w:top="1417" w:right="1134" w:bottom="1417" w:left="1701" w:header="850" w:footer="850" w:gutter="0"/>
+          <w:pgNumType w:start="1"/>
+          <w:cols w:space="720"/>
+          <w:docGrid w:linePitch="360"/>
+        </w:sectPr>
+      </w:pPr>
+    </w:p>
+    <w:p>
+      <w:pPr>
+        <w:pStyle w:val="Heading1"/>
+        <w:spacing w:before="0"/>
+        <w:jc w:val="left"/>
+      </w:pPr>
+      <w:bookmarkStart w:id="0" w:name="_Toc233556086"/>
+      <w:r>
+        <w:rPr>
+          <w:rFonts w:eastAsia="Times New Roman"/>
+        </w:rPr>
         <w:lastRenderedPageBreak/>
-        <w:fldChar w:fldCharType="end"/>
-      </w:r>
-      <w:bookmarkStart w:id="0" w:name="_Toc233554404"/>
-      <w:r>
-        <w:rPr>
-          <w:rFonts w:eastAsia="Times New Roman"/>
-        </w:rPr>
         <w:t>I. Bài toán đặt ra</w:t>
       </w:r>
       <w:bookmarkEnd w:id="0"/>
@@ -2646,7 +2681,7 @@
         <w:pStyle w:val="Heading2"/>
         <w:spacing w:before="120"/>
       </w:pPr>
-      <w:bookmarkStart w:id="1" w:name="_Toc233554405"/>
+      <w:bookmarkStart w:id="1" w:name="_Toc233556087"/>
       <w:r>
         <w:rPr>
           <w:rFonts w:eastAsia="Times New Roman"/>
@@ -2727,7 +2762,7 @@
         <w:pStyle w:val="Heading2"/>
         <w:spacing w:before="120"/>
       </w:pPr>
-      <w:bookmarkStart w:id="2" w:name="_Toc233554406"/>
+      <w:bookmarkStart w:id="2" w:name="_Toc233556088"/>
       <w:r>
         <w:rPr>
           <w:rFonts w:eastAsia="Times New Roman"/>
@@ -2959,7 +2994,7 @@
         <w:spacing w:before="0"/>
         <w:jc w:val="left"/>
       </w:pPr>
-      <w:bookmarkStart w:id="3" w:name="_Toc233554407"/>
+      <w:bookmarkStart w:id="3" w:name="_Toc233556089"/>
       <w:r>
         <w:rPr>
           <w:rFonts w:eastAsia="Times New Roman"/>
@@ -2992,7 +3027,7 @@
         <w:pStyle w:val="Heading2"/>
         <w:spacing w:before="120"/>
       </w:pPr>
-      <w:bookmarkStart w:id="4" w:name="_Toc233554408"/>
+      <w:bookmarkStart w:id="4" w:name="_Toc233556090"/>
       <w:r>
         <w:rPr>
           <w:rFonts w:eastAsia="Times New Roman"/>
@@ -3172,7 +3207,7 @@
         <w:pStyle w:val="Heading2"/>
         <w:spacing w:before="120"/>
       </w:pPr>
-      <w:bookmarkStart w:id="5" w:name="_Toc233554409"/>
+      <w:bookmarkStart w:id="5" w:name="_Toc233556091"/>
       <w:r>
         <w:rPr>
           <w:rFonts w:eastAsia="Times New Roman"/>
@@ -3468,7 +3503,7 @@
         <w:pStyle w:val="Heading2"/>
         <w:spacing w:before="120"/>
       </w:pPr>
-      <w:bookmarkStart w:id="6" w:name="_Toc233554410"/>
+      <w:bookmarkStart w:id="6" w:name="_Toc233556092"/>
       <w:r>
         <w:rPr>
           <w:rFonts w:eastAsia="Times New Roman"/>
@@ -3767,7 +3802,7 @@
         <w:pStyle w:val="Heading2"/>
         <w:spacing w:before="120"/>
       </w:pPr>
-      <w:bookmarkStart w:id="7" w:name="_Toc233554411"/>
+      <w:bookmarkStart w:id="7" w:name="_Toc233556093"/>
       <w:r>
         <w:rPr>
           <w:rFonts w:eastAsia="Times New Roman"/>
@@ -4072,7 +4107,7 @@
         <w:pStyle w:val="Heading2"/>
         <w:spacing w:before="120"/>
       </w:pPr>
-      <w:bookmarkStart w:id="8" w:name="_Toc233554412"/>
+      <w:bookmarkStart w:id="8" w:name="_Toc233556094"/>
       <w:r>
         <w:rPr>
           <w:rFonts w:eastAsia="Times New Roman"/>
@@ -4323,7 +4358,7 @@
         <w:pStyle w:val="Heading2"/>
         <w:spacing w:before="120"/>
       </w:pPr>
-      <w:bookmarkStart w:id="9" w:name="_Toc233554413"/>
+      <w:bookmarkStart w:id="9" w:name="_Toc233556095"/>
       <w:r>
         <w:rPr>
           <w:rFonts w:eastAsia="Times New Roman"/>
@@ -4571,7 +4606,7 @@
         <w:spacing w:before="0"/>
         <w:jc w:val="left"/>
       </w:pPr>
-      <w:bookmarkStart w:id="10" w:name="_Toc233554414"/>
+      <w:bookmarkStart w:id="10" w:name="_Toc233556096"/>
       <w:r>
         <w:rPr>
           <w:rFonts w:eastAsia="Times New Roman"/>
@@ -4604,7 +4639,7 @@
         <w:pStyle w:val="Heading2"/>
         <w:spacing w:before="120"/>
       </w:pPr>
-      <w:bookmarkStart w:id="11" w:name="_Toc233554415"/>
+      <w:bookmarkStart w:id="11" w:name="_Toc233556097"/>
       <w:r>
         <w:rPr>
           <w:rFonts w:eastAsia="Times New Roman"/>
@@ -4738,7 +4773,7 @@
         <w:pStyle w:val="Heading2"/>
         <w:spacing w:before="120"/>
       </w:pPr>
-      <w:bookmarkStart w:id="12" w:name="_Toc233554416"/>
+      <w:bookmarkStart w:id="12" w:name="_Toc233556098"/>
       <w:r>
         <w:rPr>
           <w:rFonts w:eastAsia="Times New Roman"/>
@@ -4878,7 +4913,7 @@
         <w:pStyle w:val="Heading2"/>
         <w:spacing w:before="120"/>
       </w:pPr>
-      <w:bookmarkStart w:id="13" w:name="_Toc233554417"/>
+      <w:bookmarkStart w:id="13" w:name="_Toc233556099"/>
       <w:r>
         <w:rPr>
           <w:rFonts w:eastAsia="Times New Roman"/>
@@ -5010,7 +5045,7 @@
         <w:pStyle w:val="Heading2"/>
         <w:spacing w:before="120"/>
       </w:pPr>
-      <w:bookmarkStart w:id="14" w:name="_Toc233554418"/>
+      <w:bookmarkStart w:id="14" w:name="_Toc233556100"/>
       <w:r>
         <w:rPr>
           <w:rFonts w:eastAsia="Times New Roman"/>
@@ -5144,7 +5179,7 @@
         <w:pStyle w:val="Heading2"/>
         <w:spacing w:before="120"/>
       </w:pPr>
-      <w:bookmarkStart w:id="15" w:name="_Toc233554419"/>
+      <w:bookmarkStart w:id="15" w:name="_Toc233556101"/>
       <w:r>
         <w:rPr>
           <w:rFonts w:eastAsia="Times New Roman"/>
@@ -5275,7 +5310,7 @@
         <w:pStyle w:val="Heading2"/>
         <w:spacing w:before="120"/>
       </w:pPr>
-      <w:bookmarkStart w:id="16" w:name="_Toc233554420"/>
+      <w:bookmarkStart w:id="16" w:name="_Toc233556102"/>
       <w:r>
         <w:rPr>
           <w:rFonts w:eastAsia="Times New Roman"/>
@@ -5413,7 +5448,7 @@
         <w:pStyle w:val="Heading2"/>
         <w:spacing w:before="120"/>
       </w:pPr>
-      <w:bookmarkStart w:id="17" w:name="_Toc233554421"/>
+      <w:bookmarkStart w:id="17" w:name="_Toc233556103"/>
       <w:r>
         <w:rPr>
           <w:rFonts w:eastAsia="Times New Roman"/>
@@ -5447,7 +5482,7 @@
         <w:spacing w:before="0"/>
         <w:jc w:val="left"/>
       </w:pPr>
-      <w:bookmarkStart w:id="18" w:name="_Toc233554422"/>
+      <w:bookmarkStart w:id="18" w:name="_Toc233556104"/>
       <w:r>
         <w:rPr>
           <w:rFonts w:eastAsia="Times New Roman"/>
@@ -5471,7 +5506,7 @@
         <w:pStyle w:val="Heading2"/>
         <w:spacing w:before="120"/>
       </w:pPr>
-      <w:bookmarkStart w:id="19" w:name="_Toc233554423"/>
+      <w:bookmarkStart w:id="19" w:name="_Toc233556105"/>
       <w:r>
         <w:rPr>
           <w:rFonts w:eastAsia="Times New Roman"/>
@@ -5543,7 +5578,7 @@
         <w:pStyle w:val="Heading2"/>
         <w:spacing w:before="120"/>
       </w:pPr>
-      <w:bookmarkStart w:id="20" w:name="_Toc233554424"/>
+      <w:bookmarkStart w:id="20" w:name="_Toc233556106"/>
       <w:r>
         <w:rPr>
           <w:rFonts w:eastAsia="Times New Roman"/>
@@ -5595,7 +5630,7 @@
         <w:spacing w:before="0"/>
         <w:jc w:val="left"/>
       </w:pPr>
-      <w:bookmarkStart w:id="21" w:name="_Toc233554425"/>
+      <w:bookmarkStart w:id="21" w:name="_Toc233556107"/>
       <w:r>
         <w:rPr>
           <w:rFonts w:eastAsia="Times New Roman"/>
@@ -5648,7 +5683,7 @@
         <w:spacing w:before="0"/>
         <w:jc w:val="left"/>
       </w:pPr>
-      <w:bookmarkStart w:id="22" w:name="_Toc233554426"/>
+      <w:bookmarkStart w:id="22" w:name="_Toc233556108"/>
       <w:r>
         <w:rPr>
           <w:rFonts w:eastAsia="Times New Roman"/>
@@ -5731,8 +5766,9 @@
       </w:r>
     </w:p>
     <w:sectPr>
-      <w:headerReference w:type="default" r:id="rId9"/>
-      <w:footerReference w:type="default" r:id="rId10"/>
+      <w:footerReference w:type="even" r:id="rId15"/>
+      <w:footerReference w:type="default" r:id="rId16"/>
+      <w:footerReference w:type="first" r:id="rId17"/>
       <w:pgSz w:w="11906" w:h="16838"/>
       <w:pgMar w:top="1417" w:right="1134" w:bottom="1417" w:left="1701" w:header="850" w:footer="850" w:gutter="0"/>
       <w:pgNumType w:start="1"/>
@@ -5773,27 +5809,134 @@
   <w:p>
     <w:pPr>
       <w:pStyle w:val="Footer"/>
+    </w:pPr>
+  </w:p>
+</w:ftr>
+</file>
+
+<file path=word/footer2.xml><?xml version="1.0" encoding="utf-8"?>
+<w:ftr xmlns:wpc="http://schemas.microsoft.com/office/word/2010/wordprocessingCanvas" xmlns:cx="http://schemas.microsoft.com/office/drawing/2014/chartex" xmlns:cx1="http://schemas.microsoft.com/office/drawing/2015/9/8/chartex" xmlns:cx2="http://schemas.microsoft.com/office/drawing/2015/10/21/chartex" xmlns:cx3="http://schemas.microsoft.com/office/drawing/2016/5/9/chartex" xmlns:cx4="http://schemas.microsoft.com/office/drawing/2016/5/10/chartex" xmlns:cx5="http://schemas.microsoft.com/office/drawing/2016/5/11/chartex" xmlns:cx6="http://schemas.microsoft.com/office/drawing/2016/5/12/chartex" xmlns:cx7="http://schemas.microsoft.com/office/drawing/2016/5/13/chartex" xmlns:cx8="http://schemas.microsoft.com/office/drawing/2016/5/14/chartex" xmlns:mc="http://schemas.openxmlformats.org/markup-compatibility/2006" xmlns:aink="http://schemas.microsoft.com/office/drawing/2016/ink" xmlns:am3d="http://schemas.microsoft.com/office/drawing/2017/model3d" xmlns:o="urn:schemas-microsoft-com:office:office" xmlns:oel="http://schemas.microsoft.com/office/2019/extlst" xmlns:r="http://schemas.openxmlformats.org/officeDocument/2006/relationships" xmlns:m="http://schemas.openxmlformats.org/officeDocument/2006/math" xmlns:v="urn:schemas-microsoft-com:vml" xmlns:wp14="http://schemas.microsoft.com/office/word/2010/wordprocessingDrawing" xmlns:wp="http://schemas.openxmlformats.org/drawingml/2006/wordprocessingDrawing" xmlns:w10="urn:schemas-microsoft-com:office:word" xmlns:w="http://schemas.openxmlformats.org/wordprocessingml/2006/main" xmlns:w14="http://schemas.microsoft.com/office/word/2010/wordml" xmlns:w15="http://schemas.microsoft.com/office/word/2012/wordml" xmlns:w16cex="http://schemas.microsoft.com/office/word/2018/wordml/cex" xmlns:w16cid="http://schemas.microsoft.com/office/word/2016/wordml/cid" xmlns:w16="http://schemas.microsoft.com/office/word/2018/wordml" xmlns:w16du="http://schemas.microsoft.com/office/word/2023/wordml/word16du" xmlns:w16sdtdh="http://schemas.microsoft.com/office/word/2020/wordml/sdtdatahash" xmlns:w16sdtfl="http://schemas.microsoft.com/office/word/2024/wordml/sdtformatlock" xmlns:w16se="http://schemas.microsoft.com/office/word/2015/wordml/symex" xmlns:wpg="http://schemas.microsoft.com/office/word/2010/wordprocessingGroup" xmlns:wpi="http://schemas.microsoft.com/office/word/2010/wordprocessingInk" xmlns:wne="http://schemas.microsoft.com/office/word/2006/wordml" xmlns:wps="http://schemas.microsoft.com/office/word/2010/wordprocessingShape" mc:Ignorable="w14 w15 w16se w16cid w16 w16cex w16sdtdh w16sdtfl w16du wp14">
+  <w:p>
+    <w:pPr>
+      <w:pStyle w:val="Footer"/>
       <w:ind w:firstLine="0"/>
       <w:jc w:val="center"/>
     </w:pPr>
+  </w:p>
+</w:ftr>
+</file>
+
+<file path=word/footer3.xml><?xml version="1.0" encoding="utf-8"?>
+<w:ftr xmlns:wpc="http://schemas.microsoft.com/office/word/2010/wordprocessingCanvas" xmlns:cx="http://schemas.microsoft.com/office/drawing/2014/chartex" xmlns:cx1="http://schemas.microsoft.com/office/drawing/2015/9/8/chartex" xmlns:cx2="http://schemas.microsoft.com/office/drawing/2015/10/21/chartex" xmlns:cx3="http://schemas.microsoft.com/office/drawing/2016/5/9/chartex" xmlns:cx4="http://schemas.microsoft.com/office/drawing/2016/5/10/chartex" xmlns:cx5="http://schemas.microsoft.com/office/drawing/2016/5/11/chartex" xmlns:cx6="http://schemas.microsoft.com/office/drawing/2016/5/12/chartex" xmlns:cx7="http://schemas.microsoft.com/office/drawing/2016/5/13/chartex" xmlns:cx8="http://schemas.microsoft.com/office/drawing/2016/5/14/chartex" xmlns:mc="http://schemas.openxmlformats.org/markup-compatibility/2006" xmlns:aink="http://schemas.microsoft.com/office/drawing/2016/ink" xmlns:am3d="http://schemas.microsoft.com/office/drawing/2017/model3d" xmlns:o="urn:schemas-microsoft-com:office:office" xmlns:oel="http://schemas.microsoft.com/office/2019/extlst" xmlns:r="http://schemas.openxmlformats.org/officeDocument/2006/relationships" xmlns:m="http://schemas.openxmlformats.org/officeDocument/2006/math" xmlns:v="urn:schemas-microsoft-com:vml" xmlns:wp14="http://schemas.microsoft.com/office/word/2010/wordprocessingDrawing" xmlns:wp="http://schemas.openxmlformats.org/drawingml/2006/wordprocessingDrawing" xmlns:w10="urn:schemas-microsoft-com:office:word" xmlns:w="http://schemas.openxmlformats.org/wordprocessingml/2006/main" xmlns:w14="http://schemas.microsoft.com/office/word/2010/wordml" xmlns:w15="http://schemas.microsoft.com/office/word/2012/wordml" xmlns:w16cex="http://schemas.microsoft.com/office/word/2018/wordml/cex" xmlns:w16cid="http://schemas.microsoft.com/office/word/2016/wordml/cid" xmlns:w16="http://schemas.microsoft.com/office/word/2018/wordml" xmlns:w16du="http://schemas.microsoft.com/office/word/2023/wordml/word16du" xmlns:w16sdtdh="http://schemas.microsoft.com/office/word/2020/wordml/sdtdatahash" xmlns:w16sdtfl="http://schemas.microsoft.com/office/word/2024/wordml/sdtformatlock" xmlns:w16se="http://schemas.microsoft.com/office/word/2015/wordml/symex" xmlns:wpg="http://schemas.microsoft.com/office/word/2010/wordprocessingGroup" xmlns:wpi="http://schemas.microsoft.com/office/word/2010/wordprocessingInk" xmlns:wne="http://schemas.microsoft.com/office/word/2006/wordml" xmlns:wps="http://schemas.microsoft.com/office/word/2010/wordprocessingShape" mc:Ignorable="w14 w15 w16se w16cid w16 w16cex w16sdtdh w16sdtfl w16du wp14">
+  <w:p>
+    <w:pPr>
+      <w:pStyle w:val="Footer"/>
+    </w:pPr>
+  </w:p>
+</w:ftr>
+</file>
+
+<file path=word/footer4.xml><?xml version="1.0" encoding="utf-8"?>
+<w:ftr xmlns:wpc="http://schemas.microsoft.com/office/word/2010/wordprocessingCanvas" xmlns:cx="http://schemas.microsoft.com/office/drawing/2014/chartex" xmlns:cx1="http://schemas.microsoft.com/office/drawing/2015/9/8/chartex" xmlns:cx2="http://schemas.microsoft.com/office/drawing/2015/10/21/chartex" xmlns:cx3="http://schemas.microsoft.com/office/drawing/2016/5/9/chartex" xmlns:cx4="http://schemas.microsoft.com/office/drawing/2016/5/10/chartex" xmlns:cx5="http://schemas.microsoft.com/office/drawing/2016/5/11/chartex" xmlns:cx6="http://schemas.microsoft.com/office/drawing/2016/5/12/chartex" xmlns:cx7="http://schemas.microsoft.com/office/drawing/2016/5/13/chartex" xmlns:cx8="http://schemas.microsoft.com/office/drawing/2016/5/14/chartex" xmlns:mc="http://schemas.openxmlformats.org/markup-compatibility/2006" xmlns:aink="http://schemas.microsoft.com/office/drawing/2016/ink" xmlns:am3d="http://schemas.microsoft.com/office/drawing/2017/model3d" xmlns:o="urn:schemas-microsoft-com:office:office" xmlns:oel="http://schemas.microsoft.com/office/2019/extlst" xmlns:r="http://schemas.openxmlformats.org/officeDocument/2006/relationships" xmlns:m="http://schemas.openxmlformats.org/officeDocument/2006/math" xmlns:v="urn:schemas-microsoft-com:vml" xmlns:wp14="http://schemas.microsoft.com/office/word/2010/wordprocessingDrawing" xmlns:wp="http://schemas.openxmlformats.org/drawingml/2006/wordprocessingDrawing" xmlns:w10="urn:schemas-microsoft-com:office:word" xmlns:w="http://schemas.openxmlformats.org/wordprocessingml/2006/main" xmlns:w14="http://schemas.microsoft.com/office/word/2010/wordml" xmlns:w15="http://schemas.microsoft.com/office/word/2012/wordml" xmlns:w16cex="http://schemas.microsoft.com/office/word/2018/wordml/cex" xmlns:w16cid="http://schemas.microsoft.com/office/word/2016/wordml/cid" xmlns:w16="http://schemas.microsoft.com/office/word/2018/wordml" xmlns:w16du="http://schemas.microsoft.com/office/word/2023/wordml/word16du" xmlns:w16sdtdh="http://schemas.microsoft.com/office/word/2020/wordml/sdtdatahash" xmlns:w16sdtfl="http://schemas.microsoft.com/office/word/2024/wordml/sdtformatlock" xmlns:w16se="http://schemas.microsoft.com/office/word/2015/wordml/symex" xmlns:wpg="http://schemas.microsoft.com/office/word/2010/wordprocessingGroup" xmlns:wpi="http://schemas.microsoft.com/office/word/2010/wordprocessingInk" xmlns:wne="http://schemas.microsoft.com/office/word/2006/wordml" xmlns:wps="http://schemas.microsoft.com/office/word/2010/wordprocessingShape" mc:Ignorable="w14 w15 w16se w16cid w16 w16cex w16sdtdh w16sdtfl w16du wp14">
+  <w:p>
+    <w:pPr>
+      <w:pStyle w:val="Footer"/>
+      <w:framePr w:wrap="around" w:vAnchor="text" w:hAnchor="margin" w:xAlign="center" w:y="1"/>
+      <w:rPr>
+        <w:rStyle w:val="PageNumber"/>
+      </w:rPr>
+    </w:pPr>
     <w:r>
+      <w:rPr>
+        <w:rStyle w:val="PageNumber"/>
+      </w:rPr>
       <w:fldChar w:fldCharType="begin"/>
     </w:r>
     <w:r>
-      <w:instrText xml:space="preserve"> PAGE   \* MERGEFORMAT </w:instrText>
+      <w:rPr>
+        <w:rStyle w:val="PageNumber"/>
+      </w:rPr>
+      <w:instrText xml:space="preserve"> PAGE </w:instrText>
     </w:r>
     <w:r>
+      <w:rPr>
+        <w:rStyle w:val="PageNumber"/>
+      </w:rPr>
       <w:fldChar w:fldCharType="separate"/>
     </w:r>
     <w:r>
       <w:rPr>
-        <w:color w:val="000000"/>
-      </w:rPr>
-      <w:t>1</w:t>
+        <w:rStyle w:val="PageNumber"/>
+      </w:rPr>
+      <w:fldChar w:fldCharType="end"/>
+    </w:r>
+  </w:p>
+  <w:p>
+    <w:pPr>
+      <w:pStyle w:val="Footer"/>
+    </w:pPr>
+  </w:p>
+</w:ftr>
+</file>
+
+<file path=word/footer5.xml><?xml version="1.0" encoding="utf-8"?>
+<w:ftr xmlns:wpc="http://schemas.microsoft.com/office/word/2010/wordprocessingCanvas" xmlns:cx="http://schemas.microsoft.com/office/drawing/2014/chartex" xmlns:cx1="http://schemas.microsoft.com/office/drawing/2015/9/8/chartex" xmlns:cx2="http://schemas.microsoft.com/office/drawing/2015/10/21/chartex" xmlns:cx3="http://schemas.microsoft.com/office/drawing/2016/5/9/chartex" xmlns:cx4="http://schemas.microsoft.com/office/drawing/2016/5/10/chartex" xmlns:cx5="http://schemas.microsoft.com/office/drawing/2016/5/11/chartex" xmlns:cx6="http://schemas.microsoft.com/office/drawing/2016/5/12/chartex" xmlns:cx7="http://schemas.microsoft.com/office/drawing/2016/5/13/chartex" xmlns:cx8="http://schemas.microsoft.com/office/drawing/2016/5/14/chartex" xmlns:mc="http://schemas.openxmlformats.org/markup-compatibility/2006" xmlns:aink="http://schemas.microsoft.com/office/drawing/2016/ink" xmlns:am3d="http://schemas.microsoft.com/office/drawing/2017/model3d" xmlns:o="urn:schemas-microsoft-com:office:office" xmlns:oel="http://schemas.microsoft.com/office/2019/extlst" xmlns:r="http://schemas.openxmlformats.org/officeDocument/2006/relationships" xmlns:m="http://schemas.openxmlformats.org/officeDocument/2006/math" xmlns:v="urn:schemas-microsoft-com:vml" xmlns:wp14="http://schemas.microsoft.com/office/word/2010/wordprocessingDrawing" xmlns:wp="http://schemas.openxmlformats.org/drawingml/2006/wordprocessingDrawing" xmlns:w10="urn:schemas-microsoft-com:office:word" xmlns:w="http://schemas.openxmlformats.org/wordprocessingml/2006/main" xmlns:w14="http://schemas.microsoft.com/office/word/2010/wordml" xmlns:w15="http://schemas.microsoft.com/office/word/2012/wordml" xmlns:w16cex="http://schemas.microsoft.com/office/word/2018/wordml/cex" xmlns:w16cid="http://schemas.microsoft.com/office/word/2016/wordml/cid" xmlns:w16="http://schemas.microsoft.com/office/word/2018/wordml" xmlns:w16du="http://schemas.microsoft.com/office/word/2023/wordml/word16du" xmlns:w16sdtdh="http://schemas.microsoft.com/office/word/2020/wordml/sdtdatahash" xmlns:w16sdtfl="http://schemas.microsoft.com/office/word/2024/wordml/sdtformatlock" xmlns:w16se="http://schemas.microsoft.com/office/word/2015/wordml/symex" xmlns:wpg="http://schemas.microsoft.com/office/word/2010/wordprocessingGroup" xmlns:wpi="http://schemas.microsoft.com/office/word/2010/wordprocessingInk" xmlns:wne="http://schemas.microsoft.com/office/word/2006/wordml" xmlns:wps="http://schemas.microsoft.com/office/word/2010/wordprocessingShape" mc:Ignorable="w14 w15 w16se w16cid w16 w16cex w16sdtdh w16sdtfl w16du wp14">
+  <w:p>
+    <w:pPr>
+      <w:pStyle w:val="Footer"/>
+      <w:framePr w:wrap="around" w:vAnchor="text" w:hAnchor="margin" w:xAlign="center" w:y="1"/>
+      <w:rPr>
+        <w:rStyle w:val="PageNumber"/>
+      </w:rPr>
+    </w:pPr>
+    <w:r>
+      <w:rPr>
+        <w:rStyle w:val="PageNumber"/>
+      </w:rPr>
+      <w:fldChar w:fldCharType="begin"/>
     </w:r>
     <w:r>
+      <w:rPr>
+        <w:rStyle w:val="PageNumber"/>
+      </w:rPr>
+      <w:instrText xml:space="preserve"> PAGE </w:instrText>
+    </w:r>
+    <w:r>
+      <w:rPr>
+        <w:rStyle w:val="PageNumber"/>
+      </w:rPr>
+      <w:fldChar w:fldCharType="separate"/>
+    </w:r>
+    <w:r>
+      <w:rPr>
+        <w:rStyle w:val="PageNumber"/>
+        <w:noProof/>
+      </w:rPr>
+      <w:t>2</w:t>
+    </w:r>
+    <w:r>
+      <w:rPr>
+        <w:rStyle w:val="PageNumber"/>
+      </w:rPr>
       <w:fldChar w:fldCharType="end"/>
     </w:r>
+  </w:p>
+  <w:p>
+    <w:pPr>
+      <w:pStyle w:val="Footer"/>
+      <w:ind w:firstLine="0"/>
+      <w:jc w:val="center"/>
+    </w:pPr>
+  </w:p>
+</w:ftr>
+</file>
+
+<file path=word/footer6.xml><?xml version="1.0" encoding="utf-8"?>
+<w:ftr xmlns:wpc="http://schemas.microsoft.com/office/word/2010/wordprocessingCanvas" xmlns:cx="http://schemas.microsoft.com/office/drawing/2014/chartex" xmlns:cx1="http://schemas.microsoft.com/office/drawing/2015/9/8/chartex" xmlns:cx2="http://schemas.microsoft.com/office/drawing/2015/10/21/chartex" xmlns:cx3="http://schemas.microsoft.com/office/drawing/2016/5/9/chartex" xmlns:cx4="http://schemas.microsoft.com/office/drawing/2016/5/10/chartex" xmlns:cx5="http://schemas.microsoft.com/office/drawing/2016/5/11/chartex" xmlns:cx6="http://schemas.microsoft.com/office/drawing/2016/5/12/chartex" xmlns:cx7="http://schemas.microsoft.com/office/drawing/2016/5/13/chartex" xmlns:cx8="http://schemas.microsoft.com/office/drawing/2016/5/14/chartex" xmlns:mc="http://schemas.openxmlformats.org/markup-compatibility/2006" xmlns:aink="http://schemas.microsoft.com/office/drawing/2016/ink" xmlns:am3d="http://schemas.microsoft.com/office/drawing/2017/model3d" xmlns:o="urn:schemas-microsoft-com:office:office" xmlns:oel="http://schemas.microsoft.com/office/2019/extlst" xmlns:r="http://schemas.openxmlformats.org/officeDocument/2006/relationships" xmlns:m="http://schemas.openxmlformats.org/officeDocument/2006/math" xmlns:v="urn:schemas-microsoft-com:vml" xmlns:wp14="http://schemas.microsoft.com/office/word/2010/wordprocessingDrawing" xmlns:wp="http://schemas.openxmlformats.org/drawingml/2006/wordprocessingDrawing" xmlns:w10="urn:schemas-microsoft-com:office:word" xmlns:w="http://schemas.openxmlformats.org/wordprocessingml/2006/main" xmlns:w14="http://schemas.microsoft.com/office/word/2010/wordml" xmlns:w15="http://schemas.microsoft.com/office/word/2012/wordml" xmlns:w16cex="http://schemas.microsoft.com/office/word/2018/wordml/cex" xmlns:w16cid="http://schemas.microsoft.com/office/word/2016/wordml/cid" xmlns:w16="http://schemas.microsoft.com/office/word/2018/wordml" xmlns:w16du="http://schemas.microsoft.com/office/word/2023/wordml/word16du" xmlns:w16sdtdh="http://schemas.microsoft.com/office/word/2020/wordml/sdtdatahash" xmlns:w16sdtfl="http://schemas.microsoft.com/office/word/2024/wordml/sdtformatlock" xmlns:w16se="http://schemas.microsoft.com/office/word/2015/wordml/symex" xmlns:wpg="http://schemas.microsoft.com/office/word/2010/wordprocessingGroup" xmlns:wpi="http://schemas.microsoft.com/office/word/2010/wordprocessingInk" xmlns:wne="http://schemas.microsoft.com/office/word/2006/wordml" xmlns:wps="http://schemas.microsoft.com/office/word/2010/wordprocessingShape" mc:Ignorable="w14 w15 w16se w16cid w16 w16cex w16sdtdh w16sdtfl w16du wp14">
+  <w:p>
+    <w:pPr>
+      <w:pStyle w:val="Footer"/>
+    </w:pPr>
   </w:p>
 </w:ftr>
 </file>
@@ -5824,6 +5967,26 @@
 </file>
 
 <file path=word/header1.xml><?xml version="1.0" encoding="utf-8"?>
+<w:hdr xmlns:wpc="http://schemas.microsoft.com/office/word/2010/wordprocessingCanvas" xmlns:cx="http://schemas.microsoft.com/office/drawing/2014/chartex" xmlns:cx1="http://schemas.microsoft.com/office/drawing/2015/9/8/chartex" xmlns:cx2="http://schemas.microsoft.com/office/drawing/2015/10/21/chartex" xmlns:cx3="http://schemas.microsoft.com/office/drawing/2016/5/9/chartex" xmlns:cx4="http://schemas.microsoft.com/office/drawing/2016/5/10/chartex" xmlns:cx5="http://schemas.microsoft.com/office/drawing/2016/5/11/chartex" xmlns:cx6="http://schemas.microsoft.com/office/drawing/2016/5/12/chartex" xmlns:cx7="http://schemas.microsoft.com/office/drawing/2016/5/13/chartex" xmlns:cx8="http://schemas.microsoft.com/office/drawing/2016/5/14/chartex" xmlns:mc="http://schemas.openxmlformats.org/markup-compatibility/2006" xmlns:aink="http://schemas.microsoft.com/office/drawing/2016/ink" xmlns:am3d="http://schemas.microsoft.com/office/drawing/2017/model3d" xmlns:o="urn:schemas-microsoft-com:office:office" xmlns:oel="http://schemas.microsoft.com/office/2019/extlst" xmlns:r="http://schemas.openxmlformats.org/officeDocument/2006/relationships" xmlns:m="http://schemas.openxmlformats.org/officeDocument/2006/math" xmlns:v="urn:schemas-microsoft-com:vml" xmlns:wp14="http://schemas.microsoft.com/office/word/2010/wordprocessingDrawing" xmlns:wp="http://schemas.openxmlformats.org/drawingml/2006/wordprocessingDrawing" xmlns:w10="urn:schemas-microsoft-com:office:word" xmlns:w="http://schemas.openxmlformats.org/wordprocessingml/2006/main" xmlns:w14="http://schemas.microsoft.com/office/word/2010/wordml" xmlns:w15="http://schemas.microsoft.com/office/word/2012/wordml" xmlns:w16cex="http://schemas.microsoft.com/office/word/2018/wordml/cex" xmlns:w16cid="http://schemas.microsoft.com/office/word/2016/wordml/cid" xmlns:w16="http://schemas.microsoft.com/office/word/2018/wordml" xmlns:w16du="http://schemas.microsoft.com/office/word/2023/wordml/word16du" xmlns:w16sdtdh="http://schemas.microsoft.com/office/word/2020/wordml/sdtdatahash" xmlns:w16sdtfl="http://schemas.microsoft.com/office/word/2024/wordml/sdtformatlock" xmlns:w16se="http://schemas.microsoft.com/office/word/2015/wordml/symex" xmlns:wpg="http://schemas.microsoft.com/office/word/2010/wordprocessingGroup" xmlns:wpi="http://schemas.microsoft.com/office/word/2010/wordprocessingInk" xmlns:wne="http://schemas.microsoft.com/office/word/2006/wordml" xmlns:wps="http://schemas.microsoft.com/office/word/2010/wordprocessingShape" mc:Ignorable="w14 w15 w16se w16cid w16 w16cex w16sdtdh w16sdtfl w16du wp14">
+  <w:p>
+    <w:pPr>
+      <w:pStyle w:val="Header"/>
+    </w:pPr>
+  </w:p>
+</w:hdr>
+</file>
+
+<file path=word/header2.xml><?xml version="1.0" encoding="utf-8"?>
+<w:hdr xmlns:wpc="http://schemas.microsoft.com/office/word/2010/wordprocessingCanvas" xmlns:cx="http://schemas.microsoft.com/office/drawing/2014/chartex" xmlns:cx1="http://schemas.microsoft.com/office/drawing/2015/9/8/chartex" xmlns:cx2="http://schemas.microsoft.com/office/drawing/2015/10/21/chartex" xmlns:cx3="http://schemas.microsoft.com/office/drawing/2016/5/9/chartex" xmlns:cx4="http://schemas.microsoft.com/office/drawing/2016/5/10/chartex" xmlns:cx5="http://schemas.microsoft.com/office/drawing/2016/5/11/chartex" xmlns:cx6="http://schemas.microsoft.com/office/drawing/2016/5/12/chartex" xmlns:cx7="http://schemas.microsoft.com/office/drawing/2016/5/13/chartex" xmlns:cx8="http://schemas.microsoft.com/office/drawing/2016/5/14/chartex" xmlns:mc="http://schemas.openxmlformats.org/markup-compatibility/2006" xmlns:aink="http://schemas.microsoft.com/office/drawing/2016/ink" xmlns:am3d="http://schemas.microsoft.com/office/drawing/2017/model3d" xmlns:o="urn:schemas-microsoft-com:office:office" xmlns:oel="http://schemas.microsoft.com/office/2019/extlst" xmlns:r="http://schemas.openxmlformats.org/officeDocument/2006/relationships" xmlns:m="http://schemas.openxmlformats.org/officeDocument/2006/math" xmlns:v="urn:schemas-microsoft-com:vml" xmlns:wp14="http://schemas.microsoft.com/office/word/2010/wordprocessingDrawing" xmlns:wp="http://schemas.openxmlformats.org/drawingml/2006/wordprocessingDrawing" xmlns:w10="urn:schemas-microsoft-com:office:word" xmlns:w="http://schemas.openxmlformats.org/wordprocessingml/2006/main" xmlns:w14="http://schemas.microsoft.com/office/word/2010/wordml" xmlns:w15="http://schemas.microsoft.com/office/word/2012/wordml" xmlns:w16cex="http://schemas.microsoft.com/office/word/2018/wordml/cex" xmlns:w16cid="http://schemas.microsoft.com/office/word/2016/wordml/cid" xmlns:w16="http://schemas.microsoft.com/office/word/2018/wordml" xmlns:w16du="http://schemas.microsoft.com/office/word/2023/wordml/word16du" xmlns:w16sdtdh="http://schemas.microsoft.com/office/word/2020/wordml/sdtdatahash" xmlns:w16sdtfl="http://schemas.microsoft.com/office/word/2024/wordml/sdtformatlock" xmlns:w16se="http://schemas.microsoft.com/office/word/2015/wordml/symex" xmlns:wpg="http://schemas.microsoft.com/office/word/2010/wordprocessingGroup" xmlns:wpi="http://schemas.microsoft.com/office/word/2010/wordprocessingInk" xmlns:wne="http://schemas.microsoft.com/office/word/2006/wordml" xmlns:wps="http://schemas.microsoft.com/office/word/2010/wordprocessingShape" mc:Ignorable="w14 w15 w16se w16cid w16 w16cex w16sdtdh w16sdtfl w16du wp14">
+  <w:p>
+    <w:pPr>
+      <w:pStyle w:val="Header"/>
+    </w:pPr>
+  </w:p>
+</w:hdr>
+</file>
+
+<file path=word/header3.xml><?xml version="1.0" encoding="utf-8"?>
 <w:hdr xmlns:wpc="http://schemas.microsoft.com/office/word/2010/wordprocessingCanvas" xmlns:cx="http://schemas.microsoft.com/office/drawing/2014/chartex" xmlns:cx1="http://schemas.microsoft.com/office/drawing/2015/9/8/chartex" xmlns:cx2="http://schemas.microsoft.com/office/drawing/2015/10/21/chartex" xmlns:cx3="http://schemas.microsoft.com/office/drawing/2016/5/9/chartex" xmlns:cx4="http://schemas.microsoft.com/office/drawing/2016/5/10/chartex" xmlns:cx5="http://schemas.microsoft.com/office/drawing/2016/5/11/chartex" xmlns:cx6="http://schemas.microsoft.com/office/drawing/2016/5/12/chartex" xmlns:cx7="http://schemas.microsoft.com/office/drawing/2016/5/13/chartex" xmlns:cx8="http://schemas.microsoft.com/office/drawing/2016/5/14/chartex" xmlns:mc="http://schemas.openxmlformats.org/markup-compatibility/2006" xmlns:aink="http://schemas.microsoft.com/office/drawing/2016/ink" xmlns:am3d="http://schemas.microsoft.com/office/drawing/2017/model3d" xmlns:o="urn:schemas-microsoft-com:office:office" xmlns:oel="http://schemas.microsoft.com/office/2019/extlst" xmlns:r="http://schemas.openxmlformats.org/officeDocument/2006/relationships" xmlns:m="http://schemas.openxmlformats.org/officeDocument/2006/math" xmlns:v="urn:schemas-microsoft-com:vml" xmlns:wp14="http://schemas.microsoft.com/office/word/2010/wordprocessingDrawing" xmlns:wp="http://schemas.openxmlformats.org/drawingml/2006/wordprocessingDrawing" xmlns:w10="urn:schemas-microsoft-com:office:word" xmlns:w="http://schemas.openxmlformats.org/wordprocessingml/2006/main" xmlns:w14="http://schemas.microsoft.com/office/word/2010/wordml" xmlns:w15="http://schemas.microsoft.com/office/word/2012/wordml" xmlns:w16cex="http://schemas.microsoft.com/office/word/2018/wordml/cex" xmlns:w16cid="http://schemas.microsoft.com/office/word/2016/wordml/cid" xmlns:w16="http://schemas.microsoft.com/office/word/2018/wordml" xmlns:w16du="http://schemas.microsoft.com/office/word/2023/wordml/word16du" xmlns:w16sdtdh="http://schemas.microsoft.com/office/word/2020/wordml/sdtdatahash" xmlns:w16sdtfl="http://schemas.microsoft.com/office/word/2024/wordml/sdtformatlock" xmlns:w16se="http://schemas.microsoft.com/office/word/2015/wordml/symex" xmlns:wpg="http://schemas.microsoft.com/office/word/2010/wordprocessingGroup" xmlns:wpi="http://schemas.microsoft.com/office/word/2010/wordprocessingInk" xmlns:wne="http://schemas.microsoft.com/office/word/2006/wordml" xmlns:wps="http://schemas.microsoft.com/office/word/2010/wordprocessingShape" mc:Ignorable="w14 w15 w16se w16cid w16 w16cex w16sdtdh w16sdtfl w16du wp14">
   <w:p>
     <w:pPr>
@@ -17525,6 +17688,14 @@
       <w:u w:val="single"/>
     </w:rPr>
   </w:style>
+  <w:style w:type="character" w:styleId="PageNumber">
+    <w:name w:val="page number"/>
+    <w:basedOn w:val="DefaultParagraphFont"/>
+    <w:uiPriority w:val="99"/>
+    <w:semiHidden/>
+    <w:unhideWhenUsed/>
+    <w:rsid w:val="00EF785D"/>
+  </w:style>
 </w:styles>
 </file>
 

</xml_diff>